<commit_message>
Split contract cost by address: 35k (Dybenko) + 25k (Komendantsky) per month
Co-Authored-By: Claude Opus 5.5 <noreply@anthropic.com>
Claude-Session: https://claude.ai/code/session_01HFBjH4MjwsHcLuC72w9pUK
</commit_message>
<xml_diff>
--- a/contracts/Договор_самозанятый_сантехника.docx
+++ b/contracts/Договор_самозанятый_сантехника.docx
@@ -278,7 +278,33 @@
         <w:rPr>
           <w:b w:val="0"/>
         </w:rPr>
-        <w:t>3.1. Общая стоимость Работ по Договору составляет 180 000 (сто восемьдесят тысяч) рублей 00 копеек. НДС не облагается в связи с применением Исполнителем специального налогового режима «Налог на профессиональный доход».</w:t>
+        <w:t>3.1. Общая стоимость Работ по Договору составляет 180 000 (сто восемьдесят тысяч) рублей 00 копеек. НДС не облагается в связи с применением Исполнителем специального налогового режима «Налог на профессиональный доход», в том числе:</w:t>
+      </w:r>
+    </w:p>
+    <w:p>
+      <w:pPr>
+        <w:spacing w:before="0"/>
+        <w:ind w:firstLine="567"/>
+        <w:jc w:val="both"/>
+      </w:pPr>
+      <w:r>
+        <w:rPr>
+          <w:b w:val="0"/>
+        </w:rPr>
+        <w:t>— по Объекту № 1 (г. Санкт-Петербург, ул. Дыбенко, д. 22, корп. 1) — 105 000 (сто пять тысяч) рублей 00 копеек (35 000 рублей в месяц);</w:t>
+      </w:r>
+    </w:p>
+    <w:p>
+      <w:pPr>
+        <w:spacing w:before="0"/>
+        <w:ind w:firstLine="567"/>
+        <w:jc w:val="both"/>
+      </w:pPr>
+      <w:r>
+        <w:rPr>
+          <w:b w:val="0"/>
+        </w:rPr>
+        <w:t>— по Объекту № 2 (г. Санкт-Петербург, Комендантский пр-т, д. 17, корп. 1) — 75 000 (семьдесят пять тысяч) рублей 00 копеек (25 000 рублей в месяц).</w:t>
       </w:r>
     </w:p>
     <w:p>
@@ -315,14 +341,16 @@
         <w:tblLook w:firstColumn="1" w:firstRow="1" w:lastColumn="0" w:lastRow="0" w:noHBand="0" w:noVBand="1" w:val="04A0"/>
       </w:tblPr>
       <w:tblGrid>
-        <w:gridCol w:w="3324"/>
-        <w:gridCol w:w="3324"/>
-        <w:gridCol w:w="3324"/>
+        <w:gridCol w:w="1995"/>
+        <w:gridCol w:w="1995"/>
+        <w:gridCol w:w="1995"/>
+        <w:gridCol w:w="1995"/>
+        <w:gridCol w:w="1995"/>
       </w:tblGrid>
       <w:tr>
         <w:tc>
           <w:tcPr>
-            <w:tcW w:type="dxa" w:w="850"/>
+            <w:tcW w:type="dxa" w:w="737"/>
           </w:tcPr>
           <w:p>
             <w:pPr>
@@ -340,7 +368,7 @@
         </w:tc>
         <w:tc>
           <w:tcPr>
-            <w:tcW w:type="dxa" w:w="6236"/>
+            <w:tcW w:type="dxa" w:w="2381"/>
           </w:tcPr>
           <w:p>
             <w:pPr>
@@ -352,7 +380,7 @@
                 <w:b/>
                 <w:sz w:val="22"/>
               </w:rPr>
-              <w:t>Содержание / период</w:t>
+              <w:t>Период</w:t>
             </w:r>
           </w:p>
         </w:tc>
@@ -370,7 +398,47 @@
                 <w:b/>
                 <w:sz w:val="22"/>
               </w:rPr>
-              <w:t>Сумма, руб.</w:t>
+              <w:t>Объект № 1</w:t>
+              <w:br/>
+              <w:t>(ул. Дыбенко, 22 к.1), руб.</w:t>
+            </w:r>
+          </w:p>
+        </w:tc>
+        <w:tc>
+          <w:tcPr>
+            <w:tcW w:type="dxa" w:w="2154"/>
+          </w:tcPr>
+          <w:p>
+            <w:pPr>
+              <w:jc w:val="center"/>
+            </w:pPr>
+            <w:r/>
+            <w:r>
+              <w:rPr>
+                <w:b/>
+                <w:sz w:val="22"/>
+              </w:rPr>
+              <w:t>Объект № 2</w:t>
+              <w:br/>
+              <w:t>(Комендантский пр., 17 к.1), руб.</w:t>
+            </w:r>
+          </w:p>
+        </w:tc>
+        <w:tc>
+          <w:tcPr>
+            <w:tcW w:type="dxa" w:w="1814"/>
+          </w:tcPr>
+          <w:p>
+            <w:pPr>
+              <w:jc w:val="center"/>
+            </w:pPr>
+            <w:r/>
+            <w:r>
+              <w:rPr>
+                <w:b/>
+                <w:sz w:val="22"/>
+              </w:rPr>
+              <w:t>Итого за этап, руб.</w:t>
             </w:r>
           </w:p>
         </w:tc>
@@ -378,7 +446,7 @@
       <w:tr>
         <w:tc>
           <w:tcPr>
-            <w:tcW w:type="dxa" w:w="850"/>
+            <w:tcW w:type="dxa" w:w="737"/>
           </w:tcPr>
           <w:p>
             <w:r/>
@@ -392,7 +460,7 @@
         </w:tc>
         <w:tc>
           <w:tcPr>
-            <w:tcW w:type="dxa" w:w="6236"/>
+            <w:tcW w:type="dxa" w:w="2381"/>
           </w:tcPr>
           <w:p>
             <w:r/>
@@ -400,13 +468,41 @@
               <w:rPr>
                 <w:sz w:val="22"/>
               </w:rPr>
-              <w:t>Работы 1-го месяца (по Приложению № 2)</w:t>
+              <w:t>1-й месяц</w:t>
             </w:r>
           </w:p>
         </w:tc>
         <w:tc>
           <w:tcPr>
             <w:tcW w:type="dxa" w:w="1984"/>
+          </w:tcPr>
+          <w:p>
+            <w:r/>
+            <w:r>
+              <w:rPr>
+                <w:sz w:val="22"/>
+              </w:rPr>
+              <w:t>35 000,00</w:t>
+            </w:r>
+          </w:p>
+        </w:tc>
+        <w:tc>
+          <w:tcPr>
+            <w:tcW w:type="dxa" w:w="2154"/>
+          </w:tcPr>
+          <w:p>
+            <w:r/>
+            <w:r>
+              <w:rPr>
+                <w:sz w:val="22"/>
+              </w:rPr>
+              <w:t>25 000,00</w:t>
+            </w:r>
+          </w:p>
+        </w:tc>
+        <w:tc>
+          <w:tcPr>
+            <w:tcW w:type="dxa" w:w="1814"/>
           </w:tcPr>
           <w:p>
             <w:r/>
@@ -422,7 +518,7 @@
       <w:tr>
         <w:tc>
           <w:tcPr>
-            <w:tcW w:type="dxa" w:w="850"/>
+            <w:tcW w:type="dxa" w:w="737"/>
           </w:tcPr>
           <w:p>
             <w:r/>
@@ -436,7 +532,7 @@
         </w:tc>
         <w:tc>
           <w:tcPr>
-            <w:tcW w:type="dxa" w:w="6236"/>
+            <w:tcW w:type="dxa" w:w="2381"/>
           </w:tcPr>
           <w:p>
             <w:r/>
@@ -444,13 +540,41 @@
               <w:rPr>
                 <w:sz w:val="22"/>
               </w:rPr>
-              <w:t>Работы 2-го месяца (по Приложению № 2)</w:t>
+              <w:t>2-й месяц</w:t>
             </w:r>
           </w:p>
         </w:tc>
         <w:tc>
           <w:tcPr>
             <w:tcW w:type="dxa" w:w="1984"/>
+          </w:tcPr>
+          <w:p>
+            <w:r/>
+            <w:r>
+              <w:rPr>
+                <w:sz w:val="22"/>
+              </w:rPr>
+              <w:t>35 000,00</w:t>
+            </w:r>
+          </w:p>
+        </w:tc>
+        <w:tc>
+          <w:tcPr>
+            <w:tcW w:type="dxa" w:w="2154"/>
+          </w:tcPr>
+          <w:p>
+            <w:r/>
+            <w:r>
+              <w:rPr>
+                <w:sz w:val="22"/>
+              </w:rPr>
+              <w:t>25 000,00</w:t>
+            </w:r>
+          </w:p>
+        </w:tc>
+        <w:tc>
+          <w:tcPr>
+            <w:tcW w:type="dxa" w:w="1814"/>
           </w:tcPr>
           <w:p>
             <w:r/>
@@ -466,7 +590,7 @@
       <w:tr>
         <w:tc>
           <w:tcPr>
-            <w:tcW w:type="dxa" w:w="850"/>
+            <w:tcW w:type="dxa" w:w="737"/>
           </w:tcPr>
           <w:p>
             <w:r/>
@@ -480,7 +604,7 @@
         </w:tc>
         <w:tc>
           <w:tcPr>
-            <w:tcW w:type="dxa" w:w="6236"/>
+            <w:tcW w:type="dxa" w:w="2381"/>
           </w:tcPr>
           <w:p>
             <w:r/>
@@ -488,13 +612,41 @@
               <w:rPr>
                 <w:sz w:val="22"/>
               </w:rPr>
-              <w:t>Работы 3-го месяца, завершение Работ (по Приложению № 2)</w:t>
+              <w:t>3-й месяц, завершение Работ</w:t>
             </w:r>
           </w:p>
         </w:tc>
         <w:tc>
           <w:tcPr>
             <w:tcW w:type="dxa" w:w="1984"/>
+          </w:tcPr>
+          <w:p>
+            <w:r/>
+            <w:r>
+              <w:rPr>
+                <w:sz w:val="22"/>
+              </w:rPr>
+              <w:t>35 000,00</w:t>
+            </w:r>
+          </w:p>
+        </w:tc>
+        <w:tc>
+          <w:tcPr>
+            <w:tcW w:type="dxa" w:w="2154"/>
+          </w:tcPr>
+          <w:p>
+            <w:r/>
+            <w:r>
+              <w:rPr>
+                <w:sz w:val="22"/>
+              </w:rPr>
+              <w:t>25 000,00</w:t>
+            </w:r>
+          </w:p>
+        </w:tc>
+        <w:tc>
+          <w:tcPr>
+            <w:tcW w:type="dxa" w:w="1814"/>
           </w:tcPr>
           <w:p>
             <w:r/>
@@ -510,7 +662,7 @@
       <w:tr>
         <w:tc>
           <w:tcPr>
-            <w:tcW w:type="dxa" w:w="850"/>
+            <w:tcW w:type="dxa" w:w="737"/>
           </w:tcPr>
           <w:p>
             <w:r/>
@@ -523,7 +675,7 @@
         </w:tc>
         <w:tc>
           <w:tcPr>
-            <w:tcW w:type="dxa" w:w="6236"/>
+            <w:tcW w:type="dxa" w:w="2381"/>
           </w:tcPr>
           <w:p>
             <w:r/>
@@ -538,6 +690,34 @@
         <w:tc>
           <w:tcPr>
             <w:tcW w:type="dxa" w:w="1984"/>
+          </w:tcPr>
+          <w:p>
+            <w:r/>
+            <w:r>
+              <w:rPr>
+                <w:sz w:val="22"/>
+              </w:rPr>
+              <w:t>105 000,00</w:t>
+            </w:r>
+          </w:p>
+        </w:tc>
+        <w:tc>
+          <w:tcPr>
+            <w:tcW w:type="dxa" w:w="2154"/>
+          </w:tcPr>
+          <w:p>
+            <w:r/>
+            <w:r>
+              <w:rPr>
+                <w:sz w:val="22"/>
+              </w:rPr>
+              <w:t>75 000,00</w:t>
+            </w:r>
+          </w:p>
+        </w:tc>
+        <w:tc>
+          <w:tcPr>
+            <w:tcW w:type="dxa" w:w="1814"/>
           </w:tcPr>
           <w:p>
             <w:r/>
@@ -2428,7 +2608,7 @@
         </w:tc>
         <w:tc>
           <w:tcPr>
-            <w:tcW w:type="dxa" w:w="1134"/>
+            <w:tcW w:type="dxa" w:w="1474"/>
           </w:tcPr>
           <w:p>
             <w:pPr>
@@ -2440,13 +2620,13 @@
                 <w:b/>
                 <w:sz w:val="22"/>
               </w:rPr>
-              <w:t>Объект(ы)</w:t>
+              <w:t>Объект</w:t>
             </w:r>
           </w:p>
         </w:tc>
         <w:tc>
           <w:tcPr>
-            <w:tcW w:type="dxa" w:w="2438"/>
+            <w:tcW w:type="dxa" w:w="2098"/>
           </w:tcPr>
           <w:p>
             <w:pPr>
@@ -2524,15 +2704,15 @@
               <w:rPr>
                 <w:sz w:val="22"/>
               </w:rPr>
-              <w:t>с «__»____ по «__»____</w:t>
+              <w:t>1-й месяц:</w:t>
               <w:br/>
-              <w:t>(1-й месяц)</w:t>
+              <w:t>с «__»___ по «__»___</w:t>
             </w:r>
           </w:p>
         </w:tc>
         <w:tc>
           <w:tcPr>
-            <w:tcW w:type="dxa" w:w="1134"/>
+            <w:tcW w:type="dxa" w:w="1474"/>
           </w:tcPr>
           <w:p>
             <w:r/>
@@ -2540,13 +2720,13 @@
               <w:rPr>
                 <w:sz w:val="22"/>
               </w:rPr>
-              <w:t>№ 1, № 2</w:t>
+              <w:t>№ 1 (Дыбенко)</w:t>
             </w:r>
           </w:p>
         </w:tc>
         <w:tc>
           <w:tcPr>
-            <w:tcW w:type="dxa" w:w="2438"/>
+            <w:tcW w:type="dxa" w:w="2098"/>
           </w:tcPr>
           <w:p>
             <w:r/>
@@ -2567,7 +2747,7 @@
               <w:rPr>
                 <w:sz w:val="22"/>
               </w:rPr>
-              <w:t>60 000,00</w:t>
+              <w:t>35 000,00</w:t>
             </w:r>
           </w:p>
         </w:tc>
@@ -2581,181 +2761,7 @@
               <w:rPr>
                 <w:sz w:val="22"/>
               </w:rPr>
-              <w:t>5 раб. дней после подписания акта этапа 1</w:t>
-            </w:r>
-          </w:p>
-        </w:tc>
-      </w:tr>
-      <w:tr>
-        <w:tc>
-          <w:tcPr>
-            <w:tcW w:type="dxa" w:w="680"/>
-          </w:tcPr>
-          <w:p>
-            <w:r/>
-            <w:r>
-              <w:rPr>
-                <w:sz w:val="22"/>
-              </w:rPr>
-              <w:t>2</w:t>
-            </w:r>
-          </w:p>
-        </w:tc>
-        <w:tc>
-          <w:tcPr>
-            <w:tcW w:type="dxa" w:w="1871"/>
-          </w:tcPr>
-          <w:p>
-            <w:r/>
-            <w:r>
-              <w:rPr>
-                <w:sz w:val="22"/>
-              </w:rPr>
-              <w:t>с «__»____ по «__»____</w:t>
-              <w:br/>
-              <w:t>(2-й месяц)</w:t>
-            </w:r>
-          </w:p>
-        </w:tc>
-        <w:tc>
-          <w:tcPr>
-            <w:tcW w:type="dxa" w:w="1134"/>
-          </w:tcPr>
-          <w:p>
-            <w:r/>
-            <w:r>
-              <w:rPr>
-                <w:sz w:val="22"/>
-              </w:rPr>
-              <w:t>№ 1, № 2</w:t>
-            </w:r>
-          </w:p>
-        </w:tc>
-        <w:tc>
-          <w:tcPr>
-            <w:tcW w:type="dxa" w:w="2438"/>
-          </w:tcPr>
-          <w:p>
-            <w:r/>
-            <w:r>
-              <w:rPr>
-                <w:sz w:val="22"/>
-              </w:rPr>
-            </w:r>
-          </w:p>
-        </w:tc>
-        <w:tc>
-          <w:tcPr>
-            <w:tcW w:type="dxa" w:w="1361"/>
-          </w:tcPr>
-          <w:p>
-            <w:r/>
-            <w:r>
-              <w:rPr>
-                <w:sz w:val="22"/>
-              </w:rPr>
-              <w:t>60 000,00</w:t>
-            </w:r>
-          </w:p>
-        </w:tc>
-        <w:tc>
-          <w:tcPr>
-            <w:tcW w:type="dxa" w:w="1871"/>
-          </w:tcPr>
-          <w:p>
-            <w:r/>
-            <w:r>
-              <w:rPr>
-                <w:sz w:val="22"/>
-              </w:rPr>
-              <w:t>5 раб. дней после подписания акта этапа 2</w:t>
-            </w:r>
-          </w:p>
-        </w:tc>
-      </w:tr>
-      <w:tr>
-        <w:tc>
-          <w:tcPr>
-            <w:tcW w:type="dxa" w:w="680"/>
-          </w:tcPr>
-          <w:p>
-            <w:r/>
-            <w:r>
-              <w:rPr>
-                <w:sz w:val="22"/>
-              </w:rPr>
-              <w:t>3</w:t>
-            </w:r>
-          </w:p>
-        </w:tc>
-        <w:tc>
-          <w:tcPr>
-            <w:tcW w:type="dxa" w:w="1871"/>
-          </w:tcPr>
-          <w:p>
-            <w:r/>
-            <w:r>
-              <w:rPr>
-                <w:sz w:val="22"/>
-              </w:rPr>
-              <w:t>с «__»____ по «__»____</w:t>
-              <w:br/>
-              <w:t>(3-й месяц)</w:t>
-            </w:r>
-          </w:p>
-        </w:tc>
-        <w:tc>
-          <w:tcPr>
-            <w:tcW w:type="dxa" w:w="1134"/>
-          </w:tcPr>
-          <w:p>
-            <w:r/>
-            <w:r>
-              <w:rPr>
-                <w:sz w:val="22"/>
-              </w:rPr>
-              <w:t>№ 1, № 2</w:t>
-            </w:r>
-          </w:p>
-        </w:tc>
-        <w:tc>
-          <w:tcPr>
-            <w:tcW w:type="dxa" w:w="2438"/>
-          </w:tcPr>
-          <w:p>
-            <w:r/>
-            <w:r>
-              <w:rPr>
-                <w:sz w:val="22"/>
-              </w:rPr>
-            </w:r>
-          </w:p>
-        </w:tc>
-        <w:tc>
-          <w:tcPr>
-            <w:tcW w:type="dxa" w:w="1361"/>
-          </w:tcPr>
-          <w:p>
-            <w:r/>
-            <w:r>
-              <w:rPr>
-                <w:sz w:val="22"/>
-              </w:rPr>
-              <w:t>60 000,00</w:t>
-            </w:r>
-          </w:p>
-        </w:tc>
-        <w:tc>
-          <w:tcPr>
-            <w:tcW w:type="dxa" w:w="1871"/>
-          </w:tcPr>
-          <w:p>
-            <w:r/>
-            <w:r>
-              <w:rPr>
-                <w:sz w:val="22"/>
-              </w:rPr>
-              <w:t>5 раб. дней после подписания акта этапа 3</w:t>
+              <w:t>5 раб. дн. после акта этапа 1</w:t>
             </w:r>
           </w:p>
         </w:tc>
@@ -2789,7 +2795,21 @@
         </w:tc>
         <w:tc>
           <w:tcPr>
-            <w:tcW w:type="dxa" w:w="1134"/>
+            <w:tcW w:type="dxa" w:w="1474"/>
+          </w:tcPr>
+          <w:p>
+            <w:r/>
+            <w:r>
+              <w:rPr>
+                <w:sz w:val="22"/>
+              </w:rPr>
+              <w:t>№ 2 (Ком. пр-т)</w:t>
+            </w:r>
+          </w:p>
+        </w:tc>
+        <w:tc>
+          <w:tcPr>
+            <w:tcW w:type="dxa" w:w="2098"/>
           </w:tcPr>
           <w:p>
             <w:r/>
@@ -2802,7 +2822,659 @@
         </w:tc>
         <w:tc>
           <w:tcPr>
-            <w:tcW w:type="dxa" w:w="2438"/>
+            <w:tcW w:type="dxa" w:w="1361"/>
+          </w:tcPr>
+          <w:p>
+            <w:r/>
+            <w:r>
+              <w:rPr>
+                <w:sz w:val="22"/>
+              </w:rPr>
+              <w:t>25 000,00</w:t>
+            </w:r>
+          </w:p>
+        </w:tc>
+        <w:tc>
+          <w:tcPr>
+            <w:tcW w:type="dxa" w:w="1871"/>
+          </w:tcPr>
+          <w:p>
+            <w:r/>
+            <w:r>
+              <w:rPr>
+                <w:sz w:val="22"/>
+              </w:rPr>
+            </w:r>
+          </w:p>
+        </w:tc>
+      </w:tr>
+      <w:tr>
+        <w:tc>
+          <w:tcPr>
+            <w:tcW w:type="dxa" w:w="680"/>
+          </w:tcPr>
+          <w:p>
+            <w:r/>
+            <w:r>
+              <w:rPr>
+                <w:sz w:val="22"/>
+              </w:rPr>
+            </w:r>
+          </w:p>
+        </w:tc>
+        <w:tc>
+          <w:tcPr>
+            <w:tcW w:type="dxa" w:w="1871"/>
+          </w:tcPr>
+          <w:p>
+            <w:r/>
+            <w:r>
+              <w:rPr>
+                <w:sz w:val="22"/>
+              </w:rPr>
+            </w:r>
+          </w:p>
+        </w:tc>
+        <w:tc>
+          <w:tcPr>
+            <w:tcW w:type="dxa" w:w="1474"/>
+          </w:tcPr>
+          <w:p>
+            <w:r/>
+            <w:r>
+              <w:rPr>
+                <w:sz w:val="22"/>
+              </w:rPr>
+            </w:r>
+          </w:p>
+        </w:tc>
+        <w:tc>
+          <w:tcPr>
+            <w:tcW w:type="dxa" w:w="2098"/>
+          </w:tcPr>
+          <w:p>
+            <w:r/>
+            <w:r>
+              <w:rPr>
+                <w:sz w:val="22"/>
+              </w:rPr>
+              <w:t>Итого по этапу 1:</w:t>
+            </w:r>
+          </w:p>
+        </w:tc>
+        <w:tc>
+          <w:tcPr>
+            <w:tcW w:type="dxa" w:w="1361"/>
+          </w:tcPr>
+          <w:p>
+            <w:r/>
+            <w:r>
+              <w:rPr>
+                <w:sz w:val="22"/>
+              </w:rPr>
+              <w:t>60 000,00</w:t>
+            </w:r>
+          </w:p>
+        </w:tc>
+        <w:tc>
+          <w:tcPr>
+            <w:tcW w:type="dxa" w:w="1871"/>
+          </w:tcPr>
+          <w:p>
+            <w:r/>
+            <w:r>
+              <w:rPr>
+                <w:sz w:val="22"/>
+              </w:rPr>
+            </w:r>
+          </w:p>
+        </w:tc>
+      </w:tr>
+      <w:tr>
+        <w:tc>
+          <w:tcPr>
+            <w:tcW w:type="dxa" w:w="680"/>
+          </w:tcPr>
+          <w:p>
+            <w:r/>
+            <w:r>
+              <w:rPr>
+                <w:sz w:val="22"/>
+              </w:rPr>
+              <w:t>2</w:t>
+            </w:r>
+          </w:p>
+        </w:tc>
+        <w:tc>
+          <w:tcPr>
+            <w:tcW w:type="dxa" w:w="1871"/>
+          </w:tcPr>
+          <w:p>
+            <w:r/>
+            <w:r>
+              <w:rPr>
+                <w:sz w:val="22"/>
+              </w:rPr>
+              <w:t>2-й месяц:</w:t>
+              <w:br/>
+              <w:t>с «__»___ по «__»___</w:t>
+            </w:r>
+          </w:p>
+        </w:tc>
+        <w:tc>
+          <w:tcPr>
+            <w:tcW w:type="dxa" w:w="1474"/>
+          </w:tcPr>
+          <w:p>
+            <w:r/>
+            <w:r>
+              <w:rPr>
+                <w:sz w:val="22"/>
+              </w:rPr>
+              <w:t>№ 1 (Дыбенко)</w:t>
+            </w:r>
+          </w:p>
+        </w:tc>
+        <w:tc>
+          <w:tcPr>
+            <w:tcW w:type="dxa" w:w="2098"/>
+          </w:tcPr>
+          <w:p>
+            <w:r/>
+            <w:r>
+              <w:rPr>
+                <w:sz w:val="22"/>
+              </w:rPr>
+            </w:r>
+          </w:p>
+        </w:tc>
+        <w:tc>
+          <w:tcPr>
+            <w:tcW w:type="dxa" w:w="1361"/>
+          </w:tcPr>
+          <w:p>
+            <w:r/>
+            <w:r>
+              <w:rPr>
+                <w:sz w:val="22"/>
+              </w:rPr>
+              <w:t>35 000,00</w:t>
+            </w:r>
+          </w:p>
+        </w:tc>
+        <w:tc>
+          <w:tcPr>
+            <w:tcW w:type="dxa" w:w="1871"/>
+          </w:tcPr>
+          <w:p>
+            <w:r/>
+            <w:r>
+              <w:rPr>
+                <w:sz w:val="22"/>
+              </w:rPr>
+              <w:t>5 раб. дн. после акта этапа 2</w:t>
+            </w:r>
+          </w:p>
+        </w:tc>
+      </w:tr>
+      <w:tr>
+        <w:tc>
+          <w:tcPr>
+            <w:tcW w:type="dxa" w:w="680"/>
+          </w:tcPr>
+          <w:p>
+            <w:r/>
+            <w:r>
+              <w:rPr>
+                <w:sz w:val="22"/>
+              </w:rPr>
+            </w:r>
+          </w:p>
+        </w:tc>
+        <w:tc>
+          <w:tcPr>
+            <w:tcW w:type="dxa" w:w="1871"/>
+          </w:tcPr>
+          <w:p>
+            <w:r/>
+            <w:r>
+              <w:rPr>
+                <w:sz w:val="22"/>
+              </w:rPr>
+            </w:r>
+          </w:p>
+        </w:tc>
+        <w:tc>
+          <w:tcPr>
+            <w:tcW w:type="dxa" w:w="1474"/>
+          </w:tcPr>
+          <w:p>
+            <w:r/>
+            <w:r>
+              <w:rPr>
+                <w:sz w:val="22"/>
+              </w:rPr>
+              <w:t>№ 2 (Ком. пр-т)</w:t>
+            </w:r>
+          </w:p>
+        </w:tc>
+        <w:tc>
+          <w:tcPr>
+            <w:tcW w:type="dxa" w:w="2098"/>
+          </w:tcPr>
+          <w:p>
+            <w:r/>
+            <w:r>
+              <w:rPr>
+                <w:sz w:val="22"/>
+              </w:rPr>
+            </w:r>
+          </w:p>
+        </w:tc>
+        <w:tc>
+          <w:tcPr>
+            <w:tcW w:type="dxa" w:w="1361"/>
+          </w:tcPr>
+          <w:p>
+            <w:r/>
+            <w:r>
+              <w:rPr>
+                <w:sz w:val="22"/>
+              </w:rPr>
+              <w:t>25 000,00</w:t>
+            </w:r>
+          </w:p>
+        </w:tc>
+        <w:tc>
+          <w:tcPr>
+            <w:tcW w:type="dxa" w:w="1871"/>
+          </w:tcPr>
+          <w:p>
+            <w:r/>
+            <w:r>
+              <w:rPr>
+                <w:sz w:val="22"/>
+              </w:rPr>
+            </w:r>
+          </w:p>
+        </w:tc>
+      </w:tr>
+      <w:tr>
+        <w:tc>
+          <w:tcPr>
+            <w:tcW w:type="dxa" w:w="680"/>
+          </w:tcPr>
+          <w:p>
+            <w:r/>
+            <w:r>
+              <w:rPr>
+                <w:sz w:val="22"/>
+              </w:rPr>
+            </w:r>
+          </w:p>
+        </w:tc>
+        <w:tc>
+          <w:tcPr>
+            <w:tcW w:type="dxa" w:w="1871"/>
+          </w:tcPr>
+          <w:p>
+            <w:r/>
+            <w:r>
+              <w:rPr>
+                <w:sz w:val="22"/>
+              </w:rPr>
+            </w:r>
+          </w:p>
+        </w:tc>
+        <w:tc>
+          <w:tcPr>
+            <w:tcW w:type="dxa" w:w="1474"/>
+          </w:tcPr>
+          <w:p>
+            <w:r/>
+            <w:r>
+              <w:rPr>
+                <w:sz w:val="22"/>
+              </w:rPr>
+            </w:r>
+          </w:p>
+        </w:tc>
+        <w:tc>
+          <w:tcPr>
+            <w:tcW w:type="dxa" w:w="2098"/>
+          </w:tcPr>
+          <w:p>
+            <w:r/>
+            <w:r>
+              <w:rPr>
+                <w:sz w:val="22"/>
+              </w:rPr>
+              <w:t>Итого по этапу 2:</w:t>
+            </w:r>
+          </w:p>
+        </w:tc>
+        <w:tc>
+          <w:tcPr>
+            <w:tcW w:type="dxa" w:w="1361"/>
+          </w:tcPr>
+          <w:p>
+            <w:r/>
+            <w:r>
+              <w:rPr>
+                <w:sz w:val="22"/>
+              </w:rPr>
+              <w:t>60 000,00</w:t>
+            </w:r>
+          </w:p>
+        </w:tc>
+        <w:tc>
+          <w:tcPr>
+            <w:tcW w:type="dxa" w:w="1871"/>
+          </w:tcPr>
+          <w:p>
+            <w:r/>
+            <w:r>
+              <w:rPr>
+                <w:sz w:val="22"/>
+              </w:rPr>
+            </w:r>
+          </w:p>
+        </w:tc>
+      </w:tr>
+      <w:tr>
+        <w:tc>
+          <w:tcPr>
+            <w:tcW w:type="dxa" w:w="680"/>
+          </w:tcPr>
+          <w:p>
+            <w:r/>
+            <w:r>
+              <w:rPr>
+                <w:sz w:val="22"/>
+              </w:rPr>
+              <w:t>3</w:t>
+            </w:r>
+          </w:p>
+        </w:tc>
+        <w:tc>
+          <w:tcPr>
+            <w:tcW w:type="dxa" w:w="1871"/>
+          </w:tcPr>
+          <w:p>
+            <w:r/>
+            <w:r>
+              <w:rPr>
+                <w:sz w:val="22"/>
+              </w:rPr>
+              <w:t>3-й месяц:</w:t>
+              <w:br/>
+              <w:t>с «__»___ по «__»___</w:t>
+            </w:r>
+          </w:p>
+        </w:tc>
+        <w:tc>
+          <w:tcPr>
+            <w:tcW w:type="dxa" w:w="1474"/>
+          </w:tcPr>
+          <w:p>
+            <w:r/>
+            <w:r>
+              <w:rPr>
+                <w:sz w:val="22"/>
+              </w:rPr>
+              <w:t>№ 1 (Дыбенко)</w:t>
+            </w:r>
+          </w:p>
+        </w:tc>
+        <w:tc>
+          <w:tcPr>
+            <w:tcW w:type="dxa" w:w="2098"/>
+          </w:tcPr>
+          <w:p>
+            <w:r/>
+            <w:r>
+              <w:rPr>
+                <w:sz w:val="22"/>
+              </w:rPr>
+            </w:r>
+          </w:p>
+        </w:tc>
+        <w:tc>
+          <w:tcPr>
+            <w:tcW w:type="dxa" w:w="1361"/>
+          </w:tcPr>
+          <w:p>
+            <w:r/>
+            <w:r>
+              <w:rPr>
+                <w:sz w:val="22"/>
+              </w:rPr>
+              <w:t>35 000,00</w:t>
+            </w:r>
+          </w:p>
+        </w:tc>
+        <w:tc>
+          <w:tcPr>
+            <w:tcW w:type="dxa" w:w="1871"/>
+          </w:tcPr>
+          <w:p>
+            <w:r/>
+            <w:r>
+              <w:rPr>
+                <w:sz w:val="22"/>
+              </w:rPr>
+              <w:t>5 раб. дн. после акта этапа 3</w:t>
+            </w:r>
+          </w:p>
+        </w:tc>
+      </w:tr>
+      <w:tr>
+        <w:tc>
+          <w:tcPr>
+            <w:tcW w:type="dxa" w:w="680"/>
+          </w:tcPr>
+          <w:p>
+            <w:r/>
+            <w:r>
+              <w:rPr>
+                <w:sz w:val="22"/>
+              </w:rPr>
+            </w:r>
+          </w:p>
+        </w:tc>
+        <w:tc>
+          <w:tcPr>
+            <w:tcW w:type="dxa" w:w="1871"/>
+          </w:tcPr>
+          <w:p>
+            <w:r/>
+            <w:r>
+              <w:rPr>
+                <w:sz w:val="22"/>
+              </w:rPr>
+            </w:r>
+          </w:p>
+        </w:tc>
+        <w:tc>
+          <w:tcPr>
+            <w:tcW w:type="dxa" w:w="1474"/>
+          </w:tcPr>
+          <w:p>
+            <w:r/>
+            <w:r>
+              <w:rPr>
+                <w:sz w:val="22"/>
+              </w:rPr>
+              <w:t>№ 2 (Ком. пр-т)</w:t>
+            </w:r>
+          </w:p>
+        </w:tc>
+        <w:tc>
+          <w:tcPr>
+            <w:tcW w:type="dxa" w:w="2098"/>
+          </w:tcPr>
+          <w:p>
+            <w:r/>
+            <w:r>
+              <w:rPr>
+                <w:sz w:val="22"/>
+              </w:rPr>
+            </w:r>
+          </w:p>
+        </w:tc>
+        <w:tc>
+          <w:tcPr>
+            <w:tcW w:type="dxa" w:w="1361"/>
+          </w:tcPr>
+          <w:p>
+            <w:r/>
+            <w:r>
+              <w:rPr>
+                <w:sz w:val="22"/>
+              </w:rPr>
+              <w:t>25 000,00</w:t>
+            </w:r>
+          </w:p>
+        </w:tc>
+        <w:tc>
+          <w:tcPr>
+            <w:tcW w:type="dxa" w:w="1871"/>
+          </w:tcPr>
+          <w:p>
+            <w:r/>
+            <w:r>
+              <w:rPr>
+                <w:sz w:val="22"/>
+              </w:rPr>
+            </w:r>
+          </w:p>
+        </w:tc>
+      </w:tr>
+      <w:tr>
+        <w:tc>
+          <w:tcPr>
+            <w:tcW w:type="dxa" w:w="680"/>
+          </w:tcPr>
+          <w:p>
+            <w:r/>
+            <w:r>
+              <w:rPr>
+                <w:sz w:val="22"/>
+              </w:rPr>
+            </w:r>
+          </w:p>
+        </w:tc>
+        <w:tc>
+          <w:tcPr>
+            <w:tcW w:type="dxa" w:w="1871"/>
+          </w:tcPr>
+          <w:p>
+            <w:r/>
+            <w:r>
+              <w:rPr>
+                <w:sz w:val="22"/>
+              </w:rPr>
+            </w:r>
+          </w:p>
+        </w:tc>
+        <w:tc>
+          <w:tcPr>
+            <w:tcW w:type="dxa" w:w="1474"/>
+          </w:tcPr>
+          <w:p>
+            <w:r/>
+            <w:r>
+              <w:rPr>
+                <w:sz w:val="22"/>
+              </w:rPr>
+            </w:r>
+          </w:p>
+        </w:tc>
+        <w:tc>
+          <w:tcPr>
+            <w:tcW w:type="dxa" w:w="2098"/>
+          </w:tcPr>
+          <w:p>
+            <w:r/>
+            <w:r>
+              <w:rPr>
+                <w:sz w:val="22"/>
+              </w:rPr>
+              <w:t>Итого по этапу 3:</w:t>
+            </w:r>
+          </w:p>
+        </w:tc>
+        <w:tc>
+          <w:tcPr>
+            <w:tcW w:type="dxa" w:w="1361"/>
+          </w:tcPr>
+          <w:p>
+            <w:r/>
+            <w:r>
+              <w:rPr>
+                <w:sz w:val="22"/>
+              </w:rPr>
+              <w:t>60 000,00</w:t>
+            </w:r>
+          </w:p>
+        </w:tc>
+        <w:tc>
+          <w:tcPr>
+            <w:tcW w:type="dxa" w:w="1871"/>
+          </w:tcPr>
+          <w:p>
+            <w:r/>
+            <w:r>
+              <w:rPr>
+                <w:sz w:val="22"/>
+              </w:rPr>
+            </w:r>
+          </w:p>
+        </w:tc>
+      </w:tr>
+      <w:tr>
+        <w:tc>
+          <w:tcPr>
+            <w:tcW w:type="dxa" w:w="680"/>
+          </w:tcPr>
+          <w:p>
+            <w:r/>
+            <w:r>
+              <w:rPr>
+                <w:sz w:val="22"/>
+              </w:rPr>
+            </w:r>
+          </w:p>
+        </w:tc>
+        <w:tc>
+          <w:tcPr>
+            <w:tcW w:type="dxa" w:w="1871"/>
+          </w:tcPr>
+          <w:p>
+            <w:r/>
+            <w:r>
+              <w:rPr>
+                <w:sz w:val="22"/>
+              </w:rPr>
+            </w:r>
+          </w:p>
+        </w:tc>
+        <w:tc>
+          <w:tcPr>
+            <w:tcW w:type="dxa" w:w="1474"/>
+          </w:tcPr>
+          <w:p>
+            <w:r/>
+            <w:r>
+              <w:rPr>
+                <w:sz w:val="22"/>
+              </w:rPr>
+            </w:r>
+          </w:p>
+        </w:tc>
+        <w:tc>
+          <w:tcPr>
+            <w:tcW w:type="dxa" w:w="2098"/>
           </w:tcPr>
           <w:p>
             <w:r/>
@@ -2865,7 +3537,7 @@
         <w:rPr>
           <w:b w:val="0"/>
         </w:rPr>
-        <w:t>Итого по Договору: 180 000 (сто восемьдесят тысяч) рублей 00 копеек, НДС не облагается.</w:t>
+        <w:t>Итого по Договору: 180 000 (сто восемьдесят тысяч) рублей 00 копеек, НДС не облагается, в том числе: по Объекту № 1 — 105 000 рублей 00 копеек, по Объекту № 2 — 75 000 рублей 00 копеек.</w:t>
       </w:r>
     </w:p>
     <w:p>
@@ -2878,19 +3550,7 @@
         <w:rPr>
           <w:b w:val="0"/>
         </w:rPr>
-        <w:t>Стороны вправе по дополнительному соглашению перераспределить состав работ и суммы между этапами без изменения общей стоимости Договора.</w:t>
-      </w:r>
-    </w:p>
-    <w:p>
-      <w:pPr>
-        <w:spacing w:before="0"/>
-        <w:ind w:firstLine="567"/>
-        <w:jc w:val="both"/>
-      </w:pPr>
-      <w:r>
-        <w:rPr>
-          <w:b w:val="0"/>
-        </w:rPr>
+        <w:t>Стороны вправе по дополнительному соглашению перераспределить состав работ и суммы между этапами и Объектами без изменения общей стоимости Договора.</w:t>
       </w:r>
     </w:p>
     <w:tbl>
@@ -3044,11 +3704,10 @@
         <w:tblLook w:firstColumn="1" w:firstRow="1" w:lastColumn="0" w:lastRow="0" w:noHBand="0" w:noVBand="1" w:val="04A0"/>
       </w:tblPr>
       <w:tblGrid>
-        <w:gridCol w:w="1995"/>
-        <w:gridCol w:w="1995"/>
-        <w:gridCol w:w="1995"/>
-        <w:gridCol w:w="1995"/>
-        <w:gridCol w:w="1995"/>
+        <w:gridCol w:w="2493"/>
+        <w:gridCol w:w="2493"/>
+        <w:gridCol w:w="2493"/>
+        <w:gridCol w:w="2493"/>
       </w:tblGrid>
       <w:tr>
         <w:tc>
@@ -3071,7 +3730,7 @@
         </w:tc>
         <w:tc>
           <w:tcPr>
-            <w:tcW w:type="dxa" w:w="1984"/>
+            <w:tcW w:type="dxa" w:w="2835"/>
           </w:tcPr>
           <w:p>
             <w:pPr>
@@ -3089,7 +3748,7 @@
         </w:tc>
         <w:tc>
           <w:tcPr>
-            <w:tcW w:type="dxa" w:w="4252"/>
+            <w:tcW w:type="dxa" w:w="3969"/>
           </w:tcPr>
           <w:p>
             <w:pPr>
@@ -3107,7 +3766,7 @@
         </w:tc>
         <w:tc>
           <w:tcPr>
-            <w:tcW w:type="dxa" w:w="1134"/>
+            <w:tcW w:type="dxa" w:w="1701"/>
           </w:tcPr>
           <w:p>
             <w:pPr>
@@ -3119,25 +3778,7 @@
                 <w:b/>
                 <w:sz w:val="22"/>
               </w:rPr>
-              <w:t>Ед. изм.</w:t>
-            </w:r>
-          </w:p>
-        </w:tc>
-        <w:tc>
-          <w:tcPr>
-            <w:tcW w:type="dxa" w:w="1134"/>
-          </w:tcPr>
-          <w:p>
-            <w:pPr>
-              <w:jc w:val="center"/>
-            </w:pPr>
-            <w:r/>
-            <w:r>
-              <w:rPr>
-                <w:b/>
-                <w:sz w:val="22"/>
-              </w:rPr>
-              <w:t>Кол-во</w:t>
+              <w:t>Стоимость, руб.</w:t>
             </w:r>
           </w:p>
         </w:tc>
@@ -3159,7 +3800,21 @@
         </w:tc>
         <w:tc>
           <w:tcPr>
-            <w:tcW w:type="dxa" w:w="1984"/>
+            <w:tcW w:type="dxa" w:w="2835"/>
+          </w:tcPr>
+          <w:p>
+            <w:r/>
+            <w:r>
+              <w:rPr>
+                <w:sz w:val="22"/>
+              </w:rPr>
+              <w:t>№ 1: ул. Дыбенко, д. 22, корп. 1</w:t>
+            </w:r>
+          </w:p>
+        </w:tc>
+        <w:tc>
+          <w:tcPr>
+            <w:tcW w:type="dxa" w:w="3969"/>
           </w:tcPr>
           <w:p>
             <w:r/>
@@ -3172,7 +3827,7 @@
         </w:tc>
         <w:tc>
           <w:tcPr>
-            <w:tcW w:type="dxa" w:w="4252"/>
+            <w:tcW w:type="dxa" w:w="1701"/>
           </w:tcPr>
           <w:p>
             <w:r/>
@@ -3180,32 +3835,7 @@
               <w:rPr>
                 <w:sz w:val="22"/>
               </w:rPr>
-            </w:r>
-          </w:p>
-        </w:tc>
-        <w:tc>
-          <w:tcPr>
-            <w:tcW w:type="dxa" w:w="1134"/>
-          </w:tcPr>
-          <w:p>
-            <w:r/>
-            <w:r>
-              <w:rPr>
-                <w:sz w:val="22"/>
-              </w:rPr>
-            </w:r>
-          </w:p>
-        </w:tc>
-        <w:tc>
-          <w:tcPr>
-            <w:tcW w:type="dxa" w:w="1134"/>
-          </w:tcPr>
-          <w:p>
-            <w:r/>
-            <w:r>
-              <w:rPr>
-                <w:sz w:val="22"/>
-              </w:rPr>
+              <w:t>35 000,00</w:t>
             </w:r>
           </w:p>
         </w:tc>
@@ -3227,7 +3857,21 @@
         </w:tc>
         <w:tc>
           <w:tcPr>
-            <w:tcW w:type="dxa" w:w="1984"/>
+            <w:tcW w:type="dxa" w:w="2835"/>
+          </w:tcPr>
+          <w:p>
+            <w:r/>
+            <w:r>
+              <w:rPr>
+                <w:sz w:val="22"/>
+              </w:rPr>
+              <w:t>№ 2: Комендантский пр-т, д. 17, корп. 1</w:t>
+            </w:r>
+          </w:p>
+        </w:tc>
+        <w:tc>
+          <w:tcPr>
+            <w:tcW w:type="dxa" w:w="3969"/>
           </w:tcPr>
           <w:p>
             <w:r/>
@@ -3240,7 +3884,7 @@
         </w:tc>
         <w:tc>
           <w:tcPr>
-            <w:tcW w:type="dxa" w:w="4252"/>
+            <w:tcW w:type="dxa" w:w="1701"/>
           </w:tcPr>
           <w:p>
             <w:r/>
@@ -3248,32 +3892,7 @@
               <w:rPr>
                 <w:sz w:val="22"/>
               </w:rPr>
-            </w:r>
-          </w:p>
-        </w:tc>
-        <w:tc>
-          <w:tcPr>
-            <w:tcW w:type="dxa" w:w="1134"/>
-          </w:tcPr>
-          <w:p>
-            <w:r/>
-            <w:r>
-              <w:rPr>
-                <w:sz w:val="22"/>
-              </w:rPr>
-            </w:r>
-          </w:p>
-        </w:tc>
-        <w:tc>
-          <w:tcPr>
-            <w:tcW w:type="dxa" w:w="1134"/>
-          </w:tcPr>
-          <w:p>
-            <w:r/>
-            <w:r>
-              <w:rPr>
-                <w:sz w:val="22"/>
-              </w:rPr>
+              <w:t>25 000,00</w:t>
             </w:r>
           </w:p>
         </w:tc>
@@ -3289,13 +3908,12 @@
               <w:rPr>
                 <w:sz w:val="22"/>
               </w:rPr>
-              <w:t>3</w:t>
             </w:r>
           </w:p>
         </w:tc>
         <w:tc>
           <w:tcPr>
-            <w:tcW w:type="dxa" w:w="1984"/>
+            <w:tcW w:type="dxa" w:w="2835"/>
           </w:tcPr>
           <w:p>
             <w:r/>
@@ -3308,7 +3926,7 @@
         </w:tc>
         <w:tc>
           <w:tcPr>
-            <w:tcW w:type="dxa" w:w="4252"/>
+            <w:tcW w:type="dxa" w:w="3969"/>
           </w:tcPr>
           <w:p>
             <w:r/>
@@ -3316,12 +3934,13 @@
               <w:rPr>
                 <w:sz w:val="22"/>
               </w:rPr>
+              <w:t>ИТОГО по этапу:</w:t>
             </w:r>
           </w:p>
         </w:tc>
         <w:tc>
           <w:tcPr>
-            <w:tcW w:type="dxa" w:w="1134"/>
+            <w:tcW w:type="dxa" w:w="1701"/>
           </w:tcPr>
           <w:p>
             <w:r/>
@@ -3329,19 +3948,7 @@
               <w:rPr>
                 <w:sz w:val="22"/>
               </w:rPr>
-            </w:r>
-          </w:p>
-        </w:tc>
-        <w:tc>
-          <w:tcPr>
-            <w:tcW w:type="dxa" w:w="1134"/>
-          </w:tcPr>
-          <w:p>
-            <w:r/>
-            <w:r>
-              <w:rPr>
-                <w:sz w:val="22"/>
-              </w:rPr>
+              <w:t>60 000,00</w:t>
             </w:r>
           </w:p>
         </w:tc>
@@ -3369,7 +3976,7 @@
         <w:rPr>
           <w:b w:val="0"/>
         </w:rPr>
-        <w:t>Стоимость выполненных работ по этапу: _____________ (______________________________) рублей 00 копеек. НДС не облагается.</w:t>
+        <w:t>Стоимость выполненных работ по этапу: 60 000 (шестьдесят тысяч) рублей 00 копеек. НДС не облагается.</w:t>
       </w:r>
     </w:p>
     <w:p>

</xml_diff>

<commit_message>
Fill in plumbing work list for two beauty salon bathrooms and link it to payment stages
Co-Authored-By: Claude Opus 5.5 <noreply@anthropic.com>
Claude-Session: https://claude.ai/code/session_01HFBjH4MjwsHcLuC72w9pUK
</commit_message>
<xml_diff>
--- a/contracts/Договор_самозанятый_сантехника.docx
+++ b/contracts/Договор_самозанятый_сантехника.docx
@@ -137,7 +137,7 @@
         <w:rPr>
           <w:b w:val="0"/>
         </w:rPr>
-        <w:t>1.2. Работы выполняются на следующих объектах (далее — «Объекты»):</w:t>
+        <w:t>1.2. Работы выполняются в санузлах нежилых помещений салонов красоты, расположенных по адресам (далее — «Объекты»):</w:t>
       </w:r>
     </w:p>
     <w:p>
@@ -338,14 +338,15 @@
         <w:tblStyle w:val="TableGrid"/>
         <w:tblW w:type="auto" w:w="0"/>
         <w:jc w:val="center"/>
+        <w:tblLayout w:type="fixed"/>
         <w:tblLook w:firstColumn="1" w:firstRow="1" w:lastColumn="0" w:lastRow="0" w:noHBand="0" w:noVBand="1" w:val="04A0"/>
       </w:tblPr>
       <w:tblGrid>
-        <w:gridCol w:w="1995"/>
-        <w:gridCol w:w="1995"/>
-        <w:gridCol w:w="1995"/>
-        <w:gridCol w:w="1995"/>
-        <w:gridCol w:w="1995"/>
+        <w:gridCol w:w="737"/>
+        <w:gridCol w:w="2381"/>
+        <w:gridCol w:w="1984"/>
+        <w:gridCol w:w="2154"/>
+        <w:gridCol w:w="1814"/>
       </w:tblGrid>
       <w:tr>
         <w:tc>
@@ -908,7 +909,20 @@
         <w:rPr>
           <w:b w:val="0"/>
         </w:rPr>
-        <w:t>4.1.6. В течение 3 (трёх) рабочих дней письменно уведомить Заказчика об утрате статуса плательщика налога на профессиональный доход (снятии с учёта).</w:t>
+        <w:t>4.1.6. Согласовывать с Заказчиком не позднее чем за 1 (один) рабочий день время работ, требующих отключения воды или сопровождающихся шумом, и выполнять их так, чтобы не препятствовать работе салонов красоты.</w:t>
+      </w:r>
+    </w:p>
+    <w:p>
+      <w:pPr>
+        <w:spacing w:before="0"/>
+        <w:ind w:firstLine="567"/>
+        <w:jc w:val="both"/>
+      </w:pPr>
+      <w:r>
+        <w:rPr>
+          <w:b w:val="0"/>
+        </w:rPr>
+        <w:t>4.1.7. В течение 3 (трёх) рабочих дней письменно уведомить Заказчика об утрате статуса плательщика налога на профессиональный доход (снятии с учёта).</w:t>
       </w:r>
     </w:p>
     <w:p>
@@ -1532,6 +1546,19 @@
     </w:p>
     <w:p>
       <w:pPr>
+        <w:spacing w:before="0"/>
+        <w:ind w:firstLine="567"/>
+        <w:jc w:val="both"/>
+      </w:pPr>
+      <w:r>
+        <w:rPr>
+          <w:b w:val="0"/>
+        </w:rPr>
+        <w:t>Объекты — санузлы в нежилых помещениях салонов красоты. Работы выполняются без остановки деятельности салонов: работы с отключением воды и шумные работы проводятся в нерабочие часы салона либо в согласованное с Заказчиком время.</w:t>
+      </w:r>
+    </w:p>
+    <w:p>
+      <w:pPr>
         <w:spacing w:before="120"/>
         <w:jc w:val="left"/>
       </w:pPr>
@@ -1542,19 +1569,32 @@
         <w:t>Объект № 1: г. Санкт-Петербург, ул. Дыбенко, д. 22, корп. 1</w:t>
       </w:r>
     </w:p>
+    <w:p>
+      <w:pPr>
+        <w:spacing w:before="0"/>
+        <w:jc w:val="left"/>
+      </w:pPr>
+      <w:r>
+        <w:rPr>
+          <w:b w:val="0"/>
+        </w:rPr>
+        <w:t>Замена санузла (полная замена инженерных систем и сантехприборов)</w:t>
+      </w:r>
+    </w:p>
     <w:tbl>
       <w:tblPr>
         <w:tblStyle w:val="TableGrid"/>
         <w:tblW w:type="auto" w:w="0"/>
         <w:jc w:val="center"/>
+        <w:tblLayout w:type="fixed"/>
         <w:tblLook w:firstColumn="1" w:firstRow="1" w:lastColumn="0" w:lastRow="0" w:noHBand="0" w:noVBand="1" w:val="04A0"/>
       </w:tblPr>
       <w:tblGrid>
-        <w:gridCol w:w="1995"/>
-        <w:gridCol w:w="1995"/>
-        <w:gridCol w:w="1995"/>
-        <w:gridCol w:w="1995"/>
-        <w:gridCol w:w="1995"/>
+        <w:gridCol w:w="567"/>
+        <w:gridCol w:w="5669"/>
+        <w:gridCol w:w="1020"/>
+        <w:gridCol w:w="964"/>
+        <w:gridCol w:w="850"/>
       </w:tblGrid>
       <w:tr>
         <w:tc>
@@ -1577,7 +1617,7 @@
         </w:tc>
         <w:tc>
           <w:tcPr>
-            <w:tcW w:type="dxa" w:w="4535"/>
+            <w:tcW w:type="dxa" w:w="5669"/>
           </w:tcPr>
           <w:p>
             <w:pPr>
@@ -1595,7 +1635,7 @@
         </w:tc>
         <w:tc>
           <w:tcPr>
-            <w:tcW w:type="dxa" w:w="1134"/>
+            <w:tcW w:type="dxa" w:w="1020"/>
           </w:tcPr>
           <w:p>
             <w:pPr>
@@ -1613,7 +1653,7 @@
         </w:tc>
         <w:tc>
           <w:tcPr>
-            <w:tcW w:type="dxa" w:w="1134"/>
+            <w:tcW w:type="dxa" w:w="964"/>
           </w:tcPr>
           <w:p>
             <w:pPr>
@@ -1631,7 +1671,7 @@
         </w:tc>
         <w:tc>
           <w:tcPr>
-            <w:tcW w:type="dxa" w:w="1984"/>
+            <w:tcW w:type="dxa" w:w="850"/>
           </w:tcPr>
           <w:p>
             <w:pPr>
@@ -1643,7 +1683,7 @@
                 <w:b/>
                 <w:sz w:val="22"/>
               </w:rPr>
-              <w:t>Примечание</w:t>
+              <w:t>Этап</w:t>
             </w:r>
           </w:p>
         </w:tc>
@@ -1665,7 +1705,7 @@
         </w:tc>
         <w:tc>
           <w:tcPr>
-            <w:tcW w:type="dxa" w:w="4535"/>
+            <w:tcW w:type="dxa" w:w="5669"/>
           </w:tcPr>
           <w:p>
             <w:r/>
@@ -1673,12 +1713,13 @@
               <w:rPr>
                 <w:sz w:val="22"/>
               </w:rPr>
-            </w:r>
-          </w:p>
-        </w:tc>
-        <w:tc>
-          <w:tcPr>
-            <w:tcW w:type="dxa" w:w="1134"/>
+              <w:t>Обследование санузла, замеры, согласование с Заказчиком схемы разводки и расстановки приборов</w:t>
+            </w:r>
+          </w:p>
+        </w:tc>
+        <w:tc>
+          <w:tcPr>
+            <w:tcW w:type="dxa" w:w="1020"/>
           </w:tcPr>
           <w:p>
             <w:r/>
@@ -1686,12 +1727,13 @@
               <w:rPr>
                 <w:sz w:val="22"/>
               </w:rPr>
-            </w:r>
-          </w:p>
-        </w:tc>
-        <w:tc>
-          <w:tcPr>
-            <w:tcW w:type="dxa" w:w="1134"/>
+              <w:t>компл.</w:t>
+            </w:r>
+          </w:p>
+        </w:tc>
+        <w:tc>
+          <w:tcPr>
+            <w:tcW w:type="dxa" w:w="964"/>
           </w:tcPr>
           <w:p>
             <w:r/>
@@ -1699,12 +1741,13 @@
               <w:rPr>
                 <w:sz w:val="22"/>
               </w:rPr>
-            </w:r>
-          </w:p>
-        </w:tc>
-        <w:tc>
-          <w:tcPr>
-            <w:tcW w:type="dxa" w:w="1984"/>
+              <w:t>1</w:t>
+            </w:r>
+          </w:p>
+        </w:tc>
+        <w:tc>
+          <w:tcPr>
+            <w:tcW w:type="dxa" w:w="850"/>
           </w:tcPr>
           <w:p>
             <w:r/>
@@ -1712,6 +1755,7 @@
               <w:rPr>
                 <w:sz w:val="22"/>
               </w:rPr>
+              <w:t>1</w:t>
             </w:r>
           </w:p>
         </w:tc>
@@ -1733,7 +1777,7 @@
         </w:tc>
         <w:tc>
           <w:tcPr>
-            <w:tcW w:type="dxa" w:w="4535"/>
+            <w:tcW w:type="dxa" w:w="5669"/>
           </w:tcPr>
           <w:p>
             <w:r/>
@@ -1741,12 +1785,13 @@
               <w:rPr>
                 <w:sz w:val="22"/>
               </w:rPr>
-            </w:r>
-          </w:p>
-        </w:tc>
-        <w:tc>
-          <w:tcPr>
-            <w:tcW w:type="dxa" w:w="1134"/>
+              <w:t>Перекрытие подачи воды, в т. ч. по согласованию с управляющей компанией</w:t>
+            </w:r>
+          </w:p>
+        </w:tc>
+        <w:tc>
+          <w:tcPr>
+            <w:tcW w:type="dxa" w:w="1020"/>
           </w:tcPr>
           <w:p>
             <w:r/>
@@ -1754,12 +1799,13 @@
               <w:rPr>
                 <w:sz w:val="22"/>
               </w:rPr>
-            </w:r>
-          </w:p>
-        </w:tc>
-        <w:tc>
-          <w:tcPr>
-            <w:tcW w:type="dxa" w:w="1134"/>
+              <w:t>компл.</w:t>
+            </w:r>
+          </w:p>
+        </w:tc>
+        <w:tc>
+          <w:tcPr>
+            <w:tcW w:type="dxa" w:w="964"/>
           </w:tcPr>
           <w:p>
             <w:r/>
@@ -1767,12 +1813,13 @@
               <w:rPr>
                 <w:sz w:val="22"/>
               </w:rPr>
-            </w:r>
-          </w:p>
-        </w:tc>
-        <w:tc>
-          <w:tcPr>
-            <w:tcW w:type="dxa" w:w="1984"/>
+              <w:t>1</w:t>
+            </w:r>
+          </w:p>
+        </w:tc>
+        <w:tc>
+          <w:tcPr>
+            <w:tcW w:type="dxa" w:w="850"/>
           </w:tcPr>
           <w:p>
             <w:r/>
@@ -1780,6 +1827,7 @@
               <w:rPr>
                 <w:sz w:val="22"/>
               </w:rPr>
+              <w:t>1</w:t>
             </w:r>
           </w:p>
         </w:tc>
@@ -1801,7 +1849,7 @@
         </w:tc>
         <w:tc>
           <w:tcPr>
-            <w:tcW w:type="dxa" w:w="4535"/>
+            <w:tcW w:type="dxa" w:w="5669"/>
           </w:tcPr>
           <w:p>
             <w:r/>
@@ -1809,12 +1857,13 @@
               <w:rPr>
                 <w:sz w:val="22"/>
               </w:rPr>
-            </w:r>
-          </w:p>
-        </w:tc>
-        <w:tc>
-          <w:tcPr>
-            <w:tcW w:type="dxa" w:w="1134"/>
+              <w:t>Демонтаж унитаза</w:t>
+            </w:r>
+          </w:p>
+        </w:tc>
+        <w:tc>
+          <w:tcPr>
+            <w:tcW w:type="dxa" w:w="1020"/>
           </w:tcPr>
           <w:p>
             <w:r/>
@@ -1822,12 +1871,13 @@
               <w:rPr>
                 <w:sz w:val="22"/>
               </w:rPr>
-            </w:r>
-          </w:p>
-        </w:tc>
-        <w:tc>
-          <w:tcPr>
-            <w:tcW w:type="dxa" w:w="1134"/>
+              <w:t>шт.</w:t>
+            </w:r>
+          </w:p>
+        </w:tc>
+        <w:tc>
+          <w:tcPr>
+            <w:tcW w:type="dxa" w:w="964"/>
           </w:tcPr>
           <w:p>
             <w:r/>
@@ -1835,12 +1885,13 @@
               <w:rPr>
                 <w:sz w:val="22"/>
               </w:rPr>
-            </w:r>
-          </w:p>
-        </w:tc>
-        <w:tc>
-          <w:tcPr>
-            <w:tcW w:type="dxa" w:w="1984"/>
+              <w:t>1</w:t>
+            </w:r>
+          </w:p>
+        </w:tc>
+        <w:tc>
+          <w:tcPr>
+            <w:tcW w:type="dxa" w:w="850"/>
           </w:tcPr>
           <w:p>
             <w:r/>
@@ -1848,6 +1899,7 @@
               <w:rPr>
                 <w:sz w:val="22"/>
               </w:rPr>
+              <w:t>1</w:t>
             </w:r>
           </w:p>
         </w:tc>
@@ -1869,7 +1921,7 @@
         </w:tc>
         <w:tc>
           <w:tcPr>
-            <w:tcW w:type="dxa" w:w="4535"/>
+            <w:tcW w:type="dxa" w:w="5669"/>
           </w:tcPr>
           <w:p>
             <w:r/>
@@ -1877,12 +1929,13 @@
               <w:rPr>
                 <w:sz w:val="22"/>
               </w:rPr>
-            </w:r>
-          </w:p>
-        </w:tc>
-        <w:tc>
-          <w:tcPr>
-            <w:tcW w:type="dxa" w:w="1134"/>
+              <w:t>Демонтаж раковины со смесителем и сифоном</w:t>
+            </w:r>
+          </w:p>
+        </w:tc>
+        <w:tc>
+          <w:tcPr>
+            <w:tcW w:type="dxa" w:w="1020"/>
           </w:tcPr>
           <w:p>
             <w:r/>
@@ -1890,12 +1943,13 @@
               <w:rPr>
                 <w:sz w:val="22"/>
               </w:rPr>
-            </w:r>
-          </w:p>
-        </w:tc>
-        <w:tc>
-          <w:tcPr>
-            <w:tcW w:type="dxa" w:w="1134"/>
+              <w:t>шт.</w:t>
+            </w:r>
+          </w:p>
+        </w:tc>
+        <w:tc>
+          <w:tcPr>
+            <w:tcW w:type="dxa" w:w="964"/>
           </w:tcPr>
           <w:p>
             <w:r/>
@@ -1903,12 +1957,13 @@
               <w:rPr>
                 <w:sz w:val="22"/>
               </w:rPr>
-            </w:r>
-          </w:p>
-        </w:tc>
-        <w:tc>
-          <w:tcPr>
-            <w:tcW w:type="dxa" w:w="1984"/>
+              <w:t>1</w:t>
+            </w:r>
+          </w:p>
+        </w:tc>
+        <w:tc>
+          <w:tcPr>
+            <w:tcW w:type="dxa" w:w="850"/>
           </w:tcPr>
           <w:p>
             <w:r/>
@@ -1916,6 +1971,7 @@
               <w:rPr>
                 <w:sz w:val="22"/>
               </w:rPr>
+              <w:t>1</w:t>
             </w:r>
           </w:p>
         </w:tc>
@@ -1937,7 +1993,7 @@
         </w:tc>
         <w:tc>
           <w:tcPr>
-            <w:tcW w:type="dxa" w:w="4535"/>
+            <w:tcW w:type="dxa" w:w="5669"/>
           </w:tcPr>
           <w:p>
             <w:r/>
@@ -1945,12 +2001,13 @@
               <w:rPr>
                 <w:sz w:val="22"/>
               </w:rPr>
-            </w:r>
-          </w:p>
-        </w:tc>
-        <w:tc>
-          <w:tcPr>
-            <w:tcW w:type="dxa" w:w="1134"/>
+              <w:t>Демонтаж старого водонагревателя / полотенцесушителя (при наличии)</w:t>
+            </w:r>
+          </w:p>
+        </w:tc>
+        <w:tc>
+          <w:tcPr>
+            <w:tcW w:type="dxa" w:w="1020"/>
           </w:tcPr>
           <w:p>
             <w:r/>
@@ -1958,12 +2015,13 @@
               <w:rPr>
                 <w:sz w:val="22"/>
               </w:rPr>
-            </w:r>
-          </w:p>
-        </w:tc>
-        <w:tc>
-          <w:tcPr>
-            <w:tcW w:type="dxa" w:w="1134"/>
+              <w:t>шт.</w:t>
+            </w:r>
+          </w:p>
+        </w:tc>
+        <w:tc>
+          <w:tcPr>
+            <w:tcW w:type="dxa" w:w="964"/>
           </w:tcPr>
           <w:p>
             <w:r/>
@@ -1971,12 +2029,13 @@
               <w:rPr>
                 <w:sz w:val="22"/>
               </w:rPr>
-            </w:r>
-          </w:p>
-        </w:tc>
-        <w:tc>
-          <w:tcPr>
-            <w:tcW w:type="dxa" w:w="1984"/>
+              <w:t>1</w:t>
+            </w:r>
+          </w:p>
+        </w:tc>
+        <w:tc>
+          <w:tcPr>
+            <w:tcW w:type="dxa" w:w="850"/>
           </w:tcPr>
           <w:p>
             <w:r/>
@@ -1984,6 +2043,1231 @@
               <w:rPr>
                 <w:sz w:val="22"/>
               </w:rPr>
+              <w:t>1</w:t>
+            </w:r>
+          </w:p>
+        </w:tc>
+      </w:tr>
+      <w:tr>
+        <w:tc>
+          <w:tcPr>
+            <w:tcW w:type="dxa" w:w="567"/>
+          </w:tcPr>
+          <w:p>
+            <w:r/>
+            <w:r>
+              <w:rPr>
+                <w:sz w:val="22"/>
+              </w:rPr>
+              <w:t>6</w:t>
+            </w:r>
+          </w:p>
+        </w:tc>
+        <w:tc>
+          <w:tcPr>
+            <w:tcW w:type="dxa" w:w="5669"/>
+          </w:tcPr>
+          <w:p>
+            <w:r/>
+            <w:r>
+              <w:rPr>
+                <w:sz w:val="22"/>
+              </w:rPr>
+              <w:t>Демонтаж старых трубопроводов холодного и горячего водоснабжения (ХВС, ГВС)</w:t>
+            </w:r>
+          </w:p>
+        </w:tc>
+        <w:tc>
+          <w:tcPr>
+            <w:tcW w:type="dxa" w:w="1020"/>
+          </w:tcPr>
+          <w:p>
+            <w:r/>
+            <w:r>
+              <w:rPr>
+                <w:sz w:val="22"/>
+              </w:rPr>
+              <w:t>м.п.</w:t>
+            </w:r>
+          </w:p>
+        </w:tc>
+        <w:tc>
+          <w:tcPr>
+            <w:tcW w:type="dxa" w:w="964"/>
+          </w:tcPr>
+          <w:p>
+            <w:r/>
+            <w:r>
+              <w:rPr>
+                <w:sz w:val="22"/>
+              </w:rPr>
+              <w:t>15</w:t>
+            </w:r>
+          </w:p>
+        </w:tc>
+        <w:tc>
+          <w:tcPr>
+            <w:tcW w:type="dxa" w:w="850"/>
+          </w:tcPr>
+          <w:p>
+            <w:r/>
+            <w:r>
+              <w:rPr>
+                <w:sz w:val="22"/>
+              </w:rPr>
+              <w:t>1</w:t>
+            </w:r>
+          </w:p>
+        </w:tc>
+      </w:tr>
+      <w:tr>
+        <w:tc>
+          <w:tcPr>
+            <w:tcW w:type="dxa" w:w="567"/>
+          </w:tcPr>
+          <w:p>
+            <w:r/>
+            <w:r>
+              <w:rPr>
+                <w:sz w:val="22"/>
+              </w:rPr>
+              <w:t>7</w:t>
+            </w:r>
+          </w:p>
+        </w:tc>
+        <w:tc>
+          <w:tcPr>
+            <w:tcW w:type="dxa" w:w="5669"/>
+          </w:tcPr>
+          <w:p>
+            <w:r/>
+            <w:r>
+              <w:rPr>
+                <w:sz w:val="22"/>
+              </w:rPr>
+              <w:t>Демонтаж старых канализационных трубопроводов</w:t>
+            </w:r>
+          </w:p>
+        </w:tc>
+        <w:tc>
+          <w:tcPr>
+            <w:tcW w:type="dxa" w:w="1020"/>
+          </w:tcPr>
+          <w:p>
+            <w:r/>
+            <w:r>
+              <w:rPr>
+                <w:sz w:val="22"/>
+              </w:rPr>
+              <w:t>м.п.</w:t>
+            </w:r>
+          </w:p>
+        </w:tc>
+        <w:tc>
+          <w:tcPr>
+            <w:tcW w:type="dxa" w:w="964"/>
+          </w:tcPr>
+          <w:p>
+            <w:r/>
+            <w:r>
+              <w:rPr>
+                <w:sz w:val="22"/>
+              </w:rPr>
+              <w:t>8</w:t>
+            </w:r>
+          </w:p>
+        </w:tc>
+        <w:tc>
+          <w:tcPr>
+            <w:tcW w:type="dxa" w:w="850"/>
+          </w:tcPr>
+          <w:p>
+            <w:r/>
+            <w:r>
+              <w:rPr>
+                <w:sz w:val="22"/>
+              </w:rPr>
+              <w:t>1</w:t>
+            </w:r>
+          </w:p>
+        </w:tc>
+      </w:tr>
+      <w:tr>
+        <w:tc>
+          <w:tcPr>
+            <w:tcW w:type="dxa" w:w="567"/>
+          </w:tcPr>
+          <w:p>
+            <w:r/>
+            <w:r>
+              <w:rPr>
+                <w:sz w:val="22"/>
+              </w:rPr>
+              <w:t>8</w:t>
+            </w:r>
+          </w:p>
+        </w:tc>
+        <w:tc>
+          <w:tcPr>
+            <w:tcW w:type="dxa" w:w="5669"/>
+          </w:tcPr>
+          <w:p>
+            <w:r/>
+            <w:r>
+              <w:rPr>
+                <w:sz w:val="22"/>
+              </w:rPr>
+              <w:t>Вынос и вывоз демонтированных изделий и строительного мусора</w:t>
+            </w:r>
+          </w:p>
+        </w:tc>
+        <w:tc>
+          <w:tcPr>
+            <w:tcW w:type="dxa" w:w="1020"/>
+          </w:tcPr>
+          <w:p>
+            <w:r/>
+            <w:r>
+              <w:rPr>
+                <w:sz w:val="22"/>
+              </w:rPr>
+              <w:t>компл.</w:t>
+            </w:r>
+          </w:p>
+        </w:tc>
+        <w:tc>
+          <w:tcPr>
+            <w:tcW w:type="dxa" w:w="964"/>
+          </w:tcPr>
+          <w:p>
+            <w:r/>
+            <w:r>
+              <w:rPr>
+                <w:sz w:val="22"/>
+              </w:rPr>
+              <w:t>1</w:t>
+            </w:r>
+          </w:p>
+        </w:tc>
+        <w:tc>
+          <w:tcPr>
+            <w:tcW w:type="dxa" w:w="850"/>
+          </w:tcPr>
+          <w:p>
+            <w:r/>
+            <w:r>
+              <w:rPr>
+                <w:sz w:val="22"/>
+              </w:rPr>
+              <w:t>1</w:t>
+            </w:r>
+          </w:p>
+        </w:tc>
+      </w:tr>
+      <w:tr>
+        <w:tc>
+          <w:tcPr>
+            <w:tcW w:type="dxa" w:w="567"/>
+          </w:tcPr>
+          <w:p>
+            <w:r/>
+            <w:r>
+              <w:rPr>
+                <w:sz w:val="22"/>
+              </w:rPr>
+              <w:t>9</w:t>
+            </w:r>
+          </w:p>
+        </w:tc>
+        <w:tc>
+          <w:tcPr>
+            <w:tcW w:type="dxa" w:w="5669"/>
+          </w:tcPr>
+          <w:p>
+            <w:r/>
+            <w:r>
+              <w:rPr>
+                <w:sz w:val="22"/>
+              </w:rPr>
+              <w:t>Замена отсечных шаровых кранов на отводах от стояков ХВС и ГВС</w:t>
+            </w:r>
+          </w:p>
+        </w:tc>
+        <w:tc>
+          <w:tcPr>
+            <w:tcW w:type="dxa" w:w="1020"/>
+          </w:tcPr>
+          <w:p>
+            <w:r/>
+            <w:r>
+              <w:rPr>
+                <w:sz w:val="22"/>
+              </w:rPr>
+              <w:t>шт.</w:t>
+            </w:r>
+          </w:p>
+        </w:tc>
+        <w:tc>
+          <w:tcPr>
+            <w:tcW w:type="dxa" w:w="964"/>
+          </w:tcPr>
+          <w:p>
+            <w:r/>
+            <w:r>
+              <w:rPr>
+                <w:sz w:val="22"/>
+              </w:rPr>
+              <w:t>2</w:t>
+            </w:r>
+          </w:p>
+        </w:tc>
+        <w:tc>
+          <w:tcPr>
+            <w:tcW w:type="dxa" w:w="850"/>
+          </w:tcPr>
+          <w:p>
+            <w:r/>
+            <w:r>
+              <w:rPr>
+                <w:sz w:val="22"/>
+              </w:rPr>
+              <w:t>2</w:t>
+            </w:r>
+          </w:p>
+        </w:tc>
+      </w:tr>
+      <w:tr>
+        <w:tc>
+          <w:tcPr>
+            <w:tcW w:type="dxa" w:w="567"/>
+          </w:tcPr>
+          <w:p>
+            <w:r/>
+            <w:r>
+              <w:rPr>
+                <w:sz w:val="22"/>
+              </w:rPr>
+              <w:t>10</w:t>
+            </w:r>
+          </w:p>
+        </w:tc>
+        <w:tc>
+          <w:tcPr>
+            <w:tcW w:type="dxa" w:w="5669"/>
+          </w:tcPr>
+          <w:p>
+            <w:r/>
+            <w:r>
+              <w:rPr>
+                <w:sz w:val="22"/>
+              </w:rPr>
+              <w:t>Установка фильтров грубой очистки и регуляторов давления</w:t>
+            </w:r>
+          </w:p>
+        </w:tc>
+        <w:tc>
+          <w:tcPr>
+            <w:tcW w:type="dxa" w:w="1020"/>
+          </w:tcPr>
+          <w:p>
+            <w:r/>
+            <w:r>
+              <w:rPr>
+                <w:sz w:val="22"/>
+              </w:rPr>
+              <w:t>шт.</w:t>
+            </w:r>
+          </w:p>
+        </w:tc>
+        <w:tc>
+          <w:tcPr>
+            <w:tcW w:type="dxa" w:w="964"/>
+          </w:tcPr>
+          <w:p>
+            <w:r/>
+            <w:r>
+              <w:rPr>
+                <w:sz w:val="22"/>
+              </w:rPr>
+              <w:t>2</w:t>
+            </w:r>
+          </w:p>
+        </w:tc>
+        <w:tc>
+          <w:tcPr>
+            <w:tcW w:type="dxa" w:w="850"/>
+          </w:tcPr>
+          <w:p>
+            <w:r/>
+            <w:r>
+              <w:rPr>
+                <w:sz w:val="22"/>
+              </w:rPr>
+              <w:t>2</w:t>
+            </w:r>
+          </w:p>
+        </w:tc>
+      </w:tr>
+      <w:tr>
+        <w:tc>
+          <w:tcPr>
+            <w:tcW w:type="dxa" w:w="567"/>
+          </w:tcPr>
+          <w:p>
+            <w:r/>
+            <w:r>
+              <w:rPr>
+                <w:sz w:val="22"/>
+              </w:rPr>
+              <w:t>11</w:t>
+            </w:r>
+          </w:p>
+        </w:tc>
+        <w:tc>
+          <w:tcPr>
+            <w:tcW w:type="dxa" w:w="5669"/>
+          </w:tcPr>
+          <w:p>
+            <w:r/>
+            <w:r>
+              <w:rPr>
+                <w:sz w:val="22"/>
+              </w:rPr>
+              <w:t>Установка (перенос) счётчиков воды ХВС и ГВС с подготовкой к опломбировке</w:t>
+            </w:r>
+          </w:p>
+        </w:tc>
+        <w:tc>
+          <w:tcPr>
+            <w:tcW w:type="dxa" w:w="1020"/>
+          </w:tcPr>
+          <w:p>
+            <w:r/>
+            <w:r>
+              <w:rPr>
+                <w:sz w:val="22"/>
+              </w:rPr>
+              <w:t>шт.</w:t>
+            </w:r>
+          </w:p>
+        </w:tc>
+        <w:tc>
+          <w:tcPr>
+            <w:tcW w:type="dxa" w:w="964"/>
+          </w:tcPr>
+          <w:p>
+            <w:r/>
+            <w:r>
+              <w:rPr>
+                <w:sz w:val="22"/>
+              </w:rPr>
+              <w:t>2</w:t>
+            </w:r>
+          </w:p>
+        </w:tc>
+        <w:tc>
+          <w:tcPr>
+            <w:tcW w:type="dxa" w:w="850"/>
+          </w:tcPr>
+          <w:p>
+            <w:r/>
+            <w:r>
+              <w:rPr>
+                <w:sz w:val="22"/>
+              </w:rPr>
+              <w:t>2</w:t>
+            </w:r>
+          </w:p>
+        </w:tc>
+      </w:tr>
+      <w:tr>
+        <w:tc>
+          <w:tcPr>
+            <w:tcW w:type="dxa" w:w="567"/>
+          </w:tcPr>
+          <w:p>
+            <w:r/>
+            <w:r>
+              <w:rPr>
+                <w:sz w:val="22"/>
+              </w:rPr>
+              <w:t>12</w:t>
+            </w:r>
+          </w:p>
+        </w:tc>
+        <w:tc>
+          <w:tcPr>
+            <w:tcW w:type="dxa" w:w="5669"/>
+          </w:tcPr>
+          <w:p>
+            <w:r/>
+            <w:r>
+              <w:rPr>
+                <w:sz w:val="22"/>
+              </w:rPr>
+              <w:t>Монтаж новой разводки трубопроводов ХВС и ГВС (полипропилен PP-R) с креплением</w:t>
+            </w:r>
+          </w:p>
+        </w:tc>
+        <w:tc>
+          <w:tcPr>
+            <w:tcW w:type="dxa" w:w="1020"/>
+          </w:tcPr>
+          <w:p>
+            <w:r/>
+            <w:r>
+              <w:rPr>
+                <w:sz w:val="22"/>
+              </w:rPr>
+              <w:t>м.п.</w:t>
+            </w:r>
+          </w:p>
+        </w:tc>
+        <w:tc>
+          <w:tcPr>
+            <w:tcW w:type="dxa" w:w="964"/>
+          </w:tcPr>
+          <w:p>
+            <w:r/>
+            <w:r>
+              <w:rPr>
+                <w:sz w:val="22"/>
+              </w:rPr>
+              <w:t>15</w:t>
+            </w:r>
+          </w:p>
+        </w:tc>
+        <w:tc>
+          <w:tcPr>
+            <w:tcW w:type="dxa" w:w="850"/>
+          </w:tcPr>
+          <w:p>
+            <w:r/>
+            <w:r>
+              <w:rPr>
+                <w:sz w:val="22"/>
+              </w:rPr>
+              <w:t>2</w:t>
+            </w:r>
+          </w:p>
+        </w:tc>
+      </w:tr>
+      <w:tr>
+        <w:tc>
+          <w:tcPr>
+            <w:tcW w:type="dxa" w:w="567"/>
+          </w:tcPr>
+          <w:p>
+            <w:r/>
+            <w:r>
+              <w:rPr>
+                <w:sz w:val="22"/>
+              </w:rPr>
+              <w:t>13</w:t>
+            </w:r>
+          </w:p>
+        </w:tc>
+        <w:tc>
+          <w:tcPr>
+            <w:tcW w:type="dxa" w:w="5669"/>
+          </w:tcPr>
+          <w:p>
+            <w:r/>
+            <w:r>
+              <w:rPr>
+                <w:sz w:val="22"/>
+              </w:rPr>
+              <w:t>Монтаж внутренней канализации (ПП Ø 50/110 мм) с соблюдением уклонов, установка ревизии</w:t>
+            </w:r>
+          </w:p>
+        </w:tc>
+        <w:tc>
+          <w:tcPr>
+            <w:tcW w:type="dxa" w:w="1020"/>
+          </w:tcPr>
+          <w:p>
+            <w:r/>
+            <w:r>
+              <w:rPr>
+                <w:sz w:val="22"/>
+              </w:rPr>
+              <w:t>м.п.</w:t>
+            </w:r>
+          </w:p>
+        </w:tc>
+        <w:tc>
+          <w:tcPr>
+            <w:tcW w:type="dxa" w:w="964"/>
+          </w:tcPr>
+          <w:p>
+            <w:r/>
+            <w:r>
+              <w:rPr>
+                <w:sz w:val="22"/>
+              </w:rPr>
+              <w:t>8</w:t>
+            </w:r>
+          </w:p>
+        </w:tc>
+        <w:tc>
+          <w:tcPr>
+            <w:tcW w:type="dxa" w:w="850"/>
+          </w:tcPr>
+          <w:p>
+            <w:r/>
+            <w:r>
+              <w:rPr>
+                <w:sz w:val="22"/>
+              </w:rPr>
+              <w:t>2</w:t>
+            </w:r>
+          </w:p>
+        </w:tc>
+      </w:tr>
+      <w:tr>
+        <w:tc>
+          <w:tcPr>
+            <w:tcW w:type="dxa" w:w="567"/>
+          </w:tcPr>
+          <w:p>
+            <w:r/>
+            <w:r>
+              <w:rPr>
+                <w:sz w:val="22"/>
+              </w:rPr>
+              <w:t>14</w:t>
+            </w:r>
+          </w:p>
+        </w:tc>
+        <w:tc>
+          <w:tcPr>
+            <w:tcW w:type="dxa" w:w="5669"/>
+          </w:tcPr>
+          <w:p>
+            <w:r/>
+            <w:r>
+              <w:rPr>
+                <w:sz w:val="22"/>
+              </w:rPr>
+              <w:t>Монтаж инсталляции для подвесного унитаза</w:t>
+            </w:r>
+          </w:p>
+        </w:tc>
+        <w:tc>
+          <w:tcPr>
+            <w:tcW w:type="dxa" w:w="1020"/>
+          </w:tcPr>
+          <w:p>
+            <w:r/>
+            <w:r>
+              <w:rPr>
+                <w:sz w:val="22"/>
+              </w:rPr>
+              <w:t>шт.</w:t>
+            </w:r>
+          </w:p>
+        </w:tc>
+        <w:tc>
+          <w:tcPr>
+            <w:tcW w:type="dxa" w:w="964"/>
+          </w:tcPr>
+          <w:p>
+            <w:r/>
+            <w:r>
+              <w:rPr>
+                <w:sz w:val="22"/>
+              </w:rPr>
+              <w:t>1</w:t>
+            </w:r>
+          </w:p>
+        </w:tc>
+        <w:tc>
+          <w:tcPr>
+            <w:tcW w:type="dxa" w:w="850"/>
+          </w:tcPr>
+          <w:p>
+            <w:r/>
+            <w:r>
+              <w:rPr>
+                <w:sz w:val="22"/>
+              </w:rPr>
+              <w:t>2</w:t>
+            </w:r>
+          </w:p>
+        </w:tc>
+      </w:tr>
+      <w:tr>
+        <w:tc>
+          <w:tcPr>
+            <w:tcW w:type="dxa" w:w="567"/>
+          </w:tcPr>
+          <w:p>
+            <w:r/>
+            <w:r>
+              <w:rPr>
+                <w:sz w:val="22"/>
+              </w:rPr>
+              <w:t>15</w:t>
+            </w:r>
+          </w:p>
+        </w:tc>
+        <w:tc>
+          <w:tcPr>
+            <w:tcW w:type="dxa" w:w="5669"/>
+          </w:tcPr>
+          <w:p>
+            <w:r/>
+            <w:r>
+              <w:rPr>
+                <w:sz w:val="22"/>
+              </w:rPr>
+              <w:t>Гидравлическое испытание (опрессовка) трубопроводов, предъявление скрытых работ Заказчику</w:t>
+            </w:r>
+          </w:p>
+        </w:tc>
+        <w:tc>
+          <w:tcPr>
+            <w:tcW w:type="dxa" w:w="1020"/>
+          </w:tcPr>
+          <w:p>
+            <w:r/>
+            <w:r>
+              <w:rPr>
+                <w:sz w:val="22"/>
+              </w:rPr>
+              <w:t>компл.</w:t>
+            </w:r>
+          </w:p>
+        </w:tc>
+        <w:tc>
+          <w:tcPr>
+            <w:tcW w:type="dxa" w:w="964"/>
+          </w:tcPr>
+          <w:p>
+            <w:r/>
+            <w:r>
+              <w:rPr>
+                <w:sz w:val="22"/>
+              </w:rPr>
+              <w:t>1</w:t>
+            </w:r>
+          </w:p>
+        </w:tc>
+        <w:tc>
+          <w:tcPr>
+            <w:tcW w:type="dxa" w:w="850"/>
+          </w:tcPr>
+          <w:p>
+            <w:r/>
+            <w:r>
+              <w:rPr>
+                <w:sz w:val="22"/>
+              </w:rPr>
+              <w:t>2</w:t>
+            </w:r>
+          </w:p>
+        </w:tc>
+      </w:tr>
+      <w:tr>
+        <w:tc>
+          <w:tcPr>
+            <w:tcW w:type="dxa" w:w="567"/>
+          </w:tcPr>
+          <w:p>
+            <w:r/>
+            <w:r>
+              <w:rPr>
+                <w:sz w:val="22"/>
+              </w:rPr>
+              <w:t>16</w:t>
+            </w:r>
+          </w:p>
+        </w:tc>
+        <w:tc>
+          <w:tcPr>
+            <w:tcW w:type="dxa" w:w="5669"/>
+          </w:tcPr>
+          <w:p>
+            <w:r/>
+            <w:r>
+              <w:rPr>
+                <w:sz w:val="22"/>
+              </w:rPr>
+              <w:t>Установка подвесного унитаза с клавишей смыва</w:t>
+            </w:r>
+          </w:p>
+        </w:tc>
+        <w:tc>
+          <w:tcPr>
+            <w:tcW w:type="dxa" w:w="1020"/>
+          </w:tcPr>
+          <w:p>
+            <w:r/>
+            <w:r>
+              <w:rPr>
+                <w:sz w:val="22"/>
+              </w:rPr>
+              <w:t>шт.</w:t>
+            </w:r>
+          </w:p>
+        </w:tc>
+        <w:tc>
+          <w:tcPr>
+            <w:tcW w:type="dxa" w:w="964"/>
+          </w:tcPr>
+          <w:p>
+            <w:r/>
+            <w:r>
+              <w:rPr>
+                <w:sz w:val="22"/>
+              </w:rPr>
+              <w:t>1</w:t>
+            </w:r>
+          </w:p>
+        </w:tc>
+        <w:tc>
+          <w:tcPr>
+            <w:tcW w:type="dxa" w:w="850"/>
+          </w:tcPr>
+          <w:p>
+            <w:r/>
+            <w:r>
+              <w:rPr>
+                <w:sz w:val="22"/>
+              </w:rPr>
+              <w:t>3</w:t>
+            </w:r>
+          </w:p>
+        </w:tc>
+      </w:tr>
+      <w:tr>
+        <w:tc>
+          <w:tcPr>
+            <w:tcW w:type="dxa" w:w="567"/>
+          </w:tcPr>
+          <w:p>
+            <w:r/>
+            <w:r>
+              <w:rPr>
+                <w:sz w:val="22"/>
+              </w:rPr>
+              <w:t>17</w:t>
+            </w:r>
+          </w:p>
+        </w:tc>
+        <w:tc>
+          <w:tcPr>
+            <w:tcW w:type="dxa" w:w="5669"/>
+          </w:tcPr>
+          <w:p>
+            <w:r/>
+            <w:r>
+              <w:rPr>
+                <w:sz w:val="22"/>
+              </w:rPr>
+              <w:t>Установка раковины (на тумбу или консольно) с сифоном</w:t>
+            </w:r>
+          </w:p>
+        </w:tc>
+        <w:tc>
+          <w:tcPr>
+            <w:tcW w:type="dxa" w:w="1020"/>
+          </w:tcPr>
+          <w:p>
+            <w:r/>
+            <w:r>
+              <w:rPr>
+                <w:sz w:val="22"/>
+              </w:rPr>
+              <w:t>шт.</w:t>
+            </w:r>
+          </w:p>
+        </w:tc>
+        <w:tc>
+          <w:tcPr>
+            <w:tcW w:type="dxa" w:w="964"/>
+          </w:tcPr>
+          <w:p>
+            <w:r/>
+            <w:r>
+              <w:rPr>
+                <w:sz w:val="22"/>
+              </w:rPr>
+              <w:t>1</w:t>
+            </w:r>
+          </w:p>
+        </w:tc>
+        <w:tc>
+          <w:tcPr>
+            <w:tcW w:type="dxa" w:w="850"/>
+          </w:tcPr>
+          <w:p>
+            <w:r/>
+            <w:r>
+              <w:rPr>
+                <w:sz w:val="22"/>
+              </w:rPr>
+              <w:t>3</w:t>
+            </w:r>
+          </w:p>
+        </w:tc>
+      </w:tr>
+      <w:tr>
+        <w:tc>
+          <w:tcPr>
+            <w:tcW w:type="dxa" w:w="567"/>
+          </w:tcPr>
+          <w:p>
+            <w:r/>
+            <w:r>
+              <w:rPr>
+                <w:sz w:val="22"/>
+              </w:rPr>
+              <w:t>18</w:t>
+            </w:r>
+          </w:p>
+        </w:tc>
+        <w:tc>
+          <w:tcPr>
+            <w:tcW w:type="dxa" w:w="5669"/>
+          </w:tcPr>
+          <w:p>
+            <w:r/>
+            <w:r>
+              <w:rPr>
+                <w:sz w:val="22"/>
+              </w:rPr>
+              <w:t>Установка смесителя для раковины с гибкой подводкой</w:t>
+            </w:r>
+          </w:p>
+        </w:tc>
+        <w:tc>
+          <w:tcPr>
+            <w:tcW w:type="dxa" w:w="1020"/>
+          </w:tcPr>
+          <w:p>
+            <w:r/>
+            <w:r>
+              <w:rPr>
+                <w:sz w:val="22"/>
+              </w:rPr>
+              <w:t>шт.</w:t>
+            </w:r>
+          </w:p>
+        </w:tc>
+        <w:tc>
+          <w:tcPr>
+            <w:tcW w:type="dxa" w:w="964"/>
+          </w:tcPr>
+          <w:p>
+            <w:r/>
+            <w:r>
+              <w:rPr>
+                <w:sz w:val="22"/>
+              </w:rPr>
+              <w:t>1</w:t>
+            </w:r>
+          </w:p>
+        </w:tc>
+        <w:tc>
+          <w:tcPr>
+            <w:tcW w:type="dxa" w:w="850"/>
+          </w:tcPr>
+          <w:p>
+            <w:r/>
+            <w:r>
+              <w:rPr>
+                <w:sz w:val="22"/>
+              </w:rPr>
+              <w:t>3</w:t>
+            </w:r>
+          </w:p>
+        </w:tc>
+      </w:tr>
+      <w:tr>
+        <w:tc>
+          <w:tcPr>
+            <w:tcW w:type="dxa" w:w="567"/>
+          </w:tcPr>
+          <w:p>
+            <w:r/>
+            <w:r>
+              <w:rPr>
+                <w:sz w:val="22"/>
+              </w:rPr>
+              <w:t>19</w:t>
+            </w:r>
+          </w:p>
+        </w:tc>
+        <w:tc>
+          <w:tcPr>
+            <w:tcW w:type="dxa" w:w="5669"/>
+          </w:tcPr>
+          <w:p>
+            <w:r/>
+            <w:r>
+              <w:rPr>
+                <w:sz w:val="22"/>
+              </w:rPr>
+              <w:t>Установка гигиенического душа</w:t>
+            </w:r>
+          </w:p>
+        </w:tc>
+        <w:tc>
+          <w:tcPr>
+            <w:tcW w:type="dxa" w:w="1020"/>
+          </w:tcPr>
+          <w:p>
+            <w:r/>
+            <w:r>
+              <w:rPr>
+                <w:sz w:val="22"/>
+              </w:rPr>
+              <w:t>шт.</w:t>
+            </w:r>
+          </w:p>
+        </w:tc>
+        <w:tc>
+          <w:tcPr>
+            <w:tcW w:type="dxa" w:w="964"/>
+          </w:tcPr>
+          <w:p>
+            <w:r/>
+            <w:r>
+              <w:rPr>
+                <w:sz w:val="22"/>
+              </w:rPr>
+              <w:t>1</w:t>
+            </w:r>
+          </w:p>
+        </w:tc>
+        <w:tc>
+          <w:tcPr>
+            <w:tcW w:type="dxa" w:w="850"/>
+          </w:tcPr>
+          <w:p>
+            <w:r/>
+            <w:r>
+              <w:rPr>
+                <w:sz w:val="22"/>
+              </w:rPr>
+              <w:t>3</w:t>
+            </w:r>
+          </w:p>
+        </w:tc>
+      </w:tr>
+      <w:tr>
+        <w:tc>
+          <w:tcPr>
+            <w:tcW w:type="dxa" w:w="567"/>
+          </w:tcPr>
+          <w:p>
+            <w:r/>
+            <w:r>
+              <w:rPr>
+                <w:sz w:val="22"/>
+              </w:rPr>
+              <w:t>20</w:t>
+            </w:r>
+          </w:p>
+        </w:tc>
+        <w:tc>
+          <w:tcPr>
+            <w:tcW w:type="dxa" w:w="5669"/>
+          </w:tcPr>
+          <w:p>
+            <w:r/>
+            <w:r>
+              <w:rPr>
+                <w:sz w:val="22"/>
+              </w:rPr>
+              <w:t>Установка и подключение накопительного электроводонагревателя (до 80 л) с группой безопасности</w:t>
+            </w:r>
+          </w:p>
+        </w:tc>
+        <w:tc>
+          <w:tcPr>
+            <w:tcW w:type="dxa" w:w="1020"/>
+          </w:tcPr>
+          <w:p>
+            <w:r/>
+            <w:r>
+              <w:rPr>
+                <w:sz w:val="22"/>
+              </w:rPr>
+              <w:t>шт.</w:t>
+            </w:r>
+          </w:p>
+        </w:tc>
+        <w:tc>
+          <w:tcPr>
+            <w:tcW w:type="dxa" w:w="964"/>
+          </w:tcPr>
+          <w:p>
+            <w:r/>
+            <w:r>
+              <w:rPr>
+                <w:sz w:val="22"/>
+              </w:rPr>
+              <w:t>1</w:t>
+            </w:r>
+          </w:p>
+        </w:tc>
+        <w:tc>
+          <w:tcPr>
+            <w:tcW w:type="dxa" w:w="850"/>
+          </w:tcPr>
+          <w:p>
+            <w:r/>
+            <w:r>
+              <w:rPr>
+                <w:sz w:val="22"/>
+              </w:rPr>
+              <w:t>3</w:t>
+            </w:r>
+          </w:p>
+        </w:tc>
+      </w:tr>
+      <w:tr>
+        <w:tc>
+          <w:tcPr>
+            <w:tcW w:type="dxa" w:w="567"/>
+          </w:tcPr>
+          <w:p>
+            <w:r/>
+            <w:r>
+              <w:rPr>
+                <w:sz w:val="22"/>
+              </w:rPr>
+              <w:t>21</w:t>
+            </w:r>
+          </w:p>
+        </w:tc>
+        <w:tc>
+          <w:tcPr>
+            <w:tcW w:type="dxa" w:w="5669"/>
+          </w:tcPr>
+          <w:p>
+            <w:r/>
+            <w:r>
+              <w:rPr>
+                <w:sz w:val="22"/>
+              </w:rPr>
+              <w:t>Герметизация примыканий сантехприборов санитарным герметиком</w:t>
+            </w:r>
+          </w:p>
+        </w:tc>
+        <w:tc>
+          <w:tcPr>
+            <w:tcW w:type="dxa" w:w="1020"/>
+          </w:tcPr>
+          <w:p>
+            <w:r/>
+            <w:r>
+              <w:rPr>
+                <w:sz w:val="22"/>
+              </w:rPr>
+              <w:t>компл.</w:t>
+            </w:r>
+          </w:p>
+        </w:tc>
+        <w:tc>
+          <w:tcPr>
+            <w:tcW w:type="dxa" w:w="964"/>
+          </w:tcPr>
+          <w:p>
+            <w:r/>
+            <w:r>
+              <w:rPr>
+                <w:sz w:val="22"/>
+              </w:rPr>
+              <w:t>1</w:t>
+            </w:r>
+          </w:p>
+        </w:tc>
+        <w:tc>
+          <w:tcPr>
+            <w:tcW w:type="dxa" w:w="850"/>
+          </w:tcPr>
+          <w:p>
+            <w:r/>
+            <w:r>
+              <w:rPr>
+                <w:sz w:val="22"/>
+              </w:rPr>
+              <w:t>3</w:t>
+            </w:r>
+          </w:p>
+        </w:tc>
+      </w:tr>
+      <w:tr>
+        <w:tc>
+          <w:tcPr>
+            <w:tcW w:type="dxa" w:w="567"/>
+          </w:tcPr>
+          <w:p>
+            <w:r/>
+            <w:r>
+              <w:rPr>
+                <w:sz w:val="22"/>
+              </w:rPr>
+              <w:t>22</w:t>
+            </w:r>
+          </w:p>
+        </w:tc>
+        <w:tc>
+          <w:tcPr>
+            <w:tcW w:type="dxa" w:w="5669"/>
+          </w:tcPr>
+          <w:p>
+            <w:r/>
+            <w:r>
+              <w:rPr>
+                <w:sz w:val="22"/>
+              </w:rPr>
+              <w:t>Пуско-наладка, проверка всех соединений на герметичность, сдача Объекта</w:t>
+            </w:r>
+          </w:p>
+        </w:tc>
+        <w:tc>
+          <w:tcPr>
+            <w:tcW w:type="dxa" w:w="1020"/>
+          </w:tcPr>
+          <w:p>
+            <w:r/>
+            <w:r>
+              <w:rPr>
+                <w:sz w:val="22"/>
+              </w:rPr>
+              <w:t>компл.</w:t>
+            </w:r>
+          </w:p>
+        </w:tc>
+        <w:tc>
+          <w:tcPr>
+            <w:tcW w:type="dxa" w:w="964"/>
+          </w:tcPr>
+          <w:p>
+            <w:r/>
+            <w:r>
+              <w:rPr>
+                <w:sz w:val="22"/>
+              </w:rPr>
+              <w:t>1</w:t>
+            </w:r>
+          </w:p>
+        </w:tc>
+        <w:tc>
+          <w:tcPr>
+            <w:tcW w:type="dxa" w:w="850"/>
+          </w:tcPr>
+          <w:p>
+            <w:r/>
+            <w:r>
+              <w:rPr>
+                <w:sz w:val="22"/>
+              </w:rPr>
+              <w:t>3</w:t>
             </w:r>
           </w:p>
         </w:tc>
@@ -2001,19 +3285,32 @@
         <w:t>Объект № 2: г. Санкт-Петербург, Комендантский пр-т, д. 17, корп. 1</w:t>
       </w:r>
     </w:p>
+    <w:p>
+      <w:pPr>
+        <w:spacing w:before="0"/>
+        <w:jc w:val="left"/>
+      </w:pPr>
+      <w:r>
+        <w:rPr>
+          <w:b w:val="0"/>
+        </w:rPr>
+        <w:t>Восстановление санузла (ремонт и частичная замена инженерных систем и сантехприборов)</w:t>
+      </w:r>
+    </w:p>
     <w:tbl>
       <w:tblPr>
         <w:tblStyle w:val="TableGrid"/>
         <w:tblW w:type="auto" w:w="0"/>
         <w:jc w:val="center"/>
+        <w:tblLayout w:type="fixed"/>
         <w:tblLook w:firstColumn="1" w:firstRow="1" w:lastColumn="0" w:lastRow="0" w:noHBand="0" w:noVBand="1" w:val="04A0"/>
       </w:tblPr>
       <w:tblGrid>
-        <w:gridCol w:w="1995"/>
-        <w:gridCol w:w="1995"/>
-        <w:gridCol w:w="1995"/>
-        <w:gridCol w:w="1995"/>
-        <w:gridCol w:w="1995"/>
+        <w:gridCol w:w="567"/>
+        <w:gridCol w:w="5669"/>
+        <w:gridCol w:w="1020"/>
+        <w:gridCol w:w="964"/>
+        <w:gridCol w:w="850"/>
       </w:tblGrid>
       <w:tr>
         <w:tc>
@@ -2036,7 +3333,7 @@
         </w:tc>
         <w:tc>
           <w:tcPr>
-            <w:tcW w:type="dxa" w:w="4535"/>
+            <w:tcW w:type="dxa" w:w="5669"/>
           </w:tcPr>
           <w:p>
             <w:pPr>
@@ -2054,7 +3351,7 @@
         </w:tc>
         <w:tc>
           <w:tcPr>
-            <w:tcW w:type="dxa" w:w="1134"/>
+            <w:tcW w:type="dxa" w:w="1020"/>
           </w:tcPr>
           <w:p>
             <w:pPr>
@@ -2072,7 +3369,7 @@
         </w:tc>
         <w:tc>
           <w:tcPr>
-            <w:tcW w:type="dxa" w:w="1134"/>
+            <w:tcW w:type="dxa" w:w="964"/>
           </w:tcPr>
           <w:p>
             <w:pPr>
@@ -2090,7 +3387,7 @@
         </w:tc>
         <w:tc>
           <w:tcPr>
-            <w:tcW w:type="dxa" w:w="1984"/>
+            <w:tcW w:type="dxa" w:w="850"/>
           </w:tcPr>
           <w:p>
             <w:pPr>
@@ -2102,7 +3399,7 @@
                 <w:b/>
                 <w:sz w:val="22"/>
               </w:rPr>
-              <w:t>Примечание</w:t>
+              <w:t>Этап</w:t>
             </w:r>
           </w:p>
         </w:tc>
@@ -2124,7 +3421,7 @@
         </w:tc>
         <w:tc>
           <w:tcPr>
-            <w:tcW w:type="dxa" w:w="4535"/>
+            <w:tcW w:type="dxa" w:w="5669"/>
           </w:tcPr>
           <w:p>
             <w:r/>
@@ -2132,12 +3429,13 @@
               <w:rPr>
                 <w:sz w:val="22"/>
               </w:rPr>
-            </w:r>
-          </w:p>
-        </w:tc>
-        <w:tc>
-          <w:tcPr>
-            <w:tcW w:type="dxa" w:w="1134"/>
+              <w:t>Обследование санузла, дефектовка, составление перечня узлов под замену</w:t>
+            </w:r>
+          </w:p>
+        </w:tc>
+        <w:tc>
+          <w:tcPr>
+            <w:tcW w:type="dxa" w:w="1020"/>
           </w:tcPr>
           <w:p>
             <w:r/>
@@ -2145,12 +3443,13 @@
               <w:rPr>
                 <w:sz w:val="22"/>
               </w:rPr>
-            </w:r>
-          </w:p>
-        </w:tc>
-        <w:tc>
-          <w:tcPr>
-            <w:tcW w:type="dxa" w:w="1134"/>
+              <w:t>компл.</w:t>
+            </w:r>
+          </w:p>
+        </w:tc>
+        <w:tc>
+          <w:tcPr>
+            <w:tcW w:type="dxa" w:w="964"/>
           </w:tcPr>
           <w:p>
             <w:r/>
@@ -2158,12 +3457,13 @@
               <w:rPr>
                 <w:sz w:val="22"/>
               </w:rPr>
-            </w:r>
-          </w:p>
-        </w:tc>
-        <w:tc>
-          <w:tcPr>
-            <w:tcW w:type="dxa" w:w="1984"/>
+              <w:t>1</w:t>
+            </w:r>
+          </w:p>
+        </w:tc>
+        <w:tc>
+          <w:tcPr>
+            <w:tcW w:type="dxa" w:w="850"/>
           </w:tcPr>
           <w:p>
             <w:r/>
@@ -2171,6 +3471,7 @@
               <w:rPr>
                 <w:sz w:val="22"/>
               </w:rPr>
+              <w:t>1</w:t>
             </w:r>
           </w:p>
         </w:tc>
@@ -2192,7 +3493,7 @@
         </w:tc>
         <w:tc>
           <w:tcPr>
-            <w:tcW w:type="dxa" w:w="4535"/>
+            <w:tcW w:type="dxa" w:w="5669"/>
           </w:tcPr>
           <w:p>
             <w:r/>
@@ -2200,12 +3501,13 @@
               <w:rPr>
                 <w:sz w:val="22"/>
               </w:rPr>
-            </w:r>
-          </w:p>
-        </w:tc>
-        <w:tc>
-          <w:tcPr>
-            <w:tcW w:type="dxa" w:w="1134"/>
+              <w:t>Ревизия и замена запорной арматуры на вводах ХВС и ГВС</w:t>
+            </w:r>
+          </w:p>
+        </w:tc>
+        <w:tc>
+          <w:tcPr>
+            <w:tcW w:type="dxa" w:w="1020"/>
           </w:tcPr>
           <w:p>
             <w:r/>
@@ -2213,12 +3515,13 @@
               <w:rPr>
                 <w:sz w:val="22"/>
               </w:rPr>
-            </w:r>
-          </w:p>
-        </w:tc>
-        <w:tc>
-          <w:tcPr>
-            <w:tcW w:type="dxa" w:w="1134"/>
+              <w:t>шт.</w:t>
+            </w:r>
+          </w:p>
+        </w:tc>
+        <w:tc>
+          <w:tcPr>
+            <w:tcW w:type="dxa" w:w="964"/>
           </w:tcPr>
           <w:p>
             <w:r/>
@@ -2226,12 +3529,13 @@
               <w:rPr>
                 <w:sz w:val="22"/>
               </w:rPr>
-            </w:r>
-          </w:p>
-        </w:tc>
-        <w:tc>
-          <w:tcPr>
-            <w:tcW w:type="dxa" w:w="1984"/>
+              <w:t>2</w:t>
+            </w:r>
+          </w:p>
+        </w:tc>
+        <w:tc>
+          <w:tcPr>
+            <w:tcW w:type="dxa" w:w="850"/>
           </w:tcPr>
           <w:p>
             <w:r/>
@@ -2239,6 +3543,7 @@
               <w:rPr>
                 <w:sz w:val="22"/>
               </w:rPr>
+              <w:t>1</w:t>
             </w:r>
           </w:p>
         </w:tc>
@@ -2260,7 +3565,7 @@
         </w:tc>
         <w:tc>
           <w:tcPr>
-            <w:tcW w:type="dxa" w:w="4535"/>
+            <w:tcW w:type="dxa" w:w="5669"/>
           </w:tcPr>
           <w:p>
             <w:r/>
@@ -2268,12 +3573,13 @@
               <w:rPr>
                 <w:sz w:val="22"/>
               </w:rPr>
-            </w:r>
-          </w:p>
-        </w:tc>
-        <w:tc>
-          <w:tcPr>
-            <w:tcW w:type="dxa" w:w="1134"/>
+              <w:t>Замена изношенных / аварийных участков трубопроводов ХВС и ГВС</w:t>
+            </w:r>
+          </w:p>
+        </w:tc>
+        <w:tc>
+          <w:tcPr>
+            <w:tcW w:type="dxa" w:w="1020"/>
           </w:tcPr>
           <w:p>
             <w:r/>
@@ -2281,12 +3587,13 @@
               <w:rPr>
                 <w:sz w:val="22"/>
               </w:rPr>
-            </w:r>
-          </w:p>
-        </w:tc>
-        <w:tc>
-          <w:tcPr>
-            <w:tcW w:type="dxa" w:w="1134"/>
+              <w:t>м.п.</w:t>
+            </w:r>
+          </w:p>
+        </w:tc>
+        <w:tc>
+          <w:tcPr>
+            <w:tcW w:type="dxa" w:w="964"/>
           </w:tcPr>
           <w:p>
             <w:r/>
@@ -2294,12 +3601,13 @@
               <w:rPr>
                 <w:sz w:val="22"/>
               </w:rPr>
-            </w:r>
-          </w:p>
-        </w:tc>
-        <w:tc>
-          <w:tcPr>
-            <w:tcW w:type="dxa" w:w="1984"/>
+              <w:t>до 6</w:t>
+            </w:r>
+          </w:p>
+        </w:tc>
+        <w:tc>
+          <w:tcPr>
+            <w:tcW w:type="dxa" w:w="850"/>
           </w:tcPr>
           <w:p>
             <w:r/>
@@ -2307,6 +3615,7 @@
               <w:rPr>
                 <w:sz w:val="22"/>
               </w:rPr>
+              <w:t>1</w:t>
             </w:r>
           </w:p>
         </w:tc>
@@ -2328,7 +3637,7 @@
         </w:tc>
         <w:tc>
           <w:tcPr>
-            <w:tcW w:type="dxa" w:w="4535"/>
+            <w:tcW w:type="dxa" w:w="5669"/>
           </w:tcPr>
           <w:p>
             <w:r/>
@@ -2336,12 +3645,13 @@
               <w:rPr>
                 <w:sz w:val="22"/>
               </w:rPr>
-            </w:r>
-          </w:p>
-        </w:tc>
-        <w:tc>
-          <w:tcPr>
-            <w:tcW w:type="dxa" w:w="1134"/>
+              <w:t>Прочистка канализационных трубопроводов</w:t>
+            </w:r>
+          </w:p>
+        </w:tc>
+        <w:tc>
+          <w:tcPr>
+            <w:tcW w:type="dxa" w:w="1020"/>
           </w:tcPr>
           <w:p>
             <w:r/>
@@ -2349,12 +3659,13 @@
               <w:rPr>
                 <w:sz w:val="22"/>
               </w:rPr>
-            </w:r>
-          </w:p>
-        </w:tc>
-        <w:tc>
-          <w:tcPr>
-            <w:tcW w:type="dxa" w:w="1134"/>
+              <w:t>м.п.</w:t>
+            </w:r>
+          </w:p>
+        </w:tc>
+        <w:tc>
+          <w:tcPr>
+            <w:tcW w:type="dxa" w:w="964"/>
           </w:tcPr>
           <w:p>
             <w:r/>
@@ -2362,12 +3673,13 @@
               <w:rPr>
                 <w:sz w:val="22"/>
               </w:rPr>
-            </w:r>
-          </w:p>
-        </w:tc>
-        <w:tc>
-          <w:tcPr>
-            <w:tcW w:type="dxa" w:w="1984"/>
+              <w:t>до 10</w:t>
+            </w:r>
+          </w:p>
+        </w:tc>
+        <w:tc>
+          <w:tcPr>
+            <w:tcW w:type="dxa" w:w="850"/>
           </w:tcPr>
           <w:p>
             <w:r/>
@@ -2375,6 +3687,7 @@
               <w:rPr>
                 <w:sz w:val="22"/>
               </w:rPr>
+              <w:t>1</w:t>
             </w:r>
           </w:p>
         </w:tc>
@@ -2396,7 +3709,7 @@
         </w:tc>
         <w:tc>
           <w:tcPr>
-            <w:tcW w:type="dxa" w:w="4535"/>
+            <w:tcW w:type="dxa" w:w="5669"/>
           </w:tcPr>
           <w:p>
             <w:r/>
@@ -2404,12 +3717,13 @@
               <w:rPr>
                 <w:sz w:val="22"/>
               </w:rPr>
-            </w:r>
-          </w:p>
-        </w:tc>
-        <w:tc>
-          <w:tcPr>
-            <w:tcW w:type="dxa" w:w="1134"/>
+              <w:t>Установка фильтра грубой очистки и регулятора давления</w:t>
+            </w:r>
+          </w:p>
+        </w:tc>
+        <w:tc>
+          <w:tcPr>
+            <w:tcW w:type="dxa" w:w="1020"/>
           </w:tcPr>
           <w:p>
             <w:r/>
@@ -2417,12 +3731,13 @@
               <w:rPr>
                 <w:sz w:val="22"/>
               </w:rPr>
-            </w:r>
-          </w:p>
-        </w:tc>
-        <w:tc>
-          <w:tcPr>
-            <w:tcW w:type="dxa" w:w="1134"/>
+              <w:t>компл.</w:t>
+            </w:r>
+          </w:p>
+        </w:tc>
+        <w:tc>
+          <w:tcPr>
+            <w:tcW w:type="dxa" w:w="964"/>
           </w:tcPr>
           <w:p>
             <w:r/>
@@ -2430,12 +3745,13 @@
               <w:rPr>
                 <w:sz w:val="22"/>
               </w:rPr>
-            </w:r>
-          </w:p>
-        </w:tc>
-        <w:tc>
-          <w:tcPr>
-            <w:tcW w:type="dxa" w:w="1984"/>
+              <w:t>1</w:t>
+            </w:r>
+          </w:p>
+        </w:tc>
+        <w:tc>
+          <w:tcPr>
+            <w:tcW w:type="dxa" w:w="850"/>
           </w:tcPr>
           <w:p>
             <w:r/>
@@ -2443,6 +3759,727 @@
               <w:rPr>
                 <w:sz w:val="22"/>
               </w:rPr>
+              <w:t>1</w:t>
+            </w:r>
+          </w:p>
+        </w:tc>
+      </w:tr>
+      <w:tr>
+        <w:tc>
+          <w:tcPr>
+            <w:tcW w:type="dxa" w:w="567"/>
+          </w:tcPr>
+          <w:p>
+            <w:r/>
+            <w:r>
+              <w:rPr>
+                <w:sz w:val="22"/>
+              </w:rPr>
+              <w:t>6</w:t>
+            </w:r>
+          </w:p>
+        </w:tc>
+        <w:tc>
+          <w:tcPr>
+            <w:tcW w:type="dxa" w:w="5669"/>
+          </w:tcPr>
+          <w:p>
+            <w:r/>
+            <w:r>
+              <w:rPr>
+                <w:sz w:val="22"/>
+              </w:rPr>
+              <w:t>Замена участков канализации, фасонных изделий и уплотнительных манжет</w:t>
+            </w:r>
+          </w:p>
+        </w:tc>
+        <w:tc>
+          <w:tcPr>
+            <w:tcW w:type="dxa" w:w="1020"/>
+          </w:tcPr>
+          <w:p>
+            <w:r/>
+            <w:r>
+              <w:rPr>
+                <w:sz w:val="22"/>
+              </w:rPr>
+              <w:t>м.п.</w:t>
+            </w:r>
+          </w:p>
+        </w:tc>
+        <w:tc>
+          <w:tcPr>
+            <w:tcW w:type="dxa" w:w="964"/>
+          </w:tcPr>
+          <w:p>
+            <w:r/>
+            <w:r>
+              <w:rPr>
+                <w:sz w:val="22"/>
+              </w:rPr>
+              <w:t>до 4</w:t>
+            </w:r>
+          </w:p>
+        </w:tc>
+        <w:tc>
+          <w:tcPr>
+            <w:tcW w:type="dxa" w:w="850"/>
+          </w:tcPr>
+          <w:p>
+            <w:r/>
+            <w:r>
+              <w:rPr>
+                <w:sz w:val="22"/>
+              </w:rPr>
+              <w:t>2</w:t>
+            </w:r>
+          </w:p>
+        </w:tc>
+      </w:tr>
+      <w:tr>
+        <w:tc>
+          <w:tcPr>
+            <w:tcW w:type="dxa" w:w="567"/>
+          </w:tcPr>
+          <w:p>
+            <w:r/>
+            <w:r>
+              <w:rPr>
+                <w:sz w:val="22"/>
+              </w:rPr>
+              <w:t>7</w:t>
+            </w:r>
+          </w:p>
+        </w:tc>
+        <w:tc>
+          <w:tcPr>
+            <w:tcW w:type="dxa" w:w="5669"/>
+          </w:tcPr>
+          <w:p>
+            <w:r/>
+            <w:r>
+              <w:rPr>
+                <w:sz w:val="22"/>
+              </w:rPr>
+              <w:t>Демонтаж и повторная установка унитаза-компакт с заменой гофры, подводки и арматуры бачка</w:t>
+            </w:r>
+          </w:p>
+        </w:tc>
+        <w:tc>
+          <w:tcPr>
+            <w:tcW w:type="dxa" w:w="1020"/>
+          </w:tcPr>
+          <w:p>
+            <w:r/>
+            <w:r>
+              <w:rPr>
+                <w:sz w:val="22"/>
+              </w:rPr>
+              <w:t>шт.</w:t>
+            </w:r>
+          </w:p>
+        </w:tc>
+        <w:tc>
+          <w:tcPr>
+            <w:tcW w:type="dxa" w:w="964"/>
+          </w:tcPr>
+          <w:p>
+            <w:r/>
+            <w:r>
+              <w:rPr>
+                <w:sz w:val="22"/>
+              </w:rPr>
+              <w:t>1</w:t>
+            </w:r>
+          </w:p>
+        </w:tc>
+        <w:tc>
+          <w:tcPr>
+            <w:tcW w:type="dxa" w:w="850"/>
+          </w:tcPr>
+          <w:p>
+            <w:r/>
+            <w:r>
+              <w:rPr>
+                <w:sz w:val="22"/>
+              </w:rPr>
+              <w:t>2</w:t>
+            </w:r>
+          </w:p>
+        </w:tc>
+      </w:tr>
+      <w:tr>
+        <w:tc>
+          <w:tcPr>
+            <w:tcW w:type="dxa" w:w="567"/>
+          </w:tcPr>
+          <w:p>
+            <w:r/>
+            <w:r>
+              <w:rPr>
+                <w:sz w:val="22"/>
+              </w:rPr>
+              <w:t>8</w:t>
+            </w:r>
+          </w:p>
+        </w:tc>
+        <w:tc>
+          <w:tcPr>
+            <w:tcW w:type="dxa" w:w="5669"/>
+          </w:tcPr>
+          <w:p>
+            <w:r/>
+            <w:r>
+              <w:rPr>
+                <w:sz w:val="22"/>
+              </w:rPr>
+              <w:t>Замена гибких подводок к сантехприборам</w:t>
+            </w:r>
+          </w:p>
+        </w:tc>
+        <w:tc>
+          <w:tcPr>
+            <w:tcW w:type="dxa" w:w="1020"/>
+          </w:tcPr>
+          <w:p>
+            <w:r/>
+            <w:r>
+              <w:rPr>
+                <w:sz w:val="22"/>
+              </w:rPr>
+              <w:t>шт.</w:t>
+            </w:r>
+          </w:p>
+        </w:tc>
+        <w:tc>
+          <w:tcPr>
+            <w:tcW w:type="dxa" w:w="964"/>
+          </w:tcPr>
+          <w:p>
+            <w:r/>
+            <w:r>
+              <w:rPr>
+                <w:sz w:val="22"/>
+              </w:rPr>
+              <w:t>до 6</w:t>
+            </w:r>
+          </w:p>
+        </w:tc>
+        <w:tc>
+          <w:tcPr>
+            <w:tcW w:type="dxa" w:w="850"/>
+          </w:tcPr>
+          <w:p>
+            <w:r/>
+            <w:r>
+              <w:rPr>
+                <w:sz w:val="22"/>
+              </w:rPr>
+              <w:t>2</w:t>
+            </w:r>
+          </w:p>
+        </w:tc>
+      </w:tr>
+      <w:tr>
+        <w:tc>
+          <w:tcPr>
+            <w:tcW w:type="dxa" w:w="567"/>
+          </w:tcPr>
+          <w:p>
+            <w:r/>
+            <w:r>
+              <w:rPr>
+                <w:sz w:val="22"/>
+              </w:rPr>
+              <w:t>9</w:t>
+            </w:r>
+          </w:p>
+        </w:tc>
+        <w:tc>
+          <w:tcPr>
+            <w:tcW w:type="dxa" w:w="5669"/>
+          </w:tcPr>
+          <w:p>
+            <w:r/>
+            <w:r>
+              <w:rPr>
+                <w:sz w:val="22"/>
+              </w:rPr>
+              <w:t>Гидравлическое испытание отремонтированных участков</w:t>
+            </w:r>
+          </w:p>
+        </w:tc>
+        <w:tc>
+          <w:tcPr>
+            <w:tcW w:type="dxa" w:w="1020"/>
+          </w:tcPr>
+          <w:p>
+            <w:r/>
+            <w:r>
+              <w:rPr>
+                <w:sz w:val="22"/>
+              </w:rPr>
+              <w:t>компл.</w:t>
+            </w:r>
+          </w:p>
+        </w:tc>
+        <w:tc>
+          <w:tcPr>
+            <w:tcW w:type="dxa" w:w="964"/>
+          </w:tcPr>
+          <w:p>
+            <w:r/>
+            <w:r>
+              <w:rPr>
+                <w:sz w:val="22"/>
+              </w:rPr>
+              <w:t>1</w:t>
+            </w:r>
+          </w:p>
+        </w:tc>
+        <w:tc>
+          <w:tcPr>
+            <w:tcW w:type="dxa" w:w="850"/>
+          </w:tcPr>
+          <w:p>
+            <w:r/>
+            <w:r>
+              <w:rPr>
+                <w:sz w:val="22"/>
+              </w:rPr>
+              <w:t>2</w:t>
+            </w:r>
+          </w:p>
+        </w:tc>
+      </w:tr>
+      <w:tr>
+        <w:tc>
+          <w:tcPr>
+            <w:tcW w:type="dxa" w:w="567"/>
+          </w:tcPr>
+          <w:p>
+            <w:r/>
+            <w:r>
+              <w:rPr>
+                <w:sz w:val="22"/>
+              </w:rPr>
+              <w:t>10</w:t>
+            </w:r>
+          </w:p>
+        </w:tc>
+        <w:tc>
+          <w:tcPr>
+            <w:tcW w:type="dxa" w:w="5669"/>
+          </w:tcPr>
+          <w:p>
+            <w:r/>
+            <w:r>
+              <w:rPr>
+                <w:sz w:val="22"/>
+              </w:rPr>
+              <w:t>Замена раковины с сифоном</w:t>
+            </w:r>
+          </w:p>
+        </w:tc>
+        <w:tc>
+          <w:tcPr>
+            <w:tcW w:type="dxa" w:w="1020"/>
+          </w:tcPr>
+          <w:p>
+            <w:r/>
+            <w:r>
+              <w:rPr>
+                <w:sz w:val="22"/>
+              </w:rPr>
+              <w:t>шт.</w:t>
+            </w:r>
+          </w:p>
+        </w:tc>
+        <w:tc>
+          <w:tcPr>
+            <w:tcW w:type="dxa" w:w="964"/>
+          </w:tcPr>
+          <w:p>
+            <w:r/>
+            <w:r>
+              <w:rPr>
+                <w:sz w:val="22"/>
+              </w:rPr>
+              <w:t>1</w:t>
+            </w:r>
+          </w:p>
+        </w:tc>
+        <w:tc>
+          <w:tcPr>
+            <w:tcW w:type="dxa" w:w="850"/>
+          </w:tcPr>
+          <w:p>
+            <w:r/>
+            <w:r>
+              <w:rPr>
+                <w:sz w:val="22"/>
+              </w:rPr>
+              <w:t>3</w:t>
+            </w:r>
+          </w:p>
+        </w:tc>
+      </w:tr>
+      <w:tr>
+        <w:tc>
+          <w:tcPr>
+            <w:tcW w:type="dxa" w:w="567"/>
+          </w:tcPr>
+          <w:p>
+            <w:r/>
+            <w:r>
+              <w:rPr>
+                <w:sz w:val="22"/>
+              </w:rPr>
+              <w:t>11</w:t>
+            </w:r>
+          </w:p>
+        </w:tc>
+        <w:tc>
+          <w:tcPr>
+            <w:tcW w:type="dxa" w:w="5669"/>
+          </w:tcPr>
+          <w:p>
+            <w:r/>
+            <w:r>
+              <w:rPr>
+                <w:sz w:val="22"/>
+              </w:rPr>
+              <w:t>Замена смесителя для раковины</w:t>
+            </w:r>
+          </w:p>
+        </w:tc>
+        <w:tc>
+          <w:tcPr>
+            <w:tcW w:type="dxa" w:w="1020"/>
+          </w:tcPr>
+          <w:p>
+            <w:r/>
+            <w:r>
+              <w:rPr>
+                <w:sz w:val="22"/>
+              </w:rPr>
+              <w:t>шт.</w:t>
+            </w:r>
+          </w:p>
+        </w:tc>
+        <w:tc>
+          <w:tcPr>
+            <w:tcW w:type="dxa" w:w="964"/>
+          </w:tcPr>
+          <w:p>
+            <w:r/>
+            <w:r>
+              <w:rPr>
+                <w:sz w:val="22"/>
+              </w:rPr>
+              <w:t>1</w:t>
+            </w:r>
+          </w:p>
+        </w:tc>
+        <w:tc>
+          <w:tcPr>
+            <w:tcW w:type="dxa" w:w="850"/>
+          </w:tcPr>
+          <w:p>
+            <w:r/>
+            <w:r>
+              <w:rPr>
+                <w:sz w:val="22"/>
+              </w:rPr>
+              <w:t>3</w:t>
+            </w:r>
+          </w:p>
+        </w:tc>
+      </w:tr>
+      <w:tr>
+        <w:tc>
+          <w:tcPr>
+            <w:tcW w:type="dxa" w:w="567"/>
+          </w:tcPr>
+          <w:p>
+            <w:r/>
+            <w:r>
+              <w:rPr>
+                <w:sz w:val="22"/>
+              </w:rPr>
+              <w:t>12</w:t>
+            </w:r>
+          </w:p>
+        </w:tc>
+        <w:tc>
+          <w:tcPr>
+            <w:tcW w:type="dxa" w:w="5669"/>
+          </w:tcPr>
+          <w:p>
+            <w:r/>
+            <w:r>
+              <w:rPr>
+                <w:sz w:val="22"/>
+              </w:rPr>
+              <w:t>Установка гигиенического душа</w:t>
+            </w:r>
+          </w:p>
+        </w:tc>
+        <w:tc>
+          <w:tcPr>
+            <w:tcW w:type="dxa" w:w="1020"/>
+          </w:tcPr>
+          <w:p>
+            <w:r/>
+            <w:r>
+              <w:rPr>
+                <w:sz w:val="22"/>
+              </w:rPr>
+              <w:t>шт.</w:t>
+            </w:r>
+          </w:p>
+        </w:tc>
+        <w:tc>
+          <w:tcPr>
+            <w:tcW w:type="dxa" w:w="964"/>
+          </w:tcPr>
+          <w:p>
+            <w:r/>
+            <w:r>
+              <w:rPr>
+                <w:sz w:val="22"/>
+              </w:rPr>
+              <w:t>1</w:t>
+            </w:r>
+          </w:p>
+        </w:tc>
+        <w:tc>
+          <w:tcPr>
+            <w:tcW w:type="dxa" w:w="850"/>
+          </w:tcPr>
+          <w:p>
+            <w:r/>
+            <w:r>
+              <w:rPr>
+                <w:sz w:val="22"/>
+              </w:rPr>
+              <w:t>3</w:t>
+            </w:r>
+          </w:p>
+        </w:tc>
+      </w:tr>
+      <w:tr>
+        <w:tc>
+          <w:tcPr>
+            <w:tcW w:type="dxa" w:w="567"/>
+          </w:tcPr>
+          <w:p>
+            <w:r/>
+            <w:r>
+              <w:rPr>
+                <w:sz w:val="22"/>
+              </w:rPr>
+              <w:t>13</w:t>
+            </w:r>
+          </w:p>
+        </w:tc>
+        <w:tc>
+          <w:tcPr>
+            <w:tcW w:type="dxa" w:w="5669"/>
+          </w:tcPr>
+          <w:p>
+            <w:r/>
+            <w:r>
+              <w:rPr>
+                <w:sz w:val="22"/>
+              </w:rPr>
+              <w:t>Ревизия водонагревателя: замена группы безопасности, проверка подключения</w:t>
+            </w:r>
+          </w:p>
+        </w:tc>
+        <w:tc>
+          <w:tcPr>
+            <w:tcW w:type="dxa" w:w="1020"/>
+          </w:tcPr>
+          <w:p>
+            <w:r/>
+            <w:r>
+              <w:rPr>
+                <w:sz w:val="22"/>
+              </w:rPr>
+              <w:t>шт.</w:t>
+            </w:r>
+          </w:p>
+        </w:tc>
+        <w:tc>
+          <w:tcPr>
+            <w:tcW w:type="dxa" w:w="964"/>
+          </w:tcPr>
+          <w:p>
+            <w:r/>
+            <w:r>
+              <w:rPr>
+                <w:sz w:val="22"/>
+              </w:rPr>
+              <w:t>1</w:t>
+            </w:r>
+          </w:p>
+        </w:tc>
+        <w:tc>
+          <w:tcPr>
+            <w:tcW w:type="dxa" w:w="850"/>
+          </w:tcPr>
+          <w:p>
+            <w:r/>
+            <w:r>
+              <w:rPr>
+                <w:sz w:val="22"/>
+              </w:rPr>
+              <w:t>3</w:t>
+            </w:r>
+          </w:p>
+        </w:tc>
+      </w:tr>
+      <w:tr>
+        <w:tc>
+          <w:tcPr>
+            <w:tcW w:type="dxa" w:w="567"/>
+          </w:tcPr>
+          <w:p>
+            <w:r/>
+            <w:r>
+              <w:rPr>
+                <w:sz w:val="22"/>
+              </w:rPr>
+              <w:t>14</w:t>
+            </w:r>
+          </w:p>
+        </w:tc>
+        <w:tc>
+          <w:tcPr>
+            <w:tcW w:type="dxa" w:w="5669"/>
+          </w:tcPr>
+          <w:p>
+            <w:r/>
+            <w:r>
+              <w:rPr>
+                <w:sz w:val="22"/>
+              </w:rPr>
+              <w:t>Герметизация примыканий сантехприборов санитарным герметиком</w:t>
+            </w:r>
+          </w:p>
+        </w:tc>
+        <w:tc>
+          <w:tcPr>
+            <w:tcW w:type="dxa" w:w="1020"/>
+          </w:tcPr>
+          <w:p>
+            <w:r/>
+            <w:r>
+              <w:rPr>
+                <w:sz w:val="22"/>
+              </w:rPr>
+              <w:t>компл.</w:t>
+            </w:r>
+          </w:p>
+        </w:tc>
+        <w:tc>
+          <w:tcPr>
+            <w:tcW w:type="dxa" w:w="964"/>
+          </w:tcPr>
+          <w:p>
+            <w:r/>
+            <w:r>
+              <w:rPr>
+                <w:sz w:val="22"/>
+              </w:rPr>
+              <w:t>1</w:t>
+            </w:r>
+          </w:p>
+        </w:tc>
+        <w:tc>
+          <w:tcPr>
+            <w:tcW w:type="dxa" w:w="850"/>
+          </w:tcPr>
+          <w:p>
+            <w:r/>
+            <w:r>
+              <w:rPr>
+                <w:sz w:val="22"/>
+              </w:rPr>
+              <w:t>3</w:t>
+            </w:r>
+          </w:p>
+        </w:tc>
+      </w:tr>
+      <w:tr>
+        <w:tc>
+          <w:tcPr>
+            <w:tcW w:type="dxa" w:w="567"/>
+          </w:tcPr>
+          <w:p>
+            <w:r/>
+            <w:r>
+              <w:rPr>
+                <w:sz w:val="22"/>
+              </w:rPr>
+              <w:t>15</w:t>
+            </w:r>
+          </w:p>
+        </w:tc>
+        <w:tc>
+          <w:tcPr>
+            <w:tcW w:type="dxa" w:w="5669"/>
+          </w:tcPr>
+          <w:p>
+            <w:r/>
+            <w:r>
+              <w:rPr>
+                <w:sz w:val="22"/>
+              </w:rPr>
+              <w:t>Пуско-наладка, проверка всех соединений на герметичность, сдача Объекта</w:t>
+            </w:r>
+          </w:p>
+        </w:tc>
+        <w:tc>
+          <w:tcPr>
+            <w:tcW w:type="dxa" w:w="1020"/>
+          </w:tcPr>
+          <w:p>
+            <w:r/>
+            <w:r>
+              <w:rPr>
+                <w:sz w:val="22"/>
+              </w:rPr>
+              <w:t>компл.</w:t>
+            </w:r>
+          </w:p>
+        </w:tc>
+        <w:tc>
+          <w:tcPr>
+            <w:tcW w:type="dxa" w:w="964"/>
+          </w:tcPr>
+          <w:p>
+            <w:r/>
+            <w:r>
+              <w:rPr>
+                <w:sz w:val="22"/>
+              </w:rPr>
+              <w:t>1</w:t>
+            </w:r>
+          </w:p>
+        </w:tc>
+        <w:tc>
+          <w:tcPr>
+            <w:tcW w:type="dxa" w:w="850"/>
+          </w:tcPr>
+          <w:p>
+            <w:r/>
+            <w:r>
+              <w:rPr>
+                <w:sz w:val="22"/>
+              </w:rPr>
+              <w:t>3</w:t>
             </w:r>
           </w:p>
         </w:tc>
@@ -2463,14 +4500,13 @@
     <w:p>
       <w:pPr>
         <w:spacing w:before="0"/>
-        <w:ind w:firstLine="567"/>
-        <w:jc w:val="both"/>
+        <w:jc w:val="left"/>
       </w:pPr>
       <w:r>
         <w:rPr>
-          <w:b w:val="0"/>
+          <w:b/>
         </w:rPr>
-        <w:t>Примерный перечень работ (для заполнения): демонтаж старых трубопроводов и сантехприборов; монтаж трубопроводов холодного и горячего водоснабжения; монтаж канализации; установка и подключение унитазов, раковин, ванн, душевых кабин, смесителей, полотенцесушителей; установка счётчиков воды, фильтров, запорной арматуры; опрессовка систем и пуско-наладка.</w:t>
+        <w:t>Примечания:</w:t>
       </w:r>
     </w:p>
     <w:p>
@@ -2483,6 +4519,46 @@
         <w:rPr>
           <w:b w:val="0"/>
         </w:rPr>
+        <w:t>1. Количество работ ориентировочное и уточняется по результатам обследования на этапе 1 в пределах стоимости, установленной Договором для соответствующего Объекта.</w:t>
+      </w:r>
+    </w:p>
+    <w:p>
+      <w:pPr>
+        <w:spacing w:before="0"/>
+        <w:ind w:firstLine="567"/>
+        <w:jc w:val="both"/>
+      </w:pPr>
+      <w:r>
+        <w:rPr>
+          <w:b w:val="0"/>
+        </w:rPr>
+        <w:t>2. Материалы и оборудование (трубы, фитинги, арматура, сантехприборы, инсталляция, водонагреватель) предоставляются Заказчиком в соответствии с п. 3.2 Договора.</w:t>
+      </w:r>
+    </w:p>
+    <w:p>
+      <w:pPr>
+        <w:spacing w:before="0"/>
+        <w:ind w:firstLine="567"/>
+        <w:jc w:val="both"/>
+      </w:pPr>
+      <w:r>
+        <w:rPr>
+          <w:b w:val="0"/>
+        </w:rPr>
+        <w:t>3. Отключение общедомовых стояков согласовывает Заказчик с управляющей компанией.</w:t>
+      </w:r>
+    </w:p>
+    <w:p>
+      <w:pPr>
+        <w:spacing w:before="0"/>
+        <w:ind w:firstLine="567"/>
+        <w:jc w:val="both"/>
+      </w:pPr>
+      <w:r>
+        <w:rPr>
+          <w:b w:val="0"/>
+        </w:rPr>
+        <w:t>4. Отделочные работы (плитка, короба, покраска, электромонтаж) в предмет Договора не входят, за исключением работ, прямо указанных в настоящем Приложении.</w:t>
       </w:r>
     </w:p>
     <w:tbl>
@@ -2559,20 +4635,21 @@
         <w:tblStyle w:val="TableGrid"/>
         <w:tblW w:type="auto" w:w="0"/>
         <w:jc w:val="center"/>
+        <w:tblLayout w:type="fixed"/>
         <w:tblLook w:firstColumn="1" w:firstRow="1" w:lastColumn="0" w:lastRow="0" w:noHBand="0" w:noVBand="1" w:val="04A0"/>
       </w:tblPr>
       <w:tblGrid>
-        <w:gridCol w:w="1662"/>
-        <w:gridCol w:w="1662"/>
-        <w:gridCol w:w="1662"/>
-        <w:gridCol w:w="1662"/>
-        <w:gridCol w:w="1662"/>
-        <w:gridCol w:w="1662"/>
+        <w:gridCol w:w="850"/>
+        <w:gridCol w:w="1701"/>
+        <w:gridCol w:w="1417"/>
+        <w:gridCol w:w="1928"/>
+        <w:gridCol w:w="1361"/>
+        <w:gridCol w:w="1814"/>
       </w:tblGrid>
       <w:tr>
         <w:tc>
           <w:tcPr>
-            <w:tcW w:type="dxa" w:w="680"/>
+            <w:tcW w:type="dxa" w:w="850"/>
           </w:tcPr>
           <w:p>
             <w:pPr>
@@ -2590,7 +4667,7 @@
         </w:tc>
         <w:tc>
           <w:tcPr>
-            <w:tcW w:type="dxa" w:w="1871"/>
+            <w:tcW w:type="dxa" w:w="1701"/>
           </w:tcPr>
           <w:p>
             <w:pPr>
@@ -2608,7 +4685,7 @@
         </w:tc>
         <w:tc>
           <w:tcPr>
-            <w:tcW w:type="dxa" w:w="1474"/>
+            <w:tcW w:type="dxa" w:w="1417"/>
           </w:tcPr>
           <w:p>
             <w:pPr>
@@ -2626,7 +4703,7 @@
         </w:tc>
         <w:tc>
           <w:tcPr>
-            <w:tcW w:type="dxa" w:w="2098"/>
+            <w:tcW w:type="dxa" w:w="1928"/>
           </w:tcPr>
           <w:p>
             <w:pPr>
@@ -2662,7 +4739,7 @@
         </w:tc>
         <w:tc>
           <w:tcPr>
-            <w:tcW w:type="dxa" w:w="1871"/>
+            <w:tcW w:type="dxa" w:w="1814"/>
           </w:tcPr>
           <w:p>
             <w:pPr>
@@ -2682,7 +4759,7 @@
       <w:tr>
         <w:tc>
           <w:tcPr>
-            <w:tcW w:type="dxa" w:w="680"/>
+            <w:tcW w:type="dxa" w:w="850"/>
           </w:tcPr>
           <w:p>
             <w:r/>
@@ -2696,7 +4773,7 @@
         </w:tc>
         <w:tc>
           <w:tcPr>
-            <w:tcW w:type="dxa" w:w="1871"/>
+            <w:tcW w:type="dxa" w:w="1701"/>
           </w:tcPr>
           <w:p>
             <w:r/>
@@ -2712,7 +4789,7 @@
         </w:tc>
         <w:tc>
           <w:tcPr>
-            <w:tcW w:type="dxa" w:w="1474"/>
+            <w:tcW w:type="dxa" w:w="1417"/>
           </w:tcPr>
           <w:p>
             <w:r/>
@@ -2726,7 +4803,7 @@
         </w:tc>
         <w:tc>
           <w:tcPr>
-            <w:tcW w:type="dxa" w:w="2098"/>
+            <w:tcW w:type="dxa" w:w="1928"/>
           </w:tcPr>
           <w:p>
             <w:r/>
@@ -2734,6 +4811,7 @@
               <w:rPr>
                 <w:sz w:val="22"/>
               </w:rPr>
+              <w:t>п. 1–8 Прил. 1</w:t>
             </w:r>
           </w:p>
         </w:tc>
@@ -2753,7 +4831,7 @@
         </w:tc>
         <w:tc>
           <w:tcPr>
-            <w:tcW w:type="dxa" w:w="1871"/>
+            <w:tcW w:type="dxa" w:w="1814"/>
           </w:tcPr>
           <w:p>
             <w:r/>
@@ -2769,7 +4847,7 @@
       <w:tr>
         <w:tc>
           <w:tcPr>
-            <w:tcW w:type="dxa" w:w="680"/>
+            <w:tcW w:type="dxa" w:w="850"/>
           </w:tcPr>
           <w:p>
             <w:r/>
@@ -2782,7 +4860,7 @@
         </w:tc>
         <w:tc>
           <w:tcPr>
-            <w:tcW w:type="dxa" w:w="1871"/>
+            <w:tcW w:type="dxa" w:w="1701"/>
           </w:tcPr>
           <w:p>
             <w:r/>
@@ -2795,7 +4873,7 @@
         </w:tc>
         <w:tc>
           <w:tcPr>
-            <w:tcW w:type="dxa" w:w="1474"/>
+            <w:tcW w:type="dxa" w:w="1417"/>
           </w:tcPr>
           <w:p>
             <w:r/>
@@ -2809,7 +4887,7 @@
         </w:tc>
         <w:tc>
           <w:tcPr>
-            <w:tcW w:type="dxa" w:w="2098"/>
+            <w:tcW w:type="dxa" w:w="1928"/>
           </w:tcPr>
           <w:p>
             <w:r/>
@@ -2817,6 +4895,7 @@
               <w:rPr>
                 <w:sz w:val="22"/>
               </w:rPr>
+              <w:t>п. 1–5 Прил. 1</w:t>
             </w:r>
           </w:p>
         </w:tc>
@@ -2836,7 +4915,7 @@
         </w:tc>
         <w:tc>
           <w:tcPr>
-            <w:tcW w:type="dxa" w:w="1871"/>
+            <w:tcW w:type="dxa" w:w="1814"/>
           </w:tcPr>
           <w:p>
             <w:r/>
@@ -2851,7 +4930,7 @@
       <w:tr>
         <w:tc>
           <w:tcPr>
-            <w:tcW w:type="dxa" w:w="680"/>
+            <w:tcW w:type="dxa" w:w="850"/>
           </w:tcPr>
           <w:p>
             <w:r/>
@@ -2864,7 +4943,7 @@
         </w:tc>
         <w:tc>
           <w:tcPr>
-            <w:tcW w:type="dxa" w:w="1871"/>
+            <w:tcW w:type="dxa" w:w="1701"/>
           </w:tcPr>
           <w:p>
             <w:r/>
@@ -2877,7 +4956,7 @@
         </w:tc>
         <w:tc>
           <w:tcPr>
-            <w:tcW w:type="dxa" w:w="1474"/>
+            <w:tcW w:type="dxa" w:w="1417"/>
           </w:tcPr>
           <w:p>
             <w:r/>
@@ -2890,7 +4969,7 @@
         </w:tc>
         <w:tc>
           <w:tcPr>
-            <w:tcW w:type="dxa" w:w="2098"/>
+            <w:tcW w:type="dxa" w:w="1928"/>
           </w:tcPr>
           <w:p>
             <w:r/>
@@ -2918,7 +4997,7 @@
         </w:tc>
         <w:tc>
           <w:tcPr>
-            <w:tcW w:type="dxa" w:w="1871"/>
+            <w:tcW w:type="dxa" w:w="1814"/>
           </w:tcPr>
           <w:p>
             <w:r/>
@@ -2933,7 +5012,7 @@
       <w:tr>
         <w:tc>
           <w:tcPr>
-            <w:tcW w:type="dxa" w:w="680"/>
+            <w:tcW w:type="dxa" w:w="850"/>
           </w:tcPr>
           <w:p>
             <w:r/>
@@ -2947,7 +5026,7 @@
         </w:tc>
         <w:tc>
           <w:tcPr>
-            <w:tcW w:type="dxa" w:w="1871"/>
+            <w:tcW w:type="dxa" w:w="1701"/>
           </w:tcPr>
           <w:p>
             <w:r/>
@@ -2963,7 +5042,7 @@
         </w:tc>
         <w:tc>
           <w:tcPr>
-            <w:tcW w:type="dxa" w:w="1474"/>
+            <w:tcW w:type="dxa" w:w="1417"/>
           </w:tcPr>
           <w:p>
             <w:r/>
@@ -2977,7 +5056,7 @@
         </w:tc>
         <w:tc>
           <w:tcPr>
-            <w:tcW w:type="dxa" w:w="2098"/>
+            <w:tcW w:type="dxa" w:w="1928"/>
           </w:tcPr>
           <w:p>
             <w:r/>
@@ -2985,6 +5064,7 @@
               <w:rPr>
                 <w:sz w:val="22"/>
               </w:rPr>
+              <w:t>п. 9–15 Прил. 1</w:t>
             </w:r>
           </w:p>
         </w:tc>
@@ -3004,7 +5084,7 @@
         </w:tc>
         <w:tc>
           <w:tcPr>
-            <w:tcW w:type="dxa" w:w="1871"/>
+            <w:tcW w:type="dxa" w:w="1814"/>
           </w:tcPr>
           <w:p>
             <w:r/>
@@ -3020,7 +5100,7 @@
       <w:tr>
         <w:tc>
           <w:tcPr>
-            <w:tcW w:type="dxa" w:w="680"/>
+            <w:tcW w:type="dxa" w:w="850"/>
           </w:tcPr>
           <w:p>
             <w:r/>
@@ -3033,7 +5113,7 @@
         </w:tc>
         <w:tc>
           <w:tcPr>
-            <w:tcW w:type="dxa" w:w="1871"/>
+            <w:tcW w:type="dxa" w:w="1701"/>
           </w:tcPr>
           <w:p>
             <w:r/>
@@ -3046,7 +5126,7 @@
         </w:tc>
         <w:tc>
           <w:tcPr>
-            <w:tcW w:type="dxa" w:w="1474"/>
+            <w:tcW w:type="dxa" w:w="1417"/>
           </w:tcPr>
           <w:p>
             <w:r/>
@@ -3060,7 +5140,7 @@
         </w:tc>
         <w:tc>
           <w:tcPr>
-            <w:tcW w:type="dxa" w:w="2098"/>
+            <w:tcW w:type="dxa" w:w="1928"/>
           </w:tcPr>
           <w:p>
             <w:r/>
@@ -3068,6 +5148,7 @@
               <w:rPr>
                 <w:sz w:val="22"/>
               </w:rPr>
+              <w:t>п. 6–9 Прил. 1</w:t>
             </w:r>
           </w:p>
         </w:tc>
@@ -3087,7 +5168,7 @@
         </w:tc>
         <w:tc>
           <w:tcPr>
-            <w:tcW w:type="dxa" w:w="1871"/>
+            <w:tcW w:type="dxa" w:w="1814"/>
           </w:tcPr>
           <w:p>
             <w:r/>
@@ -3102,7 +5183,7 @@
       <w:tr>
         <w:tc>
           <w:tcPr>
-            <w:tcW w:type="dxa" w:w="680"/>
+            <w:tcW w:type="dxa" w:w="850"/>
           </w:tcPr>
           <w:p>
             <w:r/>
@@ -3115,7 +5196,7 @@
         </w:tc>
         <w:tc>
           <w:tcPr>
-            <w:tcW w:type="dxa" w:w="1871"/>
+            <w:tcW w:type="dxa" w:w="1701"/>
           </w:tcPr>
           <w:p>
             <w:r/>
@@ -3128,7 +5209,7 @@
         </w:tc>
         <w:tc>
           <w:tcPr>
-            <w:tcW w:type="dxa" w:w="1474"/>
+            <w:tcW w:type="dxa" w:w="1417"/>
           </w:tcPr>
           <w:p>
             <w:r/>
@@ -3141,7 +5222,7 @@
         </w:tc>
         <w:tc>
           <w:tcPr>
-            <w:tcW w:type="dxa" w:w="2098"/>
+            <w:tcW w:type="dxa" w:w="1928"/>
           </w:tcPr>
           <w:p>
             <w:r/>
@@ -3169,7 +5250,7 @@
         </w:tc>
         <w:tc>
           <w:tcPr>
-            <w:tcW w:type="dxa" w:w="1871"/>
+            <w:tcW w:type="dxa" w:w="1814"/>
           </w:tcPr>
           <w:p>
             <w:r/>
@@ -3184,7 +5265,7 @@
       <w:tr>
         <w:tc>
           <w:tcPr>
-            <w:tcW w:type="dxa" w:w="680"/>
+            <w:tcW w:type="dxa" w:w="850"/>
           </w:tcPr>
           <w:p>
             <w:r/>
@@ -3198,7 +5279,7 @@
         </w:tc>
         <w:tc>
           <w:tcPr>
-            <w:tcW w:type="dxa" w:w="1871"/>
+            <w:tcW w:type="dxa" w:w="1701"/>
           </w:tcPr>
           <w:p>
             <w:r/>
@@ -3214,7 +5295,7 @@
         </w:tc>
         <w:tc>
           <w:tcPr>
-            <w:tcW w:type="dxa" w:w="1474"/>
+            <w:tcW w:type="dxa" w:w="1417"/>
           </w:tcPr>
           <w:p>
             <w:r/>
@@ -3228,7 +5309,7 @@
         </w:tc>
         <w:tc>
           <w:tcPr>
-            <w:tcW w:type="dxa" w:w="2098"/>
+            <w:tcW w:type="dxa" w:w="1928"/>
           </w:tcPr>
           <w:p>
             <w:r/>
@@ -3236,6 +5317,7 @@
               <w:rPr>
                 <w:sz w:val="22"/>
               </w:rPr>
+              <w:t>п. 16–22 Прил. 1</w:t>
             </w:r>
           </w:p>
         </w:tc>
@@ -3255,7 +5337,7 @@
         </w:tc>
         <w:tc>
           <w:tcPr>
-            <w:tcW w:type="dxa" w:w="1871"/>
+            <w:tcW w:type="dxa" w:w="1814"/>
           </w:tcPr>
           <w:p>
             <w:r/>
@@ -3271,7 +5353,7 @@
       <w:tr>
         <w:tc>
           <w:tcPr>
-            <w:tcW w:type="dxa" w:w="680"/>
+            <w:tcW w:type="dxa" w:w="850"/>
           </w:tcPr>
           <w:p>
             <w:r/>
@@ -3284,7 +5366,7 @@
         </w:tc>
         <w:tc>
           <w:tcPr>
-            <w:tcW w:type="dxa" w:w="1871"/>
+            <w:tcW w:type="dxa" w:w="1701"/>
           </w:tcPr>
           <w:p>
             <w:r/>
@@ -3297,7 +5379,7 @@
         </w:tc>
         <w:tc>
           <w:tcPr>
-            <w:tcW w:type="dxa" w:w="1474"/>
+            <w:tcW w:type="dxa" w:w="1417"/>
           </w:tcPr>
           <w:p>
             <w:r/>
@@ -3311,7 +5393,7 @@
         </w:tc>
         <w:tc>
           <w:tcPr>
-            <w:tcW w:type="dxa" w:w="2098"/>
+            <w:tcW w:type="dxa" w:w="1928"/>
           </w:tcPr>
           <w:p>
             <w:r/>
@@ -3319,6 +5401,7 @@
               <w:rPr>
                 <w:sz w:val="22"/>
               </w:rPr>
+              <w:t>п. 10–15 Прил. 1</w:t>
             </w:r>
           </w:p>
         </w:tc>
@@ -3338,7 +5421,7 @@
         </w:tc>
         <w:tc>
           <w:tcPr>
-            <w:tcW w:type="dxa" w:w="1871"/>
+            <w:tcW w:type="dxa" w:w="1814"/>
           </w:tcPr>
           <w:p>
             <w:r/>
@@ -3353,7 +5436,7 @@
       <w:tr>
         <w:tc>
           <w:tcPr>
-            <w:tcW w:type="dxa" w:w="680"/>
+            <w:tcW w:type="dxa" w:w="850"/>
           </w:tcPr>
           <w:p>
             <w:r/>
@@ -3366,7 +5449,7 @@
         </w:tc>
         <w:tc>
           <w:tcPr>
-            <w:tcW w:type="dxa" w:w="1871"/>
+            <w:tcW w:type="dxa" w:w="1701"/>
           </w:tcPr>
           <w:p>
             <w:r/>
@@ -3379,7 +5462,7 @@
         </w:tc>
         <w:tc>
           <w:tcPr>
-            <w:tcW w:type="dxa" w:w="1474"/>
+            <w:tcW w:type="dxa" w:w="1417"/>
           </w:tcPr>
           <w:p>
             <w:r/>
@@ -3392,7 +5475,7 @@
         </w:tc>
         <w:tc>
           <w:tcPr>
-            <w:tcW w:type="dxa" w:w="2098"/>
+            <w:tcW w:type="dxa" w:w="1928"/>
           </w:tcPr>
           <w:p>
             <w:r/>
@@ -3420,7 +5503,7 @@
         </w:tc>
         <w:tc>
           <w:tcPr>
-            <w:tcW w:type="dxa" w:w="1871"/>
+            <w:tcW w:type="dxa" w:w="1814"/>
           </w:tcPr>
           <w:p>
             <w:r/>
@@ -3435,7 +5518,7 @@
       <w:tr>
         <w:tc>
           <w:tcPr>
-            <w:tcW w:type="dxa" w:w="680"/>
+            <w:tcW w:type="dxa" w:w="850"/>
           </w:tcPr>
           <w:p>
             <w:r/>
@@ -3448,7 +5531,7 @@
         </w:tc>
         <w:tc>
           <w:tcPr>
-            <w:tcW w:type="dxa" w:w="1871"/>
+            <w:tcW w:type="dxa" w:w="1701"/>
           </w:tcPr>
           <w:p>
             <w:r/>
@@ -3461,7 +5544,7 @@
         </w:tc>
         <w:tc>
           <w:tcPr>
-            <w:tcW w:type="dxa" w:w="1474"/>
+            <w:tcW w:type="dxa" w:w="1417"/>
           </w:tcPr>
           <w:p>
             <w:r/>
@@ -3474,7 +5557,7 @@
         </w:tc>
         <w:tc>
           <w:tcPr>
-            <w:tcW w:type="dxa" w:w="2098"/>
+            <w:tcW w:type="dxa" w:w="1928"/>
           </w:tcPr>
           <w:p>
             <w:r/>
@@ -3502,7 +5585,7 @@
         </w:tc>
         <w:tc>
           <w:tcPr>
-            <w:tcW w:type="dxa" w:w="1871"/>
+            <w:tcW w:type="dxa" w:w="1814"/>
           </w:tcPr>
           <w:p>
             <w:r/>
@@ -3701,13 +5784,14 @@
         <w:tblStyle w:val="TableGrid"/>
         <w:tblW w:type="auto" w:w="0"/>
         <w:jc w:val="center"/>
+        <w:tblLayout w:type="fixed"/>
         <w:tblLook w:firstColumn="1" w:firstRow="1" w:lastColumn="0" w:lastRow="0" w:noHBand="0" w:noVBand="1" w:val="04A0"/>
       </w:tblPr>
       <w:tblGrid>
-        <w:gridCol w:w="2493"/>
-        <w:gridCol w:w="2493"/>
-        <w:gridCol w:w="2493"/>
-        <w:gridCol w:w="2493"/>
+        <w:gridCol w:w="567"/>
+        <w:gridCol w:w="2835"/>
+        <w:gridCol w:w="3969"/>
+        <w:gridCol w:w="1701"/>
       </w:tblGrid>
       <w:tr>
         <w:tc>

</xml_diff>

<commit_message>
Simplify contract to general wording: drop work list and per-address split
Total 180k RUB for 3 months across both addresses, paid in three equal monthly stages.

Co-Authored-By: Claude Opus 5.5 <noreply@anthropic.com>
Claude-Session: https://claude.ai/code/session_01HFBjH4MjwsHcLuC72w9pUK
</commit_message>
<xml_diff>
--- a/contracts/Договор_самозанятый_сантехника.docx
+++ b/contracts/Договор_самозанятый_сантехника.docx
@@ -124,7 +124,7 @@
         <w:rPr>
           <w:b w:val="0"/>
         </w:rPr>
-        <w:t>1.1. Исполнитель обязуется по заданию Заказчика выполнить сантехнические работы (далее — «Работы»), а Заказчик обязуется принять и оплатить результат Работ в порядке и на условиях настоящего Договора.</w:t>
+        <w:t>1.1. Исполнитель обязуется по заданию Заказчика выполнить комплекс сантехнических работ (демонтаж, монтаж, замена, ремонт и восстановление систем водоснабжения, канализации и сантехнического оборудования) (далее — «Работы»), а Заказчик обязуется принять и оплатить результат Работ в порядке и на условиях настоящего Договора.</w:t>
       </w:r>
     </w:p>
     <w:p>
@@ -137,7 +137,7 @@
         <w:rPr>
           <w:b w:val="0"/>
         </w:rPr>
-        <w:t>1.2. Работы выполняются в санузлах нежилых помещений салонов красоты, расположенных по адресам (далее — «Объекты»):</w:t>
+        <w:t>1.2. Работы выполняются в помещениях, расположенных по следующим адресам (далее — «Объекты»):</w:t>
       </w:r>
     </w:p>
     <w:p>
@@ -176,7 +176,7 @@
         <w:rPr>
           <w:b w:val="0"/>
         </w:rPr>
-        <w:t>1.3. Перечень, объём и состав Работ по каждому Объекту определяются в Техническом задании (Приложение № 1), являющемся неотъемлемой частью Договора.</w:t>
+        <w:t>1.3. Конкретный перечень, объём и очерёдность Работ на каждом Объекте определяются Заказчиком в ходе исполнения Договора путём выдачи заданий Исполнителю (в устной или письменной форме, в том числе по электронной почте или в мессенджерах) в пределах предмета Договора.</w:t>
       </w:r>
     </w:p>
     <w:p>
@@ -189,7 +189,7 @@
         <w:rPr>
           <w:b w:val="0"/>
         </w:rPr>
-        <w:t>1.4. Работы выполняются поэтапно. Состав этапов, сроки их выполнения и стоимость каждого этапа определены в Графике выполнения и оплаты работ (Приложение № 2).</w:t>
+        <w:t>1.4. Работы выполняются поэтапно. Сроки этапов и их стоимость определены в Графике выполнения и оплаты работ (Приложение № 1).</w:t>
       </w:r>
     </w:p>
     <w:p>
@@ -240,7 +240,7 @@
         <w:rPr>
           <w:b w:val="0"/>
         </w:rPr>
-        <w:t>2.2. Сроки начала и окончания каждого этапа указаны в Приложении № 2. Досрочное выполнение Работ (этапа) допускается по согласованию с Заказчиком.</w:t>
+        <w:t>2.2. Сроки начала и окончания каждого этапа указаны в Приложении № 1. Досрочное выполнение Работ (этапа) допускается по согласованию с Заказчиком.</w:t>
       </w:r>
     </w:p>
     <w:p>
@@ -278,33 +278,7 @@
         <w:rPr>
           <w:b w:val="0"/>
         </w:rPr>
-        <w:t>3.1. Общая стоимость Работ по Договору составляет 180 000 (сто восемьдесят тысяч) рублей 00 копеек. НДС не облагается в связи с применением Исполнителем специального налогового режима «Налог на профессиональный доход», в том числе:</w:t>
-      </w:r>
-    </w:p>
-    <w:p>
-      <w:pPr>
-        <w:spacing w:before="0"/>
-        <w:ind w:firstLine="567"/>
-        <w:jc w:val="both"/>
-      </w:pPr>
-      <w:r>
-        <w:rPr>
-          <w:b w:val="0"/>
-        </w:rPr>
-        <w:t>— по Объекту № 1 (г. Санкт-Петербург, ул. Дыбенко, д. 22, корп. 1) — 105 000 (сто пять тысяч) рублей 00 копеек (35 000 рублей в месяц);</w:t>
-      </w:r>
-    </w:p>
-    <w:p>
-      <w:pPr>
-        <w:spacing w:before="0"/>
-        <w:ind w:firstLine="567"/>
-        <w:jc w:val="both"/>
-      </w:pPr>
-      <w:r>
-        <w:rPr>
-          <w:b w:val="0"/>
-        </w:rPr>
-        <w:t>— по Объекту № 2 (г. Санкт-Петербург, Комендантский пр-т, д. 17, корп. 1) — 75 000 (семьдесят пять тысяч) рублей 00 копеек (25 000 рублей в месяц).</w:t>
+        <w:t>3.1. Общая стоимость Работ по Договору составляет 180 000 (сто восемьдесят тысяч) рублей 00 копеек. НДС не облагается в связи с применением Исполнителем специального налогового режима «Налог на профессиональный доход». Указанная стоимость включает Работы на обоих Объектах за весь срок выполнения Работ.</w:t>
       </w:r>
     </w:p>
     <w:p>
@@ -342,16 +316,14 @@
         <w:tblLook w:firstColumn="1" w:firstRow="1" w:lastColumn="0" w:lastRow="0" w:noHBand="0" w:noVBand="1" w:val="04A0"/>
       </w:tblPr>
       <w:tblGrid>
-        <w:gridCol w:w="737"/>
-        <w:gridCol w:w="2381"/>
-        <w:gridCol w:w="1984"/>
-        <w:gridCol w:w="2154"/>
-        <w:gridCol w:w="1814"/>
+        <w:gridCol w:w="1134"/>
+        <w:gridCol w:w="5669"/>
+        <w:gridCol w:w="2268"/>
       </w:tblGrid>
       <w:tr>
         <w:tc>
           <w:tcPr>
-            <w:tcW w:type="dxa" w:w="737"/>
+            <w:tcW w:type="dxa" w:w="1134"/>
           </w:tcPr>
           <w:p>
             <w:pPr>
@@ -369,7 +341,7 @@
         </w:tc>
         <w:tc>
           <w:tcPr>
-            <w:tcW w:type="dxa" w:w="2381"/>
+            <w:tcW w:type="dxa" w:w="5669"/>
           </w:tcPr>
           <w:p>
             <w:pPr>
@@ -381,13 +353,13 @@
                 <w:b/>
                 <w:sz w:val="22"/>
               </w:rPr>
-              <w:t>Период</w:t>
+              <w:t>Период выполнения</w:t>
             </w:r>
           </w:p>
         </w:tc>
         <w:tc>
           <w:tcPr>
-            <w:tcW w:type="dxa" w:w="1984"/>
+            <w:tcW w:type="dxa" w:w="2268"/>
           </w:tcPr>
           <w:p>
             <w:pPr>
@@ -399,47 +371,7 @@
                 <w:b/>
                 <w:sz w:val="22"/>
               </w:rPr>
-              <w:t>Объект № 1</w:t>
-              <w:br/>
-              <w:t>(ул. Дыбенко, 22 к.1), руб.</w:t>
-            </w:r>
-          </w:p>
-        </w:tc>
-        <w:tc>
-          <w:tcPr>
-            <w:tcW w:type="dxa" w:w="2154"/>
-          </w:tcPr>
-          <w:p>
-            <w:pPr>
-              <w:jc w:val="center"/>
-            </w:pPr>
-            <w:r/>
-            <w:r>
-              <w:rPr>
-                <w:b/>
-                <w:sz w:val="22"/>
-              </w:rPr>
-              <w:t>Объект № 2</w:t>
-              <w:br/>
-              <w:t>(Комендантский пр., 17 к.1), руб.</w:t>
-            </w:r>
-          </w:p>
-        </w:tc>
-        <w:tc>
-          <w:tcPr>
-            <w:tcW w:type="dxa" w:w="1814"/>
-          </w:tcPr>
-          <w:p>
-            <w:pPr>
-              <w:jc w:val="center"/>
-            </w:pPr>
-            <w:r/>
-            <w:r>
-              <w:rPr>
-                <w:b/>
-                <w:sz w:val="22"/>
-              </w:rPr>
-              <w:t>Итого за этап, руб.</w:t>
+              <w:t>Сумма, руб.</w:t>
             </w:r>
           </w:p>
         </w:tc>
@@ -447,7 +379,7 @@
       <w:tr>
         <w:tc>
           <w:tcPr>
-            <w:tcW w:type="dxa" w:w="737"/>
+            <w:tcW w:type="dxa" w:w="1134"/>
           </w:tcPr>
           <w:p>
             <w:r/>
@@ -461,7 +393,7 @@
         </w:tc>
         <w:tc>
           <w:tcPr>
-            <w:tcW w:type="dxa" w:w="2381"/>
+            <w:tcW w:type="dxa" w:w="5669"/>
           </w:tcPr>
           <w:p>
             <w:r/>
@@ -475,35 +407,7 @@
         </w:tc>
         <w:tc>
           <w:tcPr>
-            <w:tcW w:type="dxa" w:w="1984"/>
-          </w:tcPr>
-          <w:p>
-            <w:r/>
-            <w:r>
-              <w:rPr>
-                <w:sz w:val="22"/>
-              </w:rPr>
-              <w:t>35 000,00</w:t>
-            </w:r>
-          </w:p>
-        </w:tc>
-        <w:tc>
-          <w:tcPr>
-            <w:tcW w:type="dxa" w:w="2154"/>
-          </w:tcPr>
-          <w:p>
-            <w:r/>
-            <w:r>
-              <w:rPr>
-                <w:sz w:val="22"/>
-              </w:rPr>
-              <w:t>25 000,00</w:t>
-            </w:r>
-          </w:p>
-        </w:tc>
-        <w:tc>
-          <w:tcPr>
-            <w:tcW w:type="dxa" w:w="1814"/>
+            <w:tcW w:type="dxa" w:w="2268"/>
           </w:tcPr>
           <w:p>
             <w:r/>
@@ -519,7 +423,7 @@
       <w:tr>
         <w:tc>
           <w:tcPr>
-            <w:tcW w:type="dxa" w:w="737"/>
+            <w:tcW w:type="dxa" w:w="1134"/>
           </w:tcPr>
           <w:p>
             <w:r/>
@@ -533,7 +437,7 @@
         </w:tc>
         <w:tc>
           <w:tcPr>
-            <w:tcW w:type="dxa" w:w="2381"/>
+            <w:tcW w:type="dxa" w:w="5669"/>
           </w:tcPr>
           <w:p>
             <w:r/>
@@ -547,35 +451,7 @@
         </w:tc>
         <w:tc>
           <w:tcPr>
-            <w:tcW w:type="dxa" w:w="1984"/>
-          </w:tcPr>
-          <w:p>
-            <w:r/>
-            <w:r>
-              <w:rPr>
-                <w:sz w:val="22"/>
-              </w:rPr>
-              <w:t>35 000,00</w:t>
-            </w:r>
-          </w:p>
-        </w:tc>
-        <w:tc>
-          <w:tcPr>
-            <w:tcW w:type="dxa" w:w="2154"/>
-          </w:tcPr>
-          <w:p>
-            <w:r/>
-            <w:r>
-              <w:rPr>
-                <w:sz w:val="22"/>
-              </w:rPr>
-              <w:t>25 000,00</w:t>
-            </w:r>
-          </w:p>
-        </w:tc>
-        <w:tc>
-          <w:tcPr>
-            <w:tcW w:type="dxa" w:w="1814"/>
+            <w:tcW w:type="dxa" w:w="2268"/>
           </w:tcPr>
           <w:p>
             <w:r/>
@@ -591,7 +467,7 @@
       <w:tr>
         <w:tc>
           <w:tcPr>
-            <w:tcW w:type="dxa" w:w="737"/>
+            <w:tcW w:type="dxa" w:w="1134"/>
           </w:tcPr>
           <w:p>
             <w:r/>
@@ -605,7 +481,7 @@
         </w:tc>
         <w:tc>
           <w:tcPr>
-            <w:tcW w:type="dxa" w:w="2381"/>
+            <w:tcW w:type="dxa" w:w="5669"/>
           </w:tcPr>
           <w:p>
             <w:r/>
@@ -619,35 +495,7 @@
         </w:tc>
         <w:tc>
           <w:tcPr>
-            <w:tcW w:type="dxa" w:w="1984"/>
-          </w:tcPr>
-          <w:p>
-            <w:r/>
-            <w:r>
-              <w:rPr>
-                <w:sz w:val="22"/>
-              </w:rPr>
-              <w:t>35 000,00</w:t>
-            </w:r>
-          </w:p>
-        </w:tc>
-        <w:tc>
-          <w:tcPr>
-            <w:tcW w:type="dxa" w:w="2154"/>
-          </w:tcPr>
-          <w:p>
-            <w:r/>
-            <w:r>
-              <w:rPr>
-                <w:sz w:val="22"/>
-              </w:rPr>
-              <w:t>25 000,00</w:t>
-            </w:r>
-          </w:p>
-        </w:tc>
-        <w:tc>
-          <w:tcPr>
-            <w:tcW w:type="dxa" w:w="1814"/>
+            <w:tcW w:type="dxa" w:w="2268"/>
           </w:tcPr>
           <w:p>
             <w:r/>
@@ -663,7 +511,7 @@
       <w:tr>
         <w:tc>
           <w:tcPr>
-            <w:tcW w:type="dxa" w:w="737"/>
+            <w:tcW w:type="dxa" w:w="1134"/>
           </w:tcPr>
           <w:p>
             <w:r/>
@@ -676,7 +524,7 @@
         </w:tc>
         <w:tc>
           <w:tcPr>
-            <w:tcW w:type="dxa" w:w="2381"/>
+            <w:tcW w:type="dxa" w:w="5669"/>
           </w:tcPr>
           <w:p>
             <w:r/>
@@ -690,35 +538,7 @@
         </w:tc>
         <w:tc>
           <w:tcPr>
-            <w:tcW w:type="dxa" w:w="1984"/>
-          </w:tcPr>
-          <w:p>
-            <w:r/>
-            <w:r>
-              <w:rPr>
-                <w:sz w:val="22"/>
-              </w:rPr>
-              <w:t>105 000,00</w:t>
-            </w:r>
-          </w:p>
-        </w:tc>
-        <w:tc>
-          <w:tcPr>
-            <w:tcW w:type="dxa" w:w="2154"/>
-          </w:tcPr>
-          <w:p>
-            <w:r/>
-            <w:r>
-              <w:rPr>
-                <w:sz w:val="22"/>
-              </w:rPr>
-              <w:t>75 000,00</w:t>
-            </w:r>
-          </w:p>
-        </w:tc>
-        <w:tc>
-          <w:tcPr>
-            <w:tcW w:type="dxa" w:w="1814"/>
+            <w:tcW w:type="dxa" w:w="2268"/>
           </w:tcPr>
           <w:p>
             <w:r/>
@@ -754,7 +574,7 @@
         <w:rPr>
           <w:b w:val="0"/>
         </w:rPr>
-        <w:t>3.4. Оплата каждого этапа производится в течение 5 (пяти) рабочих дней с даты подписания Сторонами акта сдачи-приёмки выполненных работ по соответствующему этапу (Приложение № 3) и получения от Исполнителя чека, сформированного в соответствии с п. 3.6 Договора.</w:t>
+        <w:t>3.4. Оплата каждого этапа производится в течение 5 (пяти) рабочих дней с даты подписания Сторонами акта сдачи-приёмки выполненных работ по соответствующему этапу (Приложение № 2) и получения от Исполнителя чека, сформированного в соответствии с п. 3.6 Договора.</w:t>
       </w:r>
     </w:p>
     <w:p>
@@ -806,7 +626,7 @@
         <w:rPr>
           <w:b w:val="0"/>
         </w:rPr>
-        <w:t>3.8. Работы, не предусмотренные Приложением № 1, выполняются только на основании дополнительного соглашения Сторон с указанием их стоимости и сроков.</w:t>
+        <w:t>3.8. Работы, выходящие за пределы предмета Договора, а также работы сверх установленного срока выполняются только на основании дополнительного соглашения Сторон с указанием их стоимости и сроков.</w:t>
       </w:r>
     </w:p>
     <w:p>
@@ -844,7 +664,7 @@
         <w:rPr>
           <w:b w:val="0"/>
         </w:rPr>
-        <w:t>4.1.1. Выполнить Работы качественно, в соответствии с Техническим заданием, действующими строительными нормами и правилами (СП, ГОСТ) и в сроки, установленные Договором.</w:t>
+        <w:t>4.1.1. Выполнить Работы качественно, в соответствии с заданиями Заказчика, действующими строительными нормами и правилами (СП, ГОСТ) и в сроки, установленные Договором.</w:t>
       </w:r>
     </w:p>
     <w:p>
@@ -909,7 +729,7 @@
         <w:rPr>
           <w:b w:val="0"/>
         </w:rPr>
-        <w:t>4.1.6. Согласовывать с Заказчиком не позднее чем за 1 (один) рабочий день время работ, требующих отключения воды или сопровождающихся шумом, и выполнять их так, чтобы не препятствовать работе салонов красоты.</w:t>
+        <w:t>4.1.6. Согласовывать с Заказчиком не позднее чем за 1 (один) рабочий день время работ, требующих отключения воды или сопровождающихся шумом, и по возможности выполнять их так, чтобы не препятствовать деятельности Заказчика.</w:t>
       </w:r>
     </w:p>
     <w:p>
@@ -1025,7 +845,7 @@
         <w:rPr>
           <w:b w:val="0"/>
         </w:rPr>
-        <w:t>5.1. По завершении каждого этапа Исполнитель уведомляет Заказчика о готовности результата Работ и передаёт ему подписанный со своей стороны акт сдачи-приёмки выполненных работ (Приложение № 3).</w:t>
+        <w:t>5.1. По завершении каждого этапа Исполнитель уведомляет Заказчика о готовности результата Работ и передаёт ему подписанный со своей стороны акт сдачи-приёмки выполненных работ (Приложение № 2).</w:t>
       </w:r>
     </w:p>
     <w:p>
@@ -1384,7 +1204,7 @@
         <w:rPr>
           <w:b w:val="0"/>
         </w:rPr>
-        <w:t>Приложение № 1 — Техническое задание (перечень работ по Объектам);</w:t>
+        <w:t>Приложение № 1 — График выполнения и оплаты работ;</w:t>
       </w:r>
     </w:p>
     <w:p>
@@ -1397,20 +1217,7 @@
         <w:rPr>
           <w:b w:val="0"/>
         </w:rPr>
-        <w:t>Приложение № 2 — График выполнения и оплаты работ;</w:t>
-      </w:r>
-    </w:p>
-    <w:p>
-      <w:pPr>
-        <w:spacing w:before="0"/>
-        <w:ind w:firstLine="567"/>
-        <w:jc w:val="both"/>
-      </w:pPr>
-      <w:r>
-        <w:rPr>
-          <w:b w:val="0"/>
-        </w:rPr>
-        <w:t>Приложение № 3 — Форма акта сдачи-приёмки выполненных работ.</w:t>
+        <w:t>Приложение № 2 — Форма акта сдачи-приёмки выполненных работ.</w:t>
       </w:r>
     </w:p>
     <w:p>
@@ -1539,46 +1346,7 @@
         <w:rPr>
           <w:b/>
         </w:rPr>
-        <w:t>ТЕХНИЧЕСКОЕ ЗАДАНИЕ</w:t>
-        <w:br/>
-        <w:t>(перечень сантехнических работ)</w:t>
-      </w:r>
-    </w:p>
-    <w:p>
-      <w:pPr>
-        <w:spacing w:before="0"/>
-        <w:ind w:firstLine="567"/>
-        <w:jc w:val="both"/>
-      </w:pPr>
-      <w:r>
-        <w:rPr>
-          <w:b w:val="0"/>
-        </w:rPr>
-        <w:t>Объекты — санузлы в нежилых помещениях салонов красоты. Работы выполняются без остановки деятельности салонов: работы с отключением воды и шумные работы проводятся в нерабочие часы салона либо в согласованное с Заказчиком время.</w:t>
-      </w:r>
-    </w:p>
-    <w:p>
-      <w:pPr>
-        <w:spacing w:before="120"/>
-        <w:jc w:val="left"/>
-      </w:pPr>
-      <w:r>
-        <w:rPr>
-          <w:b/>
-        </w:rPr>
-        <w:t>Объект № 1: г. Санкт-Петербург, ул. Дыбенко, д. 22, корп. 1</w:t>
-      </w:r>
-    </w:p>
-    <w:p>
-      <w:pPr>
-        <w:spacing w:before="0"/>
-        <w:jc w:val="left"/>
-      </w:pPr>
-      <w:r>
-        <w:rPr>
-          <w:b w:val="0"/>
-        </w:rPr>
-        <w:t>Замена санузла (полная замена инженерных систем и сантехприборов)</w:t>
+        <w:t>ГРАФИК ВЫПОЛНЕНИЯ И ОПЛАТЫ РАБОТ</w:t>
       </w:r>
     </w:p>
     <w:tbl>
@@ -1590,85 +1358,13 @@
         <w:tblLook w:firstColumn="1" w:firstRow="1" w:lastColumn="0" w:lastRow="0" w:noHBand="0" w:noVBand="1" w:val="04A0"/>
       </w:tblPr>
       <w:tblGrid>
-        <w:gridCol w:w="567"/>
-        <w:gridCol w:w="5669"/>
-        <w:gridCol w:w="1020"/>
-        <w:gridCol w:w="964"/>
         <w:gridCol w:w="850"/>
+        <w:gridCol w:w="2438"/>
+        <w:gridCol w:w="1247"/>
+        <w:gridCol w:w="1701"/>
+        <w:gridCol w:w="2835"/>
       </w:tblGrid>
       <w:tr>
-        <w:tc>
-          <w:tcPr>
-            <w:tcW w:type="dxa" w:w="567"/>
-          </w:tcPr>
-          <w:p>
-            <w:pPr>
-              <w:jc w:val="center"/>
-            </w:pPr>
-            <w:r/>
-            <w:r>
-              <w:rPr>
-                <w:b/>
-                <w:sz w:val="22"/>
-              </w:rPr>
-              <w:t>№</w:t>
-            </w:r>
-          </w:p>
-        </w:tc>
-        <w:tc>
-          <w:tcPr>
-            <w:tcW w:type="dxa" w:w="5669"/>
-          </w:tcPr>
-          <w:p>
-            <w:pPr>
-              <w:jc w:val="center"/>
-            </w:pPr>
-            <w:r/>
-            <w:r>
-              <w:rPr>
-                <w:b/>
-                <w:sz w:val="22"/>
-              </w:rPr>
-              <w:t>Наименование работ</w:t>
-            </w:r>
-          </w:p>
-        </w:tc>
-        <w:tc>
-          <w:tcPr>
-            <w:tcW w:type="dxa" w:w="1020"/>
-          </w:tcPr>
-          <w:p>
-            <w:pPr>
-              <w:jc w:val="center"/>
-            </w:pPr>
-            <w:r/>
-            <w:r>
-              <w:rPr>
-                <w:b/>
-                <w:sz w:val="22"/>
-              </w:rPr>
-              <w:t>Ед. изм.</w:t>
-            </w:r>
-          </w:p>
-        </w:tc>
-        <w:tc>
-          <w:tcPr>
-            <w:tcW w:type="dxa" w:w="964"/>
-          </w:tcPr>
-          <w:p>
-            <w:pPr>
-              <w:jc w:val="center"/>
-            </w:pPr>
-            <w:r/>
-            <w:r>
-              <w:rPr>
-                <w:b/>
-                <w:sz w:val="22"/>
-              </w:rPr>
-              <w:t>Кол-во</w:t>
-            </w:r>
-          </w:p>
-        </w:tc>
         <w:tc>
           <w:tcPr>
             <w:tcW w:type="dxa" w:w="850"/>
@@ -1687,64 +1383,80 @@
             </w:r>
           </w:p>
         </w:tc>
-      </w:tr>
-      <w:tr>
         <w:tc>
           <w:tcPr>
-            <w:tcW w:type="dxa" w:w="567"/>
+            <w:tcW w:type="dxa" w:w="2438"/>
           </w:tcPr>
           <w:p>
+            <w:pPr>
+              <w:jc w:val="center"/>
+            </w:pPr>
             <w:r/>
             <w:r>
               <w:rPr>
+                <w:b/>
                 <w:sz w:val="22"/>
               </w:rPr>
-              <w:t>1</w:t>
+              <w:t>Срок выполнения</w:t>
             </w:r>
           </w:p>
         </w:tc>
         <w:tc>
           <w:tcPr>
-            <w:tcW w:type="dxa" w:w="5669"/>
+            <w:tcW w:type="dxa" w:w="1247"/>
           </w:tcPr>
           <w:p>
+            <w:pPr>
+              <w:jc w:val="center"/>
+            </w:pPr>
             <w:r/>
             <w:r>
               <w:rPr>
+                <w:b/>
                 <w:sz w:val="22"/>
               </w:rPr>
-              <w:t>Обследование санузла, замеры, согласование с Заказчиком схемы разводки и расстановки приборов</w:t>
+              <w:t>Объекты</w:t>
             </w:r>
           </w:p>
         </w:tc>
         <w:tc>
           <w:tcPr>
-            <w:tcW w:type="dxa" w:w="1020"/>
+            <w:tcW w:type="dxa" w:w="1701"/>
           </w:tcPr>
           <w:p>
+            <w:pPr>
+              <w:jc w:val="center"/>
+            </w:pPr>
             <w:r/>
             <w:r>
               <w:rPr>
+                <w:b/>
                 <w:sz w:val="22"/>
               </w:rPr>
-              <w:t>компл.</w:t>
+              <w:t>Стоимость, руб.</w:t>
             </w:r>
           </w:p>
         </w:tc>
         <w:tc>
           <w:tcPr>
-            <w:tcW w:type="dxa" w:w="964"/>
+            <w:tcW w:type="dxa" w:w="2835"/>
           </w:tcPr>
           <w:p>
+            <w:pPr>
+              <w:jc w:val="center"/>
+            </w:pPr>
             <w:r/>
             <w:r>
               <w:rPr>
+                <w:b/>
                 <w:sz w:val="22"/>
               </w:rPr>
-              <w:t>1</w:t>
+              <w:t>Срок оплаты</w:t>
             </w:r>
           </w:p>
         </w:tc>
+      </w:tr>
+      <w:tr>
         <w:tc>
           <w:tcPr>
             <w:tcW w:type="dxa" w:w="850"/>
@@ -1759,11 +1471,9 @@
             </w:r>
           </w:p>
         </w:tc>
-      </w:tr>
-      <w:tr>
         <w:tc>
           <w:tcPr>
-            <w:tcW w:type="dxa" w:w="567"/>
+            <w:tcW w:type="dxa" w:w="2438"/>
           </w:tcPr>
           <w:p>
             <w:r/>
@@ -1771,13 +1481,15 @@
               <w:rPr>
                 <w:sz w:val="22"/>
               </w:rPr>
-              <w:t>2</w:t>
+              <w:t>1-й месяц:</w:t>
+              <w:br/>
+              <w:t>с «__»_______ по «__»_______</w:t>
             </w:r>
           </w:p>
         </w:tc>
         <w:tc>
           <w:tcPr>
-            <w:tcW w:type="dxa" w:w="5669"/>
+            <w:tcW w:type="dxa" w:w="1247"/>
           </w:tcPr>
           <w:p>
             <w:r/>
@@ -1785,13 +1497,13 @@
               <w:rPr>
                 <w:sz w:val="22"/>
               </w:rPr>
-              <w:t>Перекрытие подачи воды, в т. ч. по согласованию с управляющей компанией</w:t>
+              <w:t>№ 1, № 2</w:t>
             </w:r>
           </w:p>
         </w:tc>
         <w:tc>
           <w:tcPr>
-            <w:tcW w:type="dxa" w:w="1020"/>
+            <w:tcW w:type="dxa" w:w="1701"/>
           </w:tcPr>
           <w:p>
             <w:r/>
@@ -1799,13 +1511,13 @@
               <w:rPr>
                 <w:sz w:val="22"/>
               </w:rPr>
-              <w:t>компл.</w:t>
+              <w:t>60 000,00</w:t>
             </w:r>
           </w:p>
         </w:tc>
         <w:tc>
           <w:tcPr>
-            <w:tcW w:type="dxa" w:w="964"/>
+            <w:tcW w:type="dxa" w:w="2835"/>
           </w:tcPr>
           <w:p>
             <w:r/>
@@ -1813,514 +1525,12 @@
               <w:rPr>
                 <w:sz w:val="22"/>
               </w:rPr>
-              <w:t>1</w:t>
-            </w:r>
-          </w:p>
-        </w:tc>
-        <w:tc>
-          <w:tcPr>
-            <w:tcW w:type="dxa" w:w="850"/>
-          </w:tcPr>
-          <w:p>
-            <w:r/>
-            <w:r>
-              <w:rPr>
-                <w:sz w:val="22"/>
-              </w:rPr>
-              <w:t>1</w:t>
+              <w:t>в течение 5 раб. дней после подписания акта по этапу 1</w:t>
             </w:r>
           </w:p>
         </w:tc>
       </w:tr>
       <w:tr>
-        <w:tc>
-          <w:tcPr>
-            <w:tcW w:type="dxa" w:w="567"/>
-          </w:tcPr>
-          <w:p>
-            <w:r/>
-            <w:r>
-              <w:rPr>
-                <w:sz w:val="22"/>
-              </w:rPr>
-              <w:t>3</w:t>
-            </w:r>
-          </w:p>
-        </w:tc>
-        <w:tc>
-          <w:tcPr>
-            <w:tcW w:type="dxa" w:w="5669"/>
-          </w:tcPr>
-          <w:p>
-            <w:r/>
-            <w:r>
-              <w:rPr>
-                <w:sz w:val="22"/>
-              </w:rPr>
-              <w:t>Демонтаж унитаза</w:t>
-            </w:r>
-          </w:p>
-        </w:tc>
-        <w:tc>
-          <w:tcPr>
-            <w:tcW w:type="dxa" w:w="1020"/>
-          </w:tcPr>
-          <w:p>
-            <w:r/>
-            <w:r>
-              <w:rPr>
-                <w:sz w:val="22"/>
-              </w:rPr>
-              <w:t>шт.</w:t>
-            </w:r>
-          </w:p>
-        </w:tc>
-        <w:tc>
-          <w:tcPr>
-            <w:tcW w:type="dxa" w:w="964"/>
-          </w:tcPr>
-          <w:p>
-            <w:r/>
-            <w:r>
-              <w:rPr>
-                <w:sz w:val="22"/>
-              </w:rPr>
-              <w:t>1</w:t>
-            </w:r>
-          </w:p>
-        </w:tc>
-        <w:tc>
-          <w:tcPr>
-            <w:tcW w:type="dxa" w:w="850"/>
-          </w:tcPr>
-          <w:p>
-            <w:r/>
-            <w:r>
-              <w:rPr>
-                <w:sz w:val="22"/>
-              </w:rPr>
-              <w:t>1</w:t>
-            </w:r>
-          </w:p>
-        </w:tc>
-      </w:tr>
-      <w:tr>
-        <w:tc>
-          <w:tcPr>
-            <w:tcW w:type="dxa" w:w="567"/>
-          </w:tcPr>
-          <w:p>
-            <w:r/>
-            <w:r>
-              <w:rPr>
-                <w:sz w:val="22"/>
-              </w:rPr>
-              <w:t>4</w:t>
-            </w:r>
-          </w:p>
-        </w:tc>
-        <w:tc>
-          <w:tcPr>
-            <w:tcW w:type="dxa" w:w="5669"/>
-          </w:tcPr>
-          <w:p>
-            <w:r/>
-            <w:r>
-              <w:rPr>
-                <w:sz w:val="22"/>
-              </w:rPr>
-              <w:t>Демонтаж раковины со смесителем и сифоном</w:t>
-            </w:r>
-          </w:p>
-        </w:tc>
-        <w:tc>
-          <w:tcPr>
-            <w:tcW w:type="dxa" w:w="1020"/>
-          </w:tcPr>
-          <w:p>
-            <w:r/>
-            <w:r>
-              <w:rPr>
-                <w:sz w:val="22"/>
-              </w:rPr>
-              <w:t>шт.</w:t>
-            </w:r>
-          </w:p>
-        </w:tc>
-        <w:tc>
-          <w:tcPr>
-            <w:tcW w:type="dxa" w:w="964"/>
-          </w:tcPr>
-          <w:p>
-            <w:r/>
-            <w:r>
-              <w:rPr>
-                <w:sz w:val="22"/>
-              </w:rPr>
-              <w:t>1</w:t>
-            </w:r>
-          </w:p>
-        </w:tc>
-        <w:tc>
-          <w:tcPr>
-            <w:tcW w:type="dxa" w:w="850"/>
-          </w:tcPr>
-          <w:p>
-            <w:r/>
-            <w:r>
-              <w:rPr>
-                <w:sz w:val="22"/>
-              </w:rPr>
-              <w:t>1</w:t>
-            </w:r>
-          </w:p>
-        </w:tc>
-      </w:tr>
-      <w:tr>
-        <w:tc>
-          <w:tcPr>
-            <w:tcW w:type="dxa" w:w="567"/>
-          </w:tcPr>
-          <w:p>
-            <w:r/>
-            <w:r>
-              <w:rPr>
-                <w:sz w:val="22"/>
-              </w:rPr>
-              <w:t>5</w:t>
-            </w:r>
-          </w:p>
-        </w:tc>
-        <w:tc>
-          <w:tcPr>
-            <w:tcW w:type="dxa" w:w="5669"/>
-          </w:tcPr>
-          <w:p>
-            <w:r/>
-            <w:r>
-              <w:rPr>
-                <w:sz w:val="22"/>
-              </w:rPr>
-              <w:t>Демонтаж старого водонагревателя / полотенцесушителя (при наличии)</w:t>
-            </w:r>
-          </w:p>
-        </w:tc>
-        <w:tc>
-          <w:tcPr>
-            <w:tcW w:type="dxa" w:w="1020"/>
-          </w:tcPr>
-          <w:p>
-            <w:r/>
-            <w:r>
-              <w:rPr>
-                <w:sz w:val="22"/>
-              </w:rPr>
-              <w:t>шт.</w:t>
-            </w:r>
-          </w:p>
-        </w:tc>
-        <w:tc>
-          <w:tcPr>
-            <w:tcW w:type="dxa" w:w="964"/>
-          </w:tcPr>
-          <w:p>
-            <w:r/>
-            <w:r>
-              <w:rPr>
-                <w:sz w:val="22"/>
-              </w:rPr>
-              <w:t>1</w:t>
-            </w:r>
-          </w:p>
-        </w:tc>
-        <w:tc>
-          <w:tcPr>
-            <w:tcW w:type="dxa" w:w="850"/>
-          </w:tcPr>
-          <w:p>
-            <w:r/>
-            <w:r>
-              <w:rPr>
-                <w:sz w:val="22"/>
-              </w:rPr>
-              <w:t>1</w:t>
-            </w:r>
-          </w:p>
-        </w:tc>
-      </w:tr>
-      <w:tr>
-        <w:tc>
-          <w:tcPr>
-            <w:tcW w:type="dxa" w:w="567"/>
-          </w:tcPr>
-          <w:p>
-            <w:r/>
-            <w:r>
-              <w:rPr>
-                <w:sz w:val="22"/>
-              </w:rPr>
-              <w:t>6</w:t>
-            </w:r>
-          </w:p>
-        </w:tc>
-        <w:tc>
-          <w:tcPr>
-            <w:tcW w:type="dxa" w:w="5669"/>
-          </w:tcPr>
-          <w:p>
-            <w:r/>
-            <w:r>
-              <w:rPr>
-                <w:sz w:val="22"/>
-              </w:rPr>
-              <w:t>Демонтаж старых трубопроводов холодного и горячего водоснабжения (ХВС, ГВС)</w:t>
-            </w:r>
-          </w:p>
-        </w:tc>
-        <w:tc>
-          <w:tcPr>
-            <w:tcW w:type="dxa" w:w="1020"/>
-          </w:tcPr>
-          <w:p>
-            <w:r/>
-            <w:r>
-              <w:rPr>
-                <w:sz w:val="22"/>
-              </w:rPr>
-              <w:t>м.п.</w:t>
-            </w:r>
-          </w:p>
-        </w:tc>
-        <w:tc>
-          <w:tcPr>
-            <w:tcW w:type="dxa" w:w="964"/>
-          </w:tcPr>
-          <w:p>
-            <w:r/>
-            <w:r>
-              <w:rPr>
-                <w:sz w:val="22"/>
-              </w:rPr>
-              <w:t>15</w:t>
-            </w:r>
-          </w:p>
-        </w:tc>
-        <w:tc>
-          <w:tcPr>
-            <w:tcW w:type="dxa" w:w="850"/>
-          </w:tcPr>
-          <w:p>
-            <w:r/>
-            <w:r>
-              <w:rPr>
-                <w:sz w:val="22"/>
-              </w:rPr>
-              <w:t>1</w:t>
-            </w:r>
-          </w:p>
-        </w:tc>
-      </w:tr>
-      <w:tr>
-        <w:tc>
-          <w:tcPr>
-            <w:tcW w:type="dxa" w:w="567"/>
-          </w:tcPr>
-          <w:p>
-            <w:r/>
-            <w:r>
-              <w:rPr>
-                <w:sz w:val="22"/>
-              </w:rPr>
-              <w:t>7</w:t>
-            </w:r>
-          </w:p>
-        </w:tc>
-        <w:tc>
-          <w:tcPr>
-            <w:tcW w:type="dxa" w:w="5669"/>
-          </w:tcPr>
-          <w:p>
-            <w:r/>
-            <w:r>
-              <w:rPr>
-                <w:sz w:val="22"/>
-              </w:rPr>
-              <w:t>Демонтаж старых канализационных трубопроводов</w:t>
-            </w:r>
-          </w:p>
-        </w:tc>
-        <w:tc>
-          <w:tcPr>
-            <w:tcW w:type="dxa" w:w="1020"/>
-          </w:tcPr>
-          <w:p>
-            <w:r/>
-            <w:r>
-              <w:rPr>
-                <w:sz w:val="22"/>
-              </w:rPr>
-              <w:t>м.п.</w:t>
-            </w:r>
-          </w:p>
-        </w:tc>
-        <w:tc>
-          <w:tcPr>
-            <w:tcW w:type="dxa" w:w="964"/>
-          </w:tcPr>
-          <w:p>
-            <w:r/>
-            <w:r>
-              <w:rPr>
-                <w:sz w:val="22"/>
-              </w:rPr>
-              <w:t>8</w:t>
-            </w:r>
-          </w:p>
-        </w:tc>
-        <w:tc>
-          <w:tcPr>
-            <w:tcW w:type="dxa" w:w="850"/>
-          </w:tcPr>
-          <w:p>
-            <w:r/>
-            <w:r>
-              <w:rPr>
-                <w:sz w:val="22"/>
-              </w:rPr>
-              <w:t>1</w:t>
-            </w:r>
-          </w:p>
-        </w:tc>
-      </w:tr>
-      <w:tr>
-        <w:tc>
-          <w:tcPr>
-            <w:tcW w:type="dxa" w:w="567"/>
-          </w:tcPr>
-          <w:p>
-            <w:r/>
-            <w:r>
-              <w:rPr>
-                <w:sz w:val="22"/>
-              </w:rPr>
-              <w:t>8</w:t>
-            </w:r>
-          </w:p>
-        </w:tc>
-        <w:tc>
-          <w:tcPr>
-            <w:tcW w:type="dxa" w:w="5669"/>
-          </w:tcPr>
-          <w:p>
-            <w:r/>
-            <w:r>
-              <w:rPr>
-                <w:sz w:val="22"/>
-              </w:rPr>
-              <w:t>Вынос и вывоз демонтированных изделий и строительного мусора</w:t>
-            </w:r>
-          </w:p>
-        </w:tc>
-        <w:tc>
-          <w:tcPr>
-            <w:tcW w:type="dxa" w:w="1020"/>
-          </w:tcPr>
-          <w:p>
-            <w:r/>
-            <w:r>
-              <w:rPr>
-                <w:sz w:val="22"/>
-              </w:rPr>
-              <w:t>компл.</w:t>
-            </w:r>
-          </w:p>
-        </w:tc>
-        <w:tc>
-          <w:tcPr>
-            <w:tcW w:type="dxa" w:w="964"/>
-          </w:tcPr>
-          <w:p>
-            <w:r/>
-            <w:r>
-              <w:rPr>
-                <w:sz w:val="22"/>
-              </w:rPr>
-              <w:t>1</w:t>
-            </w:r>
-          </w:p>
-        </w:tc>
-        <w:tc>
-          <w:tcPr>
-            <w:tcW w:type="dxa" w:w="850"/>
-          </w:tcPr>
-          <w:p>
-            <w:r/>
-            <w:r>
-              <w:rPr>
-                <w:sz w:val="22"/>
-              </w:rPr>
-              <w:t>1</w:t>
-            </w:r>
-          </w:p>
-        </w:tc>
-      </w:tr>
-      <w:tr>
-        <w:tc>
-          <w:tcPr>
-            <w:tcW w:type="dxa" w:w="567"/>
-          </w:tcPr>
-          <w:p>
-            <w:r/>
-            <w:r>
-              <w:rPr>
-                <w:sz w:val="22"/>
-              </w:rPr>
-              <w:t>9</w:t>
-            </w:r>
-          </w:p>
-        </w:tc>
-        <w:tc>
-          <w:tcPr>
-            <w:tcW w:type="dxa" w:w="5669"/>
-          </w:tcPr>
-          <w:p>
-            <w:r/>
-            <w:r>
-              <w:rPr>
-                <w:sz w:val="22"/>
-              </w:rPr>
-              <w:t>Замена отсечных шаровых кранов на отводах от стояков ХВС и ГВС</w:t>
-            </w:r>
-          </w:p>
-        </w:tc>
-        <w:tc>
-          <w:tcPr>
-            <w:tcW w:type="dxa" w:w="1020"/>
-          </w:tcPr>
-          <w:p>
-            <w:r/>
-            <w:r>
-              <w:rPr>
-                <w:sz w:val="22"/>
-              </w:rPr>
-              <w:t>шт.</w:t>
-            </w:r>
-          </w:p>
-        </w:tc>
-        <w:tc>
-          <w:tcPr>
-            <w:tcW w:type="dxa" w:w="964"/>
-          </w:tcPr>
-          <w:p>
-            <w:r/>
-            <w:r>
-              <w:rPr>
-                <w:sz w:val="22"/>
-              </w:rPr>
-              <w:t>2</w:t>
-            </w:r>
-          </w:p>
-        </w:tc>
         <w:tc>
           <w:tcPr>
             <w:tcW w:type="dxa" w:w="850"/>
@@ -2335,11 +1545,9 @@
             </w:r>
           </w:p>
         </w:tc>
-      </w:tr>
-      <w:tr>
         <w:tc>
           <w:tcPr>
-            <w:tcW w:type="dxa" w:w="567"/>
+            <w:tcW w:type="dxa" w:w="2438"/>
           </w:tcPr>
           <w:p>
             <w:r/>
@@ -2347,13 +1555,15 @@
               <w:rPr>
                 <w:sz w:val="22"/>
               </w:rPr>
-              <w:t>10</w:t>
+              <w:t>2-й месяц:</w:t>
+              <w:br/>
+              <w:t>с «__»_______ по «__»_______</w:t>
             </w:r>
           </w:p>
         </w:tc>
         <w:tc>
           <w:tcPr>
-            <w:tcW w:type="dxa" w:w="5669"/>
+            <w:tcW w:type="dxa" w:w="1247"/>
           </w:tcPr>
           <w:p>
             <w:r/>
@@ -2361,13 +1571,13 @@
               <w:rPr>
                 <w:sz w:val="22"/>
               </w:rPr>
-              <w:t>Установка фильтров грубой очистки и регуляторов давления</w:t>
+              <w:t>№ 1, № 2</w:t>
             </w:r>
           </w:p>
         </w:tc>
         <w:tc>
           <w:tcPr>
-            <w:tcW w:type="dxa" w:w="1020"/>
+            <w:tcW w:type="dxa" w:w="1701"/>
           </w:tcPr>
           <w:p>
             <w:r/>
@@ -2375,13 +1585,13 @@
               <w:rPr>
                 <w:sz w:val="22"/>
               </w:rPr>
-              <w:t>шт.</w:t>
+              <w:t>60 000,00</w:t>
             </w:r>
           </w:p>
         </w:tc>
         <w:tc>
           <w:tcPr>
-            <w:tcW w:type="dxa" w:w="964"/>
+            <w:tcW w:type="dxa" w:w="2835"/>
           </w:tcPr>
           <w:p>
             <w:r/>
@@ -2389,442 +1599,12 @@
               <w:rPr>
                 <w:sz w:val="22"/>
               </w:rPr>
-              <w:t>2</w:t>
-            </w:r>
-          </w:p>
-        </w:tc>
-        <w:tc>
-          <w:tcPr>
-            <w:tcW w:type="dxa" w:w="850"/>
-          </w:tcPr>
-          <w:p>
-            <w:r/>
-            <w:r>
-              <w:rPr>
-                <w:sz w:val="22"/>
-              </w:rPr>
-              <w:t>2</w:t>
+              <w:t>в течение 5 раб. дней после подписания акта по этапу 2</w:t>
             </w:r>
           </w:p>
         </w:tc>
       </w:tr>
       <w:tr>
-        <w:tc>
-          <w:tcPr>
-            <w:tcW w:type="dxa" w:w="567"/>
-          </w:tcPr>
-          <w:p>
-            <w:r/>
-            <w:r>
-              <w:rPr>
-                <w:sz w:val="22"/>
-              </w:rPr>
-              <w:t>11</w:t>
-            </w:r>
-          </w:p>
-        </w:tc>
-        <w:tc>
-          <w:tcPr>
-            <w:tcW w:type="dxa" w:w="5669"/>
-          </w:tcPr>
-          <w:p>
-            <w:r/>
-            <w:r>
-              <w:rPr>
-                <w:sz w:val="22"/>
-              </w:rPr>
-              <w:t>Установка (перенос) счётчиков воды ХВС и ГВС с подготовкой к опломбировке</w:t>
-            </w:r>
-          </w:p>
-        </w:tc>
-        <w:tc>
-          <w:tcPr>
-            <w:tcW w:type="dxa" w:w="1020"/>
-          </w:tcPr>
-          <w:p>
-            <w:r/>
-            <w:r>
-              <w:rPr>
-                <w:sz w:val="22"/>
-              </w:rPr>
-              <w:t>шт.</w:t>
-            </w:r>
-          </w:p>
-        </w:tc>
-        <w:tc>
-          <w:tcPr>
-            <w:tcW w:type="dxa" w:w="964"/>
-          </w:tcPr>
-          <w:p>
-            <w:r/>
-            <w:r>
-              <w:rPr>
-                <w:sz w:val="22"/>
-              </w:rPr>
-              <w:t>2</w:t>
-            </w:r>
-          </w:p>
-        </w:tc>
-        <w:tc>
-          <w:tcPr>
-            <w:tcW w:type="dxa" w:w="850"/>
-          </w:tcPr>
-          <w:p>
-            <w:r/>
-            <w:r>
-              <w:rPr>
-                <w:sz w:val="22"/>
-              </w:rPr>
-              <w:t>2</w:t>
-            </w:r>
-          </w:p>
-        </w:tc>
-      </w:tr>
-      <w:tr>
-        <w:tc>
-          <w:tcPr>
-            <w:tcW w:type="dxa" w:w="567"/>
-          </w:tcPr>
-          <w:p>
-            <w:r/>
-            <w:r>
-              <w:rPr>
-                <w:sz w:val="22"/>
-              </w:rPr>
-              <w:t>12</w:t>
-            </w:r>
-          </w:p>
-        </w:tc>
-        <w:tc>
-          <w:tcPr>
-            <w:tcW w:type="dxa" w:w="5669"/>
-          </w:tcPr>
-          <w:p>
-            <w:r/>
-            <w:r>
-              <w:rPr>
-                <w:sz w:val="22"/>
-              </w:rPr>
-              <w:t>Монтаж новой разводки трубопроводов ХВС и ГВС (полипропилен PP-R) с креплением</w:t>
-            </w:r>
-          </w:p>
-        </w:tc>
-        <w:tc>
-          <w:tcPr>
-            <w:tcW w:type="dxa" w:w="1020"/>
-          </w:tcPr>
-          <w:p>
-            <w:r/>
-            <w:r>
-              <w:rPr>
-                <w:sz w:val="22"/>
-              </w:rPr>
-              <w:t>м.п.</w:t>
-            </w:r>
-          </w:p>
-        </w:tc>
-        <w:tc>
-          <w:tcPr>
-            <w:tcW w:type="dxa" w:w="964"/>
-          </w:tcPr>
-          <w:p>
-            <w:r/>
-            <w:r>
-              <w:rPr>
-                <w:sz w:val="22"/>
-              </w:rPr>
-              <w:t>15</w:t>
-            </w:r>
-          </w:p>
-        </w:tc>
-        <w:tc>
-          <w:tcPr>
-            <w:tcW w:type="dxa" w:w="850"/>
-          </w:tcPr>
-          <w:p>
-            <w:r/>
-            <w:r>
-              <w:rPr>
-                <w:sz w:val="22"/>
-              </w:rPr>
-              <w:t>2</w:t>
-            </w:r>
-          </w:p>
-        </w:tc>
-      </w:tr>
-      <w:tr>
-        <w:tc>
-          <w:tcPr>
-            <w:tcW w:type="dxa" w:w="567"/>
-          </w:tcPr>
-          <w:p>
-            <w:r/>
-            <w:r>
-              <w:rPr>
-                <w:sz w:val="22"/>
-              </w:rPr>
-              <w:t>13</w:t>
-            </w:r>
-          </w:p>
-        </w:tc>
-        <w:tc>
-          <w:tcPr>
-            <w:tcW w:type="dxa" w:w="5669"/>
-          </w:tcPr>
-          <w:p>
-            <w:r/>
-            <w:r>
-              <w:rPr>
-                <w:sz w:val="22"/>
-              </w:rPr>
-              <w:t>Монтаж внутренней канализации (ПП Ø 50/110 мм) с соблюдением уклонов, установка ревизии</w:t>
-            </w:r>
-          </w:p>
-        </w:tc>
-        <w:tc>
-          <w:tcPr>
-            <w:tcW w:type="dxa" w:w="1020"/>
-          </w:tcPr>
-          <w:p>
-            <w:r/>
-            <w:r>
-              <w:rPr>
-                <w:sz w:val="22"/>
-              </w:rPr>
-              <w:t>м.п.</w:t>
-            </w:r>
-          </w:p>
-        </w:tc>
-        <w:tc>
-          <w:tcPr>
-            <w:tcW w:type="dxa" w:w="964"/>
-          </w:tcPr>
-          <w:p>
-            <w:r/>
-            <w:r>
-              <w:rPr>
-                <w:sz w:val="22"/>
-              </w:rPr>
-              <w:t>8</w:t>
-            </w:r>
-          </w:p>
-        </w:tc>
-        <w:tc>
-          <w:tcPr>
-            <w:tcW w:type="dxa" w:w="850"/>
-          </w:tcPr>
-          <w:p>
-            <w:r/>
-            <w:r>
-              <w:rPr>
-                <w:sz w:val="22"/>
-              </w:rPr>
-              <w:t>2</w:t>
-            </w:r>
-          </w:p>
-        </w:tc>
-      </w:tr>
-      <w:tr>
-        <w:tc>
-          <w:tcPr>
-            <w:tcW w:type="dxa" w:w="567"/>
-          </w:tcPr>
-          <w:p>
-            <w:r/>
-            <w:r>
-              <w:rPr>
-                <w:sz w:val="22"/>
-              </w:rPr>
-              <w:t>14</w:t>
-            </w:r>
-          </w:p>
-        </w:tc>
-        <w:tc>
-          <w:tcPr>
-            <w:tcW w:type="dxa" w:w="5669"/>
-          </w:tcPr>
-          <w:p>
-            <w:r/>
-            <w:r>
-              <w:rPr>
-                <w:sz w:val="22"/>
-              </w:rPr>
-              <w:t>Монтаж инсталляции для подвесного унитаза</w:t>
-            </w:r>
-          </w:p>
-        </w:tc>
-        <w:tc>
-          <w:tcPr>
-            <w:tcW w:type="dxa" w:w="1020"/>
-          </w:tcPr>
-          <w:p>
-            <w:r/>
-            <w:r>
-              <w:rPr>
-                <w:sz w:val="22"/>
-              </w:rPr>
-              <w:t>шт.</w:t>
-            </w:r>
-          </w:p>
-        </w:tc>
-        <w:tc>
-          <w:tcPr>
-            <w:tcW w:type="dxa" w:w="964"/>
-          </w:tcPr>
-          <w:p>
-            <w:r/>
-            <w:r>
-              <w:rPr>
-                <w:sz w:val="22"/>
-              </w:rPr>
-              <w:t>1</w:t>
-            </w:r>
-          </w:p>
-        </w:tc>
-        <w:tc>
-          <w:tcPr>
-            <w:tcW w:type="dxa" w:w="850"/>
-          </w:tcPr>
-          <w:p>
-            <w:r/>
-            <w:r>
-              <w:rPr>
-                <w:sz w:val="22"/>
-              </w:rPr>
-              <w:t>2</w:t>
-            </w:r>
-          </w:p>
-        </w:tc>
-      </w:tr>
-      <w:tr>
-        <w:tc>
-          <w:tcPr>
-            <w:tcW w:type="dxa" w:w="567"/>
-          </w:tcPr>
-          <w:p>
-            <w:r/>
-            <w:r>
-              <w:rPr>
-                <w:sz w:val="22"/>
-              </w:rPr>
-              <w:t>15</w:t>
-            </w:r>
-          </w:p>
-        </w:tc>
-        <w:tc>
-          <w:tcPr>
-            <w:tcW w:type="dxa" w:w="5669"/>
-          </w:tcPr>
-          <w:p>
-            <w:r/>
-            <w:r>
-              <w:rPr>
-                <w:sz w:val="22"/>
-              </w:rPr>
-              <w:t>Гидравлическое испытание (опрессовка) трубопроводов, предъявление скрытых работ Заказчику</w:t>
-            </w:r>
-          </w:p>
-        </w:tc>
-        <w:tc>
-          <w:tcPr>
-            <w:tcW w:type="dxa" w:w="1020"/>
-          </w:tcPr>
-          <w:p>
-            <w:r/>
-            <w:r>
-              <w:rPr>
-                <w:sz w:val="22"/>
-              </w:rPr>
-              <w:t>компл.</w:t>
-            </w:r>
-          </w:p>
-        </w:tc>
-        <w:tc>
-          <w:tcPr>
-            <w:tcW w:type="dxa" w:w="964"/>
-          </w:tcPr>
-          <w:p>
-            <w:r/>
-            <w:r>
-              <w:rPr>
-                <w:sz w:val="22"/>
-              </w:rPr>
-              <w:t>1</w:t>
-            </w:r>
-          </w:p>
-        </w:tc>
-        <w:tc>
-          <w:tcPr>
-            <w:tcW w:type="dxa" w:w="850"/>
-          </w:tcPr>
-          <w:p>
-            <w:r/>
-            <w:r>
-              <w:rPr>
-                <w:sz w:val="22"/>
-              </w:rPr>
-              <w:t>2</w:t>
-            </w:r>
-          </w:p>
-        </w:tc>
-      </w:tr>
-      <w:tr>
-        <w:tc>
-          <w:tcPr>
-            <w:tcW w:type="dxa" w:w="567"/>
-          </w:tcPr>
-          <w:p>
-            <w:r/>
-            <w:r>
-              <w:rPr>
-                <w:sz w:val="22"/>
-              </w:rPr>
-              <w:t>16</w:t>
-            </w:r>
-          </w:p>
-        </w:tc>
-        <w:tc>
-          <w:tcPr>
-            <w:tcW w:type="dxa" w:w="5669"/>
-          </w:tcPr>
-          <w:p>
-            <w:r/>
-            <w:r>
-              <w:rPr>
-                <w:sz w:val="22"/>
-              </w:rPr>
-              <w:t>Установка подвесного унитаза с клавишей смыва</w:t>
-            </w:r>
-          </w:p>
-        </w:tc>
-        <w:tc>
-          <w:tcPr>
-            <w:tcW w:type="dxa" w:w="1020"/>
-          </w:tcPr>
-          <w:p>
-            <w:r/>
-            <w:r>
-              <w:rPr>
-                <w:sz w:val="22"/>
-              </w:rPr>
-              <w:t>шт.</w:t>
-            </w:r>
-          </w:p>
-        </w:tc>
-        <w:tc>
-          <w:tcPr>
-            <w:tcW w:type="dxa" w:w="964"/>
-          </w:tcPr>
-          <w:p>
-            <w:r/>
-            <w:r>
-              <w:rPr>
-                <w:sz w:val="22"/>
-              </w:rPr>
-              <w:t>1</w:t>
-            </w:r>
-          </w:p>
-        </w:tc>
         <w:tc>
           <w:tcPr>
             <w:tcW w:type="dxa" w:w="850"/>
@@ -2839,11 +1619,9 @@
             </w:r>
           </w:p>
         </w:tc>
-      </w:tr>
-      <w:tr>
         <w:tc>
           <w:tcPr>
-            <w:tcW w:type="dxa" w:w="567"/>
+            <w:tcW w:type="dxa" w:w="2438"/>
           </w:tcPr>
           <w:p>
             <w:r/>
@@ -2851,13 +1629,15 @@
               <w:rPr>
                 <w:sz w:val="22"/>
               </w:rPr>
-              <w:t>17</w:t>
+              <w:t>3-й месяц:</w:t>
+              <w:br/>
+              <w:t>с «__»_______ по «__»_______</w:t>
             </w:r>
           </w:p>
         </w:tc>
         <w:tc>
           <w:tcPr>
-            <w:tcW w:type="dxa" w:w="5669"/>
+            <w:tcW w:type="dxa" w:w="1247"/>
           </w:tcPr>
           <w:p>
             <w:r/>
@@ -2865,13 +1645,13 @@
               <w:rPr>
                 <w:sz w:val="22"/>
               </w:rPr>
-              <w:t>Установка раковины (на тумбу или консольно) с сифоном</w:t>
+              <w:t>№ 1, № 2</w:t>
             </w:r>
           </w:p>
         </w:tc>
         <w:tc>
           <w:tcPr>
-            <w:tcW w:type="dxa" w:w="1020"/>
+            <w:tcW w:type="dxa" w:w="1701"/>
           </w:tcPr>
           <w:p>
             <w:r/>
@@ -2879,13 +1659,13 @@
               <w:rPr>
                 <w:sz w:val="22"/>
               </w:rPr>
-              <w:t>шт.</w:t>
+              <w:t>60 000,00</w:t>
             </w:r>
           </w:p>
         </w:tc>
         <w:tc>
           <w:tcPr>
-            <w:tcW w:type="dxa" w:w="964"/>
+            <w:tcW w:type="dxa" w:w="2835"/>
           </w:tcPr>
           <w:p>
             <w:r/>
@@ -2893,10 +1673,12 @@
               <w:rPr>
                 <w:sz w:val="22"/>
               </w:rPr>
-              <w:t>1</w:t>
+              <w:t>в течение 5 раб. дней после подписания акта по этапу 3</w:t>
             </w:r>
           </w:p>
         </w:tc>
+      </w:tr>
+      <w:tr>
         <w:tc>
           <w:tcPr>
             <w:tcW w:type="dxa" w:w="850"/>
@@ -2907,15 +1689,12 @@
               <w:rPr>
                 <w:sz w:val="22"/>
               </w:rPr>
-              <w:t>3</w:t>
             </w:r>
           </w:p>
         </w:tc>
-      </w:tr>
-      <w:tr>
         <w:tc>
           <w:tcPr>
-            <w:tcW w:type="dxa" w:w="567"/>
+            <w:tcW w:type="dxa" w:w="2438"/>
           </w:tcPr>
           <w:p>
             <w:r/>
@@ -2923,13 +1702,12 @@
               <w:rPr>
                 <w:sz w:val="22"/>
               </w:rPr>
-              <w:t>18</w:t>
             </w:r>
           </w:p>
         </w:tc>
         <w:tc>
           <w:tcPr>
-            <w:tcW w:type="dxa" w:w="5669"/>
+            <w:tcW w:type="dxa" w:w="1247"/>
           </w:tcPr>
           <w:p>
             <w:r/>
@@ -2937,13 +1715,13 @@
               <w:rPr>
                 <w:sz w:val="22"/>
               </w:rPr>
-              <w:t>Установка смесителя для раковины с гибкой подводкой</w:t>
+              <w:t>ИТОГО:</w:t>
             </w:r>
           </w:p>
         </w:tc>
         <w:tc>
           <w:tcPr>
-            <w:tcW w:type="dxa" w:w="1020"/>
+            <w:tcW w:type="dxa" w:w="1701"/>
           </w:tcPr>
           <w:p>
             <w:r/>
@@ -2951,13 +1729,13 @@
               <w:rPr>
                 <w:sz w:val="22"/>
               </w:rPr>
-              <w:t>шт.</w:t>
+              <w:t>180 000,00</w:t>
             </w:r>
           </w:p>
         </w:tc>
         <w:tc>
           <w:tcPr>
-            <w:tcW w:type="dxa" w:w="964"/>
+            <w:tcW w:type="dxa" w:w="2835"/>
           </w:tcPr>
           <w:p>
             <w:r/>
@@ -2965,1521 +1743,6 @@
               <w:rPr>
                 <w:sz w:val="22"/>
               </w:rPr>
-              <w:t>1</w:t>
-            </w:r>
-          </w:p>
-        </w:tc>
-        <w:tc>
-          <w:tcPr>
-            <w:tcW w:type="dxa" w:w="850"/>
-          </w:tcPr>
-          <w:p>
-            <w:r/>
-            <w:r>
-              <w:rPr>
-                <w:sz w:val="22"/>
-              </w:rPr>
-              <w:t>3</w:t>
-            </w:r>
-          </w:p>
-        </w:tc>
-      </w:tr>
-      <w:tr>
-        <w:tc>
-          <w:tcPr>
-            <w:tcW w:type="dxa" w:w="567"/>
-          </w:tcPr>
-          <w:p>
-            <w:r/>
-            <w:r>
-              <w:rPr>
-                <w:sz w:val="22"/>
-              </w:rPr>
-              <w:t>19</w:t>
-            </w:r>
-          </w:p>
-        </w:tc>
-        <w:tc>
-          <w:tcPr>
-            <w:tcW w:type="dxa" w:w="5669"/>
-          </w:tcPr>
-          <w:p>
-            <w:r/>
-            <w:r>
-              <w:rPr>
-                <w:sz w:val="22"/>
-              </w:rPr>
-              <w:t>Установка гигиенического душа</w:t>
-            </w:r>
-          </w:p>
-        </w:tc>
-        <w:tc>
-          <w:tcPr>
-            <w:tcW w:type="dxa" w:w="1020"/>
-          </w:tcPr>
-          <w:p>
-            <w:r/>
-            <w:r>
-              <w:rPr>
-                <w:sz w:val="22"/>
-              </w:rPr>
-              <w:t>шт.</w:t>
-            </w:r>
-          </w:p>
-        </w:tc>
-        <w:tc>
-          <w:tcPr>
-            <w:tcW w:type="dxa" w:w="964"/>
-          </w:tcPr>
-          <w:p>
-            <w:r/>
-            <w:r>
-              <w:rPr>
-                <w:sz w:val="22"/>
-              </w:rPr>
-              <w:t>1</w:t>
-            </w:r>
-          </w:p>
-        </w:tc>
-        <w:tc>
-          <w:tcPr>
-            <w:tcW w:type="dxa" w:w="850"/>
-          </w:tcPr>
-          <w:p>
-            <w:r/>
-            <w:r>
-              <w:rPr>
-                <w:sz w:val="22"/>
-              </w:rPr>
-              <w:t>3</w:t>
-            </w:r>
-          </w:p>
-        </w:tc>
-      </w:tr>
-      <w:tr>
-        <w:tc>
-          <w:tcPr>
-            <w:tcW w:type="dxa" w:w="567"/>
-          </w:tcPr>
-          <w:p>
-            <w:r/>
-            <w:r>
-              <w:rPr>
-                <w:sz w:val="22"/>
-              </w:rPr>
-              <w:t>20</w:t>
-            </w:r>
-          </w:p>
-        </w:tc>
-        <w:tc>
-          <w:tcPr>
-            <w:tcW w:type="dxa" w:w="5669"/>
-          </w:tcPr>
-          <w:p>
-            <w:r/>
-            <w:r>
-              <w:rPr>
-                <w:sz w:val="22"/>
-              </w:rPr>
-              <w:t>Установка и подключение накопительного электроводонагревателя (до 80 л) с группой безопасности</w:t>
-            </w:r>
-          </w:p>
-        </w:tc>
-        <w:tc>
-          <w:tcPr>
-            <w:tcW w:type="dxa" w:w="1020"/>
-          </w:tcPr>
-          <w:p>
-            <w:r/>
-            <w:r>
-              <w:rPr>
-                <w:sz w:val="22"/>
-              </w:rPr>
-              <w:t>шт.</w:t>
-            </w:r>
-          </w:p>
-        </w:tc>
-        <w:tc>
-          <w:tcPr>
-            <w:tcW w:type="dxa" w:w="964"/>
-          </w:tcPr>
-          <w:p>
-            <w:r/>
-            <w:r>
-              <w:rPr>
-                <w:sz w:val="22"/>
-              </w:rPr>
-              <w:t>1</w:t>
-            </w:r>
-          </w:p>
-        </w:tc>
-        <w:tc>
-          <w:tcPr>
-            <w:tcW w:type="dxa" w:w="850"/>
-          </w:tcPr>
-          <w:p>
-            <w:r/>
-            <w:r>
-              <w:rPr>
-                <w:sz w:val="22"/>
-              </w:rPr>
-              <w:t>3</w:t>
-            </w:r>
-          </w:p>
-        </w:tc>
-      </w:tr>
-      <w:tr>
-        <w:tc>
-          <w:tcPr>
-            <w:tcW w:type="dxa" w:w="567"/>
-          </w:tcPr>
-          <w:p>
-            <w:r/>
-            <w:r>
-              <w:rPr>
-                <w:sz w:val="22"/>
-              </w:rPr>
-              <w:t>21</w:t>
-            </w:r>
-          </w:p>
-        </w:tc>
-        <w:tc>
-          <w:tcPr>
-            <w:tcW w:type="dxa" w:w="5669"/>
-          </w:tcPr>
-          <w:p>
-            <w:r/>
-            <w:r>
-              <w:rPr>
-                <w:sz w:val="22"/>
-              </w:rPr>
-              <w:t>Герметизация примыканий сантехприборов санитарным герметиком</w:t>
-            </w:r>
-          </w:p>
-        </w:tc>
-        <w:tc>
-          <w:tcPr>
-            <w:tcW w:type="dxa" w:w="1020"/>
-          </w:tcPr>
-          <w:p>
-            <w:r/>
-            <w:r>
-              <w:rPr>
-                <w:sz w:val="22"/>
-              </w:rPr>
-              <w:t>компл.</w:t>
-            </w:r>
-          </w:p>
-        </w:tc>
-        <w:tc>
-          <w:tcPr>
-            <w:tcW w:type="dxa" w:w="964"/>
-          </w:tcPr>
-          <w:p>
-            <w:r/>
-            <w:r>
-              <w:rPr>
-                <w:sz w:val="22"/>
-              </w:rPr>
-              <w:t>1</w:t>
-            </w:r>
-          </w:p>
-        </w:tc>
-        <w:tc>
-          <w:tcPr>
-            <w:tcW w:type="dxa" w:w="850"/>
-          </w:tcPr>
-          <w:p>
-            <w:r/>
-            <w:r>
-              <w:rPr>
-                <w:sz w:val="22"/>
-              </w:rPr>
-              <w:t>3</w:t>
-            </w:r>
-          </w:p>
-        </w:tc>
-      </w:tr>
-      <w:tr>
-        <w:tc>
-          <w:tcPr>
-            <w:tcW w:type="dxa" w:w="567"/>
-          </w:tcPr>
-          <w:p>
-            <w:r/>
-            <w:r>
-              <w:rPr>
-                <w:sz w:val="22"/>
-              </w:rPr>
-              <w:t>22</w:t>
-            </w:r>
-          </w:p>
-        </w:tc>
-        <w:tc>
-          <w:tcPr>
-            <w:tcW w:type="dxa" w:w="5669"/>
-          </w:tcPr>
-          <w:p>
-            <w:r/>
-            <w:r>
-              <w:rPr>
-                <w:sz w:val="22"/>
-              </w:rPr>
-              <w:t>Пуско-наладка, проверка всех соединений на герметичность, сдача Объекта</w:t>
-            </w:r>
-          </w:p>
-        </w:tc>
-        <w:tc>
-          <w:tcPr>
-            <w:tcW w:type="dxa" w:w="1020"/>
-          </w:tcPr>
-          <w:p>
-            <w:r/>
-            <w:r>
-              <w:rPr>
-                <w:sz w:val="22"/>
-              </w:rPr>
-              <w:t>компл.</w:t>
-            </w:r>
-          </w:p>
-        </w:tc>
-        <w:tc>
-          <w:tcPr>
-            <w:tcW w:type="dxa" w:w="964"/>
-          </w:tcPr>
-          <w:p>
-            <w:r/>
-            <w:r>
-              <w:rPr>
-                <w:sz w:val="22"/>
-              </w:rPr>
-              <w:t>1</w:t>
-            </w:r>
-          </w:p>
-        </w:tc>
-        <w:tc>
-          <w:tcPr>
-            <w:tcW w:type="dxa" w:w="850"/>
-          </w:tcPr>
-          <w:p>
-            <w:r/>
-            <w:r>
-              <w:rPr>
-                <w:sz w:val="22"/>
-              </w:rPr>
-              <w:t>3</w:t>
-            </w:r>
-          </w:p>
-        </w:tc>
-      </w:tr>
-    </w:tbl>
-    <w:p>
-      <w:pPr>
-        <w:spacing w:before="120"/>
-        <w:jc w:val="left"/>
-      </w:pPr>
-      <w:r>
-        <w:rPr>
-          <w:b/>
-        </w:rPr>
-        <w:t>Объект № 2: г. Санкт-Петербург, Комендантский пр-т, д. 17, корп. 1</w:t>
-      </w:r>
-    </w:p>
-    <w:p>
-      <w:pPr>
-        <w:spacing w:before="0"/>
-        <w:jc w:val="left"/>
-      </w:pPr>
-      <w:r>
-        <w:rPr>
-          <w:b w:val="0"/>
-        </w:rPr>
-        <w:t>Восстановление санузла (ремонт и частичная замена инженерных систем и сантехприборов)</w:t>
-      </w:r>
-    </w:p>
-    <w:tbl>
-      <w:tblPr>
-        <w:tblStyle w:val="TableGrid"/>
-        <w:tblW w:type="auto" w:w="0"/>
-        <w:jc w:val="center"/>
-        <w:tblLayout w:type="fixed"/>
-        <w:tblLook w:firstColumn="1" w:firstRow="1" w:lastColumn="0" w:lastRow="0" w:noHBand="0" w:noVBand="1" w:val="04A0"/>
-      </w:tblPr>
-      <w:tblGrid>
-        <w:gridCol w:w="567"/>
-        <w:gridCol w:w="5669"/>
-        <w:gridCol w:w="1020"/>
-        <w:gridCol w:w="964"/>
-        <w:gridCol w:w="850"/>
-      </w:tblGrid>
-      <w:tr>
-        <w:tc>
-          <w:tcPr>
-            <w:tcW w:type="dxa" w:w="567"/>
-          </w:tcPr>
-          <w:p>
-            <w:pPr>
-              <w:jc w:val="center"/>
-            </w:pPr>
-            <w:r/>
-            <w:r>
-              <w:rPr>
-                <w:b/>
-                <w:sz w:val="22"/>
-              </w:rPr>
-              <w:t>№</w:t>
-            </w:r>
-          </w:p>
-        </w:tc>
-        <w:tc>
-          <w:tcPr>
-            <w:tcW w:type="dxa" w:w="5669"/>
-          </w:tcPr>
-          <w:p>
-            <w:pPr>
-              <w:jc w:val="center"/>
-            </w:pPr>
-            <w:r/>
-            <w:r>
-              <w:rPr>
-                <w:b/>
-                <w:sz w:val="22"/>
-              </w:rPr>
-              <w:t>Наименование работ</w:t>
-            </w:r>
-          </w:p>
-        </w:tc>
-        <w:tc>
-          <w:tcPr>
-            <w:tcW w:type="dxa" w:w="1020"/>
-          </w:tcPr>
-          <w:p>
-            <w:pPr>
-              <w:jc w:val="center"/>
-            </w:pPr>
-            <w:r/>
-            <w:r>
-              <w:rPr>
-                <w:b/>
-                <w:sz w:val="22"/>
-              </w:rPr>
-              <w:t>Ед. изм.</w:t>
-            </w:r>
-          </w:p>
-        </w:tc>
-        <w:tc>
-          <w:tcPr>
-            <w:tcW w:type="dxa" w:w="964"/>
-          </w:tcPr>
-          <w:p>
-            <w:pPr>
-              <w:jc w:val="center"/>
-            </w:pPr>
-            <w:r/>
-            <w:r>
-              <w:rPr>
-                <w:b/>
-                <w:sz w:val="22"/>
-              </w:rPr>
-              <w:t>Кол-во</w:t>
-            </w:r>
-          </w:p>
-        </w:tc>
-        <w:tc>
-          <w:tcPr>
-            <w:tcW w:type="dxa" w:w="850"/>
-          </w:tcPr>
-          <w:p>
-            <w:pPr>
-              <w:jc w:val="center"/>
-            </w:pPr>
-            <w:r/>
-            <w:r>
-              <w:rPr>
-                <w:b/>
-                <w:sz w:val="22"/>
-              </w:rPr>
-              <w:t>Этап</w:t>
-            </w:r>
-          </w:p>
-        </w:tc>
-      </w:tr>
-      <w:tr>
-        <w:tc>
-          <w:tcPr>
-            <w:tcW w:type="dxa" w:w="567"/>
-          </w:tcPr>
-          <w:p>
-            <w:r/>
-            <w:r>
-              <w:rPr>
-                <w:sz w:val="22"/>
-              </w:rPr>
-              <w:t>1</w:t>
-            </w:r>
-          </w:p>
-        </w:tc>
-        <w:tc>
-          <w:tcPr>
-            <w:tcW w:type="dxa" w:w="5669"/>
-          </w:tcPr>
-          <w:p>
-            <w:r/>
-            <w:r>
-              <w:rPr>
-                <w:sz w:val="22"/>
-              </w:rPr>
-              <w:t>Обследование санузла, дефектовка, составление перечня узлов под замену</w:t>
-            </w:r>
-          </w:p>
-        </w:tc>
-        <w:tc>
-          <w:tcPr>
-            <w:tcW w:type="dxa" w:w="1020"/>
-          </w:tcPr>
-          <w:p>
-            <w:r/>
-            <w:r>
-              <w:rPr>
-                <w:sz w:val="22"/>
-              </w:rPr>
-              <w:t>компл.</w:t>
-            </w:r>
-          </w:p>
-        </w:tc>
-        <w:tc>
-          <w:tcPr>
-            <w:tcW w:type="dxa" w:w="964"/>
-          </w:tcPr>
-          <w:p>
-            <w:r/>
-            <w:r>
-              <w:rPr>
-                <w:sz w:val="22"/>
-              </w:rPr>
-              <w:t>1</w:t>
-            </w:r>
-          </w:p>
-        </w:tc>
-        <w:tc>
-          <w:tcPr>
-            <w:tcW w:type="dxa" w:w="850"/>
-          </w:tcPr>
-          <w:p>
-            <w:r/>
-            <w:r>
-              <w:rPr>
-                <w:sz w:val="22"/>
-              </w:rPr>
-              <w:t>1</w:t>
-            </w:r>
-          </w:p>
-        </w:tc>
-      </w:tr>
-      <w:tr>
-        <w:tc>
-          <w:tcPr>
-            <w:tcW w:type="dxa" w:w="567"/>
-          </w:tcPr>
-          <w:p>
-            <w:r/>
-            <w:r>
-              <w:rPr>
-                <w:sz w:val="22"/>
-              </w:rPr>
-              <w:t>2</w:t>
-            </w:r>
-          </w:p>
-        </w:tc>
-        <w:tc>
-          <w:tcPr>
-            <w:tcW w:type="dxa" w:w="5669"/>
-          </w:tcPr>
-          <w:p>
-            <w:r/>
-            <w:r>
-              <w:rPr>
-                <w:sz w:val="22"/>
-              </w:rPr>
-              <w:t>Ревизия и замена запорной арматуры на вводах ХВС и ГВС</w:t>
-            </w:r>
-          </w:p>
-        </w:tc>
-        <w:tc>
-          <w:tcPr>
-            <w:tcW w:type="dxa" w:w="1020"/>
-          </w:tcPr>
-          <w:p>
-            <w:r/>
-            <w:r>
-              <w:rPr>
-                <w:sz w:val="22"/>
-              </w:rPr>
-              <w:t>шт.</w:t>
-            </w:r>
-          </w:p>
-        </w:tc>
-        <w:tc>
-          <w:tcPr>
-            <w:tcW w:type="dxa" w:w="964"/>
-          </w:tcPr>
-          <w:p>
-            <w:r/>
-            <w:r>
-              <w:rPr>
-                <w:sz w:val="22"/>
-              </w:rPr>
-              <w:t>2</w:t>
-            </w:r>
-          </w:p>
-        </w:tc>
-        <w:tc>
-          <w:tcPr>
-            <w:tcW w:type="dxa" w:w="850"/>
-          </w:tcPr>
-          <w:p>
-            <w:r/>
-            <w:r>
-              <w:rPr>
-                <w:sz w:val="22"/>
-              </w:rPr>
-              <w:t>1</w:t>
-            </w:r>
-          </w:p>
-        </w:tc>
-      </w:tr>
-      <w:tr>
-        <w:tc>
-          <w:tcPr>
-            <w:tcW w:type="dxa" w:w="567"/>
-          </w:tcPr>
-          <w:p>
-            <w:r/>
-            <w:r>
-              <w:rPr>
-                <w:sz w:val="22"/>
-              </w:rPr>
-              <w:t>3</w:t>
-            </w:r>
-          </w:p>
-        </w:tc>
-        <w:tc>
-          <w:tcPr>
-            <w:tcW w:type="dxa" w:w="5669"/>
-          </w:tcPr>
-          <w:p>
-            <w:r/>
-            <w:r>
-              <w:rPr>
-                <w:sz w:val="22"/>
-              </w:rPr>
-              <w:t>Замена изношенных / аварийных участков трубопроводов ХВС и ГВС</w:t>
-            </w:r>
-          </w:p>
-        </w:tc>
-        <w:tc>
-          <w:tcPr>
-            <w:tcW w:type="dxa" w:w="1020"/>
-          </w:tcPr>
-          <w:p>
-            <w:r/>
-            <w:r>
-              <w:rPr>
-                <w:sz w:val="22"/>
-              </w:rPr>
-              <w:t>м.п.</w:t>
-            </w:r>
-          </w:p>
-        </w:tc>
-        <w:tc>
-          <w:tcPr>
-            <w:tcW w:type="dxa" w:w="964"/>
-          </w:tcPr>
-          <w:p>
-            <w:r/>
-            <w:r>
-              <w:rPr>
-                <w:sz w:val="22"/>
-              </w:rPr>
-              <w:t>до 6</w:t>
-            </w:r>
-          </w:p>
-        </w:tc>
-        <w:tc>
-          <w:tcPr>
-            <w:tcW w:type="dxa" w:w="850"/>
-          </w:tcPr>
-          <w:p>
-            <w:r/>
-            <w:r>
-              <w:rPr>
-                <w:sz w:val="22"/>
-              </w:rPr>
-              <w:t>1</w:t>
-            </w:r>
-          </w:p>
-        </w:tc>
-      </w:tr>
-      <w:tr>
-        <w:tc>
-          <w:tcPr>
-            <w:tcW w:type="dxa" w:w="567"/>
-          </w:tcPr>
-          <w:p>
-            <w:r/>
-            <w:r>
-              <w:rPr>
-                <w:sz w:val="22"/>
-              </w:rPr>
-              <w:t>4</w:t>
-            </w:r>
-          </w:p>
-        </w:tc>
-        <w:tc>
-          <w:tcPr>
-            <w:tcW w:type="dxa" w:w="5669"/>
-          </w:tcPr>
-          <w:p>
-            <w:r/>
-            <w:r>
-              <w:rPr>
-                <w:sz w:val="22"/>
-              </w:rPr>
-              <w:t>Прочистка канализационных трубопроводов</w:t>
-            </w:r>
-          </w:p>
-        </w:tc>
-        <w:tc>
-          <w:tcPr>
-            <w:tcW w:type="dxa" w:w="1020"/>
-          </w:tcPr>
-          <w:p>
-            <w:r/>
-            <w:r>
-              <w:rPr>
-                <w:sz w:val="22"/>
-              </w:rPr>
-              <w:t>м.п.</w:t>
-            </w:r>
-          </w:p>
-        </w:tc>
-        <w:tc>
-          <w:tcPr>
-            <w:tcW w:type="dxa" w:w="964"/>
-          </w:tcPr>
-          <w:p>
-            <w:r/>
-            <w:r>
-              <w:rPr>
-                <w:sz w:val="22"/>
-              </w:rPr>
-              <w:t>до 10</w:t>
-            </w:r>
-          </w:p>
-        </w:tc>
-        <w:tc>
-          <w:tcPr>
-            <w:tcW w:type="dxa" w:w="850"/>
-          </w:tcPr>
-          <w:p>
-            <w:r/>
-            <w:r>
-              <w:rPr>
-                <w:sz w:val="22"/>
-              </w:rPr>
-              <w:t>1</w:t>
-            </w:r>
-          </w:p>
-        </w:tc>
-      </w:tr>
-      <w:tr>
-        <w:tc>
-          <w:tcPr>
-            <w:tcW w:type="dxa" w:w="567"/>
-          </w:tcPr>
-          <w:p>
-            <w:r/>
-            <w:r>
-              <w:rPr>
-                <w:sz w:val="22"/>
-              </w:rPr>
-              <w:t>5</w:t>
-            </w:r>
-          </w:p>
-        </w:tc>
-        <w:tc>
-          <w:tcPr>
-            <w:tcW w:type="dxa" w:w="5669"/>
-          </w:tcPr>
-          <w:p>
-            <w:r/>
-            <w:r>
-              <w:rPr>
-                <w:sz w:val="22"/>
-              </w:rPr>
-              <w:t>Установка фильтра грубой очистки и регулятора давления</w:t>
-            </w:r>
-          </w:p>
-        </w:tc>
-        <w:tc>
-          <w:tcPr>
-            <w:tcW w:type="dxa" w:w="1020"/>
-          </w:tcPr>
-          <w:p>
-            <w:r/>
-            <w:r>
-              <w:rPr>
-                <w:sz w:val="22"/>
-              </w:rPr>
-              <w:t>компл.</w:t>
-            </w:r>
-          </w:p>
-        </w:tc>
-        <w:tc>
-          <w:tcPr>
-            <w:tcW w:type="dxa" w:w="964"/>
-          </w:tcPr>
-          <w:p>
-            <w:r/>
-            <w:r>
-              <w:rPr>
-                <w:sz w:val="22"/>
-              </w:rPr>
-              <w:t>1</w:t>
-            </w:r>
-          </w:p>
-        </w:tc>
-        <w:tc>
-          <w:tcPr>
-            <w:tcW w:type="dxa" w:w="850"/>
-          </w:tcPr>
-          <w:p>
-            <w:r/>
-            <w:r>
-              <w:rPr>
-                <w:sz w:val="22"/>
-              </w:rPr>
-              <w:t>1</w:t>
-            </w:r>
-          </w:p>
-        </w:tc>
-      </w:tr>
-      <w:tr>
-        <w:tc>
-          <w:tcPr>
-            <w:tcW w:type="dxa" w:w="567"/>
-          </w:tcPr>
-          <w:p>
-            <w:r/>
-            <w:r>
-              <w:rPr>
-                <w:sz w:val="22"/>
-              </w:rPr>
-              <w:t>6</w:t>
-            </w:r>
-          </w:p>
-        </w:tc>
-        <w:tc>
-          <w:tcPr>
-            <w:tcW w:type="dxa" w:w="5669"/>
-          </w:tcPr>
-          <w:p>
-            <w:r/>
-            <w:r>
-              <w:rPr>
-                <w:sz w:val="22"/>
-              </w:rPr>
-              <w:t>Замена участков канализации, фасонных изделий и уплотнительных манжет</w:t>
-            </w:r>
-          </w:p>
-        </w:tc>
-        <w:tc>
-          <w:tcPr>
-            <w:tcW w:type="dxa" w:w="1020"/>
-          </w:tcPr>
-          <w:p>
-            <w:r/>
-            <w:r>
-              <w:rPr>
-                <w:sz w:val="22"/>
-              </w:rPr>
-              <w:t>м.п.</w:t>
-            </w:r>
-          </w:p>
-        </w:tc>
-        <w:tc>
-          <w:tcPr>
-            <w:tcW w:type="dxa" w:w="964"/>
-          </w:tcPr>
-          <w:p>
-            <w:r/>
-            <w:r>
-              <w:rPr>
-                <w:sz w:val="22"/>
-              </w:rPr>
-              <w:t>до 4</w:t>
-            </w:r>
-          </w:p>
-        </w:tc>
-        <w:tc>
-          <w:tcPr>
-            <w:tcW w:type="dxa" w:w="850"/>
-          </w:tcPr>
-          <w:p>
-            <w:r/>
-            <w:r>
-              <w:rPr>
-                <w:sz w:val="22"/>
-              </w:rPr>
-              <w:t>2</w:t>
-            </w:r>
-          </w:p>
-        </w:tc>
-      </w:tr>
-      <w:tr>
-        <w:tc>
-          <w:tcPr>
-            <w:tcW w:type="dxa" w:w="567"/>
-          </w:tcPr>
-          <w:p>
-            <w:r/>
-            <w:r>
-              <w:rPr>
-                <w:sz w:val="22"/>
-              </w:rPr>
-              <w:t>7</w:t>
-            </w:r>
-          </w:p>
-        </w:tc>
-        <w:tc>
-          <w:tcPr>
-            <w:tcW w:type="dxa" w:w="5669"/>
-          </w:tcPr>
-          <w:p>
-            <w:r/>
-            <w:r>
-              <w:rPr>
-                <w:sz w:val="22"/>
-              </w:rPr>
-              <w:t>Демонтаж и повторная установка унитаза-компакт с заменой гофры, подводки и арматуры бачка</w:t>
-            </w:r>
-          </w:p>
-        </w:tc>
-        <w:tc>
-          <w:tcPr>
-            <w:tcW w:type="dxa" w:w="1020"/>
-          </w:tcPr>
-          <w:p>
-            <w:r/>
-            <w:r>
-              <w:rPr>
-                <w:sz w:val="22"/>
-              </w:rPr>
-              <w:t>шт.</w:t>
-            </w:r>
-          </w:p>
-        </w:tc>
-        <w:tc>
-          <w:tcPr>
-            <w:tcW w:type="dxa" w:w="964"/>
-          </w:tcPr>
-          <w:p>
-            <w:r/>
-            <w:r>
-              <w:rPr>
-                <w:sz w:val="22"/>
-              </w:rPr>
-              <w:t>1</w:t>
-            </w:r>
-          </w:p>
-        </w:tc>
-        <w:tc>
-          <w:tcPr>
-            <w:tcW w:type="dxa" w:w="850"/>
-          </w:tcPr>
-          <w:p>
-            <w:r/>
-            <w:r>
-              <w:rPr>
-                <w:sz w:val="22"/>
-              </w:rPr>
-              <w:t>2</w:t>
-            </w:r>
-          </w:p>
-        </w:tc>
-      </w:tr>
-      <w:tr>
-        <w:tc>
-          <w:tcPr>
-            <w:tcW w:type="dxa" w:w="567"/>
-          </w:tcPr>
-          <w:p>
-            <w:r/>
-            <w:r>
-              <w:rPr>
-                <w:sz w:val="22"/>
-              </w:rPr>
-              <w:t>8</w:t>
-            </w:r>
-          </w:p>
-        </w:tc>
-        <w:tc>
-          <w:tcPr>
-            <w:tcW w:type="dxa" w:w="5669"/>
-          </w:tcPr>
-          <w:p>
-            <w:r/>
-            <w:r>
-              <w:rPr>
-                <w:sz w:val="22"/>
-              </w:rPr>
-              <w:t>Замена гибких подводок к сантехприборам</w:t>
-            </w:r>
-          </w:p>
-        </w:tc>
-        <w:tc>
-          <w:tcPr>
-            <w:tcW w:type="dxa" w:w="1020"/>
-          </w:tcPr>
-          <w:p>
-            <w:r/>
-            <w:r>
-              <w:rPr>
-                <w:sz w:val="22"/>
-              </w:rPr>
-              <w:t>шт.</w:t>
-            </w:r>
-          </w:p>
-        </w:tc>
-        <w:tc>
-          <w:tcPr>
-            <w:tcW w:type="dxa" w:w="964"/>
-          </w:tcPr>
-          <w:p>
-            <w:r/>
-            <w:r>
-              <w:rPr>
-                <w:sz w:val="22"/>
-              </w:rPr>
-              <w:t>до 6</w:t>
-            </w:r>
-          </w:p>
-        </w:tc>
-        <w:tc>
-          <w:tcPr>
-            <w:tcW w:type="dxa" w:w="850"/>
-          </w:tcPr>
-          <w:p>
-            <w:r/>
-            <w:r>
-              <w:rPr>
-                <w:sz w:val="22"/>
-              </w:rPr>
-              <w:t>2</w:t>
-            </w:r>
-          </w:p>
-        </w:tc>
-      </w:tr>
-      <w:tr>
-        <w:tc>
-          <w:tcPr>
-            <w:tcW w:type="dxa" w:w="567"/>
-          </w:tcPr>
-          <w:p>
-            <w:r/>
-            <w:r>
-              <w:rPr>
-                <w:sz w:val="22"/>
-              </w:rPr>
-              <w:t>9</w:t>
-            </w:r>
-          </w:p>
-        </w:tc>
-        <w:tc>
-          <w:tcPr>
-            <w:tcW w:type="dxa" w:w="5669"/>
-          </w:tcPr>
-          <w:p>
-            <w:r/>
-            <w:r>
-              <w:rPr>
-                <w:sz w:val="22"/>
-              </w:rPr>
-              <w:t>Гидравлическое испытание отремонтированных участков</w:t>
-            </w:r>
-          </w:p>
-        </w:tc>
-        <w:tc>
-          <w:tcPr>
-            <w:tcW w:type="dxa" w:w="1020"/>
-          </w:tcPr>
-          <w:p>
-            <w:r/>
-            <w:r>
-              <w:rPr>
-                <w:sz w:val="22"/>
-              </w:rPr>
-              <w:t>компл.</w:t>
-            </w:r>
-          </w:p>
-        </w:tc>
-        <w:tc>
-          <w:tcPr>
-            <w:tcW w:type="dxa" w:w="964"/>
-          </w:tcPr>
-          <w:p>
-            <w:r/>
-            <w:r>
-              <w:rPr>
-                <w:sz w:val="22"/>
-              </w:rPr>
-              <w:t>1</w:t>
-            </w:r>
-          </w:p>
-        </w:tc>
-        <w:tc>
-          <w:tcPr>
-            <w:tcW w:type="dxa" w:w="850"/>
-          </w:tcPr>
-          <w:p>
-            <w:r/>
-            <w:r>
-              <w:rPr>
-                <w:sz w:val="22"/>
-              </w:rPr>
-              <w:t>2</w:t>
-            </w:r>
-          </w:p>
-        </w:tc>
-      </w:tr>
-      <w:tr>
-        <w:tc>
-          <w:tcPr>
-            <w:tcW w:type="dxa" w:w="567"/>
-          </w:tcPr>
-          <w:p>
-            <w:r/>
-            <w:r>
-              <w:rPr>
-                <w:sz w:val="22"/>
-              </w:rPr>
-              <w:t>10</w:t>
-            </w:r>
-          </w:p>
-        </w:tc>
-        <w:tc>
-          <w:tcPr>
-            <w:tcW w:type="dxa" w:w="5669"/>
-          </w:tcPr>
-          <w:p>
-            <w:r/>
-            <w:r>
-              <w:rPr>
-                <w:sz w:val="22"/>
-              </w:rPr>
-              <w:t>Замена раковины с сифоном</w:t>
-            </w:r>
-          </w:p>
-        </w:tc>
-        <w:tc>
-          <w:tcPr>
-            <w:tcW w:type="dxa" w:w="1020"/>
-          </w:tcPr>
-          <w:p>
-            <w:r/>
-            <w:r>
-              <w:rPr>
-                <w:sz w:val="22"/>
-              </w:rPr>
-              <w:t>шт.</w:t>
-            </w:r>
-          </w:p>
-        </w:tc>
-        <w:tc>
-          <w:tcPr>
-            <w:tcW w:type="dxa" w:w="964"/>
-          </w:tcPr>
-          <w:p>
-            <w:r/>
-            <w:r>
-              <w:rPr>
-                <w:sz w:val="22"/>
-              </w:rPr>
-              <w:t>1</w:t>
-            </w:r>
-          </w:p>
-        </w:tc>
-        <w:tc>
-          <w:tcPr>
-            <w:tcW w:type="dxa" w:w="850"/>
-          </w:tcPr>
-          <w:p>
-            <w:r/>
-            <w:r>
-              <w:rPr>
-                <w:sz w:val="22"/>
-              </w:rPr>
-              <w:t>3</w:t>
-            </w:r>
-          </w:p>
-        </w:tc>
-      </w:tr>
-      <w:tr>
-        <w:tc>
-          <w:tcPr>
-            <w:tcW w:type="dxa" w:w="567"/>
-          </w:tcPr>
-          <w:p>
-            <w:r/>
-            <w:r>
-              <w:rPr>
-                <w:sz w:val="22"/>
-              </w:rPr>
-              <w:t>11</w:t>
-            </w:r>
-          </w:p>
-        </w:tc>
-        <w:tc>
-          <w:tcPr>
-            <w:tcW w:type="dxa" w:w="5669"/>
-          </w:tcPr>
-          <w:p>
-            <w:r/>
-            <w:r>
-              <w:rPr>
-                <w:sz w:val="22"/>
-              </w:rPr>
-              <w:t>Замена смесителя для раковины</w:t>
-            </w:r>
-          </w:p>
-        </w:tc>
-        <w:tc>
-          <w:tcPr>
-            <w:tcW w:type="dxa" w:w="1020"/>
-          </w:tcPr>
-          <w:p>
-            <w:r/>
-            <w:r>
-              <w:rPr>
-                <w:sz w:val="22"/>
-              </w:rPr>
-              <w:t>шт.</w:t>
-            </w:r>
-          </w:p>
-        </w:tc>
-        <w:tc>
-          <w:tcPr>
-            <w:tcW w:type="dxa" w:w="964"/>
-          </w:tcPr>
-          <w:p>
-            <w:r/>
-            <w:r>
-              <w:rPr>
-                <w:sz w:val="22"/>
-              </w:rPr>
-              <w:t>1</w:t>
-            </w:r>
-          </w:p>
-        </w:tc>
-        <w:tc>
-          <w:tcPr>
-            <w:tcW w:type="dxa" w:w="850"/>
-          </w:tcPr>
-          <w:p>
-            <w:r/>
-            <w:r>
-              <w:rPr>
-                <w:sz w:val="22"/>
-              </w:rPr>
-              <w:t>3</w:t>
-            </w:r>
-          </w:p>
-        </w:tc>
-      </w:tr>
-      <w:tr>
-        <w:tc>
-          <w:tcPr>
-            <w:tcW w:type="dxa" w:w="567"/>
-          </w:tcPr>
-          <w:p>
-            <w:r/>
-            <w:r>
-              <w:rPr>
-                <w:sz w:val="22"/>
-              </w:rPr>
-              <w:t>12</w:t>
-            </w:r>
-          </w:p>
-        </w:tc>
-        <w:tc>
-          <w:tcPr>
-            <w:tcW w:type="dxa" w:w="5669"/>
-          </w:tcPr>
-          <w:p>
-            <w:r/>
-            <w:r>
-              <w:rPr>
-                <w:sz w:val="22"/>
-              </w:rPr>
-              <w:t>Установка гигиенического душа</w:t>
-            </w:r>
-          </w:p>
-        </w:tc>
-        <w:tc>
-          <w:tcPr>
-            <w:tcW w:type="dxa" w:w="1020"/>
-          </w:tcPr>
-          <w:p>
-            <w:r/>
-            <w:r>
-              <w:rPr>
-                <w:sz w:val="22"/>
-              </w:rPr>
-              <w:t>шт.</w:t>
-            </w:r>
-          </w:p>
-        </w:tc>
-        <w:tc>
-          <w:tcPr>
-            <w:tcW w:type="dxa" w:w="964"/>
-          </w:tcPr>
-          <w:p>
-            <w:r/>
-            <w:r>
-              <w:rPr>
-                <w:sz w:val="22"/>
-              </w:rPr>
-              <w:t>1</w:t>
-            </w:r>
-          </w:p>
-        </w:tc>
-        <w:tc>
-          <w:tcPr>
-            <w:tcW w:type="dxa" w:w="850"/>
-          </w:tcPr>
-          <w:p>
-            <w:r/>
-            <w:r>
-              <w:rPr>
-                <w:sz w:val="22"/>
-              </w:rPr>
-              <w:t>3</w:t>
-            </w:r>
-          </w:p>
-        </w:tc>
-      </w:tr>
-      <w:tr>
-        <w:tc>
-          <w:tcPr>
-            <w:tcW w:type="dxa" w:w="567"/>
-          </w:tcPr>
-          <w:p>
-            <w:r/>
-            <w:r>
-              <w:rPr>
-                <w:sz w:val="22"/>
-              </w:rPr>
-              <w:t>13</w:t>
-            </w:r>
-          </w:p>
-        </w:tc>
-        <w:tc>
-          <w:tcPr>
-            <w:tcW w:type="dxa" w:w="5669"/>
-          </w:tcPr>
-          <w:p>
-            <w:r/>
-            <w:r>
-              <w:rPr>
-                <w:sz w:val="22"/>
-              </w:rPr>
-              <w:t>Ревизия водонагревателя: замена группы безопасности, проверка подключения</w:t>
-            </w:r>
-          </w:p>
-        </w:tc>
-        <w:tc>
-          <w:tcPr>
-            <w:tcW w:type="dxa" w:w="1020"/>
-          </w:tcPr>
-          <w:p>
-            <w:r/>
-            <w:r>
-              <w:rPr>
-                <w:sz w:val="22"/>
-              </w:rPr>
-              <w:t>шт.</w:t>
-            </w:r>
-          </w:p>
-        </w:tc>
-        <w:tc>
-          <w:tcPr>
-            <w:tcW w:type="dxa" w:w="964"/>
-          </w:tcPr>
-          <w:p>
-            <w:r/>
-            <w:r>
-              <w:rPr>
-                <w:sz w:val="22"/>
-              </w:rPr>
-              <w:t>1</w:t>
-            </w:r>
-          </w:p>
-        </w:tc>
-        <w:tc>
-          <w:tcPr>
-            <w:tcW w:type="dxa" w:w="850"/>
-          </w:tcPr>
-          <w:p>
-            <w:r/>
-            <w:r>
-              <w:rPr>
-                <w:sz w:val="22"/>
-              </w:rPr>
-              <w:t>3</w:t>
-            </w:r>
-          </w:p>
-        </w:tc>
-      </w:tr>
-      <w:tr>
-        <w:tc>
-          <w:tcPr>
-            <w:tcW w:type="dxa" w:w="567"/>
-          </w:tcPr>
-          <w:p>
-            <w:r/>
-            <w:r>
-              <w:rPr>
-                <w:sz w:val="22"/>
-              </w:rPr>
-              <w:t>14</w:t>
-            </w:r>
-          </w:p>
-        </w:tc>
-        <w:tc>
-          <w:tcPr>
-            <w:tcW w:type="dxa" w:w="5669"/>
-          </w:tcPr>
-          <w:p>
-            <w:r/>
-            <w:r>
-              <w:rPr>
-                <w:sz w:val="22"/>
-              </w:rPr>
-              <w:t>Герметизация примыканий сантехприборов санитарным герметиком</w:t>
-            </w:r>
-          </w:p>
-        </w:tc>
-        <w:tc>
-          <w:tcPr>
-            <w:tcW w:type="dxa" w:w="1020"/>
-          </w:tcPr>
-          <w:p>
-            <w:r/>
-            <w:r>
-              <w:rPr>
-                <w:sz w:val="22"/>
-              </w:rPr>
-              <w:t>компл.</w:t>
-            </w:r>
-          </w:p>
-        </w:tc>
-        <w:tc>
-          <w:tcPr>
-            <w:tcW w:type="dxa" w:w="964"/>
-          </w:tcPr>
-          <w:p>
-            <w:r/>
-            <w:r>
-              <w:rPr>
-                <w:sz w:val="22"/>
-              </w:rPr>
-              <w:t>1</w:t>
-            </w:r>
-          </w:p>
-        </w:tc>
-        <w:tc>
-          <w:tcPr>
-            <w:tcW w:type="dxa" w:w="850"/>
-          </w:tcPr>
-          <w:p>
-            <w:r/>
-            <w:r>
-              <w:rPr>
-                <w:sz w:val="22"/>
-              </w:rPr>
-              <w:t>3</w:t>
-            </w:r>
-          </w:p>
-        </w:tc>
-      </w:tr>
-      <w:tr>
-        <w:tc>
-          <w:tcPr>
-            <w:tcW w:type="dxa" w:w="567"/>
-          </w:tcPr>
-          <w:p>
-            <w:r/>
-            <w:r>
-              <w:rPr>
-                <w:sz w:val="22"/>
-              </w:rPr>
-              <w:t>15</w:t>
-            </w:r>
-          </w:p>
-        </w:tc>
-        <w:tc>
-          <w:tcPr>
-            <w:tcW w:type="dxa" w:w="5669"/>
-          </w:tcPr>
-          <w:p>
-            <w:r/>
-            <w:r>
-              <w:rPr>
-                <w:sz w:val="22"/>
-              </w:rPr>
-              <w:t>Пуско-наладка, проверка всех соединений на герметичность, сдача Объекта</w:t>
-            </w:r>
-          </w:p>
-        </w:tc>
-        <w:tc>
-          <w:tcPr>
-            <w:tcW w:type="dxa" w:w="1020"/>
-          </w:tcPr>
-          <w:p>
-            <w:r/>
-            <w:r>
-              <w:rPr>
-                <w:sz w:val="22"/>
-              </w:rPr>
-              <w:t>компл.</w:t>
-            </w:r>
-          </w:p>
-        </w:tc>
-        <w:tc>
-          <w:tcPr>
-            <w:tcW w:type="dxa" w:w="964"/>
-          </w:tcPr>
-          <w:p>
-            <w:r/>
-            <w:r>
-              <w:rPr>
-                <w:sz w:val="22"/>
-              </w:rPr>
-              <w:t>1</w:t>
-            </w:r>
-          </w:p>
-        </w:tc>
-        <w:tc>
-          <w:tcPr>
-            <w:tcW w:type="dxa" w:w="850"/>
-          </w:tcPr>
-          <w:p>
-            <w:r/>
-            <w:r>
-              <w:rPr>
-                <w:sz w:val="22"/>
-              </w:rPr>
-              <w:t>3</w:t>
             </w:r>
           </w:p>
         </w:tc>
@@ -4500,13 +1763,14 @@
     <w:p>
       <w:pPr>
         <w:spacing w:before="0"/>
-        <w:jc w:val="left"/>
+        <w:ind w:firstLine="567"/>
+        <w:jc w:val="both"/>
       </w:pPr>
       <w:r>
         <w:rPr>
-          <w:b/>
+          <w:b w:val="0"/>
         </w:rPr>
-        <w:t>Примечания:</w:t>
+        <w:t>Итого по Договору: 180 000 (сто восемьдесят тысяч) рублей 00 копеек, НДС не облагается.</w:t>
       </w:r>
     </w:p>
     <w:p>
@@ -4519,7 +1783,7 @@
         <w:rPr>
           <w:b w:val="0"/>
         </w:rPr>
-        <w:t>1. Количество работ ориентировочное и уточняется по результатам обследования на этапе 1 в пределах стоимости, установленной Договором для соответствующего Объекта.</w:t>
+        <w:t>Стороны вправе по дополнительному соглашению перераспределить суммы между этапами без изменения общей стоимости Договора.</w:t>
       </w:r>
     </w:p>
     <w:p>
@@ -4532,33 +1796,6 @@
         <w:rPr>
           <w:b w:val="0"/>
         </w:rPr>
-        <w:t>2. Материалы и оборудование (трубы, фитинги, арматура, сантехприборы, инсталляция, водонагреватель) предоставляются Заказчиком в соответствии с п. 3.2 Договора.</w:t>
-      </w:r>
-    </w:p>
-    <w:p>
-      <w:pPr>
-        <w:spacing w:before="0"/>
-        <w:ind w:firstLine="567"/>
-        <w:jc w:val="both"/>
-      </w:pPr>
-      <w:r>
-        <w:rPr>
-          <w:b w:val="0"/>
-        </w:rPr>
-        <w:t>3. Отключение общедомовых стояков согласовывает Заказчик с управляющей компанией.</w:t>
-      </w:r>
-    </w:p>
-    <w:p>
-      <w:pPr>
-        <w:spacing w:before="0"/>
-        <w:ind w:firstLine="567"/>
-        <w:jc w:val="both"/>
-      </w:pPr>
-      <w:r>
-        <w:rPr>
-          <w:b w:val="0"/>
-        </w:rPr>
-        <w:t>4. Отделочные работы (плитка, короба, покраска, электромонтаж) в предмет Договора не входят, за исключением работ, прямо указанных в настоящем Приложении.</w:t>
       </w:r>
     </w:p>
     <w:tbl>
@@ -4614,1081 +1851,6 @@
           <w:b w:val="0"/>
         </w:rPr>
         <w:t>Приложение № 2</w:t>
-        <w:br/>
-        <w:t>к Договору № ____ от «____» ___________ 2026 г.</w:t>
-      </w:r>
-    </w:p>
-    <w:p>
-      <w:pPr>
-        <w:spacing w:before="160"/>
-        <w:jc w:val="center"/>
-      </w:pPr>
-      <w:r>
-        <w:rPr>
-          <w:b/>
-        </w:rPr>
-        <w:t>ГРАФИК ВЫПОЛНЕНИЯ И ОПЛАТЫ РАБОТ</w:t>
-      </w:r>
-    </w:p>
-    <w:tbl>
-      <w:tblPr>
-        <w:tblStyle w:val="TableGrid"/>
-        <w:tblW w:type="auto" w:w="0"/>
-        <w:jc w:val="center"/>
-        <w:tblLayout w:type="fixed"/>
-        <w:tblLook w:firstColumn="1" w:firstRow="1" w:lastColumn="0" w:lastRow="0" w:noHBand="0" w:noVBand="1" w:val="04A0"/>
-      </w:tblPr>
-      <w:tblGrid>
-        <w:gridCol w:w="850"/>
-        <w:gridCol w:w="1701"/>
-        <w:gridCol w:w="1417"/>
-        <w:gridCol w:w="1928"/>
-        <w:gridCol w:w="1361"/>
-        <w:gridCol w:w="1814"/>
-      </w:tblGrid>
-      <w:tr>
-        <w:tc>
-          <w:tcPr>
-            <w:tcW w:type="dxa" w:w="850"/>
-          </w:tcPr>
-          <w:p>
-            <w:pPr>
-              <w:jc w:val="center"/>
-            </w:pPr>
-            <w:r/>
-            <w:r>
-              <w:rPr>
-                <w:b/>
-                <w:sz w:val="22"/>
-              </w:rPr>
-              <w:t>Этап</w:t>
-            </w:r>
-          </w:p>
-        </w:tc>
-        <w:tc>
-          <w:tcPr>
-            <w:tcW w:type="dxa" w:w="1701"/>
-          </w:tcPr>
-          <w:p>
-            <w:pPr>
-              <w:jc w:val="center"/>
-            </w:pPr>
-            <w:r/>
-            <w:r>
-              <w:rPr>
-                <w:b/>
-                <w:sz w:val="22"/>
-              </w:rPr>
-              <w:t>Срок выполнения</w:t>
-            </w:r>
-          </w:p>
-        </w:tc>
-        <w:tc>
-          <w:tcPr>
-            <w:tcW w:type="dxa" w:w="1417"/>
-          </w:tcPr>
-          <w:p>
-            <w:pPr>
-              <w:jc w:val="center"/>
-            </w:pPr>
-            <w:r/>
-            <w:r>
-              <w:rPr>
-                <w:b/>
-                <w:sz w:val="22"/>
-              </w:rPr>
-              <w:t>Объект</w:t>
-            </w:r>
-          </w:p>
-        </w:tc>
-        <w:tc>
-          <w:tcPr>
-            <w:tcW w:type="dxa" w:w="1928"/>
-          </w:tcPr>
-          <w:p>
-            <w:pPr>
-              <w:jc w:val="center"/>
-            </w:pPr>
-            <w:r/>
-            <w:r>
-              <w:rPr>
-                <w:b/>
-                <w:sz w:val="22"/>
-              </w:rPr>
-              <w:t>Состав работ</w:t>
-            </w:r>
-          </w:p>
-        </w:tc>
-        <w:tc>
-          <w:tcPr>
-            <w:tcW w:type="dxa" w:w="1361"/>
-          </w:tcPr>
-          <w:p>
-            <w:pPr>
-              <w:jc w:val="center"/>
-            </w:pPr>
-            <w:r/>
-            <w:r>
-              <w:rPr>
-                <w:b/>
-                <w:sz w:val="22"/>
-              </w:rPr>
-              <w:t>Стоимость, руб.</w:t>
-            </w:r>
-          </w:p>
-        </w:tc>
-        <w:tc>
-          <w:tcPr>
-            <w:tcW w:type="dxa" w:w="1814"/>
-          </w:tcPr>
-          <w:p>
-            <w:pPr>
-              <w:jc w:val="center"/>
-            </w:pPr>
-            <w:r/>
-            <w:r>
-              <w:rPr>
-                <w:b/>
-                <w:sz w:val="22"/>
-              </w:rPr>
-              <w:t>Срок оплаты</w:t>
-            </w:r>
-          </w:p>
-        </w:tc>
-      </w:tr>
-      <w:tr>
-        <w:tc>
-          <w:tcPr>
-            <w:tcW w:type="dxa" w:w="850"/>
-          </w:tcPr>
-          <w:p>
-            <w:r/>
-            <w:r>
-              <w:rPr>
-                <w:sz w:val="22"/>
-              </w:rPr>
-              <w:t>1</w:t>
-            </w:r>
-          </w:p>
-        </w:tc>
-        <w:tc>
-          <w:tcPr>
-            <w:tcW w:type="dxa" w:w="1701"/>
-          </w:tcPr>
-          <w:p>
-            <w:r/>
-            <w:r>
-              <w:rPr>
-                <w:sz w:val="22"/>
-              </w:rPr>
-              <w:t>1-й месяц:</w:t>
-              <w:br/>
-              <w:t>с «__»___ по «__»___</w:t>
-            </w:r>
-          </w:p>
-        </w:tc>
-        <w:tc>
-          <w:tcPr>
-            <w:tcW w:type="dxa" w:w="1417"/>
-          </w:tcPr>
-          <w:p>
-            <w:r/>
-            <w:r>
-              <w:rPr>
-                <w:sz w:val="22"/>
-              </w:rPr>
-              <w:t>№ 1 (Дыбенко)</w:t>
-            </w:r>
-          </w:p>
-        </w:tc>
-        <w:tc>
-          <w:tcPr>
-            <w:tcW w:type="dxa" w:w="1928"/>
-          </w:tcPr>
-          <w:p>
-            <w:r/>
-            <w:r>
-              <w:rPr>
-                <w:sz w:val="22"/>
-              </w:rPr>
-              <w:t>п. 1–8 Прил. 1</w:t>
-            </w:r>
-          </w:p>
-        </w:tc>
-        <w:tc>
-          <w:tcPr>
-            <w:tcW w:type="dxa" w:w="1361"/>
-          </w:tcPr>
-          <w:p>
-            <w:r/>
-            <w:r>
-              <w:rPr>
-                <w:sz w:val="22"/>
-              </w:rPr>
-              <w:t>35 000,00</w:t>
-            </w:r>
-          </w:p>
-        </w:tc>
-        <w:tc>
-          <w:tcPr>
-            <w:tcW w:type="dxa" w:w="1814"/>
-          </w:tcPr>
-          <w:p>
-            <w:r/>
-            <w:r>
-              <w:rPr>
-                <w:sz w:val="22"/>
-              </w:rPr>
-              <w:t>5 раб. дн. после акта этапа 1</w:t>
-            </w:r>
-          </w:p>
-        </w:tc>
-      </w:tr>
-      <w:tr>
-        <w:tc>
-          <w:tcPr>
-            <w:tcW w:type="dxa" w:w="850"/>
-          </w:tcPr>
-          <w:p>
-            <w:r/>
-            <w:r>
-              <w:rPr>
-                <w:sz w:val="22"/>
-              </w:rPr>
-            </w:r>
-          </w:p>
-        </w:tc>
-        <w:tc>
-          <w:tcPr>
-            <w:tcW w:type="dxa" w:w="1701"/>
-          </w:tcPr>
-          <w:p>
-            <w:r/>
-            <w:r>
-              <w:rPr>
-                <w:sz w:val="22"/>
-              </w:rPr>
-            </w:r>
-          </w:p>
-        </w:tc>
-        <w:tc>
-          <w:tcPr>
-            <w:tcW w:type="dxa" w:w="1417"/>
-          </w:tcPr>
-          <w:p>
-            <w:r/>
-            <w:r>
-              <w:rPr>
-                <w:sz w:val="22"/>
-              </w:rPr>
-              <w:t>№ 2 (Ком. пр-т)</w:t>
-            </w:r>
-          </w:p>
-        </w:tc>
-        <w:tc>
-          <w:tcPr>
-            <w:tcW w:type="dxa" w:w="1928"/>
-          </w:tcPr>
-          <w:p>
-            <w:r/>
-            <w:r>
-              <w:rPr>
-                <w:sz w:val="22"/>
-              </w:rPr>
-              <w:t>п. 1–5 Прил. 1</w:t>
-            </w:r>
-          </w:p>
-        </w:tc>
-        <w:tc>
-          <w:tcPr>
-            <w:tcW w:type="dxa" w:w="1361"/>
-          </w:tcPr>
-          <w:p>
-            <w:r/>
-            <w:r>
-              <w:rPr>
-                <w:sz w:val="22"/>
-              </w:rPr>
-              <w:t>25 000,00</w:t>
-            </w:r>
-          </w:p>
-        </w:tc>
-        <w:tc>
-          <w:tcPr>
-            <w:tcW w:type="dxa" w:w="1814"/>
-          </w:tcPr>
-          <w:p>
-            <w:r/>
-            <w:r>
-              <w:rPr>
-                <w:sz w:val="22"/>
-              </w:rPr>
-            </w:r>
-          </w:p>
-        </w:tc>
-      </w:tr>
-      <w:tr>
-        <w:tc>
-          <w:tcPr>
-            <w:tcW w:type="dxa" w:w="850"/>
-          </w:tcPr>
-          <w:p>
-            <w:r/>
-            <w:r>
-              <w:rPr>
-                <w:sz w:val="22"/>
-              </w:rPr>
-            </w:r>
-          </w:p>
-        </w:tc>
-        <w:tc>
-          <w:tcPr>
-            <w:tcW w:type="dxa" w:w="1701"/>
-          </w:tcPr>
-          <w:p>
-            <w:r/>
-            <w:r>
-              <w:rPr>
-                <w:sz w:val="22"/>
-              </w:rPr>
-            </w:r>
-          </w:p>
-        </w:tc>
-        <w:tc>
-          <w:tcPr>
-            <w:tcW w:type="dxa" w:w="1417"/>
-          </w:tcPr>
-          <w:p>
-            <w:r/>
-            <w:r>
-              <w:rPr>
-                <w:sz w:val="22"/>
-              </w:rPr>
-            </w:r>
-          </w:p>
-        </w:tc>
-        <w:tc>
-          <w:tcPr>
-            <w:tcW w:type="dxa" w:w="1928"/>
-          </w:tcPr>
-          <w:p>
-            <w:r/>
-            <w:r>
-              <w:rPr>
-                <w:sz w:val="22"/>
-              </w:rPr>
-              <w:t>Итого по этапу 1:</w:t>
-            </w:r>
-          </w:p>
-        </w:tc>
-        <w:tc>
-          <w:tcPr>
-            <w:tcW w:type="dxa" w:w="1361"/>
-          </w:tcPr>
-          <w:p>
-            <w:r/>
-            <w:r>
-              <w:rPr>
-                <w:sz w:val="22"/>
-              </w:rPr>
-              <w:t>60 000,00</w:t>
-            </w:r>
-          </w:p>
-        </w:tc>
-        <w:tc>
-          <w:tcPr>
-            <w:tcW w:type="dxa" w:w="1814"/>
-          </w:tcPr>
-          <w:p>
-            <w:r/>
-            <w:r>
-              <w:rPr>
-                <w:sz w:val="22"/>
-              </w:rPr>
-            </w:r>
-          </w:p>
-        </w:tc>
-      </w:tr>
-      <w:tr>
-        <w:tc>
-          <w:tcPr>
-            <w:tcW w:type="dxa" w:w="850"/>
-          </w:tcPr>
-          <w:p>
-            <w:r/>
-            <w:r>
-              <w:rPr>
-                <w:sz w:val="22"/>
-              </w:rPr>
-              <w:t>2</w:t>
-            </w:r>
-          </w:p>
-        </w:tc>
-        <w:tc>
-          <w:tcPr>
-            <w:tcW w:type="dxa" w:w="1701"/>
-          </w:tcPr>
-          <w:p>
-            <w:r/>
-            <w:r>
-              <w:rPr>
-                <w:sz w:val="22"/>
-              </w:rPr>
-              <w:t>2-й месяц:</w:t>
-              <w:br/>
-              <w:t>с «__»___ по «__»___</w:t>
-            </w:r>
-          </w:p>
-        </w:tc>
-        <w:tc>
-          <w:tcPr>
-            <w:tcW w:type="dxa" w:w="1417"/>
-          </w:tcPr>
-          <w:p>
-            <w:r/>
-            <w:r>
-              <w:rPr>
-                <w:sz w:val="22"/>
-              </w:rPr>
-              <w:t>№ 1 (Дыбенко)</w:t>
-            </w:r>
-          </w:p>
-        </w:tc>
-        <w:tc>
-          <w:tcPr>
-            <w:tcW w:type="dxa" w:w="1928"/>
-          </w:tcPr>
-          <w:p>
-            <w:r/>
-            <w:r>
-              <w:rPr>
-                <w:sz w:val="22"/>
-              </w:rPr>
-              <w:t>п. 9–15 Прил. 1</w:t>
-            </w:r>
-          </w:p>
-        </w:tc>
-        <w:tc>
-          <w:tcPr>
-            <w:tcW w:type="dxa" w:w="1361"/>
-          </w:tcPr>
-          <w:p>
-            <w:r/>
-            <w:r>
-              <w:rPr>
-                <w:sz w:val="22"/>
-              </w:rPr>
-              <w:t>35 000,00</w:t>
-            </w:r>
-          </w:p>
-        </w:tc>
-        <w:tc>
-          <w:tcPr>
-            <w:tcW w:type="dxa" w:w="1814"/>
-          </w:tcPr>
-          <w:p>
-            <w:r/>
-            <w:r>
-              <w:rPr>
-                <w:sz w:val="22"/>
-              </w:rPr>
-              <w:t>5 раб. дн. после акта этапа 2</w:t>
-            </w:r>
-          </w:p>
-        </w:tc>
-      </w:tr>
-      <w:tr>
-        <w:tc>
-          <w:tcPr>
-            <w:tcW w:type="dxa" w:w="850"/>
-          </w:tcPr>
-          <w:p>
-            <w:r/>
-            <w:r>
-              <w:rPr>
-                <w:sz w:val="22"/>
-              </w:rPr>
-            </w:r>
-          </w:p>
-        </w:tc>
-        <w:tc>
-          <w:tcPr>
-            <w:tcW w:type="dxa" w:w="1701"/>
-          </w:tcPr>
-          <w:p>
-            <w:r/>
-            <w:r>
-              <w:rPr>
-                <w:sz w:val="22"/>
-              </w:rPr>
-            </w:r>
-          </w:p>
-        </w:tc>
-        <w:tc>
-          <w:tcPr>
-            <w:tcW w:type="dxa" w:w="1417"/>
-          </w:tcPr>
-          <w:p>
-            <w:r/>
-            <w:r>
-              <w:rPr>
-                <w:sz w:val="22"/>
-              </w:rPr>
-              <w:t>№ 2 (Ком. пр-т)</w:t>
-            </w:r>
-          </w:p>
-        </w:tc>
-        <w:tc>
-          <w:tcPr>
-            <w:tcW w:type="dxa" w:w="1928"/>
-          </w:tcPr>
-          <w:p>
-            <w:r/>
-            <w:r>
-              <w:rPr>
-                <w:sz w:val="22"/>
-              </w:rPr>
-              <w:t>п. 6–9 Прил. 1</w:t>
-            </w:r>
-          </w:p>
-        </w:tc>
-        <w:tc>
-          <w:tcPr>
-            <w:tcW w:type="dxa" w:w="1361"/>
-          </w:tcPr>
-          <w:p>
-            <w:r/>
-            <w:r>
-              <w:rPr>
-                <w:sz w:val="22"/>
-              </w:rPr>
-              <w:t>25 000,00</w:t>
-            </w:r>
-          </w:p>
-        </w:tc>
-        <w:tc>
-          <w:tcPr>
-            <w:tcW w:type="dxa" w:w="1814"/>
-          </w:tcPr>
-          <w:p>
-            <w:r/>
-            <w:r>
-              <w:rPr>
-                <w:sz w:val="22"/>
-              </w:rPr>
-            </w:r>
-          </w:p>
-        </w:tc>
-      </w:tr>
-      <w:tr>
-        <w:tc>
-          <w:tcPr>
-            <w:tcW w:type="dxa" w:w="850"/>
-          </w:tcPr>
-          <w:p>
-            <w:r/>
-            <w:r>
-              <w:rPr>
-                <w:sz w:val="22"/>
-              </w:rPr>
-            </w:r>
-          </w:p>
-        </w:tc>
-        <w:tc>
-          <w:tcPr>
-            <w:tcW w:type="dxa" w:w="1701"/>
-          </w:tcPr>
-          <w:p>
-            <w:r/>
-            <w:r>
-              <w:rPr>
-                <w:sz w:val="22"/>
-              </w:rPr>
-            </w:r>
-          </w:p>
-        </w:tc>
-        <w:tc>
-          <w:tcPr>
-            <w:tcW w:type="dxa" w:w="1417"/>
-          </w:tcPr>
-          <w:p>
-            <w:r/>
-            <w:r>
-              <w:rPr>
-                <w:sz w:val="22"/>
-              </w:rPr>
-            </w:r>
-          </w:p>
-        </w:tc>
-        <w:tc>
-          <w:tcPr>
-            <w:tcW w:type="dxa" w:w="1928"/>
-          </w:tcPr>
-          <w:p>
-            <w:r/>
-            <w:r>
-              <w:rPr>
-                <w:sz w:val="22"/>
-              </w:rPr>
-              <w:t>Итого по этапу 2:</w:t>
-            </w:r>
-          </w:p>
-        </w:tc>
-        <w:tc>
-          <w:tcPr>
-            <w:tcW w:type="dxa" w:w="1361"/>
-          </w:tcPr>
-          <w:p>
-            <w:r/>
-            <w:r>
-              <w:rPr>
-                <w:sz w:val="22"/>
-              </w:rPr>
-              <w:t>60 000,00</w:t>
-            </w:r>
-          </w:p>
-        </w:tc>
-        <w:tc>
-          <w:tcPr>
-            <w:tcW w:type="dxa" w:w="1814"/>
-          </w:tcPr>
-          <w:p>
-            <w:r/>
-            <w:r>
-              <w:rPr>
-                <w:sz w:val="22"/>
-              </w:rPr>
-            </w:r>
-          </w:p>
-        </w:tc>
-      </w:tr>
-      <w:tr>
-        <w:tc>
-          <w:tcPr>
-            <w:tcW w:type="dxa" w:w="850"/>
-          </w:tcPr>
-          <w:p>
-            <w:r/>
-            <w:r>
-              <w:rPr>
-                <w:sz w:val="22"/>
-              </w:rPr>
-              <w:t>3</w:t>
-            </w:r>
-          </w:p>
-        </w:tc>
-        <w:tc>
-          <w:tcPr>
-            <w:tcW w:type="dxa" w:w="1701"/>
-          </w:tcPr>
-          <w:p>
-            <w:r/>
-            <w:r>
-              <w:rPr>
-                <w:sz w:val="22"/>
-              </w:rPr>
-              <w:t>3-й месяц:</w:t>
-              <w:br/>
-              <w:t>с «__»___ по «__»___</w:t>
-            </w:r>
-          </w:p>
-        </w:tc>
-        <w:tc>
-          <w:tcPr>
-            <w:tcW w:type="dxa" w:w="1417"/>
-          </w:tcPr>
-          <w:p>
-            <w:r/>
-            <w:r>
-              <w:rPr>
-                <w:sz w:val="22"/>
-              </w:rPr>
-              <w:t>№ 1 (Дыбенко)</w:t>
-            </w:r>
-          </w:p>
-        </w:tc>
-        <w:tc>
-          <w:tcPr>
-            <w:tcW w:type="dxa" w:w="1928"/>
-          </w:tcPr>
-          <w:p>
-            <w:r/>
-            <w:r>
-              <w:rPr>
-                <w:sz w:val="22"/>
-              </w:rPr>
-              <w:t>п. 16–22 Прил. 1</w:t>
-            </w:r>
-          </w:p>
-        </w:tc>
-        <w:tc>
-          <w:tcPr>
-            <w:tcW w:type="dxa" w:w="1361"/>
-          </w:tcPr>
-          <w:p>
-            <w:r/>
-            <w:r>
-              <w:rPr>
-                <w:sz w:val="22"/>
-              </w:rPr>
-              <w:t>35 000,00</w:t>
-            </w:r>
-          </w:p>
-        </w:tc>
-        <w:tc>
-          <w:tcPr>
-            <w:tcW w:type="dxa" w:w="1814"/>
-          </w:tcPr>
-          <w:p>
-            <w:r/>
-            <w:r>
-              <w:rPr>
-                <w:sz w:val="22"/>
-              </w:rPr>
-              <w:t>5 раб. дн. после акта этапа 3</w:t>
-            </w:r>
-          </w:p>
-        </w:tc>
-      </w:tr>
-      <w:tr>
-        <w:tc>
-          <w:tcPr>
-            <w:tcW w:type="dxa" w:w="850"/>
-          </w:tcPr>
-          <w:p>
-            <w:r/>
-            <w:r>
-              <w:rPr>
-                <w:sz w:val="22"/>
-              </w:rPr>
-            </w:r>
-          </w:p>
-        </w:tc>
-        <w:tc>
-          <w:tcPr>
-            <w:tcW w:type="dxa" w:w="1701"/>
-          </w:tcPr>
-          <w:p>
-            <w:r/>
-            <w:r>
-              <w:rPr>
-                <w:sz w:val="22"/>
-              </w:rPr>
-            </w:r>
-          </w:p>
-        </w:tc>
-        <w:tc>
-          <w:tcPr>
-            <w:tcW w:type="dxa" w:w="1417"/>
-          </w:tcPr>
-          <w:p>
-            <w:r/>
-            <w:r>
-              <w:rPr>
-                <w:sz w:val="22"/>
-              </w:rPr>
-              <w:t>№ 2 (Ком. пр-т)</w:t>
-            </w:r>
-          </w:p>
-        </w:tc>
-        <w:tc>
-          <w:tcPr>
-            <w:tcW w:type="dxa" w:w="1928"/>
-          </w:tcPr>
-          <w:p>
-            <w:r/>
-            <w:r>
-              <w:rPr>
-                <w:sz w:val="22"/>
-              </w:rPr>
-              <w:t>п. 10–15 Прил. 1</w:t>
-            </w:r>
-          </w:p>
-        </w:tc>
-        <w:tc>
-          <w:tcPr>
-            <w:tcW w:type="dxa" w:w="1361"/>
-          </w:tcPr>
-          <w:p>
-            <w:r/>
-            <w:r>
-              <w:rPr>
-                <w:sz w:val="22"/>
-              </w:rPr>
-              <w:t>25 000,00</w:t>
-            </w:r>
-          </w:p>
-        </w:tc>
-        <w:tc>
-          <w:tcPr>
-            <w:tcW w:type="dxa" w:w="1814"/>
-          </w:tcPr>
-          <w:p>
-            <w:r/>
-            <w:r>
-              <w:rPr>
-                <w:sz w:val="22"/>
-              </w:rPr>
-            </w:r>
-          </w:p>
-        </w:tc>
-      </w:tr>
-      <w:tr>
-        <w:tc>
-          <w:tcPr>
-            <w:tcW w:type="dxa" w:w="850"/>
-          </w:tcPr>
-          <w:p>
-            <w:r/>
-            <w:r>
-              <w:rPr>
-                <w:sz w:val="22"/>
-              </w:rPr>
-            </w:r>
-          </w:p>
-        </w:tc>
-        <w:tc>
-          <w:tcPr>
-            <w:tcW w:type="dxa" w:w="1701"/>
-          </w:tcPr>
-          <w:p>
-            <w:r/>
-            <w:r>
-              <w:rPr>
-                <w:sz w:val="22"/>
-              </w:rPr>
-            </w:r>
-          </w:p>
-        </w:tc>
-        <w:tc>
-          <w:tcPr>
-            <w:tcW w:type="dxa" w:w="1417"/>
-          </w:tcPr>
-          <w:p>
-            <w:r/>
-            <w:r>
-              <w:rPr>
-                <w:sz w:val="22"/>
-              </w:rPr>
-            </w:r>
-          </w:p>
-        </w:tc>
-        <w:tc>
-          <w:tcPr>
-            <w:tcW w:type="dxa" w:w="1928"/>
-          </w:tcPr>
-          <w:p>
-            <w:r/>
-            <w:r>
-              <w:rPr>
-                <w:sz w:val="22"/>
-              </w:rPr>
-              <w:t>Итого по этапу 3:</w:t>
-            </w:r>
-          </w:p>
-        </w:tc>
-        <w:tc>
-          <w:tcPr>
-            <w:tcW w:type="dxa" w:w="1361"/>
-          </w:tcPr>
-          <w:p>
-            <w:r/>
-            <w:r>
-              <w:rPr>
-                <w:sz w:val="22"/>
-              </w:rPr>
-              <w:t>60 000,00</w:t>
-            </w:r>
-          </w:p>
-        </w:tc>
-        <w:tc>
-          <w:tcPr>
-            <w:tcW w:type="dxa" w:w="1814"/>
-          </w:tcPr>
-          <w:p>
-            <w:r/>
-            <w:r>
-              <w:rPr>
-                <w:sz w:val="22"/>
-              </w:rPr>
-            </w:r>
-          </w:p>
-        </w:tc>
-      </w:tr>
-      <w:tr>
-        <w:tc>
-          <w:tcPr>
-            <w:tcW w:type="dxa" w:w="850"/>
-          </w:tcPr>
-          <w:p>
-            <w:r/>
-            <w:r>
-              <w:rPr>
-                <w:sz w:val="22"/>
-              </w:rPr>
-            </w:r>
-          </w:p>
-        </w:tc>
-        <w:tc>
-          <w:tcPr>
-            <w:tcW w:type="dxa" w:w="1701"/>
-          </w:tcPr>
-          <w:p>
-            <w:r/>
-            <w:r>
-              <w:rPr>
-                <w:sz w:val="22"/>
-              </w:rPr>
-            </w:r>
-          </w:p>
-        </w:tc>
-        <w:tc>
-          <w:tcPr>
-            <w:tcW w:type="dxa" w:w="1417"/>
-          </w:tcPr>
-          <w:p>
-            <w:r/>
-            <w:r>
-              <w:rPr>
-                <w:sz w:val="22"/>
-              </w:rPr>
-            </w:r>
-          </w:p>
-        </w:tc>
-        <w:tc>
-          <w:tcPr>
-            <w:tcW w:type="dxa" w:w="1928"/>
-          </w:tcPr>
-          <w:p>
-            <w:r/>
-            <w:r>
-              <w:rPr>
-                <w:sz w:val="22"/>
-              </w:rPr>
-              <w:t>ИТОГО:</w:t>
-            </w:r>
-          </w:p>
-        </w:tc>
-        <w:tc>
-          <w:tcPr>
-            <w:tcW w:type="dxa" w:w="1361"/>
-          </w:tcPr>
-          <w:p>
-            <w:r/>
-            <w:r>
-              <w:rPr>
-                <w:sz w:val="22"/>
-              </w:rPr>
-              <w:t>180 000,00</w:t>
-            </w:r>
-          </w:p>
-        </w:tc>
-        <w:tc>
-          <w:tcPr>
-            <w:tcW w:type="dxa" w:w="1814"/>
-          </w:tcPr>
-          <w:p>
-            <w:r/>
-            <w:r>
-              <w:rPr>
-                <w:sz w:val="22"/>
-              </w:rPr>
-            </w:r>
-          </w:p>
-        </w:tc>
-      </w:tr>
-    </w:tbl>
-    <w:p>
-      <w:pPr>
-        <w:spacing w:before="0"/>
-        <w:ind w:firstLine="567"/>
-        <w:jc w:val="both"/>
-      </w:pPr>
-      <w:r>
-        <w:rPr>
-          <w:b w:val="0"/>
-        </w:rPr>
-      </w:r>
-    </w:p>
-    <w:p>
-      <w:pPr>
-        <w:spacing w:before="0"/>
-        <w:ind w:firstLine="567"/>
-        <w:jc w:val="both"/>
-      </w:pPr>
-      <w:r>
-        <w:rPr>
-          <w:b w:val="0"/>
-        </w:rPr>
-        <w:t>Итого по Договору: 180 000 (сто восемьдесят тысяч) рублей 00 копеек, НДС не облагается, в том числе: по Объекту № 1 — 105 000 рублей 00 копеек, по Объекту № 2 — 75 000 рублей 00 копеек.</w:t>
-      </w:r>
-    </w:p>
-    <w:p>
-      <w:pPr>
-        <w:spacing w:before="0"/>
-        <w:ind w:firstLine="567"/>
-        <w:jc w:val="both"/>
-      </w:pPr>
-      <w:r>
-        <w:rPr>
-          <w:b w:val="0"/>
-        </w:rPr>
-        <w:t>Стороны вправе по дополнительному соглашению перераспределить состав работ и суммы между этапами и Объектами без изменения общей стоимости Договора.</w:t>
-      </w:r>
-    </w:p>
-    <w:tbl>
-      <w:tblPr>
-        <w:tblW w:type="auto" w:w="0"/>
-        <w:tblLook w:firstColumn="1" w:firstRow="1" w:lastColumn="0" w:lastRow="0" w:noHBand="0" w:noVBand="1" w:val="04A0"/>
-      </w:tblPr>
-      <w:tblGrid>
-        <w:gridCol w:w="4986"/>
-        <w:gridCol w:w="4986"/>
-      </w:tblGrid>
-      <w:tr>
-        <w:tc>
-          <w:tcPr>
-            <w:tcW w:type="dxa" w:w="4986"/>
-          </w:tcPr>
-          <w:p>
-            <w:r>
-              <w:t>Заказчик:</w:t>
-              <w:br/>
-              <w:br/>
-              <w:t>____________ / ______________ /</w:t>
-            </w:r>
-          </w:p>
-        </w:tc>
-        <w:tc>
-          <w:tcPr>
-            <w:tcW w:type="dxa" w:w="4986"/>
-          </w:tcPr>
-          <w:p>
-            <w:r>
-              <w:t>Исполнитель:</w:t>
-              <w:br/>
-              <w:br/>
-              <w:t>____________ / ______________ /</w:t>
-            </w:r>
-          </w:p>
-        </w:tc>
-      </w:tr>
-    </w:tbl>
-    <w:p>
-      <w:r>
-        <w:br w:type="page"/>
-      </w:r>
-    </w:p>
-    <w:p>
-      <w:pPr>
-        <w:spacing w:before="0"/>
-        <w:jc w:val="right"/>
-      </w:pPr>
-      <w:r>
-        <w:rPr>
-          <w:b w:val="0"/>
-        </w:rPr>
-        <w:t>Приложение № 3</w:t>
         <w:br/>
         <w:t>к Договору № ____ от «____» ___________ 2026 г.</w:t>
       </w:r>
@@ -5789,9 +1951,8 @@
       </w:tblPr>
       <w:tblGrid>
         <w:gridCol w:w="567"/>
-        <w:gridCol w:w="2835"/>
-        <w:gridCol w:w="3969"/>
-        <w:gridCol w:w="1701"/>
+        <w:gridCol w:w="3118"/>
+        <w:gridCol w:w="5386"/>
       </w:tblGrid>
       <w:tr>
         <w:tc>
@@ -5814,7 +1975,7 @@
         </w:tc>
         <w:tc>
           <w:tcPr>
-            <w:tcW w:type="dxa" w:w="2835"/>
+            <w:tcW w:type="dxa" w:w="3118"/>
           </w:tcPr>
           <w:p>
             <w:pPr>
@@ -5832,7 +1993,7 @@
         </w:tc>
         <w:tc>
           <w:tcPr>
-            <w:tcW w:type="dxa" w:w="3969"/>
+            <w:tcW w:type="dxa" w:w="5386"/>
           </w:tcPr>
           <w:p>
             <w:pPr>
@@ -5844,25 +2005,7 @@
                 <w:b/>
                 <w:sz w:val="22"/>
               </w:rPr>
-              <w:t>Наименование работ</w:t>
-            </w:r>
-          </w:p>
-        </w:tc>
-        <w:tc>
-          <w:tcPr>
-            <w:tcW w:type="dxa" w:w="1701"/>
-          </w:tcPr>
-          <w:p>
-            <w:pPr>
-              <w:jc w:val="center"/>
-            </w:pPr>
-            <w:r/>
-            <w:r>
-              <w:rPr>
-                <w:b/>
-                <w:sz w:val="22"/>
-              </w:rPr>
-              <w:t>Стоимость, руб.</w:t>
+              <w:t>Наименование выполненных работ</w:t>
             </w:r>
           </w:p>
         </w:tc>
@@ -5884,7 +2027,7 @@
         </w:tc>
         <w:tc>
           <w:tcPr>
-            <w:tcW w:type="dxa" w:w="2835"/>
+            <w:tcW w:type="dxa" w:w="3118"/>
           </w:tcPr>
           <w:p>
             <w:r/>
@@ -5898,7 +2041,7 @@
         </w:tc>
         <w:tc>
           <w:tcPr>
-            <w:tcW w:type="dxa" w:w="3969"/>
+            <w:tcW w:type="dxa" w:w="5386"/>
           </w:tcPr>
           <w:p>
             <w:r/>
@@ -5906,20 +2049,8 @@
               <w:rPr>
                 <w:sz w:val="22"/>
               </w:rPr>
-            </w:r>
-          </w:p>
-        </w:tc>
-        <w:tc>
-          <w:tcPr>
-            <w:tcW w:type="dxa" w:w="1701"/>
-          </w:tcPr>
-          <w:p>
-            <w:r/>
-            <w:r>
-              <w:rPr>
-                <w:sz w:val="22"/>
-              </w:rPr>
-              <w:t>35 000,00</w:t>
+              <w:br/>
+              <w:br/>
             </w:r>
           </w:p>
         </w:tc>
@@ -5941,7 +2072,7 @@
         </w:tc>
         <w:tc>
           <w:tcPr>
-            <w:tcW w:type="dxa" w:w="2835"/>
+            <w:tcW w:type="dxa" w:w="3118"/>
           </w:tcPr>
           <w:p>
             <w:r/>
@@ -5955,7 +2086,7 @@
         </w:tc>
         <w:tc>
           <w:tcPr>
-            <w:tcW w:type="dxa" w:w="3969"/>
+            <w:tcW w:type="dxa" w:w="5386"/>
           </w:tcPr>
           <w:p>
             <w:r/>
@@ -5963,76 +2094,8 @@
               <w:rPr>
                 <w:sz w:val="22"/>
               </w:rPr>
-            </w:r>
-          </w:p>
-        </w:tc>
-        <w:tc>
-          <w:tcPr>
-            <w:tcW w:type="dxa" w:w="1701"/>
-          </w:tcPr>
-          <w:p>
-            <w:r/>
-            <w:r>
-              <w:rPr>
-                <w:sz w:val="22"/>
-              </w:rPr>
-              <w:t>25 000,00</w:t>
-            </w:r>
-          </w:p>
-        </w:tc>
-      </w:tr>
-      <w:tr>
-        <w:tc>
-          <w:tcPr>
-            <w:tcW w:type="dxa" w:w="567"/>
-          </w:tcPr>
-          <w:p>
-            <w:r/>
-            <w:r>
-              <w:rPr>
-                <w:sz w:val="22"/>
-              </w:rPr>
-            </w:r>
-          </w:p>
-        </w:tc>
-        <w:tc>
-          <w:tcPr>
-            <w:tcW w:type="dxa" w:w="2835"/>
-          </w:tcPr>
-          <w:p>
-            <w:r/>
-            <w:r>
-              <w:rPr>
-                <w:sz w:val="22"/>
-              </w:rPr>
-            </w:r>
-          </w:p>
-        </w:tc>
-        <w:tc>
-          <w:tcPr>
-            <w:tcW w:type="dxa" w:w="3969"/>
-          </w:tcPr>
-          <w:p>
-            <w:r/>
-            <w:r>
-              <w:rPr>
-                <w:sz w:val="22"/>
-              </w:rPr>
-              <w:t>ИТОГО по этапу:</w:t>
-            </w:r>
-          </w:p>
-        </w:tc>
-        <w:tc>
-          <w:tcPr>
-            <w:tcW w:type="dxa" w:w="1701"/>
-          </w:tcPr>
-          <w:p>
-            <w:r/>
-            <w:r>
-              <w:rPr>
-                <w:sz w:val="22"/>
-              </w:rPr>
-              <w:t>60 000,00</w:t>
+              <w:br/>
+              <w:br/>
             </w:r>
           </w:p>
         </w:tc>

</xml_diff>

<commit_message>
Reframe contract subject as plumbing maintenance with repair/replacement as needed
Co-Authored-By: Claude Opus 5.5 <noreply@anthropic.com>
Claude-Session: https://claude.ai/code/session_01HFBjH4MjwsHcLuC72w9pUK
</commit_message>
<xml_diff>
--- a/contracts/Договор_самозанятый_сантехника.docx
+++ b/contracts/Договор_самозанятый_сантехника.docx
@@ -24,7 +24,9 @@
         <w:rPr>
           <w:b/>
         </w:rPr>
-        <w:t>возмездного оказания услуг (выполнения сантехнических работ)</w:t>
+        <w:t>возмездного оказания услуг по техническому обслуживанию</w:t>
+        <w:br/>
+        <w:t>систем водоснабжения, канализации и сантехнического оборудования</w:t>
         <w:br/>
         <w:t>с физическим лицом — плательщиком налога на профессиональный доход</w:t>
       </w:r>
@@ -124,7 +126,7 @@
         <w:rPr>
           <w:b w:val="0"/>
         </w:rPr>
-        <w:t>1.1. Исполнитель обязуется по заданию Заказчика выполнить комплекс сантехнических работ (демонтаж, монтаж, замена, ремонт и восстановление систем водоснабжения, канализации и сантехнического оборудования) (далее — «Работы»), а Заказчик обязуется принять и оплатить результат Работ в порядке и на условиях настоящего Договора.</w:t>
+        <w:t>1.1. Исполнитель обязуется по заданию Заказчика оказывать услуги по техническому обслуживанию систем водоснабжения, канализации и сантехнического оборудования, а в случае необходимости — выполнять их ремонт и замену отдельных участков и элементов (далее совместно — «Работы»), а Заказчик обязуется принять и оплатить Работы в порядке и на условиях настоящего Договора.</w:t>
       </w:r>
     </w:p>
     <w:p>
@@ -176,7 +178,7 @@
         <w:rPr>
           <w:b w:val="0"/>
         </w:rPr>
-        <w:t>1.3. Конкретный перечень, объём и очерёдность Работ на каждом Объекте определяются Заказчиком в ходе исполнения Договора путём выдачи заданий Исполнителю (в устной или письменной форме, в том числе по электронной почте или в мессенджерах) в пределах предмета Договора.</w:t>
+        <w:t>1.3. Техническое обслуживание включает:</w:t>
       </w:r>
     </w:p>
     <w:p>
@@ -189,7 +191,7 @@
         <w:rPr>
           <w:b w:val="0"/>
         </w:rPr>
-        <w:t>1.4. Работы выполняются поэтапно. Сроки этапов и их стоимость определены в Графике выполнения и оплаты работ (Приложение № 1).</w:t>
+        <w:t>— плановые осмотры систем водоснабжения, канализации и сантехнического оборудования на каждом Объекте не реже 2 (двух) раз в месяц;</w:t>
       </w:r>
     </w:p>
     <w:p>
@@ -202,7 +204,98 @@
         <w:rPr>
           <w:b w:val="0"/>
         </w:rPr>
-        <w:t>1.5. Исполнитель выполняет Работы лично, своими инструментами и оборудованием. Привлечение третьих лиц допускается только с предварительного письменного согласия Заказчика.</w:t>
+        <w:t>— проверку состояния трубопроводов, запорной арматуры, соединений, сантехнических приборов и водонагревательного оборудования;</w:t>
+      </w:r>
+    </w:p>
+    <w:p>
+      <w:pPr>
+        <w:spacing w:before="0"/>
+        <w:ind w:firstLine="567"/>
+        <w:jc w:val="both"/>
+      </w:pPr>
+      <w:r>
+        <w:rPr>
+          <w:b w:val="0"/>
+        </w:rPr>
+        <w:t>— профилактические работы: подтяжку и уплотнение соединений, замену прокладок и уплотнителей, прочистку сифонов и канализационных трубопроводов, регулировку арматуры;</w:t>
+      </w:r>
+    </w:p>
+    <w:p>
+      <w:pPr>
+        <w:spacing w:before="0"/>
+        <w:ind w:firstLine="567"/>
+        <w:jc w:val="both"/>
+      </w:pPr>
+      <w:r>
+        <w:rPr>
+          <w:b w:val="0"/>
+        </w:rPr>
+        <w:t>— устранение выявленных неисправностей и засоров;</w:t>
+      </w:r>
+    </w:p>
+    <w:p>
+      <w:pPr>
+        <w:spacing w:before="0"/>
+        <w:ind w:firstLine="567"/>
+        <w:jc w:val="both"/>
+      </w:pPr>
+      <w:r>
+        <w:rPr>
+          <w:b w:val="0"/>
+        </w:rPr>
+        <w:t>— консультирование Заказчика по вопросам эксплуатации сантехнического оборудования.</w:t>
+      </w:r>
+    </w:p>
+    <w:p>
+      <w:pPr>
+        <w:spacing w:before="0"/>
+        <w:ind w:firstLine="567"/>
+        <w:jc w:val="both"/>
+      </w:pPr>
+      <w:r>
+        <w:rPr>
+          <w:b w:val="0"/>
+        </w:rPr>
+        <w:t>1.4. При выявлении неисправностей, которые не могут быть устранены в рамках технического обслуживания, Исполнитель по согласованию с Заказчиком выполняет ремонт или замену отдельных участков трубопроводов, запорной арматуры, сантехнических приборов и иных элементов систем. Необходимость, объём и сроки таких Работ согласовываются Сторонами до начала их выполнения (в письменной форме, в том числе по электронной почте или в мессенджерах).</w:t>
+      </w:r>
+    </w:p>
+    <w:p>
+      <w:pPr>
+        <w:spacing w:before="0"/>
+        <w:ind w:firstLine="567"/>
+        <w:jc w:val="both"/>
+      </w:pPr>
+      <w:r>
+        <w:rPr>
+          <w:b w:val="0"/>
+        </w:rPr>
+        <w:t>1.5. Исполнитель обязан приступить к устранению неисправностей по заявке Заказчика: при аварийной ситуации (протечка, прорыв трубопровода, засор канализации) — не позднее 3 (трёх) часов с момента получения заявки; в остальных случаях — не позднее 2 (двух) рабочих дней.</w:t>
+      </w:r>
+    </w:p>
+    <w:p>
+      <w:pPr>
+        <w:spacing w:before="0"/>
+        <w:ind w:firstLine="567"/>
+        <w:jc w:val="both"/>
+      </w:pPr>
+      <w:r>
+        <w:rPr>
+          <w:b w:val="0"/>
+        </w:rPr>
+        <w:t>1.6. Работы выполняются поэтапно. Сроки этапов и их стоимость определены в Графике выполнения и оплаты работ (Приложение № 1).</w:t>
+      </w:r>
+    </w:p>
+    <w:p>
+      <w:pPr>
+        <w:spacing w:before="0"/>
+        <w:ind w:firstLine="567"/>
+        <w:jc w:val="both"/>
+      </w:pPr>
+      <w:r>
+        <w:rPr>
+          <w:b w:val="0"/>
+        </w:rPr>
+        <w:t>1.7. Исполнитель выполняет Работы лично, своими инструментами и оборудованием. Привлечение третьих лиц допускается только с предварительного письменного согласия Заказчика.</w:t>
       </w:r>
     </w:p>
     <w:p>
@@ -897,7 +990,7 @@
         <w:rPr>
           <w:b w:val="0"/>
         </w:rPr>
-        <w:t>5.5. Скрытые работы (прокладка трубопроводов в штробах, коробах, под стяжкой и т. п.) предъявляются Заказчику до их закрытия. Без согласия Заказчика закрытие скрытых работ не допускается.</w:t>
+        <w:t>5.5. Скрытые работы (при замене участков трубопроводов в штробах, коробах и т. п.) предъявляются Заказчику до их закрытия. Без согласия Заказчика закрытие скрытых работ не допускается.</w:t>
       </w:r>
     </w:p>
     <w:p>
@@ -922,7 +1015,7 @@
         <w:rPr>
           <w:b w:val="0"/>
         </w:rPr>
-        <w:t>6.1. Исполнитель гарантирует качество выполненных Работ в течение 12 (двенадцати) месяцев с даты подписания акта по последнему этапу.</w:t>
+        <w:t>6.1. Исполнитель гарантирует качество выполненных работ по ремонту и замене отдельных участков и элементов систем в течение 12 (двенадцати) месяцев с даты подписания акта по соответствующему этапу.</w:t>
       </w:r>
     </w:p>
     <w:p>
@@ -2005,7 +2098,7 @@
                 <w:b/>
                 <w:sz w:val="22"/>
               </w:rPr>
-              <w:t>Наименование выполненных работ</w:t>
+              <w:t>Выполненные работы (техническое обслуживание, ремонт, замена)</w:t>
             </w:r>
           </w:p>
         </w:tc>

</xml_diff>

<commit_message>
Convert to framework contract without fixed total or stage amounts
Cost is determined per monthly stage by the signed acceptance act; payment schedule appendix removed.

Co-Authored-By: Claude Opus 5.5 <noreply@anthropic.com>
Claude-Session: https://claude.ai/code/session_01HFBjH4MjwsHcLuC72w9pUK
</commit_message>
<xml_diff>
--- a/contracts/Договор_самозанятый_сантехника.docx
+++ b/contracts/Договор_самозанятый_сантехника.docx
@@ -12,7 +12,7 @@
           <w:b/>
           <w:sz w:val="28"/>
         </w:rPr>
-        <w:t>ДОГОВОР № ____</w:t>
+        <w:t>РАМОЧНЫЙ ДОГОВОР № ____</w:t>
       </w:r>
     </w:p>
     <w:p>
@@ -282,7 +282,7 @@
         <w:rPr>
           <w:b w:val="0"/>
         </w:rPr>
-        <w:t>1.6. Работы выполняются поэтапно. Сроки этапов и их стоимость определены в Графике выполнения и оплаты работ (Приложение № 1).</w:t>
+        <w:t>1.6. Работы выполняются в течение срока действия Договора по мере необходимости и заявкам Заказчика. Сдача-приёмка и оплата Работ производятся поэтапно; этапом (отчётным периодом) является календарный месяц.</w:t>
       </w:r>
     </w:p>
     <w:p>
@@ -333,7 +333,7 @@
         <w:rPr>
           <w:b w:val="0"/>
         </w:rPr>
-        <w:t>2.2. Сроки начала и окончания каждого этапа указаны в Приложении № 1. Досрочное выполнение Работ (этапа) допускается по согласованию с Заказчиком.</w:t>
+        <w:t>2.2. Срок выполнения отдельных работ по ремонту и замене согласовывается Сторонами в порядке, предусмотренном п. 1.4 Договора.</w:t>
       </w:r>
     </w:p>
     <w:p>
@@ -371,7 +371,7 @@
         <w:rPr>
           <w:b w:val="0"/>
         </w:rPr>
-        <w:t>3.1. Общая стоимость Работ по Договору составляет 180 000 (сто восемьдесят тысяч) рублей 00 копеек. НДС не облагается в связи с применением Исполнителем специального налогового режима «Налог на профессиональный доход». Указанная стоимость включает Работы на обоих Объектах за весь срок выполнения Работ.</w:t>
+        <w:t>3.1. Настоящий Договор является рамочным (ст. 429.1 Гражданского кодекса РФ) и определяет общие условия взаимоотношений Сторон. Общая стоимость Работ по Договору не фиксируется и складывается из стоимости Работ, фактически выполненных и принятых Заказчиком за каждый этап.</w:t>
       </w:r>
     </w:p>
     <w:p>
@@ -384,7 +384,7 @@
         <w:rPr>
           <w:b w:val="0"/>
         </w:rPr>
-        <w:t>3.2. Стоимость Работ является твёрдой и включает вознаграждение Исполнителя и все его расходы, связанные с выполнением Работ (инструмент, транспорт, вывоз строительного мусора с Объектов), за исключением стоимости материалов и оборудования, которые предоставляет Заказчик либо приобретает Исполнитель за счёт Заказчика по предварительно согласованной смете с подтверждением расходов чеками.</w:t>
+        <w:t>3.2. Стоимость Работ за этап определяется по фактически выполненным Работам и указывается в акте сдачи-приёмки выполненных работ (Приложение № 1), подписанном Сторонами. Стоимость работ по ремонту и замене согласовывается Сторонами до начала их выполнения в соответствии с п. 1.4 Договора.</w:t>
       </w:r>
     </w:p>
     <w:p>
@@ -397,264 +397,7 @@
         <w:rPr>
           <w:b w:val="0"/>
         </w:rPr>
-        <w:t>3.3. Оплата производится поэтапно в следующем порядке:</w:t>
-      </w:r>
-    </w:p>
-    <w:tbl>
-      <w:tblPr>
-        <w:tblStyle w:val="TableGrid"/>
-        <w:tblW w:type="auto" w:w="0"/>
-        <w:jc w:val="center"/>
-        <w:tblLayout w:type="fixed"/>
-        <w:tblLook w:firstColumn="1" w:firstRow="1" w:lastColumn="0" w:lastRow="0" w:noHBand="0" w:noVBand="1" w:val="04A0"/>
-      </w:tblPr>
-      <w:tblGrid>
-        <w:gridCol w:w="1134"/>
-        <w:gridCol w:w="5669"/>
-        <w:gridCol w:w="2268"/>
-      </w:tblGrid>
-      <w:tr>
-        <w:tc>
-          <w:tcPr>
-            <w:tcW w:type="dxa" w:w="1134"/>
-          </w:tcPr>
-          <w:p>
-            <w:pPr>
-              <w:jc w:val="center"/>
-            </w:pPr>
-            <w:r/>
-            <w:r>
-              <w:rPr>
-                <w:b/>
-                <w:sz w:val="22"/>
-              </w:rPr>
-              <w:t>Этап</w:t>
-            </w:r>
-          </w:p>
-        </w:tc>
-        <w:tc>
-          <w:tcPr>
-            <w:tcW w:type="dxa" w:w="5669"/>
-          </w:tcPr>
-          <w:p>
-            <w:pPr>
-              <w:jc w:val="center"/>
-            </w:pPr>
-            <w:r/>
-            <w:r>
-              <w:rPr>
-                <w:b/>
-                <w:sz w:val="22"/>
-              </w:rPr>
-              <w:t>Период выполнения</w:t>
-            </w:r>
-          </w:p>
-        </w:tc>
-        <w:tc>
-          <w:tcPr>
-            <w:tcW w:type="dxa" w:w="2268"/>
-          </w:tcPr>
-          <w:p>
-            <w:pPr>
-              <w:jc w:val="center"/>
-            </w:pPr>
-            <w:r/>
-            <w:r>
-              <w:rPr>
-                <w:b/>
-                <w:sz w:val="22"/>
-              </w:rPr>
-              <w:t>Сумма, руб.</w:t>
-            </w:r>
-          </w:p>
-        </w:tc>
-      </w:tr>
-      <w:tr>
-        <w:tc>
-          <w:tcPr>
-            <w:tcW w:type="dxa" w:w="1134"/>
-          </w:tcPr>
-          <w:p>
-            <w:r/>
-            <w:r>
-              <w:rPr>
-                <w:sz w:val="22"/>
-              </w:rPr>
-              <w:t>1</w:t>
-            </w:r>
-          </w:p>
-        </w:tc>
-        <w:tc>
-          <w:tcPr>
-            <w:tcW w:type="dxa" w:w="5669"/>
-          </w:tcPr>
-          <w:p>
-            <w:r/>
-            <w:r>
-              <w:rPr>
-                <w:sz w:val="22"/>
-              </w:rPr>
-              <w:t>1-й месяц</w:t>
-            </w:r>
-          </w:p>
-        </w:tc>
-        <w:tc>
-          <w:tcPr>
-            <w:tcW w:type="dxa" w:w="2268"/>
-          </w:tcPr>
-          <w:p>
-            <w:r/>
-            <w:r>
-              <w:rPr>
-                <w:sz w:val="22"/>
-              </w:rPr>
-              <w:t>60 000,00</w:t>
-            </w:r>
-          </w:p>
-        </w:tc>
-      </w:tr>
-      <w:tr>
-        <w:tc>
-          <w:tcPr>
-            <w:tcW w:type="dxa" w:w="1134"/>
-          </w:tcPr>
-          <w:p>
-            <w:r/>
-            <w:r>
-              <w:rPr>
-                <w:sz w:val="22"/>
-              </w:rPr>
-              <w:t>2</w:t>
-            </w:r>
-          </w:p>
-        </w:tc>
-        <w:tc>
-          <w:tcPr>
-            <w:tcW w:type="dxa" w:w="5669"/>
-          </w:tcPr>
-          <w:p>
-            <w:r/>
-            <w:r>
-              <w:rPr>
-                <w:sz w:val="22"/>
-              </w:rPr>
-              <w:t>2-й месяц</w:t>
-            </w:r>
-          </w:p>
-        </w:tc>
-        <w:tc>
-          <w:tcPr>
-            <w:tcW w:type="dxa" w:w="2268"/>
-          </w:tcPr>
-          <w:p>
-            <w:r/>
-            <w:r>
-              <w:rPr>
-                <w:sz w:val="22"/>
-              </w:rPr>
-              <w:t>60 000,00</w:t>
-            </w:r>
-          </w:p>
-        </w:tc>
-      </w:tr>
-      <w:tr>
-        <w:tc>
-          <w:tcPr>
-            <w:tcW w:type="dxa" w:w="1134"/>
-          </w:tcPr>
-          <w:p>
-            <w:r/>
-            <w:r>
-              <w:rPr>
-                <w:sz w:val="22"/>
-              </w:rPr>
-              <w:t>3</w:t>
-            </w:r>
-          </w:p>
-        </w:tc>
-        <w:tc>
-          <w:tcPr>
-            <w:tcW w:type="dxa" w:w="5669"/>
-          </w:tcPr>
-          <w:p>
-            <w:r/>
-            <w:r>
-              <w:rPr>
-                <w:sz w:val="22"/>
-              </w:rPr>
-              <w:t>3-й месяц, завершение Работ</w:t>
-            </w:r>
-          </w:p>
-        </w:tc>
-        <w:tc>
-          <w:tcPr>
-            <w:tcW w:type="dxa" w:w="2268"/>
-          </w:tcPr>
-          <w:p>
-            <w:r/>
-            <w:r>
-              <w:rPr>
-                <w:sz w:val="22"/>
-              </w:rPr>
-              <w:t>60 000,00</w:t>
-            </w:r>
-          </w:p>
-        </w:tc>
-      </w:tr>
-      <w:tr>
-        <w:tc>
-          <w:tcPr>
-            <w:tcW w:type="dxa" w:w="1134"/>
-          </w:tcPr>
-          <w:p>
-            <w:r/>
-            <w:r>
-              <w:rPr>
-                <w:sz w:val="22"/>
-              </w:rPr>
-            </w:r>
-          </w:p>
-        </w:tc>
-        <w:tc>
-          <w:tcPr>
-            <w:tcW w:type="dxa" w:w="5669"/>
-          </w:tcPr>
-          <w:p>
-            <w:r/>
-            <w:r>
-              <w:rPr>
-                <w:sz w:val="22"/>
-              </w:rPr>
-              <w:t>ИТОГО</w:t>
-            </w:r>
-          </w:p>
-        </w:tc>
-        <w:tc>
-          <w:tcPr>
-            <w:tcW w:type="dxa" w:w="2268"/>
-          </w:tcPr>
-          <w:p>
-            <w:r/>
-            <w:r>
-              <w:rPr>
-                <w:sz w:val="22"/>
-              </w:rPr>
-              <w:t>180 000,00</w:t>
-            </w:r>
-          </w:p>
-        </w:tc>
-      </w:tr>
-    </w:tbl>
-    <w:p>
-      <w:pPr>
-        <w:spacing w:before="0"/>
-        <w:ind w:firstLine="567"/>
-        <w:jc w:val="both"/>
-      </w:pPr>
-      <w:r>
-        <w:rPr>
-          <w:b w:val="0"/>
-        </w:rPr>
+        <w:t>3.3. НДС не облагается в связи с применением Исполнителем специального налогового режима «Налог на профессиональный доход».</w:t>
       </w:r>
     </w:p>
     <w:p>
@@ -667,7 +410,7 @@
         <w:rPr>
           <w:b w:val="0"/>
         </w:rPr>
-        <w:t>3.4. Оплата каждого этапа производится в течение 5 (пяти) рабочих дней с даты подписания Сторонами акта сдачи-приёмки выполненных работ по соответствующему этапу (Приложение № 2) и получения от Исполнителя чека, сформированного в соответствии с п. 3.6 Договора.</w:t>
+        <w:t>3.4. Стоимость Работ включает вознаграждение Исполнителя и все его расходы, связанные с выполнением Работ (инструмент, транспорт, вывоз мусора с Объектов), за исключением стоимости материалов и оборудования, которые предоставляет Заказчик либо приобретает Исполнитель за счёт Заказчика по предварительному согласованию с подтверждением расходов чеками.</w:t>
       </w:r>
     </w:p>
     <w:p>
@@ -680,7 +423,7 @@
         <w:rPr>
           <w:b w:val="0"/>
         </w:rPr>
-        <w:t>3.5. Оплата производится в безналичном порядке путём перечисления денежных средств на банковский счёт Исполнителя, указанный в разделе 11 Договора. Обязательство Заказчика по оплате считается исполненным с момента списания денежных средств с его счёта.</w:t>
+        <w:t>3.5. Оплата Работ за каждый этап производится в течение 5 (пяти) рабочих дней с даты подписания Сторонами акта сдачи-приёмки выполненных работ за соответствующий этап и получения от Исполнителя чека, сформированного в соответствии с п. 3.7 Договора.</w:t>
       </w:r>
     </w:p>
     <w:p>
@@ -693,7 +436,7 @@
         <w:rPr>
           <w:b w:val="0"/>
         </w:rPr>
-        <w:t>3.6. Исполнитель обязан в течение срока, установленного ч. 3 ст. 14 Федерального закона № 422-ФЗ, сформировать в приложении «Мой налог» чек на полученную сумму и передать его Заказчику (в электронной форме или на бумажном носителе).</w:t>
+        <w:t>3.6. Оплата производится в безналичном порядке путём перечисления денежных средств на банковский счёт Исполнителя, указанный в разделе 11 Договора. Обязательство Заказчика по оплате считается исполненным с момента списания денежных средств с его счёта.</w:t>
       </w:r>
     </w:p>
     <w:p>
@@ -706,7 +449,7 @@
         <w:rPr>
           <w:b w:val="0"/>
         </w:rPr>
-        <w:t>3.7. Исполнитель самостоятельно исчисляет и уплачивает налог на профессиональный доход. Заказчик не является налоговым агентом Исполнителя, не удерживает НДФЛ и не начисляет страховые взносы с выплат по Договору.</w:t>
+        <w:t>3.7. Исполнитель обязан в течение срока, установленного ч. 3 ст. 14 Федерального закона № 422-ФЗ, сформировать в приложении «Мой налог» чек на полученную сумму и передать его Заказчику (в электронной форме или на бумажном носителе).</w:t>
       </w:r>
     </w:p>
     <w:p>
@@ -719,7 +462,20 @@
         <w:rPr>
           <w:b w:val="0"/>
         </w:rPr>
-        <w:t>3.8. Работы, выходящие за пределы предмета Договора, а также работы сверх установленного срока выполняются только на основании дополнительного соглашения Сторон с указанием их стоимости и сроков.</w:t>
+        <w:t>3.8. Исполнитель самостоятельно исчисляет и уплачивает налог на профессиональный доход. Заказчик не является налоговым агентом Исполнителя, не удерживает НДФЛ и не начисляет страховые взносы с выплат по Договору.</w:t>
+      </w:r>
+    </w:p>
+    <w:p>
+      <w:pPr>
+        <w:spacing w:before="0"/>
+        <w:ind w:firstLine="567"/>
+        <w:jc w:val="both"/>
+      </w:pPr>
+      <w:r>
+        <w:rPr>
+          <w:b w:val="0"/>
+        </w:rPr>
+        <w:t>3.9. Работы, выходящие за пределы предмета Договора, выполняются только на основании дополнительного соглашения Сторон с указанием их стоимости и сроков.</w:t>
       </w:r>
     </w:p>
     <w:p>
@@ -938,7 +694,7 @@
         <w:rPr>
           <w:b w:val="0"/>
         </w:rPr>
-        <w:t>5.1. По завершении каждого этапа Исполнитель уведомляет Заказчика о готовности результата Работ и передаёт ему подписанный со своей стороны акт сдачи-приёмки выполненных работ (Приложение № 2).</w:t>
+        <w:t>5.1. По завершении каждого этапа Исполнитель уведомляет Заказчика о готовности результата Работ и передаёт ему подписанный со своей стороны акт сдачи-приёмки выполненных работ (Приложение № 1).</w:t>
       </w:r>
     </w:p>
     <w:p>
@@ -1079,7 +835,7 @@
         <w:rPr>
           <w:b w:val="0"/>
         </w:rPr>
-        <w:t>7.2. За нарушение сроков выполнения этапа Работ по вине Исполнителя Заказчик вправе потребовать уплаты неустойки в размере 0,1 % от стоимости соответствующего этапа за каждый день просрочки, но не более 10 % от стоимости этапа.</w:t>
+        <w:t>7.2. За нарушение сроков выполнения Работ по вине Исполнителя Заказчик вправе потребовать уплаты неустойки в размере 0,1 % от стоимости просроченных Работ за каждый день просрочки, но не более 10 % от их стоимости.</w:t>
       </w:r>
     </w:p>
     <w:p>
@@ -1284,33 +1040,7 @@
         <w:rPr>
           <w:b w:val="0"/>
         </w:rPr>
-        <w:t>10.4. Приложения, являющиеся неотъемлемой частью Договора:</w:t>
-      </w:r>
-    </w:p>
-    <w:p>
-      <w:pPr>
-        <w:spacing w:before="0"/>
-        <w:ind w:firstLine="567"/>
-        <w:jc w:val="both"/>
-      </w:pPr>
-      <w:r>
-        <w:rPr>
-          <w:b w:val="0"/>
-        </w:rPr>
-        <w:t>Приложение № 1 — График выполнения и оплаты работ;</w:t>
-      </w:r>
-    </w:p>
-    <w:p>
-      <w:pPr>
-        <w:spacing w:before="0"/>
-        <w:ind w:firstLine="567"/>
-        <w:jc w:val="both"/>
-      </w:pPr>
-      <w:r>
-        <w:rPr>
-          <w:b w:val="0"/>
-        </w:rPr>
-        <w:t>Приложение № 2 — Форма акта сдачи-приёмки выполненных работ.</w:t>
+        <w:t>10.4. Неотъемлемой частью Договора является Приложение № 1 — Форма акта сдачи-приёмки выполненных работ.</w:t>
       </w:r>
     </w:p>
     <w:p>
@@ -1432,524 +1162,6 @@
     </w:p>
     <w:p>
       <w:pPr>
-        <w:spacing w:before="160"/>
-        <w:jc w:val="center"/>
-      </w:pPr>
-      <w:r>
-        <w:rPr>
-          <w:b/>
-        </w:rPr>
-        <w:t>ГРАФИК ВЫПОЛНЕНИЯ И ОПЛАТЫ РАБОТ</w:t>
-      </w:r>
-    </w:p>
-    <w:tbl>
-      <w:tblPr>
-        <w:tblStyle w:val="TableGrid"/>
-        <w:tblW w:type="auto" w:w="0"/>
-        <w:jc w:val="center"/>
-        <w:tblLayout w:type="fixed"/>
-        <w:tblLook w:firstColumn="1" w:firstRow="1" w:lastColumn="0" w:lastRow="0" w:noHBand="0" w:noVBand="1" w:val="04A0"/>
-      </w:tblPr>
-      <w:tblGrid>
-        <w:gridCol w:w="850"/>
-        <w:gridCol w:w="2438"/>
-        <w:gridCol w:w="1247"/>
-        <w:gridCol w:w="1701"/>
-        <w:gridCol w:w="2835"/>
-      </w:tblGrid>
-      <w:tr>
-        <w:tc>
-          <w:tcPr>
-            <w:tcW w:type="dxa" w:w="850"/>
-          </w:tcPr>
-          <w:p>
-            <w:pPr>
-              <w:jc w:val="center"/>
-            </w:pPr>
-            <w:r/>
-            <w:r>
-              <w:rPr>
-                <w:b/>
-                <w:sz w:val="22"/>
-              </w:rPr>
-              <w:t>Этап</w:t>
-            </w:r>
-          </w:p>
-        </w:tc>
-        <w:tc>
-          <w:tcPr>
-            <w:tcW w:type="dxa" w:w="2438"/>
-          </w:tcPr>
-          <w:p>
-            <w:pPr>
-              <w:jc w:val="center"/>
-            </w:pPr>
-            <w:r/>
-            <w:r>
-              <w:rPr>
-                <w:b/>
-                <w:sz w:val="22"/>
-              </w:rPr>
-              <w:t>Срок выполнения</w:t>
-            </w:r>
-          </w:p>
-        </w:tc>
-        <w:tc>
-          <w:tcPr>
-            <w:tcW w:type="dxa" w:w="1247"/>
-          </w:tcPr>
-          <w:p>
-            <w:pPr>
-              <w:jc w:val="center"/>
-            </w:pPr>
-            <w:r/>
-            <w:r>
-              <w:rPr>
-                <w:b/>
-                <w:sz w:val="22"/>
-              </w:rPr>
-              <w:t>Объекты</w:t>
-            </w:r>
-          </w:p>
-        </w:tc>
-        <w:tc>
-          <w:tcPr>
-            <w:tcW w:type="dxa" w:w="1701"/>
-          </w:tcPr>
-          <w:p>
-            <w:pPr>
-              <w:jc w:val="center"/>
-            </w:pPr>
-            <w:r/>
-            <w:r>
-              <w:rPr>
-                <w:b/>
-                <w:sz w:val="22"/>
-              </w:rPr>
-              <w:t>Стоимость, руб.</w:t>
-            </w:r>
-          </w:p>
-        </w:tc>
-        <w:tc>
-          <w:tcPr>
-            <w:tcW w:type="dxa" w:w="2835"/>
-          </w:tcPr>
-          <w:p>
-            <w:pPr>
-              <w:jc w:val="center"/>
-            </w:pPr>
-            <w:r/>
-            <w:r>
-              <w:rPr>
-                <w:b/>
-                <w:sz w:val="22"/>
-              </w:rPr>
-              <w:t>Срок оплаты</w:t>
-            </w:r>
-          </w:p>
-        </w:tc>
-      </w:tr>
-      <w:tr>
-        <w:tc>
-          <w:tcPr>
-            <w:tcW w:type="dxa" w:w="850"/>
-          </w:tcPr>
-          <w:p>
-            <w:r/>
-            <w:r>
-              <w:rPr>
-                <w:sz w:val="22"/>
-              </w:rPr>
-              <w:t>1</w:t>
-            </w:r>
-          </w:p>
-        </w:tc>
-        <w:tc>
-          <w:tcPr>
-            <w:tcW w:type="dxa" w:w="2438"/>
-          </w:tcPr>
-          <w:p>
-            <w:r/>
-            <w:r>
-              <w:rPr>
-                <w:sz w:val="22"/>
-              </w:rPr>
-              <w:t>1-й месяц:</w:t>
-              <w:br/>
-              <w:t>с «__»_______ по «__»_______</w:t>
-            </w:r>
-          </w:p>
-        </w:tc>
-        <w:tc>
-          <w:tcPr>
-            <w:tcW w:type="dxa" w:w="1247"/>
-          </w:tcPr>
-          <w:p>
-            <w:r/>
-            <w:r>
-              <w:rPr>
-                <w:sz w:val="22"/>
-              </w:rPr>
-              <w:t>№ 1, № 2</w:t>
-            </w:r>
-          </w:p>
-        </w:tc>
-        <w:tc>
-          <w:tcPr>
-            <w:tcW w:type="dxa" w:w="1701"/>
-          </w:tcPr>
-          <w:p>
-            <w:r/>
-            <w:r>
-              <w:rPr>
-                <w:sz w:val="22"/>
-              </w:rPr>
-              <w:t>60 000,00</w:t>
-            </w:r>
-          </w:p>
-        </w:tc>
-        <w:tc>
-          <w:tcPr>
-            <w:tcW w:type="dxa" w:w="2835"/>
-          </w:tcPr>
-          <w:p>
-            <w:r/>
-            <w:r>
-              <w:rPr>
-                <w:sz w:val="22"/>
-              </w:rPr>
-              <w:t>в течение 5 раб. дней после подписания акта по этапу 1</w:t>
-            </w:r>
-          </w:p>
-        </w:tc>
-      </w:tr>
-      <w:tr>
-        <w:tc>
-          <w:tcPr>
-            <w:tcW w:type="dxa" w:w="850"/>
-          </w:tcPr>
-          <w:p>
-            <w:r/>
-            <w:r>
-              <w:rPr>
-                <w:sz w:val="22"/>
-              </w:rPr>
-              <w:t>2</w:t>
-            </w:r>
-          </w:p>
-        </w:tc>
-        <w:tc>
-          <w:tcPr>
-            <w:tcW w:type="dxa" w:w="2438"/>
-          </w:tcPr>
-          <w:p>
-            <w:r/>
-            <w:r>
-              <w:rPr>
-                <w:sz w:val="22"/>
-              </w:rPr>
-              <w:t>2-й месяц:</w:t>
-              <w:br/>
-              <w:t>с «__»_______ по «__»_______</w:t>
-            </w:r>
-          </w:p>
-        </w:tc>
-        <w:tc>
-          <w:tcPr>
-            <w:tcW w:type="dxa" w:w="1247"/>
-          </w:tcPr>
-          <w:p>
-            <w:r/>
-            <w:r>
-              <w:rPr>
-                <w:sz w:val="22"/>
-              </w:rPr>
-              <w:t>№ 1, № 2</w:t>
-            </w:r>
-          </w:p>
-        </w:tc>
-        <w:tc>
-          <w:tcPr>
-            <w:tcW w:type="dxa" w:w="1701"/>
-          </w:tcPr>
-          <w:p>
-            <w:r/>
-            <w:r>
-              <w:rPr>
-                <w:sz w:val="22"/>
-              </w:rPr>
-              <w:t>60 000,00</w:t>
-            </w:r>
-          </w:p>
-        </w:tc>
-        <w:tc>
-          <w:tcPr>
-            <w:tcW w:type="dxa" w:w="2835"/>
-          </w:tcPr>
-          <w:p>
-            <w:r/>
-            <w:r>
-              <w:rPr>
-                <w:sz w:val="22"/>
-              </w:rPr>
-              <w:t>в течение 5 раб. дней после подписания акта по этапу 2</w:t>
-            </w:r>
-          </w:p>
-        </w:tc>
-      </w:tr>
-      <w:tr>
-        <w:tc>
-          <w:tcPr>
-            <w:tcW w:type="dxa" w:w="850"/>
-          </w:tcPr>
-          <w:p>
-            <w:r/>
-            <w:r>
-              <w:rPr>
-                <w:sz w:val="22"/>
-              </w:rPr>
-              <w:t>3</w:t>
-            </w:r>
-          </w:p>
-        </w:tc>
-        <w:tc>
-          <w:tcPr>
-            <w:tcW w:type="dxa" w:w="2438"/>
-          </w:tcPr>
-          <w:p>
-            <w:r/>
-            <w:r>
-              <w:rPr>
-                <w:sz w:val="22"/>
-              </w:rPr>
-              <w:t>3-й месяц:</w:t>
-              <w:br/>
-              <w:t>с «__»_______ по «__»_______</w:t>
-            </w:r>
-          </w:p>
-        </w:tc>
-        <w:tc>
-          <w:tcPr>
-            <w:tcW w:type="dxa" w:w="1247"/>
-          </w:tcPr>
-          <w:p>
-            <w:r/>
-            <w:r>
-              <w:rPr>
-                <w:sz w:val="22"/>
-              </w:rPr>
-              <w:t>№ 1, № 2</w:t>
-            </w:r>
-          </w:p>
-        </w:tc>
-        <w:tc>
-          <w:tcPr>
-            <w:tcW w:type="dxa" w:w="1701"/>
-          </w:tcPr>
-          <w:p>
-            <w:r/>
-            <w:r>
-              <w:rPr>
-                <w:sz w:val="22"/>
-              </w:rPr>
-              <w:t>60 000,00</w:t>
-            </w:r>
-          </w:p>
-        </w:tc>
-        <w:tc>
-          <w:tcPr>
-            <w:tcW w:type="dxa" w:w="2835"/>
-          </w:tcPr>
-          <w:p>
-            <w:r/>
-            <w:r>
-              <w:rPr>
-                <w:sz w:val="22"/>
-              </w:rPr>
-              <w:t>в течение 5 раб. дней после подписания акта по этапу 3</w:t>
-            </w:r>
-          </w:p>
-        </w:tc>
-      </w:tr>
-      <w:tr>
-        <w:tc>
-          <w:tcPr>
-            <w:tcW w:type="dxa" w:w="850"/>
-          </w:tcPr>
-          <w:p>
-            <w:r/>
-            <w:r>
-              <w:rPr>
-                <w:sz w:val="22"/>
-              </w:rPr>
-            </w:r>
-          </w:p>
-        </w:tc>
-        <w:tc>
-          <w:tcPr>
-            <w:tcW w:type="dxa" w:w="2438"/>
-          </w:tcPr>
-          <w:p>
-            <w:r/>
-            <w:r>
-              <w:rPr>
-                <w:sz w:val="22"/>
-              </w:rPr>
-            </w:r>
-          </w:p>
-        </w:tc>
-        <w:tc>
-          <w:tcPr>
-            <w:tcW w:type="dxa" w:w="1247"/>
-          </w:tcPr>
-          <w:p>
-            <w:r/>
-            <w:r>
-              <w:rPr>
-                <w:sz w:val="22"/>
-              </w:rPr>
-              <w:t>ИТОГО:</w:t>
-            </w:r>
-          </w:p>
-        </w:tc>
-        <w:tc>
-          <w:tcPr>
-            <w:tcW w:type="dxa" w:w="1701"/>
-          </w:tcPr>
-          <w:p>
-            <w:r/>
-            <w:r>
-              <w:rPr>
-                <w:sz w:val="22"/>
-              </w:rPr>
-              <w:t>180 000,00</w:t>
-            </w:r>
-          </w:p>
-        </w:tc>
-        <w:tc>
-          <w:tcPr>
-            <w:tcW w:type="dxa" w:w="2835"/>
-          </w:tcPr>
-          <w:p>
-            <w:r/>
-            <w:r>
-              <w:rPr>
-                <w:sz w:val="22"/>
-              </w:rPr>
-            </w:r>
-          </w:p>
-        </w:tc>
-      </w:tr>
-    </w:tbl>
-    <w:p>
-      <w:pPr>
-        <w:spacing w:before="0"/>
-        <w:ind w:firstLine="567"/>
-        <w:jc w:val="both"/>
-      </w:pPr>
-      <w:r>
-        <w:rPr>
-          <w:b w:val="0"/>
-        </w:rPr>
-      </w:r>
-    </w:p>
-    <w:p>
-      <w:pPr>
-        <w:spacing w:before="0"/>
-        <w:ind w:firstLine="567"/>
-        <w:jc w:val="both"/>
-      </w:pPr>
-      <w:r>
-        <w:rPr>
-          <w:b w:val="0"/>
-        </w:rPr>
-        <w:t>Итого по Договору: 180 000 (сто восемьдесят тысяч) рублей 00 копеек, НДС не облагается.</w:t>
-      </w:r>
-    </w:p>
-    <w:p>
-      <w:pPr>
-        <w:spacing w:before="0"/>
-        <w:ind w:firstLine="567"/>
-        <w:jc w:val="both"/>
-      </w:pPr>
-      <w:r>
-        <w:rPr>
-          <w:b w:val="0"/>
-        </w:rPr>
-        <w:t>Стороны вправе по дополнительному соглашению перераспределить суммы между этапами без изменения общей стоимости Договора.</w:t>
-      </w:r>
-    </w:p>
-    <w:p>
-      <w:pPr>
-        <w:spacing w:before="0"/>
-        <w:ind w:firstLine="567"/>
-        <w:jc w:val="both"/>
-      </w:pPr>
-      <w:r>
-        <w:rPr>
-          <w:b w:val="0"/>
-        </w:rPr>
-      </w:r>
-    </w:p>
-    <w:tbl>
-      <w:tblPr>
-        <w:tblW w:type="auto" w:w="0"/>
-        <w:tblLook w:firstColumn="1" w:firstRow="1" w:lastColumn="0" w:lastRow="0" w:noHBand="0" w:noVBand="1" w:val="04A0"/>
-      </w:tblPr>
-      <w:tblGrid>
-        <w:gridCol w:w="4986"/>
-        <w:gridCol w:w="4986"/>
-      </w:tblGrid>
-      <w:tr>
-        <w:tc>
-          <w:tcPr>
-            <w:tcW w:type="dxa" w:w="4986"/>
-          </w:tcPr>
-          <w:p>
-            <w:r>
-              <w:t>Заказчик:</w:t>
-              <w:br/>
-              <w:br/>
-              <w:t>____________ / ______________ /</w:t>
-            </w:r>
-          </w:p>
-        </w:tc>
-        <w:tc>
-          <w:tcPr>
-            <w:tcW w:type="dxa" w:w="4986"/>
-          </w:tcPr>
-          <w:p>
-            <w:r>
-              <w:t>Исполнитель:</w:t>
-              <w:br/>
-              <w:br/>
-              <w:t>____________ / ______________ /</w:t>
-            </w:r>
-          </w:p>
-        </w:tc>
-      </w:tr>
-    </w:tbl>
-    <w:p>
-      <w:r>
-        <w:br w:type="page"/>
-      </w:r>
-    </w:p>
-    <w:p>
-      <w:pPr>
-        <w:spacing w:before="0"/>
-        <w:jc w:val="right"/>
-      </w:pPr>
-      <w:r>
-        <w:rPr>
-          <w:b w:val="0"/>
-        </w:rPr>
-        <w:t>Приложение № 2</w:t>
-        <w:br/>
-        <w:t>к Договору № ____ от «____» ___________ 2026 г.</w:t>
-      </w:r>
-    </w:p>
-    <w:p>
-      <w:pPr>
         <w:spacing w:before="0"/>
         <w:jc w:val="center"/>
       </w:pPr>
@@ -1971,7 +1183,7 @@
         </w:rPr>
         <w:t>АКТ № ____</w:t>
         <w:br/>
-        <w:t>сдачи-приёмки выполненных работ по этапу № ____</w:t>
+        <w:t>сдачи-приёмки выполненных работ за этап (месяц) № ____</w:t>
       </w:r>
     </w:p>
     <w:tbl>
@@ -2031,7 +1243,7 @@
         <w:rPr>
           <w:b w:val="0"/>
         </w:rPr>
-        <w:t>Заказчик _____________________________________________ и Исполнитель (плательщик налога на профессиональный доход) _____________________________________, ИНН __________________, составили настоящий Акт о том, что в соответствии с Договором № ____ от «____» ___________ 2026 г. Исполнитель выполнил, а Заказчик принял следующие работы по этапу № ____ за период с «____» ________ по «____» ________ 20___ г.:</w:t>
+        <w:t>Заказчик _____________________________________________ и Исполнитель (плательщик налога на профессиональный доход) _____________________________________, ИНН __________________, составили настоящий Акт о том, что в соответствии с Договором № ____ от «____» ___________ 2026 г. Исполнитель выполнил, а Заказчик принял следующие работы за этап № ____ за период с «____» ________ по «____» ________ 20___ г.:</w:t>
       </w:r>
     </w:p>
     <w:tbl>
@@ -2044,8 +1256,9 @@
       </w:tblPr>
       <w:tblGrid>
         <w:gridCol w:w="567"/>
-        <w:gridCol w:w="3118"/>
-        <w:gridCol w:w="5386"/>
+        <w:gridCol w:w="2551"/>
+        <w:gridCol w:w="4252"/>
+        <w:gridCol w:w="1701"/>
       </w:tblGrid>
       <w:tr>
         <w:tc>
@@ -2068,7 +1281,7 @@
         </w:tc>
         <w:tc>
           <w:tcPr>
-            <w:tcW w:type="dxa" w:w="3118"/>
+            <w:tcW w:type="dxa" w:w="2551"/>
           </w:tcPr>
           <w:p>
             <w:pPr>
@@ -2086,7 +1299,7 @@
         </w:tc>
         <w:tc>
           <w:tcPr>
-            <w:tcW w:type="dxa" w:w="5386"/>
+            <w:tcW w:type="dxa" w:w="4252"/>
           </w:tcPr>
           <w:p>
             <w:pPr>
@@ -2099,6 +1312,24 @@
                 <w:sz w:val="22"/>
               </w:rPr>
               <w:t>Выполненные работы (техническое обслуживание, ремонт, замена)</w:t>
+            </w:r>
+          </w:p>
+        </w:tc>
+        <w:tc>
+          <w:tcPr>
+            <w:tcW w:type="dxa" w:w="1701"/>
+          </w:tcPr>
+          <w:p>
+            <w:pPr>
+              <w:jc w:val="center"/>
+            </w:pPr>
+            <w:r/>
+            <w:r>
+              <w:rPr>
+                <w:b/>
+                <w:sz w:val="22"/>
+              </w:rPr>
+              <w:t>Стоимость, руб.</w:t>
             </w:r>
           </w:p>
         </w:tc>
@@ -2120,7 +1351,7 @@
         </w:tc>
         <w:tc>
           <w:tcPr>
-            <w:tcW w:type="dxa" w:w="3118"/>
+            <w:tcW w:type="dxa" w:w="2551"/>
           </w:tcPr>
           <w:p>
             <w:r/>
@@ -2134,7 +1365,7 @@
         </w:tc>
         <w:tc>
           <w:tcPr>
-            <w:tcW w:type="dxa" w:w="5386"/>
+            <w:tcW w:type="dxa" w:w="4252"/>
           </w:tcPr>
           <w:p>
             <w:r/>
@@ -2144,6 +1375,19 @@
               </w:rPr>
               <w:br/>
               <w:br/>
+            </w:r>
+          </w:p>
+        </w:tc>
+        <w:tc>
+          <w:tcPr>
+            <w:tcW w:type="dxa" w:w="1701"/>
+          </w:tcPr>
+          <w:p>
+            <w:r/>
+            <w:r>
+              <w:rPr>
+                <w:sz w:val="22"/>
+              </w:rPr>
             </w:r>
           </w:p>
         </w:tc>
@@ -2165,7 +1409,7 @@
         </w:tc>
         <w:tc>
           <w:tcPr>
-            <w:tcW w:type="dxa" w:w="3118"/>
+            <w:tcW w:type="dxa" w:w="2551"/>
           </w:tcPr>
           <w:p>
             <w:r/>
@@ -2179,7 +1423,7 @@
         </w:tc>
         <w:tc>
           <w:tcPr>
-            <w:tcW w:type="dxa" w:w="5386"/>
+            <w:tcW w:type="dxa" w:w="4252"/>
           </w:tcPr>
           <w:p>
             <w:r/>
@@ -2189,6 +1433,74 @@
               </w:rPr>
               <w:br/>
               <w:br/>
+            </w:r>
+          </w:p>
+        </w:tc>
+        <w:tc>
+          <w:tcPr>
+            <w:tcW w:type="dxa" w:w="1701"/>
+          </w:tcPr>
+          <w:p>
+            <w:r/>
+            <w:r>
+              <w:rPr>
+                <w:sz w:val="22"/>
+              </w:rPr>
+            </w:r>
+          </w:p>
+        </w:tc>
+      </w:tr>
+      <w:tr>
+        <w:tc>
+          <w:tcPr>
+            <w:tcW w:type="dxa" w:w="567"/>
+          </w:tcPr>
+          <w:p>
+            <w:r/>
+            <w:r>
+              <w:rPr>
+                <w:sz w:val="22"/>
+              </w:rPr>
+            </w:r>
+          </w:p>
+        </w:tc>
+        <w:tc>
+          <w:tcPr>
+            <w:tcW w:type="dxa" w:w="2551"/>
+          </w:tcPr>
+          <w:p>
+            <w:r/>
+            <w:r>
+              <w:rPr>
+                <w:sz w:val="22"/>
+              </w:rPr>
+            </w:r>
+          </w:p>
+        </w:tc>
+        <w:tc>
+          <w:tcPr>
+            <w:tcW w:type="dxa" w:w="4252"/>
+          </w:tcPr>
+          <w:p>
+            <w:r/>
+            <w:r>
+              <w:rPr>
+                <w:sz w:val="22"/>
+              </w:rPr>
+              <w:t>ИТОГО за этап:</w:t>
+            </w:r>
+          </w:p>
+        </w:tc>
+        <w:tc>
+          <w:tcPr>
+            <w:tcW w:type="dxa" w:w="1701"/>
+          </w:tcPr>
+          <w:p>
+            <w:r/>
+            <w:r>
+              <w:rPr>
+                <w:sz w:val="22"/>
+              </w:rPr>
             </w:r>
           </w:p>
         </w:tc>
@@ -2216,7 +1528,7 @@
         <w:rPr>
           <w:b w:val="0"/>
         </w:rPr>
-        <w:t>Стоимость выполненных работ по этапу: 60 000 (шестьдесят тысяч) рублей 00 копеек. НДС не облагается.</w:t>
+        <w:t>Стоимость выполненных работ за этап: ____________ (__________________________________) рублей ___ копеек. НДС не облагается.</w:t>
       </w:r>
     </w:p>
     <w:p>

</xml_diff>

<commit_message>
Set contract term to 12 months and drop the 3-month work period
Co-Authored-By: Claude Opus 5.5 <noreply@anthropic.com>
Claude-Session: https://claude.ai/code/session_01HFBjH4MjwsHcLuC72w9pUK
</commit_message>
<xml_diff>
--- a/contracts/Договор_самозанятый_сантехника.docx
+++ b/contracts/Договор_самозанятый_сантехника.docx
@@ -320,7 +320,7 @@
         <w:rPr>
           <w:b w:val="0"/>
         </w:rPr>
-        <w:t>2.1. Общий срок выполнения Работ составляет 3 (три) календарных месяца: с «____» _______________ 2026 г. по «____» _______________ 20___ г.</w:t>
+        <w:t>2.1. Работы выполняются в течение всего срока действия Договора, установленного п. 9.1 Договора.</w:t>
       </w:r>
     </w:p>
     <w:p>
@@ -950,7 +950,7 @@
         <w:rPr>
           <w:b w:val="0"/>
         </w:rPr>
-        <w:t>9.1. Договор вступает в силу с момента подписания Сторонами и действует до полного исполнения Сторонами своих обязательств.</w:t>
+        <w:t>9.1. Договор вступает в силу с момента подписания Сторонами и действует в течение 12 (двенадцати) месяцев: с «____» _______________ 2026 г. по «____» _______________ 2027 г., а в части неисполненных обязательств (в том числе по оплате и гарантии) — до их полного исполнения.</w:t>
       </w:r>
     </w:p>
     <w:p>

</xml_diff>

<commit_message>
Remove contractual penalties for late work and late payment
Co-Authored-By: Claude Opus 5.5 <noreply@anthropic.com>
Claude-Session: https://claude.ai/code/session_01HFBjH4MjwsHcLuC72w9pUK
</commit_message>
<xml_diff>
--- a/contracts/Договор_самозанятый_сантехника.docx
+++ b/contracts/Договор_самозанятый_сантехника.docx
@@ -835,7 +835,7 @@
         <w:rPr>
           <w:b w:val="0"/>
         </w:rPr>
-        <w:t>7.2. За нарушение сроков выполнения Работ по вине Исполнителя Заказчик вправе потребовать уплаты неустойки в размере 0,1 % от стоимости просроченных Работ за каждый день просрочки, но не более 10 % от их стоимости.</w:t>
+        <w:t>7.2. Исполнитель возмещает реальный ущерб, причинённый по его вине Заказчику и третьим лицам (в том числе вследствие залива помещений) при выполнении Работ.</w:t>
       </w:r>
     </w:p>
     <w:p>
@@ -848,33 +848,7 @@
         <w:rPr>
           <w:b w:val="0"/>
         </w:rPr>
-        <w:t>7.3. За нарушение сроков оплаты Исполнитель вправе потребовать уплаты неустойки в размере 0,1 % от суммы задолженности за каждый день просрочки, но не более 10 % от суммы задолженности.</w:t>
-      </w:r>
-    </w:p>
-    <w:p>
-      <w:pPr>
-        <w:spacing w:before="0"/>
-        <w:ind w:firstLine="567"/>
-        <w:jc w:val="both"/>
-      </w:pPr>
-      <w:r>
-        <w:rPr>
-          <w:b w:val="0"/>
-        </w:rPr>
-        <w:t>7.4. Исполнитель возмещает реальный ущерб, причинённый по его вине Заказчику и третьим лицам (в том числе вследствие залива помещений) при выполнении Работ.</w:t>
-      </w:r>
-    </w:p>
-    <w:p>
-      <w:pPr>
-        <w:spacing w:before="0"/>
-        <w:ind w:firstLine="567"/>
-        <w:jc w:val="both"/>
-      </w:pPr>
-      <w:r>
-        <w:rPr>
-          <w:b w:val="0"/>
-        </w:rPr>
-        <w:t>7.5. Стороны освобождаются от ответственности за неисполнение обязательств, если оно явилось следствием обстоятельств непреодолимой силы, о наступлении которых Сторона обязана уведомить другую Сторону в течение 3 (трёх) рабочих дней.</w:t>
+        <w:t>7.3. Стороны освобождаются от ответственности за неисполнение обязательств, если оно явилось следствием обстоятельств непреодолимой силы, о наступлении которых Сторона обязана уведомить другую Сторону в течение 3 (трёх) рабочих дней.</w:t>
       </w:r>
     </w:p>
     <w:p>

</xml_diff>

<commit_message>
Remove quality warranty section and renumber following sections
Co-Authored-By: Claude Opus 5.5 <noreply@anthropic.com>
Claude-Session: https://claude.ai/code/session_01HFBjH4MjwsHcLuC72w9pUK
</commit_message>
<xml_diff>
--- a/contracts/Договор_самозанятый_сантехника.docx
+++ b/contracts/Договор_самозанятый_сантехника.docx
@@ -320,7 +320,7 @@
         <w:rPr>
           <w:b w:val="0"/>
         </w:rPr>
-        <w:t>2.1. Работы выполняются в течение всего срока действия Договора, установленного п. 9.1 Договора.</w:t>
+        <w:t>2.1. Работы выполняются в течение всего срока действия Договора, установленного п. 8.1 Договора.</w:t>
       </w:r>
     </w:p>
     <w:p>
@@ -436,7 +436,7 @@
         <w:rPr>
           <w:b w:val="0"/>
         </w:rPr>
-        <w:t>3.6. Оплата производится в безналичном порядке путём перечисления денежных средств на банковский счёт Исполнителя, указанный в разделе 11 Договора. Обязательство Заказчика по оплате считается исполненным с момента списания денежных средств с его счёта.</w:t>
+        <w:t>3.6. Оплата производится в безналичном порядке путём перечисления денежных средств на банковский счёт Исполнителя, указанный в разделе 10 Договора. Обязательство Заказчика по оплате считается исполненным с момента списания денежных средств с его счёта.</w:t>
       </w:r>
     </w:p>
     <w:p>
@@ -758,7 +758,7 @@
         <w:rPr>
           <w:b/>
         </w:rPr>
-        <w:t>6. ГАРАНТИИ КАЧЕСТВА</w:t>
+        <w:t>6. ОТВЕТСТВЕННОСТЬ СТОРОН</w:t>
       </w:r>
     </w:p>
     <w:p>
@@ -771,7 +771,7 @@
         <w:rPr>
           <w:b w:val="0"/>
         </w:rPr>
-        <w:t>6.1. Исполнитель гарантирует качество выполненных работ по ремонту и замене отдельных участков и элементов систем в течение 12 (двенадцати) месяцев с даты подписания акта по соответствующему этапу.</w:t>
+        <w:t>6.1. За неисполнение или ненадлежащее исполнение обязательств Стороны несут ответственность в соответствии с законодательством Российской Федерации.</w:t>
       </w:r>
     </w:p>
     <w:p>
@@ -784,7 +784,7 @@
         <w:rPr>
           <w:b w:val="0"/>
         </w:rPr>
-        <w:t>6.2. Недостатки (протечки, неисправности соединений и т. п.), выявленные в гарантийный срок и возникшие по вине Исполнителя, устраняются им безвозмездно в течение 5 (пяти) рабочих дней с момента получения уведомления Заказчика, а в аварийных ситуациях — в течение 24 часов.</w:t>
+        <w:t>6.2. Исполнитель возмещает реальный ущерб, причинённый по его вине Заказчику и третьим лицам (в том числе вследствие залива помещений) при выполнении Работ.</w:t>
       </w:r>
     </w:p>
     <w:p>
@@ -797,7 +797,7 @@
         <w:rPr>
           <w:b w:val="0"/>
         </w:rPr>
-        <w:t>6.3. Гарантия не распространяется на недостатки, возникшие вследствие нормального износа, ненадлежащей эксплуатации, действий третьих лиц или дефектов материалов и оборудования, предоставленных Заказчиком.</w:t>
+        <w:t>6.3. Стороны освобождаются от ответственности за неисполнение обязательств, если оно явилось следствием обстоятельств непреодолимой силы, о наступлении которых Сторона обязана уведомить другую Сторону в течение 3 (трёх) рабочих дней.</w:t>
       </w:r>
     </w:p>
     <w:p>
@@ -809,7 +809,7 @@
         <w:rPr>
           <w:b/>
         </w:rPr>
-        <w:t>7. ОТВЕТСТВЕННОСТЬ СТОРОН</w:t>
+        <w:t>7. ОСОБЫЕ УСЛОВИЯ</w:t>
       </w:r>
     </w:p>
     <w:p>
@@ -822,7 +822,7 @@
         <w:rPr>
           <w:b w:val="0"/>
         </w:rPr>
-        <w:t>7.1. За неисполнение или ненадлежащее исполнение обязательств Стороны несут ответственность в соответствии с законодательством Российской Федерации.</w:t>
+        <w:t>7.1. Настоящий Договор является гражданско-правовым. Исполнитель не является работником Заказчика, не подчиняется правилам внутреннего трудового распорядка Заказчика и самостоятельно организует выполнение Работ в рамках согласованных сроков.</w:t>
       </w:r>
     </w:p>
     <w:p>
@@ -835,7 +835,7 @@
         <w:rPr>
           <w:b w:val="0"/>
         </w:rPr>
-        <w:t>7.2. Исполнитель возмещает реальный ущерб, причинённый по его вине Заказчику и третьим лицам (в том числе вследствие залива помещений) при выполнении Работ.</w:t>
+        <w:t>7.2. Исполнитель подтверждает, что на дату заключения Договора состоит на учёте в качестве плательщика налога на профессиональный доход и не является бывшим работником Заказчика, трудовые отношения с которым прекращены менее двух лет назад (пп. 8 п. 2 ст. 6 Федерального закона № 422-ФЗ). Справка о постановке на учёт, сформированная в приложении «Мой налог», прилагается к Договору.</w:t>
       </w:r>
     </w:p>
     <w:p>
@@ -848,7 +848,7 @@
         <w:rPr>
           <w:b w:val="0"/>
         </w:rPr>
-        <w:t>7.3. Стороны освобождаются от ответственности за неисполнение обязательств, если оно явилось следствием обстоятельств непреодолимой силы, о наступлении которых Сторона обязана уведомить другую Сторону в течение 3 (трёх) рабочих дней.</w:t>
+        <w:t>7.3. В случае утраты Исполнителем статуса плательщика налога на профессиональный доход и неуведомления об этом Заказчика Исполнитель возмещает Заказчику понесённые в связи с этим расходы, включая доначисленные налоги, страховые взносы, пени и штрафы.</w:t>
       </w:r>
     </w:p>
     <w:p>
@@ -860,7 +860,7 @@
         <w:rPr>
           <w:b/>
         </w:rPr>
-        <w:t>8. ОСОБЫЕ УСЛОВИЯ</w:t>
+        <w:t>8. СРОК ДЕЙСТВИЯ, ИЗМЕНЕНИЕ И РАСТОРЖЕНИЕ ДОГОВОРА</w:t>
       </w:r>
     </w:p>
     <w:p>
@@ -873,7 +873,7 @@
         <w:rPr>
           <w:b w:val="0"/>
         </w:rPr>
-        <w:t>8.1. Настоящий Договор является гражданско-правовым. Исполнитель не является работником Заказчика, не подчиняется правилам внутреннего трудового распорядка Заказчика и самостоятельно организует выполнение Работ в рамках согласованных сроков.</w:t>
+        <w:t>8.1. Договор вступает в силу с момента подписания Сторонами и действует в течение 12 (двенадцати) месяцев: с «____» _______________ 2026 г. по «____» _______________ 2027 г., а в части неисполненных обязательств (в том числе по оплате) — до их полного исполнения.</w:t>
       </w:r>
     </w:p>
     <w:p>
@@ -886,7 +886,7 @@
         <w:rPr>
           <w:b w:val="0"/>
         </w:rPr>
-        <w:t>8.2. Исполнитель подтверждает, что на дату заключения Договора состоит на учёте в качестве плательщика налога на профессиональный доход и не является бывшим работником Заказчика, трудовые отношения с которым прекращены менее двух лет назад (пп. 8 п. 2 ст. 6 Федерального закона № 422-ФЗ). Справка о постановке на учёт, сформированная в приложении «Мой налог», прилагается к Договору.</w:t>
+        <w:t>8.2. Договор может быть изменён или расторгнут по соглашению Сторон, а также в одностороннем порядке в случаях, предусмотренных законодательством РФ, с письменным уведомлением другой Стороны не менее чем за 10 (десять) календарных дней.</w:t>
       </w:r>
     </w:p>
     <w:p>
@@ -899,7 +899,7 @@
         <w:rPr>
           <w:b w:val="0"/>
         </w:rPr>
-        <w:t>8.3. В случае утраты Исполнителем статуса плательщика налога на профессиональный доход и неуведомления об этом Заказчика Исполнитель возмещает Заказчику понесённые в связи с этим расходы, включая доначисленные налоги, страховые взносы, пени и штрафы.</w:t>
+        <w:t>8.3. При досрочном расторжении Договора Заказчик оплачивает фактически выполненные и принятые по акту Работы.</w:t>
       </w:r>
     </w:p>
     <w:p>
@@ -911,7 +911,7 @@
         <w:rPr>
           <w:b/>
         </w:rPr>
-        <w:t>9. СРОК ДЕЙСТВИЯ, ИЗМЕНЕНИЕ И РАСТОРЖЕНИЕ ДОГОВОРА</w:t>
+        <w:t>9. ЗАКЛЮЧИТЕЛЬНЫЕ ПОЛОЖЕНИЯ</w:t>
       </w:r>
     </w:p>
     <w:p>
@@ -924,7 +924,7 @@
         <w:rPr>
           <w:b w:val="0"/>
         </w:rPr>
-        <w:t>9.1. Договор вступает в силу с момента подписания Сторонами и действует в течение 12 (двенадцати) месяцев: с «____» _______________ 2026 г. по «____» _______________ 2027 г., а в части неисполненных обязательств (в том числе по оплате и гарантии) — до их полного исполнения.</w:t>
+        <w:t>9.1. Споры разрешаются путём переговоров, а при недостижении согласия — в суде по месту нахождения Заказчика с соблюдением претензионного порядка (срок ответа на претензию — 10 календарных дней).</w:t>
       </w:r>
     </w:p>
     <w:p>
@@ -937,7 +937,7 @@
         <w:rPr>
           <w:b w:val="0"/>
         </w:rPr>
-        <w:t>9.2. Договор может быть изменён или расторгнут по соглашению Сторон, а также в одностороннем порядке в случаях, предусмотренных законодательством РФ, с письменным уведомлением другой Стороны не менее чем за 10 (десять) календарных дней.</w:t>
+        <w:t>9.2. Все изменения и дополнения к Договору действительны, если они совершены в письменной форме и подписаны Сторонами. Переписка по электронной почте и в мессенджерах по контактам, указанным в разделе 10, признаётся Сторонами юридически значимой для целей оперативного взаимодействия.</w:t>
       </w:r>
     </w:p>
     <w:p>
@@ -950,19 +950,7 @@
         <w:rPr>
           <w:b w:val="0"/>
         </w:rPr>
-        <w:t>9.3. При досрочном расторжении Договора Заказчик оплачивает фактически выполненные и принятые по акту Работы.</w:t>
-      </w:r>
-    </w:p>
-    <w:p>
-      <w:pPr>
-        <w:spacing w:before="160"/>
-        <w:jc w:val="center"/>
-      </w:pPr>
-      <w:r>
-        <w:rPr>
-          <w:b/>
-        </w:rPr>
-        <w:t>10. ЗАКЛЮЧИТЕЛЬНЫЕ ПОЛОЖЕНИЯ</w:t>
+        <w:t>9.3. Договор составлен в двух экземплярах, имеющих равную юридическую силу, по одному для каждой Стороны.</w:t>
       </w:r>
     </w:p>
     <w:p>
@@ -975,46 +963,7 @@
         <w:rPr>
           <w:b w:val="0"/>
         </w:rPr>
-        <w:t>10.1. Споры разрешаются путём переговоров, а при недостижении согласия — в суде по месту нахождения Заказчика с соблюдением претензионного порядка (срок ответа на претензию — 10 календарных дней).</w:t>
-      </w:r>
-    </w:p>
-    <w:p>
-      <w:pPr>
-        <w:spacing w:before="0"/>
-        <w:ind w:firstLine="567"/>
-        <w:jc w:val="both"/>
-      </w:pPr>
-      <w:r>
-        <w:rPr>
-          <w:b w:val="0"/>
-        </w:rPr>
-        <w:t>10.2. Все изменения и дополнения к Договору действительны, если они совершены в письменной форме и подписаны Сторонами. Переписка по электронной почте и в мессенджерах по контактам, указанным в разделе 11, признаётся Сторонами юридически значимой для целей оперативного взаимодействия.</w:t>
-      </w:r>
-    </w:p>
-    <w:p>
-      <w:pPr>
-        <w:spacing w:before="0"/>
-        <w:ind w:firstLine="567"/>
-        <w:jc w:val="both"/>
-      </w:pPr>
-      <w:r>
-        <w:rPr>
-          <w:b w:val="0"/>
-        </w:rPr>
-        <w:t>10.3. Договор составлен в двух экземплярах, имеющих равную юридическую силу, по одному для каждой Стороны.</w:t>
-      </w:r>
-    </w:p>
-    <w:p>
-      <w:pPr>
-        <w:spacing w:before="0"/>
-        <w:ind w:firstLine="567"/>
-        <w:jc w:val="both"/>
-      </w:pPr>
-      <w:r>
-        <w:rPr>
-          <w:b w:val="0"/>
-        </w:rPr>
-        <w:t>10.4. Неотъемлемой частью Договора является Приложение № 1 — Форма акта сдачи-приёмки выполненных работ.</w:t>
+        <w:t>9.4. Неотъемлемой частью Договора является Приложение № 1 — Форма акта сдачи-приёмки выполненных работ.</w:t>
       </w:r>
     </w:p>
     <w:p>
@@ -1026,7 +975,7 @@
         <w:rPr>
           <w:b/>
         </w:rPr>
-        <w:t>11. РЕКВИЗИТЫ И ПОДПИСИ СТОРОН</w:t>
+        <w:t>10. РЕКВИЗИТЫ И ПОДПИСИ СТОРОН</w:t>
       </w:r>
     </w:p>
     <w:tbl>

</xml_diff>

<commit_message>
Replace work stages with per-visit accounting and payment at least twice a month
Co-Authored-By: Claude Opus 5.5 <noreply@anthropic.com>
Claude-Session: https://claude.ai/code/session_01HFBjH4MjwsHcLuC72w9pUK
</commit_message>
<xml_diff>
--- a/contracts/Договор_самозанятый_сантехника.docx
+++ b/contracts/Договор_самозанятый_сантехника.docx
@@ -282,7 +282,7 @@
         <w:rPr>
           <w:b w:val="0"/>
         </w:rPr>
-        <w:t>1.6. Работы выполняются в течение срока действия Договора по мере необходимости и заявкам Заказчика. Сдача-приёмка и оплата Работ производятся поэтапно; этапом (отчётным периодом) является календарный месяц.</w:t>
+        <w:t>1.6. Работы выполняются в течение срока действия Договора по мере необходимости путём выездов Исполнителя на Объекты (плановые осмотры и выезды по заявкам Заказчика). Учёт, приёмка и оплата Работ производятся по фактически совершённым выездам и фактически выполненным Работам.</w:t>
       </w:r>
     </w:p>
     <w:p>
@@ -371,7 +371,7 @@
         <w:rPr>
           <w:b w:val="0"/>
         </w:rPr>
-        <w:t>3.1. Настоящий Договор является рамочным (ст. 429.1 Гражданского кодекса РФ) и определяет общие условия взаимоотношений Сторон. Общая стоимость Работ по Договору не фиксируется и складывается из стоимости Работ, фактически выполненных и принятых Заказчиком за каждый этап.</w:t>
+        <w:t>3.1. Настоящий Договор является рамочным (ст. 429.1 Гражданского кодекса РФ) и определяет общие условия взаимоотношений Сторон. Общая стоимость Работ по Договору не фиксируется и складывается из стоимости фактически совершённых выездов и выполненных Работ, принятых Заказчиком.</w:t>
       </w:r>
     </w:p>
     <w:p>
@@ -384,7 +384,7 @@
         <w:rPr>
           <w:b w:val="0"/>
         </w:rPr>
-        <w:t>3.2. Стоимость Работ за этап определяется по фактически выполненным Работам и указывается в акте сдачи-приёмки выполненных работ (Приложение № 1), подписанном Сторонами. Стоимость работ по ремонту и замене согласовывается Сторонами до начала их выполнения в соответствии с п. 1.4 Договора.</w:t>
+        <w:t>3.2. Стоимость Работ определяется по фактическим выездам и фактически выполненным Работам и указывается в акте сдачи-приёмки выполненных работ (Приложение № 1), подписанном Сторонами. Стоимость работ по ремонту и замене согласовывается Сторонами до начала их выполнения в соответствии с п. 1.4 Договора.</w:t>
       </w:r>
     </w:p>
     <w:p>
@@ -423,7 +423,7 @@
         <w:rPr>
           <w:b w:val="0"/>
         </w:rPr>
-        <w:t>3.5. Оплата Работ за каждый этап производится в течение 5 (пяти) рабочих дней с даты подписания Сторонами акта сдачи-приёмки выполненных работ за соответствующий этап и получения от Исполнителя чека, сформированного в соответствии с п. 3.7 Договора.</w:t>
+        <w:t>3.5. Оплата Работ производится не реже 2 (двух) раз в месяц за расчётные периоды: с 1-го по 15-е число и с 16-го по последнее число календарного месяца. Оплата производится в течение 5 (пяти) рабочих дней с даты подписания Сторонами акта сдачи-приёмки выполненных работ за соответствующий расчётный период и получения от Исполнителя чека, сформированного в соответствии с п. 3.7 Договора. Если в расчётном периоде выездов не было, акт не составляется и оплата не производится.</w:t>
       </w:r>
     </w:p>
     <w:p>
@@ -565,7 +565,7 @@
         <w:rPr>
           <w:b w:val="0"/>
         </w:rPr>
-        <w:t>4.1.5. По окончании каждого этапа предъявить результат Заказчику и передать акт сдачи-приёмки.</w:t>
+        <w:t>4.1.5. Вести учёт выездов и выполненных Работ и по окончании каждого расчётного периода передавать Заказчику акт сдачи-приёмки.</w:t>
       </w:r>
     </w:p>
     <w:p>
@@ -694,7 +694,7 @@
         <w:rPr>
           <w:b w:val="0"/>
         </w:rPr>
-        <w:t>5.1. По завершении каждого этапа Исполнитель уведомляет Заказчика о готовности результата Работ и передаёт ему подписанный со своей стороны акт сдачи-приёмки выполненных работ (Приложение № 1).</w:t>
+        <w:t>5.1. По окончании каждого расчётного периода (п. 3.5) Исполнитель передаёт Заказчику подписанный со своей стороны акт сдачи-приёмки выполненных работ (Приложение № 1) с перечнем выездов и выполненных Работ.</w:t>
       </w:r>
     </w:p>
     <w:p>
@@ -733,7 +733,7 @@
         <w:rPr>
           <w:b w:val="0"/>
         </w:rPr>
-        <w:t>5.4. Если в срок, указанный в п. 5.2, Заказчик не подписал акт и не направил мотивированный отказ, Работы по этапу считаются принятыми.</w:t>
+        <w:t>5.4. Если в срок, указанный в п. 5.2, Заказчик не подписал акт и не направил мотивированный отказ, Работы, указанные в акте, считаются принятыми.</w:t>
       </w:r>
     </w:p>
     <w:p>
@@ -1106,7 +1106,7 @@
         </w:rPr>
         <w:t>АКТ № ____</w:t>
         <w:br/>
-        <w:t>сдачи-приёмки выполненных работ за этап (месяц) № ____</w:t>
+        <w:t>сдачи-приёмки выполненных работ</w:t>
       </w:r>
     </w:p>
     <w:tbl>
@@ -1166,7 +1166,7 @@
         <w:rPr>
           <w:b w:val="0"/>
         </w:rPr>
-        <w:t>Заказчик _____________________________________________ и Исполнитель (плательщик налога на профессиональный доход) _____________________________________, ИНН __________________, составили настоящий Акт о том, что в соответствии с Договором № ____ от «____» ___________ 2026 г. Исполнитель выполнил, а Заказчик принял следующие работы за этап № ____ за период с «____» ________ по «____» ________ 20___ г.:</w:t>
+        <w:t>Заказчик _____________________________________________ и Исполнитель (плательщик налога на профессиональный доход) _____________________________________, ИНН __________________, составили настоящий Акт о том, что в соответствии с Договором № ____ от «____» ___________ 2026 г. Исполнитель выполнил, а Заказчик принял следующие работы за расчётный период с «____» ________ по «____» ________ 20___ г.:</w:t>
       </w:r>
     </w:p>
     <w:tbl>
@@ -1178,15 +1178,16 @@
         <w:tblLook w:firstColumn="1" w:firstRow="1" w:lastColumn="0" w:lastRow="0" w:noHBand="0" w:noVBand="1" w:val="04A0"/>
       </w:tblPr>
       <w:tblGrid>
-        <w:gridCol w:w="567"/>
-        <w:gridCol w:w="2551"/>
-        <w:gridCol w:w="4252"/>
+        <w:gridCol w:w="510"/>
+        <w:gridCol w:w="1361"/>
+        <w:gridCol w:w="1361"/>
+        <w:gridCol w:w="4139"/>
         <w:gridCol w:w="1701"/>
       </w:tblGrid>
       <w:tr>
         <w:tc>
           <w:tcPr>
-            <w:tcW w:type="dxa" w:w="567"/>
+            <w:tcW w:type="dxa" w:w="510"/>
           </w:tcPr>
           <w:p>
             <w:pPr>
@@ -1204,7 +1205,7 @@
         </w:tc>
         <w:tc>
           <w:tcPr>
-            <w:tcW w:type="dxa" w:w="2551"/>
+            <w:tcW w:type="dxa" w:w="1361"/>
           </w:tcPr>
           <w:p>
             <w:pPr>
@@ -1216,13 +1217,31 @@
                 <w:b/>
                 <w:sz w:val="22"/>
               </w:rPr>
-              <w:t>Объект</w:t>
+              <w:t>Дата выезда</w:t>
             </w:r>
           </w:p>
         </w:tc>
         <w:tc>
           <w:tcPr>
-            <w:tcW w:type="dxa" w:w="4252"/>
+            <w:tcW w:type="dxa" w:w="1361"/>
+          </w:tcPr>
+          <w:p>
+            <w:pPr>
+              <w:jc w:val="center"/>
+            </w:pPr>
+            <w:r/>
+            <w:r>
+              <w:rPr>
+                <w:b/>
+                <w:sz w:val="22"/>
+              </w:rPr>
+              <w:t>Объект (№ 1 / № 2)</w:t>
+            </w:r>
+          </w:p>
+        </w:tc>
+        <w:tc>
+          <w:tcPr>
+            <w:tcW w:type="dxa" w:w="4139"/>
           </w:tcPr>
           <w:p>
             <w:pPr>
@@ -1260,7 +1279,7 @@
       <w:tr>
         <w:tc>
           <w:tcPr>
-            <w:tcW w:type="dxa" w:w="567"/>
+            <w:tcW w:type="dxa" w:w="510"/>
           </w:tcPr>
           <w:p>
             <w:r/>
@@ -1274,7 +1293,7 @@
         </w:tc>
         <w:tc>
           <w:tcPr>
-            <w:tcW w:type="dxa" w:w="2551"/>
+            <w:tcW w:type="dxa" w:w="1361"/>
           </w:tcPr>
           <w:p>
             <w:r/>
@@ -1282,13 +1301,12 @@
               <w:rPr>
                 <w:sz w:val="22"/>
               </w:rPr>
-              <w:t>№ 1: ул. Дыбенко, д. 22, корп. 1</w:t>
             </w:r>
           </w:p>
         </w:tc>
         <w:tc>
           <w:tcPr>
-            <w:tcW w:type="dxa" w:w="4252"/>
+            <w:tcW w:type="dxa" w:w="1361"/>
           </w:tcPr>
           <w:p>
             <w:r/>
@@ -1296,8 +1314,19 @@
               <w:rPr>
                 <w:sz w:val="22"/>
               </w:rPr>
-              <w:br/>
-              <w:br/>
+            </w:r>
+          </w:p>
+        </w:tc>
+        <w:tc>
+          <w:tcPr>
+            <w:tcW w:type="dxa" w:w="4139"/>
+          </w:tcPr>
+          <w:p>
+            <w:r/>
+            <w:r>
+              <w:rPr>
+                <w:sz w:val="22"/>
+              </w:rPr>
             </w:r>
           </w:p>
         </w:tc>
@@ -1318,7 +1347,7 @@
       <w:tr>
         <w:tc>
           <w:tcPr>
-            <w:tcW w:type="dxa" w:w="567"/>
+            <w:tcW w:type="dxa" w:w="510"/>
           </w:tcPr>
           <w:p>
             <w:r/>
@@ -1332,7 +1361,7 @@
         </w:tc>
         <w:tc>
           <w:tcPr>
-            <w:tcW w:type="dxa" w:w="2551"/>
+            <w:tcW w:type="dxa" w:w="1361"/>
           </w:tcPr>
           <w:p>
             <w:r/>
@@ -1340,13 +1369,12 @@
               <w:rPr>
                 <w:sz w:val="22"/>
               </w:rPr>
-              <w:t>№ 2: Комендантский пр-т, д. 17, корп. 1</w:t>
             </w:r>
           </w:p>
         </w:tc>
         <w:tc>
           <w:tcPr>
-            <w:tcW w:type="dxa" w:w="4252"/>
+            <w:tcW w:type="dxa" w:w="1361"/>
           </w:tcPr>
           <w:p>
             <w:r/>
@@ -1354,8 +1382,19 @@
               <w:rPr>
                 <w:sz w:val="22"/>
               </w:rPr>
-              <w:br/>
-              <w:br/>
+            </w:r>
+          </w:p>
+        </w:tc>
+        <w:tc>
+          <w:tcPr>
+            <w:tcW w:type="dxa" w:w="4139"/>
+          </w:tcPr>
+          <w:p>
+            <w:r/>
+            <w:r>
+              <w:rPr>
+                <w:sz w:val="22"/>
+              </w:rPr>
             </w:r>
           </w:p>
         </w:tc>
@@ -1376,7 +1415,21 @@
       <w:tr>
         <w:tc>
           <w:tcPr>
-            <w:tcW w:type="dxa" w:w="567"/>
+            <w:tcW w:type="dxa" w:w="510"/>
+          </w:tcPr>
+          <w:p>
+            <w:r/>
+            <w:r>
+              <w:rPr>
+                <w:sz w:val="22"/>
+              </w:rPr>
+              <w:t>3</w:t>
+            </w:r>
+          </w:p>
+        </w:tc>
+        <w:tc>
+          <w:tcPr>
+            <w:tcW w:type="dxa" w:w="1361"/>
           </w:tcPr>
           <w:p>
             <w:r/>
@@ -1389,7 +1442,7 @@
         </w:tc>
         <w:tc>
           <w:tcPr>
-            <w:tcW w:type="dxa" w:w="2551"/>
+            <w:tcW w:type="dxa" w:w="1361"/>
           </w:tcPr>
           <w:p>
             <w:r/>
@@ -1402,7 +1455,7 @@
         </w:tc>
         <w:tc>
           <w:tcPr>
-            <w:tcW w:type="dxa" w:w="4252"/>
+            <w:tcW w:type="dxa" w:w="4139"/>
           </w:tcPr>
           <w:p>
             <w:r/>
@@ -1410,7 +1463,278 @@
               <w:rPr>
                 <w:sz w:val="22"/>
               </w:rPr>
-              <w:t>ИТОГО за этап:</w:t>
+            </w:r>
+          </w:p>
+        </w:tc>
+        <w:tc>
+          <w:tcPr>
+            <w:tcW w:type="dxa" w:w="1701"/>
+          </w:tcPr>
+          <w:p>
+            <w:r/>
+            <w:r>
+              <w:rPr>
+                <w:sz w:val="22"/>
+              </w:rPr>
+            </w:r>
+          </w:p>
+        </w:tc>
+      </w:tr>
+      <w:tr>
+        <w:tc>
+          <w:tcPr>
+            <w:tcW w:type="dxa" w:w="510"/>
+          </w:tcPr>
+          <w:p>
+            <w:r/>
+            <w:r>
+              <w:rPr>
+                <w:sz w:val="22"/>
+              </w:rPr>
+              <w:t>4</w:t>
+            </w:r>
+          </w:p>
+        </w:tc>
+        <w:tc>
+          <w:tcPr>
+            <w:tcW w:type="dxa" w:w="1361"/>
+          </w:tcPr>
+          <w:p>
+            <w:r/>
+            <w:r>
+              <w:rPr>
+                <w:sz w:val="22"/>
+              </w:rPr>
+            </w:r>
+          </w:p>
+        </w:tc>
+        <w:tc>
+          <w:tcPr>
+            <w:tcW w:type="dxa" w:w="1361"/>
+          </w:tcPr>
+          <w:p>
+            <w:r/>
+            <w:r>
+              <w:rPr>
+                <w:sz w:val="22"/>
+              </w:rPr>
+            </w:r>
+          </w:p>
+        </w:tc>
+        <w:tc>
+          <w:tcPr>
+            <w:tcW w:type="dxa" w:w="4139"/>
+          </w:tcPr>
+          <w:p>
+            <w:r/>
+            <w:r>
+              <w:rPr>
+                <w:sz w:val="22"/>
+              </w:rPr>
+            </w:r>
+          </w:p>
+        </w:tc>
+        <w:tc>
+          <w:tcPr>
+            <w:tcW w:type="dxa" w:w="1701"/>
+          </w:tcPr>
+          <w:p>
+            <w:r/>
+            <w:r>
+              <w:rPr>
+                <w:sz w:val="22"/>
+              </w:rPr>
+            </w:r>
+          </w:p>
+        </w:tc>
+      </w:tr>
+      <w:tr>
+        <w:tc>
+          <w:tcPr>
+            <w:tcW w:type="dxa" w:w="510"/>
+          </w:tcPr>
+          <w:p>
+            <w:r/>
+            <w:r>
+              <w:rPr>
+                <w:sz w:val="22"/>
+              </w:rPr>
+              <w:t>5</w:t>
+            </w:r>
+          </w:p>
+        </w:tc>
+        <w:tc>
+          <w:tcPr>
+            <w:tcW w:type="dxa" w:w="1361"/>
+          </w:tcPr>
+          <w:p>
+            <w:r/>
+            <w:r>
+              <w:rPr>
+                <w:sz w:val="22"/>
+              </w:rPr>
+            </w:r>
+          </w:p>
+        </w:tc>
+        <w:tc>
+          <w:tcPr>
+            <w:tcW w:type="dxa" w:w="1361"/>
+          </w:tcPr>
+          <w:p>
+            <w:r/>
+            <w:r>
+              <w:rPr>
+                <w:sz w:val="22"/>
+              </w:rPr>
+            </w:r>
+          </w:p>
+        </w:tc>
+        <w:tc>
+          <w:tcPr>
+            <w:tcW w:type="dxa" w:w="4139"/>
+          </w:tcPr>
+          <w:p>
+            <w:r/>
+            <w:r>
+              <w:rPr>
+                <w:sz w:val="22"/>
+              </w:rPr>
+            </w:r>
+          </w:p>
+        </w:tc>
+        <w:tc>
+          <w:tcPr>
+            <w:tcW w:type="dxa" w:w="1701"/>
+          </w:tcPr>
+          <w:p>
+            <w:r/>
+            <w:r>
+              <w:rPr>
+                <w:sz w:val="22"/>
+              </w:rPr>
+            </w:r>
+          </w:p>
+        </w:tc>
+      </w:tr>
+      <w:tr>
+        <w:tc>
+          <w:tcPr>
+            <w:tcW w:type="dxa" w:w="510"/>
+          </w:tcPr>
+          <w:p>
+            <w:r/>
+            <w:r>
+              <w:rPr>
+                <w:sz w:val="22"/>
+              </w:rPr>
+              <w:t>6</w:t>
+            </w:r>
+          </w:p>
+        </w:tc>
+        <w:tc>
+          <w:tcPr>
+            <w:tcW w:type="dxa" w:w="1361"/>
+          </w:tcPr>
+          <w:p>
+            <w:r/>
+            <w:r>
+              <w:rPr>
+                <w:sz w:val="22"/>
+              </w:rPr>
+            </w:r>
+          </w:p>
+        </w:tc>
+        <w:tc>
+          <w:tcPr>
+            <w:tcW w:type="dxa" w:w="1361"/>
+          </w:tcPr>
+          <w:p>
+            <w:r/>
+            <w:r>
+              <w:rPr>
+                <w:sz w:val="22"/>
+              </w:rPr>
+            </w:r>
+          </w:p>
+        </w:tc>
+        <w:tc>
+          <w:tcPr>
+            <w:tcW w:type="dxa" w:w="4139"/>
+          </w:tcPr>
+          <w:p>
+            <w:r/>
+            <w:r>
+              <w:rPr>
+                <w:sz w:val="22"/>
+              </w:rPr>
+            </w:r>
+          </w:p>
+        </w:tc>
+        <w:tc>
+          <w:tcPr>
+            <w:tcW w:type="dxa" w:w="1701"/>
+          </w:tcPr>
+          <w:p>
+            <w:r/>
+            <w:r>
+              <w:rPr>
+                <w:sz w:val="22"/>
+              </w:rPr>
+            </w:r>
+          </w:p>
+        </w:tc>
+      </w:tr>
+      <w:tr>
+        <w:tc>
+          <w:tcPr>
+            <w:tcW w:type="dxa" w:w="510"/>
+          </w:tcPr>
+          <w:p>
+            <w:r/>
+            <w:r>
+              <w:rPr>
+                <w:sz w:val="22"/>
+              </w:rPr>
+            </w:r>
+          </w:p>
+        </w:tc>
+        <w:tc>
+          <w:tcPr>
+            <w:tcW w:type="dxa" w:w="1361"/>
+          </w:tcPr>
+          <w:p>
+            <w:r/>
+            <w:r>
+              <w:rPr>
+                <w:sz w:val="22"/>
+              </w:rPr>
+            </w:r>
+          </w:p>
+        </w:tc>
+        <w:tc>
+          <w:tcPr>
+            <w:tcW w:type="dxa" w:w="1361"/>
+          </w:tcPr>
+          <w:p>
+            <w:r/>
+            <w:r>
+              <w:rPr>
+                <w:sz w:val="22"/>
+              </w:rPr>
+            </w:r>
+          </w:p>
+        </w:tc>
+        <w:tc>
+          <w:tcPr>
+            <w:tcW w:type="dxa" w:w="4139"/>
+          </w:tcPr>
+          <w:p>
+            <w:r/>
+            <w:r>
+              <w:rPr>
+                <w:sz w:val="22"/>
+              </w:rPr>
+              <w:t>ИТОГО:</w:t>
             </w:r>
           </w:p>
         </w:tc>
@@ -1429,6 +1753,18 @@
         </w:tc>
       </w:tr>
     </w:tbl>
+    <w:p>
+      <w:pPr>
+        <w:spacing w:before="0"/>
+        <w:jc w:val="both"/>
+      </w:pPr>
+      <w:r>
+        <w:rPr>
+          <w:b w:val="0"/>
+        </w:rPr>
+        <w:t>Объект № 1 — ул. Дыбенко, д. 22, корп. 1; Объект № 2 — Комендантский пр-т, д. 17, корп. 1.</w:t>
+      </w:r>
+    </w:p>
     <w:p>
       <w:pPr>
         <w:spacing w:before="0"/>
@@ -1451,7 +1787,7 @@
         <w:rPr>
           <w:b w:val="0"/>
         </w:rPr>
-        <w:t>Стоимость выполненных работ за этап: ____________ (__________________________________) рублей ___ копеек. НДС не облагается.</w:t>
+        <w:t>Стоимость выполненных работ за расчётный период: ____________ (__________________________________) рублей ___ копеек. НДС не облагается.</w:t>
       </w:r>
     </w:p>
     <w:p>

</xml_diff>

<commit_message>
Add visit and hourly rates with 60k monthly planned cost for both sites
Co-Authored-By: Claude Opus 5.5 <noreply@anthropic.com>
Claude-Session: https://claude.ai/code/session_01HFBjH4MjwsHcLuC72w9pUK
</commit_message>
<xml_diff>
--- a/contracts/Договор_самозанятый_сантехника.docx
+++ b/contracts/Договор_самозанятый_сантехника.docx
@@ -384,7 +384,7 @@
         <w:rPr>
           <w:b w:val="0"/>
         </w:rPr>
-        <w:t>3.2. Стоимость Работ определяется по фактическим выездам и фактически выполненным Работам и указывается в акте сдачи-приёмки выполненных работ (Приложение № 1), подписанном Сторонами. Стоимость работ по ремонту и замене согласовывается Сторонами до начала их выполнения в соответствии с п. 1.4 Договора.</w:t>
+        <w:t>3.2. Стоимость Работ определяется по фактическим выездам и фактически затраченному времени по следующим расценкам:</w:t>
       </w:r>
     </w:p>
     <w:p>
@@ -397,7 +397,7 @@
         <w:rPr>
           <w:b w:val="0"/>
         </w:rPr>
-        <w:t>3.3. НДС не облагается в связи с применением Исполнителем специального налогового режима «Налог на профессиональный доход».</w:t>
+        <w:t>— выезд Исполнителя на Объект — 2 500 (две тысячи пятьсот) рублей 00 копеек за один выезд;</w:t>
       </w:r>
     </w:p>
     <w:p>
@@ -410,7 +410,7 @@
         <w:rPr>
           <w:b w:val="0"/>
         </w:rPr>
-        <w:t>3.4. Стоимость Работ включает вознаграждение Исполнителя и все его расходы, связанные с выполнением Работ (инструмент, транспорт, вывоз мусора с Объектов), за исключением стоимости материалов и оборудования, которые предоставляет Заказчик либо приобретает Исполнитель за счёт Заказчика по предварительному согласованию с подтверждением расходов чеками.</w:t>
+        <w:t>— работа Исполнителя на Объекте — 2 500 (две тысячи пятьсот) рублей 00 копеек за 1 (один) час.</w:t>
       </w:r>
     </w:p>
     <w:p>
@@ -423,7 +423,7 @@
         <w:rPr>
           <w:b w:val="0"/>
         </w:rPr>
-        <w:t>3.5. Оплата Работ производится не реже 2 (двух) раз в месяц за расчётные периоды: с 1-го по 15-е число и с 16-го по последнее число календарного месяца. Оплата производится в течение 5 (пяти) рабочих дней с даты подписания Сторонами акта сдачи-приёмки выполненных работ за соответствующий расчётный период и получения от Исполнителя чека, сформированного в соответствии с п. 3.7 Договора. Если в расчётном периоде выездов не было, акт не составляется и оплата не производится.</w:t>
+        <w:t>Время работы учитывается с момента прибытия Исполнителя на Объект до окончания Работ; неполный час округляется до 0,5 часа, минимальная оплачиваемая продолжительность работы за один выезд — 1 (один) час. Выезды, время работы и их стоимость указываются в акте сдачи-приёмки выполненных работ (Приложение № 1). Работы по ремонту и замене оплачиваются по тем же расценкам; их необходимость и объём согласовываются Сторонами до начала выполнения в соответствии с п. 1.4 Договора.</w:t>
       </w:r>
     </w:p>
     <w:p>
@@ -436,7 +436,7 @@
         <w:rPr>
           <w:b w:val="0"/>
         </w:rPr>
-        <w:t>3.6. Оплата производится в безналичном порядке путём перечисления денежных средств на банковский счёт Исполнителя, указанный в разделе 10 Договора. Обязательство Заказчика по оплате считается исполненным с момента списания денежных средств с его счёта.</w:t>
+        <w:t>3.3. Плановая стоимость Работ по двум Объектам составляет 60 000 (шестьдесят тысяч) рублей 00 копеек в календарный месяц (ориентировочно 8 (восемь) выездов продолжительностью 2 (два) часа). Работы, выполнение которых приведёт к превышению плановой стоимости в календарном месяце, выполняются только по предварительному согласованию с Заказчиком, за исключением устранения аварийных ситуаций.</w:t>
       </w:r>
     </w:p>
     <w:p>
@@ -449,7 +449,7 @@
         <w:rPr>
           <w:b w:val="0"/>
         </w:rPr>
-        <w:t>3.7. Исполнитель обязан в течение срока, установленного ч. 3 ст. 14 Федерального закона № 422-ФЗ, сформировать в приложении «Мой налог» чек на полученную сумму и передать его Заказчику (в электронной форме или на бумажном носителе).</w:t>
+        <w:t>3.4. НДС не облагается в связи с применением Исполнителем специального налогового режима «Налог на профессиональный доход».</w:t>
       </w:r>
     </w:p>
     <w:p>
@@ -462,7 +462,7 @@
         <w:rPr>
           <w:b w:val="0"/>
         </w:rPr>
-        <w:t>3.8. Исполнитель самостоятельно исчисляет и уплачивает налог на профессиональный доход. Заказчик не является налоговым агентом Исполнителя, не удерживает НДФЛ и не начисляет страховые взносы с выплат по Договору.</w:t>
+        <w:t>3.5. Стоимость Работ включает вознаграждение Исполнителя и все его расходы, связанные с выполнением Работ (инструмент, транспорт, вывоз мусора с Объектов), за исключением стоимости материалов и оборудования, которые предоставляет Заказчик либо приобретает Исполнитель за счёт Заказчика по предварительному согласованию с подтверждением расходов чеками.</w:t>
       </w:r>
     </w:p>
     <w:p>
@@ -475,7 +475,59 @@
         <w:rPr>
           <w:b w:val="0"/>
         </w:rPr>
-        <w:t>3.9. Работы, выходящие за пределы предмета Договора, выполняются только на основании дополнительного соглашения Сторон с указанием их стоимости и сроков.</w:t>
+        <w:t>3.6. Оплата Работ производится не реже 2 (двух) раз в месяц за расчётные периоды: с 1-го по 15-е число и с 16-го по последнее число календарного месяца. Оплата производится в течение 5 (пяти) рабочих дней с даты подписания Сторонами акта сдачи-приёмки выполненных работ за соответствующий расчётный период и получения от Исполнителя чека, сформированного в соответствии с п. 3.8 Договора. Если в расчётном периоде выездов не было, акт не составляется и оплата не производится.</w:t>
+      </w:r>
+    </w:p>
+    <w:p>
+      <w:pPr>
+        <w:spacing w:before="0"/>
+        <w:ind w:firstLine="567"/>
+        <w:jc w:val="both"/>
+      </w:pPr>
+      <w:r>
+        <w:rPr>
+          <w:b w:val="0"/>
+        </w:rPr>
+        <w:t>3.7. Оплата производится в безналичном порядке путём перечисления денежных средств на банковский счёт Исполнителя, указанный в разделе 10 Договора. Обязательство Заказчика по оплате считается исполненным с момента списания денежных средств с его счёта.</w:t>
+      </w:r>
+    </w:p>
+    <w:p>
+      <w:pPr>
+        <w:spacing w:before="0"/>
+        <w:ind w:firstLine="567"/>
+        <w:jc w:val="both"/>
+      </w:pPr>
+      <w:r>
+        <w:rPr>
+          <w:b w:val="0"/>
+        </w:rPr>
+        <w:t>3.8. Исполнитель обязан в течение срока, установленного ч. 3 ст. 14 Федерального закона № 422-ФЗ, сформировать в приложении «Мой налог» чек на полученную сумму и передать его Заказчику (в электронной форме или на бумажном носителе).</w:t>
+      </w:r>
+    </w:p>
+    <w:p>
+      <w:pPr>
+        <w:spacing w:before="0"/>
+        <w:ind w:firstLine="567"/>
+        <w:jc w:val="both"/>
+      </w:pPr>
+      <w:r>
+        <w:rPr>
+          <w:b w:val="0"/>
+        </w:rPr>
+        <w:t>3.9. Исполнитель самостоятельно исчисляет и уплачивает налог на профессиональный доход. Заказчик не является налоговым агентом Исполнителя, не удерживает НДФЛ и не начисляет страховые взносы с выплат по Договору.</w:t>
+      </w:r>
+    </w:p>
+    <w:p>
+      <w:pPr>
+        <w:spacing w:before="0"/>
+        <w:ind w:firstLine="567"/>
+        <w:jc w:val="both"/>
+      </w:pPr>
+      <w:r>
+        <w:rPr>
+          <w:b w:val="0"/>
+        </w:rPr>
+        <w:t>3.10. Работы, выходящие за пределы предмета Договора, выполняются только на основании дополнительного соглашения Сторон с указанием их стоимости и сроков.</w:t>
       </w:r>
     </w:p>
     <w:p>
@@ -694,7 +746,7 @@
         <w:rPr>
           <w:b w:val="0"/>
         </w:rPr>
-        <w:t>5.1. По окончании каждого расчётного периода (п. 3.5) Исполнитель передаёт Заказчику подписанный со своей стороны акт сдачи-приёмки выполненных работ (Приложение № 1) с перечнем выездов и выполненных Работ.</w:t>
+        <w:t>5.1. По окончании каждого расчётного периода (п. 3.6) Исполнитель передаёт Заказчику подписанный со своей стороны акт сдачи-приёмки выполненных работ (Приложение № 1) с перечнем выездов и выполненных Работ.</w:t>
       </w:r>
     </w:p>
     <w:p>
@@ -968,6 +1020,7 @@
     </w:p>
     <w:p>
       <w:pPr>
+        <w:keepNext/>
         <w:spacing w:before="160"/>
         <w:jc w:val="center"/>
       </w:pPr>
@@ -988,6 +1041,9 @@
         <w:gridCol w:w="4986"/>
       </w:tblGrid>
       <w:tr>
+        <w:trPr>
+          <w:cantSplit/>
+        </w:trPr>
         <w:tc>
           <w:tcPr>
             <w:tcW w:type="dxa" w:w="4986"/>
@@ -1178,16 +1234,17 @@
         <w:tblLook w:firstColumn="1" w:firstRow="1" w:lastColumn="0" w:lastRow="0" w:noHBand="0" w:noVBand="1" w:val="04A0"/>
       </w:tblPr>
       <w:tblGrid>
-        <w:gridCol w:w="510"/>
-        <w:gridCol w:w="1361"/>
-        <w:gridCol w:w="1361"/>
-        <w:gridCol w:w="4139"/>
-        <w:gridCol w:w="1701"/>
+        <w:gridCol w:w="454"/>
+        <w:gridCol w:w="1191"/>
+        <w:gridCol w:w="1077"/>
+        <w:gridCol w:w="3402"/>
+        <w:gridCol w:w="964"/>
+        <w:gridCol w:w="1984"/>
       </w:tblGrid>
       <w:tr>
         <w:tc>
           <w:tcPr>
-            <w:tcW w:type="dxa" w:w="510"/>
+            <w:tcW w:type="dxa" w:w="454"/>
           </w:tcPr>
           <w:p>
             <w:pPr>
@@ -1205,7 +1262,7 @@
         </w:tc>
         <w:tc>
           <w:tcPr>
-            <w:tcW w:type="dxa" w:w="1361"/>
+            <w:tcW w:type="dxa" w:w="1191"/>
           </w:tcPr>
           <w:p>
             <w:pPr>
@@ -1223,7 +1280,7 @@
         </w:tc>
         <w:tc>
           <w:tcPr>
-            <w:tcW w:type="dxa" w:w="1361"/>
+            <w:tcW w:type="dxa" w:w="1077"/>
           </w:tcPr>
           <w:p>
             <w:pPr>
@@ -1241,7 +1298,7 @@
         </w:tc>
         <w:tc>
           <w:tcPr>
-            <w:tcW w:type="dxa" w:w="4139"/>
+            <w:tcW w:type="dxa" w:w="3402"/>
           </w:tcPr>
           <w:p>
             <w:pPr>
@@ -1259,7 +1316,7 @@
         </w:tc>
         <w:tc>
           <w:tcPr>
-            <w:tcW w:type="dxa" w:w="1701"/>
+            <w:tcW w:type="dxa" w:w="964"/>
           </w:tcPr>
           <w:p>
             <w:pPr>
@@ -1271,7 +1328,25 @@
                 <w:b/>
                 <w:sz w:val="22"/>
               </w:rPr>
-              <w:t>Стоимость, руб.</w:t>
+              <w:t>Часы</w:t>
+            </w:r>
+          </w:p>
+        </w:tc>
+        <w:tc>
+          <w:tcPr>
+            <w:tcW w:type="dxa" w:w="1984"/>
+          </w:tcPr>
+          <w:p>
+            <w:pPr>
+              <w:jc w:val="center"/>
+            </w:pPr>
+            <w:r/>
+            <w:r>
+              <w:rPr>
+                <w:b/>
+                <w:sz w:val="22"/>
+              </w:rPr>
+              <w:t>Стоимость (выезд 2 500 руб. + 2 500 руб./ч), руб.</w:t>
             </w:r>
           </w:p>
         </w:tc>
@@ -1279,7 +1354,7 @@
       <w:tr>
         <w:tc>
           <w:tcPr>
-            <w:tcW w:type="dxa" w:w="510"/>
+            <w:tcW w:type="dxa" w:w="454"/>
           </w:tcPr>
           <w:p>
             <w:r/>
@@ -1293,7 +1368,7 @@
         </w:tc>
         <w:tc>
           <w:tcPr>
-            <w:tcW w:type="dxa" w:w="1361"/>
+            <w:tcW w:type="dxa" w:w="1191"/>
           </w:tcPr>
           <w:p>
             <w:r/>
@@ -1306,7 +1381,7 @@
         </w:tc>
         <w:tc>
           <w:tcPr>
-            <w:tcW w:type="dxa" w:w="1361"/>
+            <w:tcW w:type="dxa" w:w="1077"/>
           </w:tcPr>
           <w:p>
             <w:r/>
@@ -1319,7 +1394,7 @@
         </w:tc>
         <w:tc>
           <w:tcPr>
-            <w:tcW w:type="dxa" w:w="4139"/>
+            <w:tcW w:type="dxa" w:w="3402"/>
           </w:tcPr>
           <w:p>
             <w:r/>
@@ -1332,7 +1407,20 @@
         </w:tc>
         <w:tc>
           <w:tcPr>
-            <w:tcW w:type="dxa" w:w="1701"/>
+            <w:tcW w:type="dxa" w:w="964"/>
+          </w:tcPr>
+          <w:p>
+            <w:r/>
+            <w:r>
+              <w:rPr>
+                <w:sz w:val="22"/>
+              </w:rPr>
+            </w:r>
+          </w:p>
+        </w:tc>
+        <w:tc>
+          <w:tcPr>
+            <w:tcW w:type="dxa" w:w="1984"/>
           </w:tcPr>
           <w:p>
             <w:r/>
@@ -1347,7 +1435,7 @@
       <w:tr>
         <w:tc>
           <w:tcPr>
-            <w:tcW w:type="dxa" w:w="510"/>
+            <w:tcW w:type="dxa" w:w="454"/>
           </w:tcPr>
           <w:p>
             <w:r/>
@@ -1361,7 +1449,7 @@
         </w:tc>
         <w:tc>
           <w:tcPr>
-            <w:tcW w:type="dxa" w:w="1361"/>
+            <w:tcW w:type="dxa" w:w="1191"/>
           </w:tcPr>
           <w:p>
             <w:r/>
@@ -1374,7 +1462,7 @@
         </w:tc>
         <w:tc>
           <w:tcPr>
-            <w:tcW w:type="dxa" w:w="1361"/>
+            <w:tcW w:type="dxa" w:w="1077"/>
           </w:tcPr>
           <w:p>
             <w:r/>
@@ -1387,7 +1475,7 @@
         </w:tc>
         <w:tc>
           <w:tcPr>
-            <w:tcW w:type="dxa" w:w="4139"/>
+            <w:tcW w:type="dxa" w:w="3402"/>
           </w:tcPr>
           <w:p>
             <w:r/>
@@ -1400,7 +1488,20 @@
         </w:tc>
         <w:tc>
           <w:tcPr>
-            <w:tcW w:type="dxa" w:w="1701"/>
+            <w:tcW w:type="dxa" w:w="964"/>
+          </w:tcPr>
+          <w:p>
+            <w:r/>
+            <w:r>
+              <w:rPr>
+                <w:sz w:val="22"/>
+              </w:rPr>
+            </w:r>
+          </w:p>
+        </w:tc>
+        <w:tc>
+          <w:tcPr>
+            <w:tcW w:type="dxa" w:w="1984"/>
           </w:tcPr>
           <w:p>
             <w:r/>
@@ -1415,7 +1516,7 @@
       <w:tr>
         <w:tc>
           <w:tcPr>
-            <w:tcW w:type="dxa" w:w="510"/>
+            <w:tcW w:type="dxa" w:w="454"/>
           </w:tcPr>
           <w:p>
             <w:r/>
@@ -1429,7 +1530,7 @@
         </w:tc>
         <w:tc>
           <w:tcPr>
-            <w:tcW w:type="dxa" w:w="1361"/>
+            <w:tcW w:type="dxa" w:w="1191"/>
           </w:tcPr>
           <w:p>
             <w:r/>
@@ -1442,7 +1543,7 @@
         </w:tc>
         <w:tc>
           <w:tcPr>
-            <w:tcW w:type="dxa" w:w="1361"/>
+            <w:tcW w:type="dxa" w:w="1077"/>
           </w:tcPr>
           <w:p>
             <w:r/>
@@ -1455,7 +1556,7 @@
         </w:tc>
         <w:tc>
           <w:tcPr>
-            <w:tcW w:type="dxa" w:w="4139"/>
+            <w:tcW w:type="dxa" w:w="3402"/>
           </w:tcPr>
           <w:p>
             <w:r/>
@@ -1468,7 +1569,20 @@
         </w:tc>
         <w:tc>
           <w:tcPr>
-            <w:tcW w:type="dxa" w:w="1701"/>
+            <w:tcW w:type="dxa" w:w="964"/>
+          </w:tcPr>
+          <w:p>
+            <w:r/>
+            <w:r>
+              <w:rPr>
+                <w:sz w:val="22"/>
+              </w:rPr>
+            </w:r>
+          </w:p>
+        </w:tc>
+        <w:tc>
+          <w:tcPr>
+            <w:tcW w:type="dxa" w:w="1984"/>
           </w:tcPr>
           <w:p>
             <w:r/>
@@ -1483,7 +1597,7 @@
       <w:tr>
         <w:tc>
           <w:tcPr>
-            <w:tcW w:type="dxa" w:w="510"/>
+            <w:tcW w:type="dxa" w:w="454"/>
           </w:tcPr>
           <w:p>
             <w:r/>
@@ -1497,7 +1611,7 @@
         </w:tc>
         <w:tc>
           <w:tcPr>
-            <w:tcW w:type="dxa" w:w="1361"/>
+            <w:tcW w:type="dxa" w:w="1191"/>
           </w:tcPr>
           <w:p>
             <w:r/>
@@ -1510,7 +1624,7 @@
         </w:tc>
         <w:tc>
           <w:tcPr>
-            <w:tcW w:type="dxa" w:w="1361"/>
+            <w:tcW w:type="dxa" w:w="1077"/>
           </w:tcPr>
           <w:p>
             <w:r/>
@@ -1523,7 +1637,7 @@
         </w:tc>
         <w:tc>
           <w:tcPr>
-            <w:tcW w:type="dxa" w:w="4139"/>
+            <w:tcW w:type="dxa" w:w="3402"/>
           </w:tcPr>
           <w:p>
             <w:r/>
@@ -1536,7 +1650,20 @@
         </w:tc>
         <w:tc>
           <w:tcPr>
-            <w:tcW w:type="dxa" w:w="1701"/>
+            <w:tcW w:type="dxa" w:w="964"/>
+          </w:tcPr>
+          <w:p>
+            <w:r/>
+            <w:r>
+              <w:rPr>
+                <w:sz w:val="22"/>
+              </w:rPr>
+            </w:r>
+          </w:p>
+        </w:tc>
+        <w:tc>
+          <w:tcPr>
+            <w:tcW w:type="dxa" w:w="1984"/>
           </w:tcPr>
           <w:p>
             <w:r/>
@@ -1551,7 +1678,7 @@
       <w:tr>
         <w:tc>
           <w:tcPr>
-            <w:tcW w:type="dxa" w:w="510"/>
+            <w:tcW w:type="dxa" w:w="454"/>
           </w:tcPr>
           <w:p>
             <w:r/>
@@ -1565,7 +1692,7 @@
         </w:tc>
         <w:tc>
           <w:tcPr>
-            <w:tcW w:type="dxa" w:w="1361"/>
+            <w:tcW w:type="dxa" w:w="1191"/>
           </w:tcPr>
           <w:p>
             <w:r/>
@@ -1578,7 +1705,7 @@
         </w:tc>
         <w:tc>
           <w:tcPr>
-            <w:tcW w:type="dxa" w:w="1361"/>
+            <w:tcW w:type="dxa" w:w="1077"/>
           </w:tcPr>
           <w:p>
             <w:r/>
@@ -1591,7 +1718,7 @@
         </w:tc>
         <w:tc>
           <w:tcPr>
-            <w:tcW w:type="dxa" w:w="4139"/>
+            <w:tcW w:type="dxa" w:w="3402"/>
           </w:tcPr>
           <w:p>
             <w:r/>
@@ -1604,7 +1731,20 @@
         </w:tc>
         <w:tc>
           <w:tcPr>
-            <w:tcW w:type="dxa" w:w="1701"/>
+            <w:tcW w:type="dxa" w:w="964"/>
+          </w:tcPr>
+          <w:p>
+            <w:r/>
+            <w:r>
+              <w:rPr>
+                <w:sz w:val="22"/>
+              </w:rPr>
+            </w:r>
+          </w:p>
+        </w:tc>
+        <w:tc>
+          <w:tcPr>
+            <w:tcW w:type="dxa" w:w="1984"/>
           </w:tcPr>
           <w:p>
             <w:r/>
@@ -1619,7 +1759,7 @@
       <w:tr>
         <w:tc>
           <w:tcPr>
-            <w:tcW w:type="dxa" w:w="510"/>
+            <w:tcW w:type="dxa" w:w="454"/>
           </w:tcPr>
           <w:p>
             <w:r/>
@@ -1633,7 +1773,7 @@
         </w:tc>
         <w:tc>
           <w:tcPr>
-            <w:tcW w:type="dxa" w:w="1361"/>
+            <w:tcW w:type="dxa" w:w="1191"/>
           </w:tcPr>
           <w:p>
             <w:r/>
@@ -1646,7 +1786,7 @@
         </w:tc>
         <w:tc>
           <w:tcPr>
-            <w:tcW w:type="dxa" w:w="1361"/>
+            <w:tcW w:type="dxa" w:w="1077"/>
           </w:tcPr>
           <w:p>
             <w:r/>
@@ -1659,7 +1799,7 @@
         </w:tc>
         <w:tc>
           <w:tcPr>
-            <w:tcW w:type="dxa" w:w="4139"/>
+            <w:tcW w:type="dxa" w:w="3402"/>
           </w:tcPr>
           <w:p>
             <w:r/>
@@ -1672,7 +1812,20 @@
         </w:tc>
         <w:tc>
           <w:tcPr>
-            <w:tcW w:type="dxa" w:w="1701"/>
+            <w:tcW w:type="dxa" w:w="964"/>
+          </w:tcPr>
+          <w:p>
+            <w:r/>
+            <w:r>
+              <w:rPr>
+                <w:sz w:val="22"/>
+              </w:rPr>
+            </w:r>
+          </w:p>
+        </w:tc>
+        <w:tc>
+          <w:tcPr>
+            <w:tcW w:type="dxa" w:w="1984"/>
           </w:tcPr>
           <w:p>
             <w:r/>
@@ -1687,7 +1840,7 @@
       <w:tr>
         <w:tc>
           <w:tcPr>
-            <w:tcW w:type="dxa" w:w="510"/>
+            <w:tcW w:type="dxa" w:w="454"/>
           </w:tcPr>
           <w:p>
             <w:r/>
@@ -1700,7 +1853,7 @@
         </w:tc>
         <w:tc>
           <w:tcPr>
-            <w:tcW w:type="dxa" w:w="1361"/>
+            <w:tcW w:type="dxa" w:w="1191"/>
           </w:tcPr>
           <w:p>
             <w:r/>
@@ -1713,7 +1866,7 @@
         </w:tc>
         <w:tc>
           <w:tcPr>
-            <w:tcW w:type="dxa" w:w="1361"/>
+            <w:tcW w:type="dxa" w:w="1077"/>
           </w:tcPr>
           <w:p>
             <w:r/>
@@ -1726,7 +1879,7 @@
         </w:tc>
         <w:tc>
           <w:tcPr>
-            <w:tcW w:type="dxa" w:w="4139"/>
+            <w:tcW w:type="dxa" w:w="3402"/>
           </w:tcPr>
           <w:p>
             <w:r/>
@@ -1740,7 +1893,20 @@
         </w:tc>
         <w:tc>
           <w:tcPr>
-            <w:tcW w:type="dxa" w:w="1701"/>
+            <w:tcW w:type="dxa" w:w="964"/>
+          </w:tcPr>
+          <w:p>
+            <w:r/>
+            <w:r>
+              <w:rPr>
+                <w:sz w:val="22"/>
+              </w:rPr>
+            </w:r>
+          </w:p>
+        </w:tc>
+        <w:tc>
+          <w:tcPr>
+            <w:tcW w:type="dxa" w:w="1984"/>
           </w:tcPr>
           <w:p>
             <w:r/>

</xml_diff>

<commit_message>
Set visit rate to 3000 RUB and update monthly plan breakdown
Co-Authored-By: Claude Opus 5.5 <noreply@anthropic.com>
Claude-Session: https://claude.ai/code/session_01HFBjH4MjwsHcLuC72w9pUK
</commit_message>
<xml_diff>
--- a/contracts/Договор_самозанятый_сантехника.docx
+++ b/contracts/Договор_самозанятый_сантехника.docx
@@ -397,7 +397,7 @@
         <w:rPr>
           <w:b w:val="0"/>
         </w:rPr>
-        <w:t>— выезд Исполнителя на Объект — 2 500 (две тысячи пятьсот) рублей 00 копеек за один выезд;</w:t>
+        <w:t>— выезд Исполнителя на Объект — 3 000 (три тысячи) рублей 00 копеек за один выезд;</w:t>
       </w:r>
     </w:p>
     <w:p>
@@ -436,7 +436,7 @@
         <w:rPr>
           <w:b w:val="0"/>
         </w:rPr>
-        <w:t>3.3. Плановая стоимость Работ по двум Объектам составляет 60 000 (шестьдесят тысяч) рублей 00 копеек в календарный месяц (ориентировочно 8 (восемь) выездов продолжительностью 2 (два) часа). Работы, выполнение которых приведёт к превышению плановой стоимости в календарном месяце, выполняются только по предварительному согласованию с Заказчиком, за исключением устранения аварийных ситуаций.</w:t>
+        <w:t>3.3. Плановая стоимость Работ по двум Объектам составляет 60 000 (шестьдесят тысяч) рублей 00 копеек в календарный месяц (ориентировочно 10 (десять) выездов и 12 (двенадцать) часов работы). Работы, выполнение которых приведёт к превышению плановой стоимости в календарном месяце, выполняются только по предварительному согласованию с Заказчиком, за исключением устранения аварийных ситуаций.</w:t>
       </w:r>
     </w:p>
     <w:p>
@@ -1346,7 +1346,7 @@
                 <w:b/>
                 <w:sz w:val="22"/>
               </w:rPr>
-              <w:t>Стоимость (выезд 2 500 руб. + 2 500 руб./ч), руб.</w:t>
+              <w:t>Стоимость (выезд 3 000 руб. + 2 500 руб./ч), руб.</w:t>
             </w:r>
           </w:p>
         </w:tc>

</xml_diff>